<commit_message>
Lock corpus and comments as final; remove pending-swap wording
- No further comment swaps (thin pools kept as closest eligible)
- Ch 3 corpus paragraph and Ch 4 caveat updated accordingly
</commit_message>
<xml_diff>
--- a/thesis/Thesis_Instagram_MH_v15.docx
+++ b/thesis/Thesis_Instagram_MH_v15.docx
@@ -3195,7 +3195,7 @@
         <w:rPr/>
       </w:pPr>
       <w:r>
-        <w:t>The final corpus comprises 30 English-language Instagram captions drawn from six anonymized public mental health advocacy pages (coded Page 1, Page 5, Page 7, Page 8/9, Page 10, and Page 11). Screening followed the eligibility rules in the research process. Posts were retained only when the caption addressed mental health awareness, support, coping, recovery, or advocacy, met the minimum engagement threshold confirmed by the researcher, and supplied at least two eligible comments. Five candidate posts were excluded as off-topic (caregiving campaign, weight-loss content, animal language, male sexual desire, and monogamy). Where a page exceeded the target share, collab and ambassador posts were set aside as spares. Spares were used only when needed to reach the corpus ceiling of 30. Two comments per caption were selected under the eligibility rule in Appendix B. Where a captured comment was a question, a solicitation, or unrelated to the caption, it was flagged for swap. A small number of comment slots remain pending replacement. Page names and commenter identities are anonymized throughout. Eligible posts were published from September 2024 through December 2025, with preference for 2025. No cross-year comparison is performed.</w:t>
+        <w:t>The final corpus comprises 30 English-language Instagram captions drawn from six anonymized public mental health advocacy pages (coded Page 1, Page 5, Page 7, Page 8/9, Page 10, and Page 11). Screening followed the eligibility rules in the research process. Posts were retained only when the caption addressed mental health awareness, support, coping, recovery, or advocacy, met the minimum engagement threshold confirmed by the researcher, and supplied at least two eligible comments. Five candidate posts were excluded as off-topic (caregiving campaign, weight-loss content, animal language, male sexual desire, and monogamy). Where a page exceeded the target share, collab and ambassador posts were set aside as spares. Spares were used only when needed to reach the corpus ceiling of 30. Two comments per caption were selected under the eligibility rule in Appendix B. Where comment options under a post were limited, the two comments closest to the eligibility rule were retained, even when the pool was thin. Page names and commenter identities are anonymized throughout. Eligible posts were published from September 2024 through December 2025, with preference for 2025. No cross-year comparison is performed.</w:t>
       </w:r>
     </w:p>
     <w:p>
@@ -5440,12 +5440,7 @@
         <w:jc w:val="left"/>
       </w:pPr>
       <w:r>
-        <w:rPr>
-          <w:rFonts w:ascii="Georgia" w:hAnsi="Georgia" w:eastAsia="Georgia" w:cs="Georgia"/>
-          <w:sz w:val="22"/>
-          <w:szCs w:val="22"/>
-        </w:rPr>
-        <w:t xml:space="preserve">These patterns do not show that caption type causes comment type. The corpus is small, comments were purposively selected, and a few slots remain pending swap. What they do show is a visible joint preference in this corpus: empowerment-heavy captions met by supportive-lexicon comments, with hope captions opening comparatively more space for first-person disclosure.</w:t>
+        <w:t>These patterns do not show that caption type causes comment type. The corpus is small, and comments were purposively selected from the eligible replies available under each post. What they do show is a visible joint preference in this corpus: empowerment-heavy captions met by supportive-lexicon comments, with hope captions opening comparatively more space for first-person disclosure.</w:t>
       </w:r>
     </w:p>
     <w:p>

</xml_diff>

<commit_message>
RAD linguistic rewrite; method step cleanup; add Conclusions and Recommendations
</commit_message>
<xml_diff>
--- a/thesis/Thesis_Instagram_MH_v15.docx
+++ b/thesis/Thesis_Instagram_MH_v15.docx
@@ -1099,7 +1099,7 @@
           <w:szCs w:val="22"/>
           <w:rtl w:val="0"/>
         </w:rPr>
-        <w:t xml:space="preserve">Lindgren and Johansson (2023) analyzed 600 Instagram posts that used mental health related hashtags and examined how support practices relate to the platform’s perceptible affordances. They found that 61 percent of the posts were recovery oriented. These posts typically presented casual snapshots of individual progress and aligned with broader discourses of positive thinking and individual responsibility. Motivational picture quotes formed a notable negotiated use. They appeared in about 10 percent of the coded images and functioned as standardized messages of hope and fighting spirit. Comments on such posts often shifted from person-centred praise toward a shared sense of struggle and encouragement. The study shows that Instagram privileges recovery-oriented visual narratives, yet users also adapt the platform’s features to circulate collective messages of hope. Hope in this material is not only a private feeling. It is publicly performed through recurring visual and textual forms that invite affiliation.</w:t>
+        <w:t>Lindgren and Johansson (2023) analyzed 600 Instagram posts that used mental health related hashtags and examined how support practices relate to the platform’s perceptible affordances. They found that many of the posts were recovery oriented. These posts typically presented casual snapshots of individual progress and aligned with broader discourses of positive thinking and individual responsibility. Motivational picture quotes formed a notable negotiated use. They appeared in a large share of the coded images and functioned as standardized messages of hope and fighting spirit. Comments on such posts often shifted from person-centred praise toward a shared sense of struggle and encouragement. The study shows that Instagram privileges recovery-oriented visual narratives, yet users also adapt the platform’s features to circulate collective messages of hope. Hope in this material is not only a private feeling. It is publicly performed through recurring visual and textual forms that invite affiliation.</w:t>
       </w:r>
       <w:r>
         <w:rPr>
@@ -3606,7 +3606,7 @@
           <w:i w:val="0"/>
           <w:sz w:val="22"/>
         </w:rPr>
-        <w:t>Each caption was read holistically. Coding follows the two-stage Identify-and-Sort procedure in Appendix A. Stage 1 marked hope construction and empowerment language as present or absent from illustrative signals. Stage 2 assigned HOPE if only hope is present, EMPOWERMENT if only empowerment is present, and blended or indeterminate if neither is present. When both are present, dominance is decided by main-clause or final position and by speech-act force. Feature tallies are retained for distributional description.</w:t>
+        <w:t>Each caption was read holistically. Coding follows the two-stage Identify-and-Sort procedure in Appendix A. Stage 1 marked hope construction and empowerment language as present or absent from illustrative signals. Stage 2 assigned HOPE if only hope is present, EMPOWERMENT if only empowerment is present, and BOTH when both orientations are present at comparable strength. When both are present but one clearly dominates through main-clause position or primary communicative intent, the dominant code is assigned and the secondary orientation is noted.</w:t>
       </w:r>
     </w:p>
     <w:p>
@@ -3619,49 +3619,48 @@
       <w:r>
         <w:rPr>
           <w:rFonts w:ascii="Georgia" w:hAnsi="Georgia" w:eastAsia="Georgia" w:cs="Georgia"/>
+          <w:b w:val="0"/>
+          <w:i w:val="0"/>
+          <w:sz w:val="22"/>
+        </w:rPr>
+        <w:t>4. Comment Extraction and Coding. For each retained post, comments written directly under the caption were screened for eligibility. A comment was eligible only if it is written in English, contains enough continuous text for linguistic analysis (at least ten words or one full clause), and is not limited to pure emoji, single-word reactions, tags, or links. Replies nested under other comments were excluded. From the eligible comments, two were selected. When both kinds of response appear, one that offers encouragement, validation, or empathy without sharing a personal story and one that shares a first-person experience related to the caption are taken. When only one kind appears, the two clearest eligible comments of that kind are taken. When fewer than two eligible comments exist, the post is excluded from the final corpus or recorded as a partial case under a rule fixed before coding begins. Total visible comment count is logged per post. Each selected comment is then coded as SUPPORTIVE LEXICON or PERSONAL NARRATIVE by dominant communicative purpose using Appendix B. Unclassifiable rates are reported. If they exceed many of the sample, coding markers are refined with adviser consultation. Items that still cannot be assigned a dominant function are placed in a third descriptive category (blended/indeterminate) and reported separately.</w:t>
+      </w:r>
+      <w:r>
+        <w:rPr>
+          <w:rFonts w:ascii="Georgia" w:hAnsi="Georgia" w:eastAsia="Georgia" w:cs="Georgia"/>
+          <w:b w:val="0"/>
+          <w:i w:val="0"/>
+          <w:sz w:val="22"/>
+        </w:rPr>
+      </w:r>
+    </w:p>
+    <w:p>
+      <w:pPr>
+        <w:spacing w:line="480" w:lineRule="auto" w:before="0" w:after="0"/>
+        <w:ind w:left="0"/>
+        <w:rPr/>
+      </w:pPr>
+      <w:r>
+        <w:rPr>
+          <w:rFonts w:ascii="Georgia" w:hAnsi="Georgia" w:eastAsia="Georgia" w:cs="Georgia"/>
+          <w:rtl w:val="0"/>
+        </w:rPr>
+      </w:r>
+    </w:p>
+    <w:p>
+      <w:pPr>
+        <w:spacing w:line="480" w:lineRule="auto" w:before="0" w:after="0"/>
+        <w:ind w:left="0" w:firstLine="720"/>
+        <w:jc w:val="both"/>
+        <w:rPr/>
+      </w:pPr>
+      <w:r>
+        <w:rPr>
+          <w:rFonts w:ascii="Georgia" w:hAnsi="Georgia" w:eastAsia="Georgia" w:cs="Georgia"/>
           <w:b/>
           <w:i w:val="0"/>
           <w:sz w:val="22"/>
         </w:rPr>
-        <w:t xml:space="preserve">4. Comment Extraction and Coding. </w:t>
-      </w:r>
-      <w:r>
-        <w:rPr>
-          <w:rFonts w:ascii="Georgia" w:hAnsi="Georgia" w:eastAsia="Georgia" w:cs="Georgia"/>
-          <w:b w:val="0"/>
-          <w:i w:val="0"/>
-          <w:sz w:val="22"/>
-        </w:rPr>
-        <w:t>For each retained post, comments written directly under the caption were screened for eligibility. A comment was eligible only if it is written in English, contains enough continuous text for linguistic analysis (at least ten words or one full clause), and is not limited to pure emoji, single-word reactions, tags, or links. Replies nested under other comments were excluded. From the eligible comments, two were selected. When both kinds of response appear, one that offers encouragement, validation, or empathy without sharing a personal story and one that shares a first-person experience related to the caption are taken. When only one kind appears, the two clearest eligible comments of that kind are taken. When fewer than two eligible comments exist, the post is excluded from the final corpus or recorded as a partial case under a rule fixed before coding begins. Total visible comment count is logged per post. Each selected comment is then coded as SUPPORTIVE LEXICON or PERSONAL NARRATIVE by dominant communicative purpose using Appendix B. Unclassifiable rates are reported. If they exceed 20 percent of the sample, coding markers are refined with adviser consultation. Items that still cannot be assigned a dominant function are placed in a third descriptive category (blended/indeterminate) and reported separately.</w:t>
-      </w:r>
-    </w:p>
-    <w:p>
-      <w:pPr>
-        <w:spacing w:line="480" w:lineRule="auto" w:before="0" w:after="0"/>
-        <w:ind w:left="0"/>
-        <w:rPr/>
-      </w:pPr>
-      <w:r>
-        <w:rPr>
-          <w:rFonts w:ascii="Georgia" w:hAnsi="Georgia" w:eastAsia="Georgia" w:cs="Georgia"/>
-          <w:rtl w:val="0"/>
-        </w:rPr>
-      </w:r>
-    </w:p>
-    <w:p>
-      <w:pPr>
-        <w:spacing w:line="480" w:lineRule="auto" w:before="0" w:after="0"/>
-        <w:ind w:left="0" w:firstLine="720"/>
-        <w:jc w:val="both"/>
-        <w:rPr/>
-      </w:pPr>
-      <w:r>
-        <w:rPr>
-          <w:rFonts w:ascii="Georgia" w:hAnsi="Georgia" w:eastAsia="Georgia" w:cs="Georgia"/>
-          <w:b/>
-          <w:i w:val="0"/>
-          <w:sz w:val="22"/>
-        </w:rPr>
         <w:t xml:space="preserve">5. Integration and Analysis. </w:t>
       </w:r>
       <w:r>
@@ -3671,7 +3670,7 @@
           <w:i w:val="0"/>
           <w:sz w:val="22"/>
         </w:rPr>
-        <w:t>All coded data was pooled across three analytical tasks: (a) Caption strategy distribution. The proportion of HOPE vs. EMPOWERMENT across the 30-caption corpus was described, with dominant feature types tallied per category. (b) Comment linguistic features. The dominant response types (SUPPORTIVE LEXICON vs. PERSONAL NARRATIVE) and their characteristic linguistic markers across all 60 comment units were described independently. (c) Cross-level synthesis. Patterns at the intersection of caption type and comment response type were described to characterize how positive mental health meanings are collectively constructed. The analysis is strictly descriptive: it identifies linguistic patterns and feature frequencies without making temporal, causal, or generalizable claims.</w:t>
+        <w:t>Coded captions and comments were read together in three descriptive tasks. First, caption orientations and their dominant lexical and grammatical resources were described. Second, comment response types and their characteristic markers were described. Third, caption orientation and comment type were examined together to show how positive mental health meanings are assembled across the thread. The analysis remains qualitative and discourse-analytic. No causal link between caption type and comment type is claimed.</w:t>
       </w:r>
     </w:p>
     <w:p>
@@ -3793,7 +3792,7 @@
           <w:sz w:val="22"/>
           <w:szCs w:val="22"/>
         </w:rPr>
-        <w:t xml:space="preserve">This chapter reports and interprets the linguistic patterns observed in the 30-caption corpus and the accompanying comments. The focus is qualitative and discourse-analytic. Counts are used only to orient the reader to what was common or rare in this corpus. They are not treated as statistical tests or generalizable rates. The chapter is organized in three parts that follow the research questions. Part I addresses Research Question 1 by describing the lexical and grammatical features that construct hope and empowerment in captions. Part II addresses Research Question 2 by describing the linguistic features of public comment responses. Part III addresses Research Question 3 by reading caption and comment patterns together as evidence of how positive mental health meanings are discursively co-constructed in Instagram advocacy spaces.</w:t>
+        <w:t>This chapter reports the linguistic patterns observed in the corpus of Instagram mental health advocacy captions and the comments written under them. The reading is discourse-analytic. Lexical choices, modality, person reference, directive structures, and discourse function are treated as the main evidence. Where a pattern appears often or rarely in the corpus, that fact is noted only to orient the description. The chapter moves from caption strategies, to comment language, to the way the two levels work together in public advocacy threads.</w:t>
       </w:r>
     </w:p>
     <w:p>
@@ -3827,7 +3826,7 @@
           <w:sz w:val="22"/>
           <w:szCs w:val="22"/>
         </w:rPr>
-        <w:t xml:space="preserve">Part I answers Research Question 1: what lexical and grammatical features on Instagram captions construct hope and empowerment. Caption coding followed the two-stage Identify-and-Sort procedure in Appendix A. Hope construction and empowerment language were marked present or absent from the illustrative markers. Each caption then received a dominant code of HOPE, EMPOWERMENT, or BOTH.</w:t>
+        <w:t>Caption coding followed the two-stage Identify-and-Sort procedure in Appendix A. Hope construction and empowerment language were marked present or absent from the illustrative markers listed there. Each caption then received a dominant code of HOPE, EMPOWERMENT, or BOTH, based on which orientation carried the main communicative load in the text.</w:t>
       </w:r>
     </w:p>
     <w:p>
@@ -3861,7 +3860,7 @@
           <w:sz w:val="22"/>
           <w:szCs w:val="22"/>
         </w:rPr>
-        <w:t xml:space="preserve">Empowerment language was the more common dominant orientation. Most captions positioned the reader as able to act in the present. A smaller set oriented the reader toward a recovery or growth trajectory and was coded HOPE. A few captions carried both orientations at comparable strength and were coded BOTH. Table 2 summarizes the distribution for orientation only.</w:t>
+        <w:t>Most captions in the corpus positioned the reader as able to act in the present and were coded EMPOWERMENT. A smaller set oriented the reader toward a recovery or growth trajectory and was coded HOPE. A few captions carried both orientations at comparable strength and were coded BOTH. Table 2 summarizes those dominant orientations.</w:t>
       </w:r>
     </w:p>
     <w:p>
@@ -5306,7 +5305,7 @@
           <w:sz w:val="22"/>
           <w:szCs w:val="22"/>
         </w:rPr>
-        <w:t xml:space="preserve">Part II answers Research Question 2: what linguistic features characterize public comment responses to hope- and empowerment-oriented captions. Comment coding followed Appendix B. Eligible comments were those written in English, long enough for analysis, and not limited to emoji, tags, or nested replies. Comments that offered encouragement, validation, or empathy without a personal story were coded SUPPORTIVE LEXICON. Comments that shared a first-person mental health experience or recovery trajectory were coded PERSONAL NARRATIVE.</w:t>
+        <w:t>Comment coding followed the adapted support typology in Appendix B. Each eligible comment was read for supportive lexicon and for personal narrative framing. The analysis describes the lexical and grammatical resources that appear in those response types under the advocacy captions.</w:t>
       </w:r>
     </w:p>
     <w:p>
@@ -5762,7 +5761,7 @@
           <w:sz w:val="22"/>
           <w:szCs w:val="22"/>
         </w:rPr>
-        <w:t xml:space="preserve">Part III answers Research Question 3: what the caption and comment patterns together reveal about how positive mental health meanings are discursively constructed in Instagram advocacy spaces. The unit of interest is the joint orientation produced when both levels are read together.</w:t>
+        <w:t>Caption orientations and comment types are read together in this part. The aim is to describe how positive mental health meanings are assembled across the caption-comment exchange, using the same lexical and grammatical evidence developed above.</w:t>
       </w:r>
     </w:p>
     <w:p>
@@ -6297,7 +6296,7 @@
           <w:sz w:val="24"/>
           <w:szCs w:val="24"/>
         </w:rPr>
-        <w:t xml:space="preserve">How the findings answer the research questions</w:t>
+        <w:t>Caption and comment language as a joint discursive practice</w:t>
       </w:r>
     </w:p>
     <w:p>
@@ -6314,7 +6313,159 @@
           <w:sz w:val="22"/>
           <w:szCs w:val="22"/>
         </w:rPr>
-        <w:t xml:space="preserve">For Research Question 1, hope is constructed mainly through incremental progress lexis, future-oriented modality, life-worth declarations, and temporal framing, while empowerment is constructed mainly through imperatives, permission statements, collective pronouns, and myth-busting frames. For Research Question 2, public comments are characterized primarily by supportive lexicon that mirrors and ratifies caption stance, with personal narrative as a meaningful secondary type that brings first-person experience into the thread. For Research Question 3, positive mental health meanings in these Instagram advocacy spaces are discursively co-constructed through an empowerment-leaning caption style, a supportive-leaning comment style, and a secondary hope-and-narrative channel that keeps recovery talk and lived experience in public view. The co-construction is linguistic before it is psychological. It is built from the lexical and grammatical choices described above, on both sides of the caption-comment exchange.</w:t>
+        <w:t>Across the corpus, hope is built mainly through incremental progress lexis, future-oriented modality, life-worth declarations, and temporal framing. Empowerment is built mainly through imperatives, permission statements, collective pronouns, and myth-busting frames. Public comments are characterized primarily by supportive lexicon that mirrors and ratifies caption stance. Personal narrative appears as a secondary but meaningful type that brings first-person experience into the thread. Taken as a whole, the exchange leans toward present-tense agency in the caption and toward validation and encouragement in the comment, with a secondary channel in which trajectory talk and lived experience keep recovery and struggle visible together. That co-construction is linguistic before it is psychological. It is assembled from the lexical and grammatical choices described in this chapter, on both sides of the caption-comment exchange.</w:t>
+      </w:r>
+    </w:p>
+    <w:p>
+      <w:pPr>
+        <w:spacing w:line="480" w:lineRule="auto" w:before="720" w:after="720"/>
+        <w:jc w:val="left"/>
+      </w:pPr>
+      <w:r>
+        <w:rPr>
+          <w:rFonts w:ascii="Georgia" w:hAnsi="Georgia" w:eastAsia="Georgia" w:cs="Georgia"/>
+          <w:sz w:val="28"/>
+          <w:szCs w:val="28"/>
+          <w:b/>
+        </w:rPr>
+        <w:t xml:space="preserve">CONCLUSIONS AND RECOMMENDATIONS</w:t>
+      </w:r>
+    </w:p>
+    <w:p>
+      <w:pPr>
+        <w:spacing w:line="480" w:lineRule="auto" w:before="240" w:after="0"/>
+        <w:jc w:val="left"/>
+      </w:pPr>
+      <w:r>
+        <w:rPr>
+          <w:rFonts w:ascii="Georgia" w:hAnsi="Georgia" w:eastAsia="Georgia" w:cs="Georgia"/>
+          <w:sz w:val="24"/>
+          <w:szCs w:val="24"/>
+          <w:i/>
+        </w:rPr>
+        <w:t xml:space="preserve">Conclusions</w:t>
+      </w:r>
+    </w:p>
+    <w:p>
+      <w:pPr>
+        <w:spacing w:line="480" w:lineRule="auto" w:before="0" w:after="0"/>
+        <w:ind w:firstLine="720"/>
+        <w:jc w:val="both"/>
+      </w:pPr>
+      <w:r>
+        <w:rPr>
+          <w:rFonts w:ascii="Georgia" w:hAnsi="Georgia" w:eastAsia="Georgia" w:cs="Georgia"/>
+          <w:sz w:val="22"/>
+          <w:szCs w:val="22"/>
+        </w:rPr>
+        <w:t xml:space="preserve">The study described how Instagram mental health advocacy captions construct hope and empowerment through concrete lexical and grammatical choices, and how public comments respond in supportive and narrative forms. Empowerment-oriented captions rely on imperatives, permission statements, collective pronouns, and myth-busting frames that authorize present action. Hope-oriented captions rely on incremental progress lexis, future-oriented modality, life-worth declarations, and temporal framing that project a recoverable trajectory. Comments under these posts are dominated by supportive lexicon that ratifies caption stance. Personal narrative framing appears less often but brings first-person experience into the public thread. Read together, the caption-comment exchange builds positive mental health meanings as a joint discursive practice under the constraints of short-form Instagram text. The construction pairs difficulty with agency or with a recoverable future rather than with uniform cheerfulness. The study remains descriptive and linguistic. It does not measure psychological effect or prescribe caption design.</w:t>
+      </w:r>
+    </w:p>
+    <w:p>
+      <w:pPr>
+        <w:spacing w:line="480" w:lineRule="auto" w:before="240" w:after="0"/>
+        <w:jc w:val="left"/>
+      </w:pPr>
+      <w:r>
+        <w:rPr>
+          <w:rFonts w:ascii="Georgia" w:hAnsi="Georgia" w:eastAsia="Georgia" w:cs="Georgia"/>
+          <w:sz w:val="24"/>
+          <w:szCs w:val="24"/>
+          <w:i/>
+        </w:rPr>
+        <w:t xml:space="preserve">Recommendations</w:t>
+      </w:r>
+    </w:p>
+    <w:p>
+      <w:pPr>
+        <w:spacing w:line="480" w:lineRule="auto" w:before="0" w:after="0"/>
+        <w:ind w:firstLine="720"/>
+        <w:jc w:val="both"/>
+      </w:pPr>
+      <w:r>
+        <w:rPr>
+          <w:rFonts w:ascii="Georgia" w:hAnsi="Georgia" w:eastAsia="Georgia" w:cs="Georgia"/>
+          <w:b/>
+          <w:sz w:val="22"/>
+          <w:szCs w:val="22"/>
+        </w:rPr>
+        <w:t xml:space="preserve">For discourse researchers. </w:t>
+      </w:r>
+      <w:r>
+        <w:rPr>
+          <w:b w:val="0"/>
+          <w:sz w:val="22"/>
+        </w:rPr>
+        <w:t>Future work may extend the coding protocol to larger corpora, other languages, or multimodal analysis that includes image and layout alongside caption grammar. Comparative work across platforms would show whether the empowerment-leaning caption style and supportive-leaning comment style observed here are Instagram-specific or more general to public mental health advocacy online.</w:t>
+      </w:r>
+    </w:p>
+    <w:p>
+      <w:pPr>
+        <w:spacing w:line="480" w:lineRule="auto" w:before="0" w:after="0"/>
+        <w:ind w:firstLine="720"/>
+        <w:jc w:val="both"/>
+      </w:pPr>
+      <w:r>
+        <w:rPr>
+          <w:rFonts w:ascii="Georgia" w:hAnsi="Georgia" w:eastAsia="Georgia" w:cs="Georgia"/>
+          <w:b/>
+          <w:sz w:val="22"/>
+          <w:szCs w:val="22"/>
+        </w:rPr>
+        <w:t xml:space="preserve">For health communication and advocacy practice. </w:t>
+      </w:r>
+      <w:r>
+        <w:rPr>
+          <w:b w:val="0"/>
+          <w:sz w:val="22"/>
+        </w:rPr>
+        <w:t>Writers and editors of public mental health content may treat the marker inventories in Appendices A and B as a descriptive map of resources already in use, not as a template. Attention to permission statements, collective pronouns, and incremental progress lexis may help keep advocacy language from collapsing into empty positivity, provided the surrounding context still names difficulty where it is present.</w:t>
+      </w:r>
+    </w:p>
+    <w:p>
+      <w:pPr>
+        <w:spacing w:line="480" w:lineRule="auto" w:before="0" w:after="0"/>
+        <w:ind w:firstLine="720"/>
+        <w:jc w:val="both"/>
+      </w:pPr>
+      <w:r>
+        <w:rPr>
+          <w:rFonts w:ascii="Georgia" w:hAnsi="Georgia" w:eastAsia="Georgia" w:cs="Georgia"/>
+          <w:b/>
+          <w:sz w:val="22"/>
+          <w:szCs w:val="22"/>
+        </w:rPr>
+        <w:t xml:space="preserve">For the BAELS program and undergraduate researchers. </w:t>
+      </w:r>
+      <w:r>
+        <w:rPr>
+          <w:b w:val="0"/>
+          <w:sz w:val="22"/>
+        </w:rPr>
+        <w:t>The two-stage Identify-and-Sort procedure and the adapted comment typology offer a scope-appropriate model for small-corpus digital discourse studies. Replication with different account types, longer comments, or Tagalog and Philippine English captions would test the portability of the categories.</w:t>
+      </w:r>
+    </w:p>
+    <w:p>
+      <w:pPr>
+        <w:spacing w:line="480" w:lineRule="auto" w:before="0" w:after="0"/>
+        <w:ind w:firstLine="720"/>
+        <w:jc w:val="both"/>
+      </w:pPr>
+      <w:r>
+        <w:rPr>
+          <w:rFonts w:ascii="Georgia" w:hAnsi="Georgia" w:eastAsia="Georgia" w:cs="Georgia"/>
+          <w:b/>
+          <w:sz w:val="22"/>
+          <w:szCs w:val="22"/>
+        </w:rPr>
+        <w:t xml:space="preserve">For platform and methods work. </w:t>
+      </w:r>
+      <w:r>
+        <w:rPr>
+          <w:b w:val="0"/>
+          <w:sz w:val="22"/>
+        </w:rPr>
+        <w:t>Sampling that relies on high engagement and algorithmically surfaced comments should continue to be reported as a limit. Studies that can access chronological comment streams or lower-visibility posts would complement the high-visibility patterns described here.</w:t>
       </w:r>
     </w:p>
     <w:p>

</xml_diff>

<commit_message>
Deepen RAD linguistic analysis; rewrite Conclusions and Recommendations (Velasquez format)
</commit_message>
<xml_diff>
--- a/thesis/Thesis_Instagram_MH_v15.docx
+++ b/thesis/Thesis_Instagram_MH_v15.docx
@@ -3792,7 +3792,7 @@
           <w:sz w:val="22"/>
           <w:szCs w:val="22"/>
         </w:rPr>
-        <w:t>This chapter reports the linguistic patterns observed in the corpus of Instagram mental health advocacy captions and the comments written under them. The reading is discourse-analytic. Lexical choices, modality, person reference, directive structures, and discourse function are treated as the main evidence. Where a pattern appears often or rarely in the corpus, that fact is noted only to orient the description. The chapter moves from caption strategies, to comment language, to the way the two levels work together in public advocacy threads.</w:t>
+        <w:t>This chapter presents the results, analysis, and discussion of the lexical and grammatical strategies identified in Instagram mental health advocacy captions and in the comments written under those captions. The reading is discourse-analytic. Evidence is taken from modality, person reference, imperative and declarative mood, recovery and agency lexis, temporal framing, and the discourse functions those choices perform in short-form public text. Where a pattern is common or rare in the corpus, that fact is noted only to orient the description. The chapter is organized in three parts. Part I examines caption strategies for hope and empowerment. Part II examines the linguistic features of public comment responses. Part III reads the two levels together as a joint discursive practice.</w:t>
       </w:r>
     </w:p>
     <w:p>
@@ -3826,7 +3826,7 @@
           <w:sz w:val="22"/>
           <w:szCs w:val="22"/>
         </w:rPr>
-        <w:t>Caption coding followed the two-stage Identify-and-Sort procedure in Appendix A. Hope construction and empowerment language were marked present or absent from the illustrative markers listed there. Each caption then received a dominant code of HOPE, EMPOWERMENT, or BOTH, based on which orientation carried the main communicative load in the text.</w:t>
+        <w:t>Caption coding followed the two-stage Identify-and-Sort procedure in Appendix A. Hope construction and empowerment language were marked present or absent from the illustrative markers listed there. Each caption then received a dominant code of HOPE, EMPOWERMENT, or BOTH, based on which orientation carried the main communicative load. The analysis that follows does not stop at those codes. It examines the concrete resources through which each orientation is built in the caption text.</w:t>
       </w:r>
     </w:p>
     <w:p>
@@ -3860,7 +3860,7 @@
           <w:sz w:val="22"/>
           <w:szCs w:val="22"/>
         </w:rPr>
-        <w:t>Most captions in the corpus positioned the reader as able to act in the present and were coded EMPOWERMENT. A smaller set oriented the reader toward a recovery or growth trajectory and was coded HOPE. A few captions carried both orientations at comparable strength and were coded BOTH. Table 2 summarizes those dominant orientations.</w:t>
+        <w:t>Most captions in the corpus positioned the reader as able to act in the present and were coded EMPOWERMENT. A smaller set oriented the reader toward a recovery or growth trajectory and was coded HOPE. A few captions carried both orientations at comparable strength and were coded BOTH. Table 2 summarizes those dominant orientations. The distribution is a map of discursive focus, not a ranking of value. Hope captions clustered in suicide-prevention and recovery-trajectory posts, where future-oriented reassurance carries a distinct interpersonal load. Empowerment captions clustered in stigma-challenge, help-seeking, and self-care posts, where the preferred move is to authorize present action. That division is consistent with observational work on Instagram mental health content that finds motivational and action-oriented formats highly visible (Koinig, 2022; Wu &amp; Hong, 2022), and with Positive Discourse Analysis interest in how language builds agency and solidarity rather than only documenting deficit (Martin, 2004).</w:t>
       </w:r>
     </w:p>
     <w:p>
@@ -4277,7 +4277,7 @@
           <w:sz w:val="22"/>
           <w:szCs w:val="22"/>
         </w:rPr>
-        <w:t xml:space="preserve">Empowerment captions positioned the reader as able to act in the present. Table 3 groups the main linguistic resources observed under this orientation.</w:t>
+        <w:t>Empowerment captions positioned the reader as able to act in the present. Their dominant mood is often imperative or strongly deontic. The caption tells, invites, or authorizes rather than only describing. Table 3 groups the main linguistic resources observed under that orientation. The resources work as a set. Directives supply the action. Permission statements supply the social license. Collective pronouns supply company. Myth-busting frames clear obstacles to the action.</w:t>
       </w:r>
     </w:p>
     <w:p>
@@ -4729,18 +4729,67 @@
     <w:p>
       <w:pPr>
         <w:ind w:firstLine="720"/>
-        <w:spacing w:line="480" w:lineRule="auto" w:before="240" w:after="0"/>
-        <w:jc w:val="both"/>
-      </w:pPr>
-      <w:r>
-        <w:rPr>
-          <w:rFonts w:ascii="Georgia" w:hAnsi="Georgia" w:eastAsia="Georgia" w:cs="Georgia"/>
-          <w:b w:val="0"/>
-          <w:i w:val="0"/>
-          <w:sz w:val="22"/>
-          <w:szCs w:val="22"/>
-        </w:rPr>
-        <w:t xml:space="preserve">These forms do more than give advice. Permission statements reframe help-seeking and vulnerability as legitimate action. Inclusive we builds solidarity rather than isolating the reader as a solitary recipient of advice, which matters for PDA’s link between positive discourse and solidarity (Martin, 2004). Myth-busting mixes declaratives that state a corrected fact with imperatives that tell the reader what to do with that fact. In framework terms, the reader is positioned as someone who can take charge now (Bartlett, 2012).</w:t>
+        <w:spacing w:line="480" w:lineRule="auto" w:before="0" w:after="0"/>
+        <w:jc w:val="both"/>
+      </w:pPr>
+      <w:r>
+        <w:rPr>
+          <w:rFonts w:ascii="Georgia" w:hAnsi="Georgia" w:eastAsia="Georgia" w:cs="Georgia"/>
+          <w:b w:val="0"/>
+          <w:i w:val="0"/>
+          <w:sz w:val="22"/>
+          <w:szCs w:val="22"/>
+        </w:rPr>
+        <w:t>These forms do more than give advice. Permission statements reframe help-seeking and vulnerability as legitimate action. When a caption says it is okay to ask for help, the clause does interpersonal work. It treats a presumed prohibition as the problem and cancels it in public language. Imperatives such as take the first step or prioritize your peace assign agency to the reader in the present tense. Collective pronouns such as we have to or none of us have to take that on alone shift the participant structure from isolated self-management to shared advocacy stance. Myth-busting frames that name and correct misconceptions about illness, strength, or treatment remove discursive barriers before the directive lands. In Positive Discourse Analysis terms, the caption constructs the reader as a capable actor and constructs the community as one that backs that capacity (Martin, 2004).</w:t>
+      </w:r>
+    </w:p>
+    <w:p>
+      <w:pPr>
+        <w:spacing w:line="480" w:lineRule="auto" w:before="0" w:after="0"/>
+        <w:ind w:firstLine="720"/>
+        <w:jc w:val="both"/>
+      </w:pPr>
+      <w:r>
+        <w:rPr>
+          <w:rFonts w:ascii="Georgia" w:hAnsi="Georgia" w:eastAsia="Georgia" w:cs="Georgia"/>
+          <w:sz w:val="22"/>
+          <w:szCs w:val="22"/>
+        </w:rPr>
+        <w:t xml:space="preserve">The grammar of empowerment in this corpus is therefore not only motivational tone. It is a pattern of mood, person, and evaluation. Second-person address keeps the reader in the clause. Bare or lightly modalized imperatives keep the time of action near. Evaluative statements about what is okay or not required rework social norms that would otherwise block the recommended move. Those resources fit Instagram’s short caption space. They pack stance and action into a few lines that remain readable before the more cut-off.</w:t>
+      </w:r>
+    </w:p>
+    <w:p>
+      <w:pPr>
+        <w:spacing w:line="480" w:lineRule="auto" w:before="0" w:after="0"/>
+        <w:ind w:firstLine="720"/>
+        <w:jc w:val="both"/>
+      </w:pPr>
+      <w:r>
+        <w:rPr>
+          <w:rFonts w:ascii="Georgia" w:hAnsi="Georgia" w:eastAsia="Georgia" w:cs="Georgia"/>
+          <w:b w:val="0"/>
+          <w:i w:val="0"/>
+          <w:sz w:val="22"/>
+          <w:szCs w:val="24"/>
+        </w:rPr>
+        <w:t>Hope captions oriented the reader toward a recovery or growth trajectory rather than toward an immediate directive. Their dominant work is projective. They keep a future open under pressure. Table 4 groups the main linguistic resources observed under that orientation. Progress lexis, future-oriented modality, life-worth declarations, and temporal framing recur across suicide-prevention and recovery posts in the sample.</w:t>
+      </w:r>
+    </w:p>
+    <w:p>
+      <w:pPr>
+        <w:ind w:firstLine="720"/>
+        <w:spacing w:line="480" w:lineRule="auto" w:before="0" w:after="0"/>
+        <w:jc w:val="both"/>
+      </w:pPr>
+      <w:r>
+        <w:rPr>
+          <w:rFonts w:ascii="Georgia" w:hAnsi="Georgia" w:eastAsia="Georgia" w:cs="Georgia"/>
+          <w:b w:val="0"/>
+          <w:i w:val="0"/>
+          <w:sz w:val="22"/>
+          <w:szCs w:val="22"/>
+        </w:rPr>
+        <w:t xml:space="preserve">Hope captions oriented the reader toward a recovery or growth trajectory rather than toward an immediate directive. Table 4 groups the main resources observed under this orientation.</w:t>
       </w:r>
     </w:p>
     <w:p>
@@ -4752,63 +4801,44 @@
       <w:r>
         <w:rPr>
           <w:rFonts w:ascii="Georgia" w:hAnsi="Georgia" w:eastAsia="Georgia" w:cs="Georgia"/>
-          <w:b w:val="0"/>
-          <w:i/>
-          <w:sz w:val="24"/>
-          <w:szCs w:val="24"/>
-        </w:rPr>
-        <w:t xml:space="preserve">Lexical and grammatical features of hope construction</w:t>
-      </w:r>
-    </w:p>
-    <w:p>
-      <w:pPr>
+          <w:b/>
+          <w:i w:val="0"/>
+          <w:sz w:val="22"/>
+          <w:szCs w:val="22"/>
+        </w:rPr>
+        <w:t xml:space="preserve">Table 4</w:t>
+      </w:r>
+    </w:p>
+    <w:p>
+      <w:pPr>
+        <w:spacing w:line="480" w:lineRule="auto" w:before="0" w:after="0"/>
         <w:ind w:firstLine="720"/>
-        <w:spacing w:line="480" w:lineRule="auto" w:before="0" w:after="0"/>
-        <w:jc w:val="both"/>
-      </w:pPr>
-      <w:r>
-        <w:rPr>
-          <w:rFonts w:ascii="Georgia" w:hAnsi="Georgia" w:eastAsia="Georgia" w:cs="Georgia"/>
-          <w:b w:val="0"/>
-          <w:i w:val="0"/>
-          <w:sz w:val="22"/>
-          <w:szCs w:val="22"/>
-        </w:rPr>
-        <w:t xml:space="preserve">Hope captions oriented the reader toward a recovery or growth trajectory rather than toward an immediate directive. Table 4 groups the main resources observed under this orientation.</w:t>
-      </w:r>
-    </w:p>
-    <w:p>
-      <w:pPr>
-        <w:spacing w:line="480" w:lineRule="auto" w:before="240" w:after="0"/>
-        <w:ind w:firstLine="0"/>
-        <w:jc w:val="left"/>
-      </w:pPr>
-      <w:r>
-        <w:rPr>
-          <w:rFonts w:ascii="Georgia" w:hAnsi="Georgia" w:eastAsia="Georgia" w:cs="Georgia"/>
-          <w:b/>
-          <w:i w:val="0"/>
-          <w:sz w:val="22"/>
-          <w:szCs w:val="22"/>
-        </w:rPr>
-        <w:t xml:space="preserve">Table 4</w:t>
-      </w:r>
-    </w:p>
-    <w:p>
-      <w:pPr>
-        <w:spacing w:line="480" w:lineRule="auto" w:before="0" w:after="0"/>
-        <w:ind w:firstLine="0"/>
-        <w:jc w:val="left"/>
-      </w:pPr>
-      <w:r>
-        <w:rPr>
-          <w:rFonts w:ascii="Georgia" w:hAnsi="Georgia" w:eastAsia="Georgia" w:cs="Georgia"/>
-          <w:b w:val="0"/>
-          <w:i w:val="0"/>
-          <w:sz w:val="22"/>
-          <w:szCs w:val="22"/>
-        </w:rPr>
-        <w:t xml:space="preserve">Linguistic Resources for Hope Construction</w:t>
+        <w:jc w:val="both"/>
+      </w:pPr>
+      <w:r>
+        <w:rPr>
+          <w:rFonts w:ascii="Georgia" w:hAnsi="Georgia" w:eastAsia="Georgia" w:cs="Georgia"/>
+          <w:b w:val="0"/>
+          <w:i w:val="0"/>
+          <w:sz w:val="22"/>
+          <w:szCs w:val="22"/>
+        </w:rPr>
+        <w:t>Grammatically, hope captions relied less on bare imperatives and more on declarative reassurances and predictive clauses. Incremental progress lexis such as small steps and little victories scales recovery into units a reader can inhabit when a full turnaround feels unavailable. Future-oriented modality such as can and will projects possibility without stating certainty as fact. Life-worth declarations affirm value in contexts where that value is contested by crisis language. Temporal framing such as step by step or seasonal metaphors stretches the event line so that the present episode is not the whole narrative. Hope construction in these captions is therefore a package of time, modality, and evaluation rather than a single keyword of positivity.</w:t>
+      </w:r>
+    </w:p>
+    <w:p>
+      <w:pPr>
+        <w:spacing w:line="480" w:lineRule="auto" w:before="0" w:after="0"/>
+        <w:ind w:firstLine="720"/>
+        <w:jc w:val="both"/>
+      </w:pPr>
+      <w:r>
+        <w:rPr>
+          <w:rFonts w:ascii="Georgia" w:hAnsi="Georgia" w:eastAsia="Georgia" w:cs="Georgia"/>
+          <w:sz w:val="22"/>
+          <w:szCs w:val="22"/>
+        </w:rPr>
+        <w:t xml:space="preserve">That package matters for the study’s larger claim. Hope here is not the absence of struggle. Several hope captions named risk, exhaustion, or imperfect days before the projective clause arrived. The linguistic sequence often moves from problem to trajectory. The second move does not delete the first. It repositions it inside a longer time frame. Beelen and Karsay (2024) found that exposure to hopeful Instagram messages alone did not reliably raise hope in experimental conditions. The present analysis does not test effect. It shows how hope is built in the text when advocacy pages attempt that construction under platform constraints.</w:t>
       </w:r>
     </w:p>
     <w:tbl>
@@ -5226,18 +5256,18 @@
     <w:p>
       <w:pPr>
         <w:ind w:firstLine="720"/>
-        <w:spacing w:line="480" w:lineRule="auto" w:before="240" w:after="0"/>
-        <w:jc w:val="both"/>
-      </w:pPr>
-      <w:r>
-        <w:rPr>
-          <w:rFonts w:ascii="Georgia" w:hAnsi="Georgia" w:eastAsia="Georgia" w:cs="Georgia"/>
-          <w:b w:val="0"/>
-          <w:i w:val="0"/>
-          <w:sz w:val="22"/>
-          <w:szCs w:val="22"/>
-        </w:rPr>
-        <w:t xml:space="preserve">Grammatically, hope captions relied less on bare imperatives and more on declarative reassurances and predictive clauses. The reader was positioned as someone who can look forward. That orientation aligns with work that treats hopeful mental health content as a distinct communicative resource on Instagram, not merely as generic positivity (Beelen &amp; Karsay, 2024). It also answers the caution in PDA scholarship that positive discourse must be described in specific linguistic terms rather than assumed as a single mood (Macgilchrist, 2007; Lecompte-Van Poucke, 2022).</w:t>
+        <w:spacing w:line="480" w:lineRule="auto" w:before="0" w:after="0"/>
+        <w:jc w:val="both"/>
+      </w:pPr>
+      <w:r>
+        <w:rPr>
+          <w:rFonts w:ascii="Georgia" w:hAnsi="Georgia" w:eastAsia="Georgia" w:cs="Georgia"/>
+          <w:b w:val="0"/>
+          <w:i w:val="0"/>
+          <w:sz w:val="22"/>
+          <w:szCs w:val="22"/>
+        </w:rPr>
+        <w:t>A small number of captions were coded BOTH because hope and empowerment signals carried comparable weight. One paired an imperative to seek support with a predictive clause about recovery. Another authorized rest in the present while naming growth over time. In those texts neither orientation could be demoted without losing the caption’s main communicative load. Blended captions show that the two orientations are analytically distinct but not mutually exclusive in practice. Writers can instruct present action and project a recoverable future in the same short post. The coding scheme records that coexistence rather than forcing a false choice.</w:t>
       </w:r>
     </w:p>
     <w:p>
@@ -5339,7 +5369,7 @@
           <w:sz w:val="22"/>
           <w:szCs w:val="22"/>
         </w:rPr>
-        <w:t xml:space="preserve">Supportive lexicon was the more common response type among eligible comments. Personal narrative was less frequent but still clearly present. Table 5 sets the two types side by side.</w:t>
+        <w:t>Supportive lexicon was the more common response type among eligible comments. Personal narrative framing appeared less often but remained a clear secondary pattern. Table 5 summarizes the two types and their main linguistic markers. The preference for supportive lexicon is consistent with Chang (2009), who found emotional and esteem support central in online peer support interaction, and with Kim et al. (2023), who show that supporters often work to validate and encourage rather than only to inform. On Instagram, that preference is reinforced by the interface. Short replies, emoji-supported affirmation, and second-person address fit the feed’s pace, while extended first-person narrative requires more sustained attention from both writer and reader.</w:t>
       </w:r>
     </w:p>
     <w:p>
@@ -5631,18 +5661,18 @@
     <w:p>
       <w:pPr>
         <w:ind w:firstLine="720"/>
-        <w:spacing w:line="480" w:lineRule="auto" w:before="240" w:after="0"/>
-        <w:jc w:val="both"/>
-      </w:pPr>
-      <w:r>
-        <w:rPr>
-          <w:rFonts w:ascii="Georgia" w:hAnsi="Georgia" w:eastAsia="Georgia" w:cs="Georgia"/>
-          <w:b w:val="0"/>
-          <w:i w:val="0"/>
-          <w:sz w:val="22"/>
-          <w:szCs w:val="22"/>
-        </w:rPr>
-        <w:t xml:space="preserve">The preference for supportive lexicon is consistent with Chang (2009), who found emotional and esteem support highly active in online mental health peer spaces, and with later social media support work that treats validation and encouragement as default public replies (Myrick et al., 2015; Kim et al., 2023). Personal narrative remains important because it shows that these comment sections are not only cheer spaces. They also host lived-experience disclosure.</w:t>
+        <w:spacing w:line="480" w:lineRule="auto" w:before="0" w:after="0"/>
+        <w:jc w:val="both"/>
+      </w:pPr>
+      <w:r>
+        <w:rPr>
+          <w:rFonts w:ascii="Georgia" w:hAnsi="Georgia" w:eastAsia="Georgia" w:cs="Georgia"/>
+          <w:b w:val="0"/>
+          <w:i w:val="0"/>
+          <w:sz w:val="22"/>
+          <w:szCs w:val="22"/>
+        </w:rPr>
+        <w:t>Supportive comments also do different interpersonal work from narrative comments. Supportive lexicon tends to close the loop between caption and reader by confirming the caption’s stance. Personal narrative opens a parallel line of experience that may align with the caption or complicate it. Both types participate in the construction of positive mental health meaning, but they do so through different grammatical and lexical routes.</w:t>
       </w:r>
     </w:p>
     <w:p>
@@ -5676,7 +5706,7 @@
           <w:sz w:val="22"/>
           <w:szCs w:val="22"/>
         </w:rPr>
-        <w:t xml:space="preserve">Supportive comments often mirrored caption language. Under empowerment captions they restated agency, as in asking for help is courage and healing happens in connection. Under hope captions they amplified trajectory language, as in small steps everyday, source of hope, and growing through what we go through. That mirroring is a linguistic solidarity move. Commenters take up the caption’s preferred reader position and return it in shortened form (Martin, 2004). Short affective forms were especially common under crisis-oriented hope posts. Informational support was rare in the eligible set, which matches the study’s decision to keep primary comment coding on supportive lexicon and personal narrative.</w:t>
+        <w:t>Supportive comments often mirrored caption language at the level of lexis and stance. Under empowerment captions they restated agency and permission. Commenters wrote that it is okay to ask for help, that readers do not have to stay silent, or that taking a first step matters. Those replies recycle the caption’s permission statements and directives into second-person encouragement, so the thread becomes a public ratification of the authorized action. Under hope captions, supportive replies more often echoed trajectory and endurance language. Commenters affirmed that the reader can get through the moment, that small steps count, or that the life named in the caption is worth protecting. In both cases the comment stays close to the caption’s orientation. It does not typically introduce a competing frame. The linguistic work is alignment: shared modality, shared evaluation, and short clauses that keep the stance easy to scan in a fast-moving comment section.</w:t>
       </w:r>
     </w:p>
     <w:p>
@@ -5710,7 +5740,7 @@
           <w:sz w:val="22"/>
           <w:szCs w:val="22"/>
         </w:rPr>
-        <w:t xml:space="preserve">Personal narrative comments typically used first-person past or present forms such as I felt, I went through, and I have been having this feelings. Some named a diagnosis, a crisis event, or an ongoing struggle. A subset linked the story back to the caption theme, for example by describing a spouse’s schizophrenia under a World Schizophrenia Day post or by recounting a near-death experience under a suicide-prevention caption. Those links turn the comment into a second voice in the same discursive event.</w:t>
+        <w:t>Personal narrative comments typically used first-person past or present forms such as I felt, I went through, or I still struggle. They often reported a concrete episode of distress, help-seeking, or partial recovery, then linked that episode back to the caption’s theme. Grammatically, the narrative comment shifts the participant roles. The caption addresses a generalized you. The narrative reply reintroduces an I who claims lived authority. That shift is important for Positive Discourse Analysis. Solidarity is not only produced by cheering from outside the experience. It is also produced when someone places their own history beside the caption’s claim and makes the advocacy space hold more than one voice.</w:t>
       </w:r>
     </w:p>
     <w:p>
@@ -5727,7 +5757,7 @@
           <w:sz w:val="22"/>
           <w:szCs w:val="22"/>
         </w:rPr>
-        <w:t xml:space="preserve">A few narratives expressed unresolved distress rather than recovery. Those comments still count as personal narrative framing under Appendix B because the commenter shares lived experience. Network support in Chang’s (2009) original sense is realized here through first-person disclosure rather than through explicit group invitations. Related work on online social support notes that narrative posts do relational work by making private struggle publicly legible (Yip, 2024).</w:t>
+        <w:t>A few narratives expressed unresolved distress rather than recovery. Those comments still count as personal narrative framing because their primary work is experiential disclosure, not evaluation of the page. They matter for the larger argument of this chapter. Hope and empowerment in the caption do not erase struggle in the thread. Instead, the public exchange can hold recovery lexis and unfinished difficulty in the same comment section. That coexistence is part of how positive mental health meanings are constructed in this corpus: not as the deletion of pain, but as the pairing of pain with agency, trajectory, or recognition from peers.</w:t>
       </w:r>
     </w:p>
     <w:p>
@@ -5795,7 +5825,7 @@
           <w:sz w:val="22"/>
           <w:szCs w:val="22"/>
         </w:rPr>
-        <w:t xml:space="preserve">Supportive lexicon appeared under all caption orientations. It was especially common under empowerment captions. Personal narrative appeared under both hope and empowerment captions but was relatively more noticeable under hope captions in this corpus. Table 6 presents the cross-level pattern in qualitative terms.</w:t>
+        <w:t>Supportive lexicon appeared under all caption orientations. It was especially common under empowerment captions, where directive and permission language in the post invited confirmation of the reader’s capacity to act. Hope captions still drew supportive replies, but they also attracted a higher share of personal narrative relative to empowerment posts. Trajectory talk appears to open space for experience-sharing as well as for short encouragement. Table 6 summarizes the cross-level pattern. These patterns do not show that caption type causes comment type. Comments are algorithmically surfaced samples, and the corpus is small. What the pattern does show is a recurring discursive fit: present-tense agency in the caption is often met with ratification, while future-oriented recovery talk is more often met with a mix of ratification and first-person story.</w:t>
       </w:r>
     </w:p>
     <w:p>
@@ -6211,7 +6241,7 @@
           <w:sz w:val="22"/>
           <w:szCs w:val="22"/>
         </w:rPr>
-        <w:t xml:space="preserve">Positive Discourse Analysis treats constructive discourse as something to be described in linguistic detail, not as an automatic social good (Martin, 2004; Macgilchrist, 2007). In this corpus, positive mental health meanings are co-constructed mainly through two complementary moves. Captions build a preferred reader position, either as someone who can act now (empowerment) or as someone who can look forward (hope). Comments largely ratify that position through supportive lexicon, and a smaller set of comments deepen it through personal narrative. The result is a public exchange in which agency and encouragement are the most visible shared resources, while lived experience remains available as a secondary but important strand.</w:t>
+        <w:t>Positive Discourse Analysis treats constructive discourse as something to be described in linguistic detail, not only praised for good intentions (Martin, 2004; Macgilchrist, 2007). In this corpus the constructive work is visible in specific resources. Empowerment captions use imperative mood and permission statements to reposition the reader as an agent. Hope captions use modalized predictions and incremental progress lexis to keep a future open. Supportive comments reproduce those evaluations in second person. Narrative comments expand the participant set by adding an I who has lived a version of the problem. Together those choices build a public space in which help-seeking, endurance, and partial recovery can be named without being reduced to clinical description alone.</w:t>
       </w:r>
     </w:p>
     <w:p>
@@ -6228,7 +6258,7 @@
           <w:sz w:val="22"/>
           <w:szCs w:val="22"/>
         </w:rPr>
-        <w:t xml:space="preserve">Bartlett (2012) warns that early PDA risked celebrating preferred texts without enough attention to context and hybridity. The present findings take that warning seriously. Empowerment and hope in this corpus appear in campaign posts, crisis posts, myth-busting posts, and short affective posts. Comments mix organizational praise, peer empathy, and raw disclosure. The positive orientation is real, but it is assembled from mixed materials under platform constraints of length, visibility, and ranking.</w:t>
+        <w:t>Bartlett (2012) warns that early Positive Discourse Analysis risked celebrating preferred texts without enough attention to hybridity, power, and what a text leaves out. That warning applies here. The corpus is drawn from high-engagement advocacy pages. The comments analyzed are those the platform surfaces. Lower-visibility posts, deleted comments, and non-English threads are outside the sample. The positive orientation described in this chapter is therefore an orientation in a particular slice of public Instagram discourse, assembled under ranking and visibility constraints, not a claim about all mental health talk online.</w:t>
       </w:r>
     </w:p>
     <w:p>
@@ -6262,7 +6292,7 @@
           <w:sz w:val="22"/>
           <w:szCs w:val="22"/>
         </w:rPr>
-        <w:t xml:space="preserve">The pattern also speaks to critiques of toxic positivity. Lecompte-Van Poucke (2022) shows how forced positivity on social media can silence difficulty. Wong et al. (2025) examine public perceptions of good vibes only discourse and its limits. In the present corpus, hope and empowerment captions did not only suppress struggle. Several hope captions named crisis, suicide risk, or imperfect days before offering trajectory language. Several empowerment captions authorized not being strong and asked readers to seek help. Personal narrative comments likewise included unresolved distress.</w:t>
+        <w:t>The pattern also speaks to critiques of toxic positivity. Lecompte-Van Poucke (2022) shows how forced positivity on social media can silence difficulty. Wong et al. (2025) examine public perceptions of good-vibes-only discourse and its limits. In the present corpus, hope and empowerment captions did not only suppress struggle. Several hope captions named crisis, suicide risk, or imperfect days before offering trajectory language. Several empowerment captions authorized not being strong and asked readers to seek help. Personal narrative comments likewise included unresolved distress. The positive orientation of the corpus is therefore not uniform cheerfulness. It is a selective construction that pairs difficulty with agency or with a recoverable future. That pairing is closer to PDA’s interest in solidarity and change than to uncritical positivity (Bartlett, 2012; Martin, 2004). At the same time, the study describes discursive construction, not psychological effect (Naslund et al., 2016).</w:t>
       </w:r>
     </w:p>
     <w:p>
@@ -6279,7 +6309,7 @@
           <w:sz w:val="22"/>
           <w:szCs w:val="22"/>
         </w:rPr>
-        <w:t xml:space="preserve">The positive orientation of the corpus is therefore not uniform cheerfulness. It is a selective construction that pairs difficulty with agency or with a recoverable future. That pairing is closer to PDA’s interest in solidarity and change than to uncritical positivity (Bartlett, 2012; Martin, 2004). At the same time, the study describes discursive construction, not psychological effect (Naslund et al., 2016).</w:t>
+        <w:t>Linguistically, that selectivity shows up as contrast inside the same short text. A caption may open with a problem clause and close with a modalized future or an imperative. A comment may affirm the caption and still report ongoing struggle in the next sentence. The grammar of the exchange allows both moves. Positive meaning is built by arranging those moves, not by deleting the negative material.</w:t>
       </w:r>
     </w:p>
     <w:p>
@@ -6333,6 +6363,21 @@
     </w:p>
     <w:p>
       <w:pPr>
+        <w:spacing w:line="480" w:lineRule="auto" w:before="0" w:after="0"/>
+        <w:ind w:firstLine="720"/>
+        <w:jc w:val="both"/>
+      </w:pPr>
+      <w:r>
+        <w:rPr>
+          <w:rFonts w:ascii="Georgia" w:hAnsi="Georgia" w:eastAsia="Georgia" w:cs="Georgia"/>
+          <w:sz w:val="22"/>
+          <w:szCs w:val="22"/>
+        </w:rPr>
+        <w:t xml:space="preserve">This study examined lexical and grammatical strategies that construct hope and empowerment in Instagram mental health advocacy captions and the linguistic features of public comments written under those captions. A corpus of thirty English-language captions from public advocacy pages, with two eligible comments per post, was coded using Positive Discourse Analysis for caption orientations and an adapted Chang (2009) typology for comment responses. The analysis remained descriptive and discourse-analytic. It tracked modality, person reference, mood, recovery and agency lexis, temporal framing, and discourse function rather than psychological outcome or marketing performance.</w:t>
+      </w:r>
+    </w:p>
+    <w:p>
+      <w:pPr>
         <w:spacing w:line="480" w:lineRule="auto" w:before="240" w:after="0"/>
         <w:jc w:val="left"/>
       </w:pPr>
@@ -6358,7 +6403,52 @@
           <w:sz w:val="22"/>
           <w:szCs w:val="22"/>
         </w:rPr>
-        <w:t xml:space="preserve">The study described how Instagram mental health advocacy captions construct hope and empowerment through concrete lexical and grammatical choices, and how public comments respond in supportive and narrative forms. Empowerment-oriented captions rely on imperatives, permission statements, collective pronouns, and myth-busting frames that authorize present action. Hope-oriented captions rely on incremental progress lexis, future-oriented modality, life-worth declarations, and temporal framing that project a recoverable trajectory. Comments under these posts are dominated by supportive lexicon that ratifies caption stance. Personal narrative framing appears less often but brings first-person experience into the public thread. Read together, the caption-comment exchange builds positive mental health meanings as a joint discursive practice under the constraints of short-form Instagram text. The construction pairs difficulty with agency or with a recoverable future rather than with uniform cheerfulness. The study remains descriptive and linguistic. It does not measure psychological effect or prescribe caption design.</w:t>
+        <w:t xml:space="preserve">Empowerment was the more frequent dominant caption orientation in the corpus. Those captions constructed the reader as able to act in the present through imperatives and directives, permission statements that authorized vulnerability and help-seeking, collective pronouns that shared agency with an advocacy community, and myth-busting frames that cleared beliefs blocking support-seeking. The grammar of empowerment in this sample is a pattern of mood, person, and evaluation packed into the short caption space Instagram makes visible before the more cut-off.</w:t>
+      </w:r>
+    </w:p>
+    <w:p>
+      <w:pPr>
+        <w:spacing w:line="480" w:lineRule="auto" w:before="0" w:after="0"/>
+        <w:ind w:firstLine="720"/>
+        <w:jc w:val="both"/>
+      </w:pPr>
+      <w:r>
+        <w:rPr>
+          <w:rFonts w:ascii="Georgia" w:hAnsi="Georgia" w:eastAsia="Georgia" w:cs="Georgia"/>
+          <w:sz w:val="22"/>
+          <w:szCs w:val="22"/>
+        </w:rPr>
+        <w:t xml:space="preserve">Hope was less frequent as a dominant orientation but remained distinct. Hope captions oriented the reader toward a recovery or growth trajectory through incremental progress lexis, future-oriented modality and prediction, life-worth declarations, and temporal framing that stretched the event line beyond the crisis moment. They relied less on bare imperatives and more on declarative reassurance and projective clauses. Several hope captions named struggle before the projective move, so hope in the text was not the deletion of difficulty but its placement inside a longer time frame.</w:t>
+      </w:r>
+    </w:p>
+    <w:p>
+      <w:pPr>
+        <w:spacing w:line="480" w:lineRule="auto" w:before="0" w:after="0"/>
+        <w:ind w:firstLine="720"/>
+        <w:jc w:val="both"/>
+      </w:pPr>
+      <w:r>
+        <w:rPr>
+          <w:rFonts w:ascii="Georgia" w:hAnsi="Georgia" w:eastAsia="Georgia" w:cs="Georgia"/>
+          <w:sz w:val="22"/>
+          <w:szCs w:val="22"/>
+        </w:rPr>
+        <w:t xml:space="preserve">Public comments were dominated by supportive lexicon. Commenters recycled caption stance through empathy, validation, encouragement, and second-person affirmation. Personal narrative framing appeared less often but brought first-person experience into the thread, including episodes of unresolved distress. Supportive replies were common under all caption orientations. Hope captions drew a relatively higher share of narrative uptake. Read together, the caption-comment exchange builds positive mental health meanings as a joint discursive practice. Present-tense agency is often ratified. Trajectory talk opens space for both reassurance and lived story. The construction pairs difficulty with agency or with a recoverable future rather than with uniform cheerfulness.</w:t>
+      </w:r>
+    </w:p>
+    <w:p>
+      <w:pPr>
+        <w:spacing w:line="480" w:lineRule="auto" w:before="0" w:after="0"/>
+        <w:ind w:firstLine="720"/>
+        <w:jc w:val="both"/>
+      </w:pPr>
+      <w:r>
+        <w:rPr>
+          <w:rFonts w:ascii="Georgia" w:hAnsi="Georgia" w:eastAsia="Georgia" w:cs="Georgia"/>
+          <w:sz w:val="22"/>
+          <w:szCs w:val="22"/>
+        </w:rPr>
+        <w:t xml:space="preserve">Overall, the findings indicate that positive mental health meaning in these Instagram advocacy spaces is assembled from concrete lexical and grammatical choices on both sides of the exchange. The study describes that assembly. It does not claim causal effects on readers’ states of mind, and it does not generalize beyond the high-engagement English-language sample analyzed here.</w:t>
       </w:r>
     </w:p>
     <w:p>
@@ -6385,18 +6475,10 @@
       <w:r>
         <w:rPr>
           <w:rFonts w:ascii="Georgia" w:hAnsi="Georgia" w:eastAsia="Georgia" w:cs="Georgia"/>
-          <w:b/>
-          <w:sz w:val="22"/>
-          <w:szCs w:val="22"/>
-        </w:rPr>
-        <w:t xml:space="preserve">For discourse researchers. </w:t>
-      </w:r>
-      <w:r>
-        <w:rPr>
-          <w:b w:val="0"/>
-          <w:sz w:val="22"/>
-        </w:rPr>
-        <w:t>Future work may extend the coding protocol to larger corpora, other languages, or multimodal analysis that includes image and layout alongside caption grammar. Comparative work across platforms would show whether the empowerment-leaning caption style and supportive-leaning comment style observed here are Instagram-specific or more general to public mental health advocacy online.</w:t>
+          <w:sz w:val="22"/>
+          <w:szCs w:val="22"/>
+        </w:rPr>
+        <w:t xml:space="preserve">Based on the findings of the study, discourse researchers may extend the two-stage Identify-and-Sort caption protocol and the adapted comment typology to larger corpora, other languages, and multimodal designs that include image and layout beside caption grammar. Comparative work across platforms would show whether the empowerment-leaning caption style and supportive-leaning comment style observed here are specific to Instagram advocacy pages or more general to public mental health discourse online.</w:t>
       </w:r>
     </w:p>
     <w:p>
@@ -6408,18 +6490,10 @@
       <w:r>
         <w:rPr>
           <w:rFonts w:ascii="Georgia" w:hAnsi="Georgia" w:eastAsia="Georgia" w:cs="Georgia"/>
-          <w:b/>
-          <w:sz w:val="22"/>
-          <w:szCs w:val="22"/>
-        </w:rPr>
-        <w:t xml:space="preserve">For health communication and advocacy practice. </w:t>
-      </w:r>
-      <w:r>
-        <w:rPr>
-          <w:b w:val="0"/>
-          <w:sz w:val="22"/>
-        </w:rPr>
-        <w:t>Writers and editors of public mental health content may treat the marker inventories in Appendices A and B as a descriptive map of resources already in use, not as a template. Attention to permission statements, collective pronouns, and incremental progress lexis may help keep advocacy language from collapsing into empty positivity, provided the surrounding context still names difficulty where it is present.</w:t>
+          <w:sz w:val="22"/>
+          <w:szCs w:val="22"/>
+        </w:rPr>
+        <w:t xml:space="preserve">Writers and editors of public mental health content may treat the marker inventories in Appendices A and B as a descriptive map of resources already in use rather than as a template for production. Attention to permission statements, collective pronouns, and incremental progress lexis may help keep advocacy language from collapsing into empty positivity, provided the surrounding text still names difficulty where difficulty is present.</w:t>
       </w:r>
     </w:p>
     <w:p>
@@ -6431,18 +6505,10 @@
       <w:r>
         <w:rPr>
           <w:rFonts w:ascii="Georgia" w:hAnsi="Georgia" w:eastAsia="Georgia" w:cs="Georgia"/>
-          <w:b/>
-          <w:sz w:val="22"/>
-          <w:szCs w:val="22"/>
-        </w:rPr>
-        <w:t xml:space="preserve">For the BAELS program and undergraduate researchers. </w:t>
-      </w:r>
-      <w:r>
-        <w:rPr>
-          <w:b w:val="0"/>
-          <w:sz w:val="22"/>
-        </w:rPr>
-        <w:t>The two-stage Identify-and-Sort procedure and the adapted comment typology offer a scope-appropriate model for small-corpus digital discourse studies. Replication with different account types, longer comments, or Tagalog and Philippine English captions would test the portability of the categories.</w:t>
+          <w:sz w:val="22"/>
+          <w:szCs w:val="22"/>
+        </w:rPr>
+        <w:t xml:space="preserve">Undergraduate researchers in English language studies may use the coding procedure as a scope-appropriate model for small-corpus digital discourse projects. Replication with different account types, longer comment threads, or Tagalog and Philippine English captions would test how portable the hope and empowerment categories remain outside the present sample.</w:t>
       </w:r>
     </w:p>
     <w:p>
@@ -6454,18 +6520,10 @@
       <w:r>
         <w:rPr>
           <w:rFonts w:ascii="Georgia" w:hAnsi="Georgia" w:eastAsia="Georgia" w:cs="Georgia"/>
-          <w:b/>
-          <w:sz w:val="22"/>
-          <w:szCs w:val="22"/>
-        </w:rPr>
-        <w:t xml:space="preserve">For platform and methods work. </w:t>
-      </w:r>
-      <w:r>
-        <w:rPr>
-          <w:b w:val="0"/>
-          <w:sz w:val="22"/>
-        </w:rPr>
-        <w:t>Sampling that relies on high engagement and algorithmically surfaced comments should continue to be reported as a limit. Studies that can access chronological comment streams or lower-visibility posts would complement the high-visibility patterns described here.</w:t>
+          <w:sz w:val="22"/>
+          <w:szCs w:val="22"/>
+        </w:rPr>
+        <w:t xml:space="preserve">Future studies may also address sampling limits that this project could not remove. Designs that reach chronological comment streams or lower-visibility posts would complement the high-engagement patterns described here and would show whether the supportive-leaning uptake holds when ranking pressure is reduced.</w:t>
       </w:r>
     </w:p>
     <w:p>

</xml_diff>

<commit_message>
Attach table captions and titles tightly to table bodies; fix Table 4 order
</commit_message>
<xml_diff>
--- a/thesis/Thesis_Instagram_MH_v15.docx
+++ b/thesis/Thesis_Instagram_MH_v15.docx
@@ -2395,20 +2395,6 @@
     <w:p>
       <w:pPr>
         <w:spacing w:after="0" w:before="240" w:line="480" w:lineRule="auto"/>
-        <w:ind w:left="0"/>
-        <w:jc w:val="both"/>
-        <w:rPr/>
-      </w:pPr>
-      <w:r>
-        <w:rPr>
-          <w:rFonts w:ascii="Georgia" w:hAnsi="Georgia" w:eastAsia="Georgia" w:cs="Georgia"/>
-          <w:rtl w:val="0"/>
-        </w:rPr>
-      </w:r>
-    </w:p>
-    <w:p>
-      <w:pPr>
-        <w:spacing w:after="0" w:before="0" w:line="480" w:lineRule="auto"/>
         <w:ind w:left="0" w:firstLine="720"/>
         <w:jc w:val="both"/>
         <w:rPr/>
@@ -4729,7 +4715,7 @@
     <w:p>
       <w:pPr>
         <w:ind w:firstLine="720"/>
-        <w:spacing w:line="480" w:lineRule="auto" w:before="0" w:after="0"/>
+        <w:spacing w:line="480" w:lineRule="auto" w:before="240" w:after="0"/>
         <w:jc w:val="both"/>
       </w:pPr>
       <w:r>
@@ -4812,33 +4798,15 @@
     <w:p>
       <w:pPr>
         <w:spacing w:line="480" w:lineRule="auto" w:before="0" w:after="0"/>
-        <w:ind w:firstLine="720"/>
-        <w:jc w:val="both"/>
-      </w:pPr>
-      <w:r>
-        <w:rPr>
-          <w:rFonts w:ascii="Georgia" w:hAnsi="Georgia" w:eastAsia="Georgia" w:cs="Georgia"/>
-          <w:b w:val="0"/>
-          <w:i w:val="0"/>
-          <w:sz w:val="22"/>
-          <w:szCs w:val="22"/>
-        </w:rPr>
-        <w:t>Grammatically, hope captions relied less on bare imperatives and more on declarative reassurances and predictive clauses. Incremental progress lexis such as small steps and little victories scales recovery into units a reader can inhabit when a full turnaround feels unavailable. Future-oriented modality such as can and will projects possibility without stating certainty as fact. Life-worth declarations affirm value in contexts where that value is contested by crisis language. Temporal framing such as step by step or seasonal metaphors stretches the event line so that the present episode is not the whole narrative. Hope construction in these captions is therefore a package of time, modality, and evaluation rather than a single keyword of positivity.</w:t>
-      </w:r>
-    </w:p>
-    <w:p>
-      <w:pPr>
-        <w:spacing w:line="480" w:lineRule="auto" w:before="0" w:after="0"/>
-        <w:ind w:firstLine="720"/>
-        <w:jc w:val="both"/>
-      </w:pPr>
-      <w:r>
-        <w:rPr>
-          <w:rFonts w:ascii="Georgia" w:hAnsi="Georgia" w:eastAsia="Georgia" w:cs="Georgia"/>
-          <w:sz w:val="22"/>
-          <w:szCs w:val="22"/>
-        </w:rPr>
-        <w:t xml:space="preserve">That package matters for the study’s larger claim. Hope here is not the absence of struggle. Several hope captions named risk, exhaustion, or imperfect days before the projective clause arrived. The linguistic sequence often moves from problem to trajectory. The second move does not delete the first. It repositions it inside a longer time frame. Beelen and Karsay (2024) found that exposure to hopeful Instagram messages alone did not reliably raise hope in experimental conditions. The present analysis does not test effect. It shows how hope is built in the text when advocacy pages attempt that construction under platform constraints.</w:t>
+        <w:jc w:val="left"/>
+      </w:pPr>
+      <w:r>
+        <w:rPr>
+          <w:rFonts w:ascii="Georgia" w:hAnsi="Georgia" w:eastAsia="Georgia" w:cs="Georgia"/>
+          <w:sz w:val="22"/>
+          <w:szCs w:val="22"/>
+        </w:rPr>
+        <w:t>Linguistic Resources for Hope Construction</w:t>
       </w:r>
     </w:p>
     <w:tbl>
@@ -5255,8 +5223,40 @@
     </w:tbl>
     <w:p>
       <w:pPr>
+        <w:spacing w:line="480" w:lineRule="auto" w:before="240" w:after="0"/>
         <w:ind w:firstLine="720"/>
-        <w:spacing w:line="480" w:lineRule="auto" w:before="0" w:after="0"/>
+        <w:jc w:val="both"/>
+      </w:pPr>
+      <w:r>
+        <w:rPr>
+          <w:rFonts w:ascii="Georgia" w:hAnsi="Georgia" w:eastAsia="Georgia" w:cs="Georgia"/>
+          <w:b w:val="0"/>
+          <w:i w:val="0"/>
+          <w:sz w:val="22"/>
+          <w:szCs w:val="22"/>
+        </w:rPr>
+        <w:t>Grammatically, hope captions relied less on bare imperatives and more on declarative reassurances and predictive clauses. Incremental progress lexis such as small steps and little victories scales recovery into units a reader can inhabit when a full turnaround feels unavailable. Future-oriented modality such as can and will projects possibility without stating certainty as fact. Life-worth declarations affirm value in contexts where that value is contested by crisis language. Temporal framing such as step by step or seasonal metaphors stretches the event line so that the present episode is not the whole narrative. Hope construction in these captions is therefore a package of time, modality, and evaluation rather than a single keyword of positivity.</w:t>
+      </w:r>
+    </w:p>
+    <w:p>
+      <w:pPr>
+        <w:spacing w:line="480" w:lineRule="auto" w:before="0" w:after="0"/>
+        <w:ind w:firstLine="720"/>
+        <w:jc w:val="both"/>
+      </w:pPr>
+      <w:r>
+        <w:rPr>
+          <w:rFonts w:ascii="Georgia" w:hAnsi="Georgia" w:eastAsia="Georgia" w:cs="Georgia"/>
+          <w:sz w:val="22"/>
+          <w:szCs w:val="22"/>
+        </w:rPr>
+        <w:t xml:space="preserve">That package matters for the study’s larger claim. Hope here is not the absence of struggle. Several hope captions named risk, exhaustion, or imperfect days before the projective clause arrived. The linguistic sequence often moves from problem to trajectory. The second move does not delete the first. It repositions it inside a longer time frame. Beelen and Karsay (2024) found that exposure to hopeful Instagram messages alone did not reliably raise hope in experimental conditions. The present analysis does not test effect. It shows how hope is built in the text when advocacy pages attempt that construction under platform constraints.</w:t>
+      </w:r>
+    </w:p>
+    <w:p>
+      <w:pPr>
+        <w:ind w:firstLine="720"/>
+        <w:spacing w:line="480" w:lineRule="auto" w:before="240" w:after="0"/>
         <w:jc w:val="both"/>
       </w:pPr>
       <w:r>
@@ -5661,7 +5661,7 @@
     <w:p>
       <w:pPr>
         <w:ind w:firstLine="720"/>
-        <w:spacing w:line="480" w:lineRule="auto" w:before="0" w:after="0"/>
+        <w:spacing w:line="480" w:lineRule="auto" w:before="240" w:after="0"/>
         <w:jc w:val="both"/>
       </w:pPr>
       <w:r>
@@ -7831,22 +7831,6 @@
     <w:p>
       <w:pPr>
         <w:spacing w:line="480" w:lineRule="auto" w:before="240" w:after="0"/>
-        <w:ind w:left="0"/>
-        <w:rPr>
-          <w:sz w:val="20"/>
-          <w:szCs w:val="20"/>
-        </w:rPr>
-      </w:pPr>
-      <w:r>
-        <w:rPr>
-          <w:rFonts w:ascii="Georgia" w:hAnsi="Georgia" w:eastAsia="Georgia" w:cs="Georgia"/>
-          <w:rtl w:val="0"/>
-        </w:rPr>
-      </w:r>
-    </w:p>
-    <w:p>
-      <w:pPr>
-        <w:spacing w:line="480" w:lineRule="auto" w:before="0" w:after="0"/>
         <w:ind w:left="0" w:firstLine="720"/>
         <w:jc w:val="both"/>
         <w:rPr/>
@@ -8389,19 +8373,6 @@
     <w:p>
       <w:pPr>
         <w:spacing w:line="480" w:lineRule="auto" w:before="240" w:after="0"/>
-        <w:ind w:left="0"/>
-        <w:rPr/>
-      </w:pPr>
-      <w:r>
-        <w:rPr>
-          <w:rFonts w:ascii="Georgia" w:hAnsi="Georgia" w:eastAsia="Georgia" w:cs="Georgia"/>
-          <w:rtl w:val="0"/>
-        </w:rPr>
-      </w:r>
-    </w:p>
-    <w:p>
-      <w:pPr>
-        <w:spacing w:line="480" w:lineRule="auto" w:before="0" w:after="0"/>
         <w:ind w:left="0" w:firstLine="0"/>
         <w:jc w:val="both"/>
         <w:rPr/>

</xml_diff>

<commit_message>
Full format pass: center major headers per companion; uniform body/tables
</commit_message>
<xml_diff>
--- a/thesis/Thesis_Instagram_MH_v15.docx
+++ b/thesis/Thesis_Instagram_MH_v15.docx
@@ -424,7 +424,7 @@
       <w:pPr>
         <w:spacing w:after="720" w:before="720" w:line="480" w:lineRule="auto"/>
         <w:ind w:left="0" w:firstLine="0"/>
-        <w:jc w:val="left"/>
+        <w:jc w:val="center"/>
         <w:rPr/>
         <w:pageBreakBefore/>
       </w:pPr>
@@ -3196,7 +3196,7 @@
       <w:r>
         <w:rPr>
           <w:rFonts w:ascii="Georgia" w:hAnsi="Georgia" w:eastAsia="Georgia" w:cs="Georgia"/>
-          <w:b/>
+          <w:b w:val="0"/>
           <w:i w:val="0"/>
           <w:sz w:val="22"/>
         </w:rPr>
@@ -3309,7 +3309,7 @@
       <w:pPr>
         <w:spacing w:after="720" w:before="720" w:line="480" w:lineRule="auto"/>
         <w:ind w:left="0" w:firstLine="0"/>
-        <w:jc w:val="left"/>
+        <w:jc w:val="center"/>
         <w:rPr/>
         <w:pageBreakBefore/>
       </w:pPr>
@@ -3605,19 +3605,20 @@
       <w:r>
         <w:rPr>
           <w:rFonts w:ascii="Georgia" w:hAnsi="Georgia" w:eastAsia="Georgia" w:cs="Georgia"/>
-          <w:b w:val="0"/>
-          <w:i w:val="0"/>
-          <w:sz w:val="22"/>
-        </w:rPr>
-        <w:t>4. Comment Extraction and Coding. For each retained post, comments written directly under the caption were screened for eligibility. A comment was eligible only if it is written in English, contains enough continuous text for linguistic analysis (at least ten words or one full clause), and is not limited to pure emoji, single-word reactions, tags, or links. Replies nested under other comments were excluded. From the eligible comments, two were selected. When both kinds of response appear, one that offers encouragement, validation, or empathy without sharing a personal story and one that shares a first-person experience related to the caption are taken. When only one kind appears, the two clearest eligible comments of that kind are taken. When fewer than two eligible comments exist, the post is excluded from the final corpus or recorded as a partial case under a rule fixed before coding begins. Total visible comment count is logged per post. Each selected comment is then coded as SUPPORTIVE LEXICON or PERSONAL NARRATIVE by dominant communicative purpose using Appendix B. Unclassifiable rates are reported. If they exceed many of the sample, coding markers are refined with adviser consultation. Items that still cannot be assigned a dominant function are placed in a third descriptive category (blended/indeterminate) and reported separately.</w:t>
-      </w:r>
-      <w:r>
-        <w:rPr>
-          <w:rFonts w:ascii="Georgia" w:hAnsi="Georgia" w:eastAsia="Georgia" w:cs="Georgia"/>
-          <w:b w:val="0"/>
-          <w:i w:val="0"/>
-          <w:sz w:val="22"/>
-        </w:rPr>
+          <w:b/>
+          <w:i w:val="0"/>
+          <w:sz w:val="22"/>
+        </w:rPr>
+        <w:t xml:space="preserve">4. Comment Extraction and Coding. </w:t>
+      </w:r>
+      <w:r>
+        <w:rPr>
+          <w:rFonts w:ascii="Georgia" w:hAnsi="Georgia" w:eastAsia="Georgia" w:cs="Georgia"/>
+          <w:b w:val="0"/>
+          <w:i w:val="0"/>
+          <w:sz w:val="22"/>
+        </w:rPr>
+        <w:t>For each retained post, comments written directly under the caption were screened for eligibility. A comment was eligible only if it is written in English, contains enough continuous text for linguistic analysis (at least ten words or one full clause), and is not limited to pure emoji, single-word reactions, tags, or links. Replies nested under other comments were excluded. From the eligible comments, two were selected. When both kinds of response appear, one that offers encouragement, validation, or empathy without sharing a personal story and one that shares a first-person experience related to the caption are taken. When only one kind appears, the two clearest eligible comments of that kind are taken. When fewer than two eligible comments exist, the post is excluded from the final corpus or recorded as a partial case under a rule fixed before coding begins. Total visible comment count is logged per post. Each selected comment is then coded as SUPPORTIVE LEXICON or PERSONAL NARRATIVE by dominant communicative purpose using Appendix B. Unclassifiable rates are reported. If they exceed many of the sample, coding markers are refined with adviser consultation. Items that still cannot be assigned a dominant function are placed in a third descriptive category (blended/indeterminate) and reported separately.</w:t>
       </w:r>
     </w:p>
     <w:p>
@@ -3751,7 +3752,7 @@
       <w:pPr>
         <w:spacing w:line="480" w:lineRule="auto" w:before="720" w:after="720"/>
         <w:ind w:firstLine="0"/>
-        <w:jc w:val="left"/>
+        <w:jc w:val="center"/>
       </w:pPr>
       <w:r>
         <w:rPr>
@@ -3766,7 +3767,7 @@
     </w:p>
     <w:p>
       <w:pPr>
-        <w:ind w:firstLine="720"/>
+        <w:ind w:firstLine="720" w:left="0"/>
         <w:spacing w:line="480" w:lineRule="auto" w:before="0" w:after="0"/>
         <w:jc w:val="both"/>
       </w:pPr>
@@ -3800,7 +3801,7 @@
     </w:p>
     <w:p>
       <w:pPr>
-        <w:ind w:firstLine="720"/>
+        <w:ind w:firstLine="720" w:left="0"/>
         <w:spacing w:line="480" w:lineRule="auto" w:before="0" w:after="0"/>
         <w:jc w:val="both"/>
       </w:pPr>
@@ -3834,7 +3835,7 @@
     </w:p>
     <w:p>
       <w:pPr>
-        <w:ind w:firstLine="720"/>
+        <w:ind w:firstLine="720" w:left="0"/>
         <w:spacing w:line="480" w:lineRule="auto" w:before="0" w:after="0"/>
         <w:jc w:val="both"/>
       </w:pPr>
@@ -4217,7 +4218,7 @@
     </w:tbl>
     <w:p>
       <w:pPr>
-        <w:ind w:firstLine="720"/>
+        <w:ind w:firstLine="720" w:left="0"/>
         <w:spacing w:line="480" w:lineRule="auto" w:before="240" w:after="0"/>
         <w:jc w:val="both"/>
       </w:pPr>
@@ -4251,7 +4252,7 @@
     </w:p>
     <w:p>
       <w:pPr>
-        <w:ind w:firstLine="720"/>
+        <w:ind w:firstLine="720" w:left="0"/>
         <w:spacing w:line="480" w:lineRule="auto" w:before="0" w:after="0"/>
         <w:jc w:val="both"/>
       </w:pPr>
@@ -4714,7 +4715,7 @@
     </w:tbl>
     <w:p>
       <w:pPr>
-        <w:ind w:firstLine="720"/>
+        <w:ind w:firstLine="720" w:left="0"/>
         <w:spacing w:line="480" w:lineRule="auto" w:before="240" w:after="0"/>
         <w:jc w:val="both"/>
       </w:pPr>
@@ -4732,12 +4733,14 @@
     <w:p>
       <w:pPr>
         <w:spacing w:line="480" w:lineRule="auto" w:before="0" w:after="0"/>
-        <w:ind w:firstLine="720"/>
-        <w:jc w:val="both"/>
-      </w:pPr>
-      <w:r>
-        <w:rPr>
-          <w:rFonts w:ascii="Georgia" w:hAnsi="Georgia" w:eastAsia="Georgia" w:cs="Georgia"/>
+        <w:ind w:firstLine="720" w:left="0"/>
+        <w:jc w:val="both"/>
+      </w:pPr>
+      <w:r>
+        <w:rPr>
+          <w:rFonts w:ascii="Georgia" w:hAnsi="Georgia" w:eastAsia="Georgia" w:cs="Georgia"/>
+          <w:b w:val="0"/>
+          <w:i w:val="0"/>
           <w:sz w:val="22"/>
           <w:szCs w:val="22"/>
         </w:rPr>
@@ -4747,7 +4750,7 @@
     <w:p>
       <w:pPr>
         <w:spacing w:line="480" w:lineRule="auto" w:before="0" w:after="0"/>
-        <w:ind w:firstLine="720"/>
+        <w:ind w:firstLine="720" w:left="0"/>
         <w:jc w:val="both"/>
       </w:pPr>
       <w:r>
@@ -4763,7 +4766,7 @@
     </w:p>
     <w:p>
       <w:pPr>
-        <w:ind w:firstLine="720"/>
+        <w:ind w:firstLine="720" w:left="0"/>
         <w:spacing w:line="480" w:lineRule="auto" w:before="0" w:after="0"/>
         <w:jc w:val="both"/>
       </w:pPr>
@@ -4798,11 +4801,14 @@
     <w:p>
       <w:pPr>
         <w:spacing w:line="480" w:lineRule="auto" w:before="0" w:after="0"/>
+        <w:ind w:firstLine="0"/>
         <w:jc w:val="left"/>
       </w:pPr>
       <w:r>
         <w:rPr>
           <w:rFonts w:ascii="Georgia" w:hAnsi="Georgia" w:eastAsia="Georgia" w:cs="Georgia"/>
+          <w:b w:val="0"/>
+          <w:i w:val="0"/>
           <w:sz w:val="22"/>
           <w:szCs w:val="22"/>
         </w:rPr>
@@ -5224,7 +5230,7 @@
     <w:p>
       <w:pPr>
         <w:spacing w:line="480" w:lineRule="auto" w:before="240" w:after="0"/>
-        <w:ind w:firstLine="720"/>
+        <w:ind w:firstLine="720" w:left="0"/>
         <w:jc w:val="both"/>
       </w:pPr>
       <w:r>
@@ -5241,12 +5247,14 @@
     <w:p>
       <w:pPr>
         <w:spacing w:line="480" w:lineRule="auto" w:before="0" w:after="0"/>
-        <w:ind w:firstLine="720"/>
-        <w:jc w:val="both"/>
-      </w:pPr>
-      <w:r>
-        <w:rPr>
-          <w:rFonts w:ascii="Georgia" w:hAnsi="Georgia" w:eastAsia="Georgia" w:cs="Georgia"/>
+        <w:ind w:firstLine="720" w:left="0"/>
+        <w:jc w:val="both"/>
+      </w:pPr>
+      <w:r>
+        <w:rPr>
+          <w:rFonts w:ascii="Georgia" w:hAnsi="Georgia" w:eastAsia="Georgia" w:cs="Georgia"/>
+          <w:b w:val="0"/>
+          <w:i w:val="0"/>
           <w:sz w:val="22"/>
           <w:szCs w:val="22"/>
         </w:rPr>
@@ -5255,8 +5263,8 @@
     </w:p>
     <w:p>
       <w:pPr>
-        <w:ind w:firstLine="720"/>
-        <w:spacing w:line="480" w:lineRule="auto" w:before="240" w:after="0"/>
+        <w:ind w:firstLine="720" w:left="0"/>
+        <w:spacing w:line="480" w:lineRule="auto" w:before="0" w:after="0"/>
         <w:jc w:val="both"/>
       </w:pPr>
       <w:r>
@@ -5289,7 +5297,7 @@
     </w:p>
     <w:p>
       <w:pPr>
-        <w:ind w:firstLine="720"/>
+        <w:ind w:firstLine="720" w:left="0"/>
         <w:spacing w:line="480" w:lineRule="auto" w:before="0" w:after="0"/>
         <w:jc w:val="both"/>
       </w:pPr>
@@ -5323,7 +5331,7 @@
     </w:p>
     <w:p>
       <w:pPr>
-        <w:ind w:firstLine="720"/>
+        <w:ind w:firstLine="720" w:left="0"/>
         <w:spacing w:line="480" w:lineRule="auto" w:before="0" w:after="0"/>
         <w:jc w:val="both"/>
       </w:pPr>
@@ -5357,7 +5365,7 @@
     </w:p>
     <w:p>
       <w:pPr>
-        <w:ind w:firstLine="720"/>
+        <w:ind w:firstLine="720" w:left="0"/>
         <w:spacing w:line="480" w:lineRule="auto" w:before="0" w:after="0"/>
         <w:jc w:val="both"/>
       </w:pPr>
@@ -5660,7 +5668,7 @@
     </w:tbl>
     <w:p>
       <w:pPr>
-        <w:ind w:firstLine="720"/>
+        <w:ind w:firstLine="720" w:left="0"/>
         <w:spacing w:line="480" w:lineRule="auto" w:before="240" w:after="0"/>
         <w:jc w:val="both"/>
       </w:pPr>
@@ -5694,7 +5702,7 @@
     </w:p>
     <w:p>
       <w:pPr>
-        <w:ind w:firstLine="720"/>
+        <w:ind w:firstLine="720" w:left="0"/>
         <w:spacing w:line="480" w:lineRule="auto" w:before="0" w:after="0"/>
         <w:jc w:val="both"/>
       </w:pPr>
@@ -5728,7 +5736,7 @@
     </w:p>
     <w:p>
       <w:pPr>
-        <w:ind w:firstLine="720"/>
+        <w:ind w:firstLine="720" w:left="0"/>
         <w:spacing w:line="480" w:lineRule="auto" w:before="0" w:after="0"/>
         <w:jc w:val="both"/>
       </w:pPr>
@@ -5745,7 +5753,7 @@
     </w:p>
     <w:p>
       <w:pPr>
-        <w:ind w:firstLine="720"/>
+        <w:ind w:firstLine="720" w:left="0"/>
         <w:spacing w:line="480" w:lineRule="auto" w:before="0" w:after="0"/>
         <w:jc w:val="both"/>
       </w:pPr>
@@ -5779,7 +5787,7 @@
     </w:p>
     <w:p>
       <w:pPr>
-        <w:ind w:firstLine="720"/>
+        <w:ind w:firstLine="720" w:left="0"/>
         <w:spacing w:line="480" w:lineRule="auto" w:before="0" w:after="0"/>
         <w:jc w:val="both"/>
       </w:pPr>
@@ -5813,7 +5821,7 @@
     </w:p>
     <w:p>
       <w:pPr>
-        <w:ind w:firstLine="720"/>
+        <w:ind w:firstLine="720" w:left="0"/>
         <w:spacing w:line="480" w:lineRule="auto" w:before="0" w:after="0"/>
         <w:jc w:val="both"/>
       </w:pPr>
@@ -6196,7 +6204,7 @@
     </w:tbl>
     <w:p>
       <w:pPr>
-        <w:ind w:firstLine="720"/>
+        <w:ind w:firstLine="720" w:left="0"/>
         <w:spacing w:line="480" w:lineRule="auto" w:before="240" w:after="0"/>
         <w:jc w:val="both"/>
       </w:pPr>
@@ -6229,7 +6237,7 @@
     </w:p>
     <w:p>
       <w:pPr>
-        <w:ind w:firstLine="720"/>
+        <w:ind w:firstLine="720" w:left="0"/>
         <w:spacing w:line="480" w:lineRule="auto" w:before="0" w:after="0"/>
         <w:jc w:val="both"/>
       </w:pPr>
@@ -6246,7 +6254,7 @@
     </w:p>
     <w:p>
       <w:pPr>
-        <w:ind w:firstLine="720"/>
+        <w:ind w:firstLine="720" w:left="0"/>
         <w:spacing w:line="480" w:lineRule="auto" w:before="0" w:after="0"/>
         <w:jc w:val="both"/>
       </w:pPr>
@@ -6280,7 +6288,7 @@
     </w:p>
     <w:p>
       <w:pPr>
-        <w:ind w:firstLine="720"/>
+        <w:ind w:firstLine="720" w:left="0"/>
         <w:spacing w:line="480" w:lineRule="auto" w:before="0" w:after="0"/>
         <w:jc w:val="both"/>
       </w:pPr>
@@ -6297,7 +6305,7 @@
     </w:p>
     <w:p>
       <w:pPr>
-        <w:ind w:firstLine="720"/>
+        <w:ind w:firstLine="720" w:left="0"/>
         <w:spacing w:line="480" w:lineRule="auto" w:before="0" w:after="0"/>
         <w:jc w:val="both"/>
       </w:pPr>
@@ -6331,7 +6339,7 @@
     </w:p>
     <w:p>
       <w:pPr>
-        <w:ind w:firstLine="720"/>
+        <w:ind w:firstLine="720" w:left="0"/>
         <w:spacing w:line="480" w:lineRule="auto" w:before="0" w:after="0"/>
         <w:jc w:val="both"/>
       </w:pPr>
@@ -6349,11 +6357,13 @@
     <w:p>
       <w:pPr>
         <w:spacing w:line="480" w:lineRule="auto" w:before="720" w:after="720"/>
-        <w:jc w:val="left"/>
-      </w:pPr>
-      <w:r>
-        <w:rPr>
-          <w:rFonts w:ascii="Georgia" w:hAnsi="Georgia" w:eastAsia="Georgia" w:cs="Georgia"/>
+        <w:ind w:firstLine="0"/>
+        <w:jc w:val="center"/>
+      </w:pPr>
+      <w:r>
+        <w:rPr>
+          <w:rFonts w:ascii="Georgia" w:hAnsi="Georgia" w:eastAsia="Georgia" w:cs="Georgia"/>
+          <w:i w:val="0"/>
           <w:sz w:val="28"/>
           <w:szCs w:val="28"/>
           <w:b/>
@@ -6364,12 +6374,14 @@
     <w:p>
       <w:pPr>
         <w:spacing w:line="480" w:lineRule="auto" w:before="0" w:after="0"/>
-        <w:ind w:firstLine="720"/>
-        <w:jc w:val="both"/>
-      </w:pPr>
-      <w:r>
-        <w:rPr>
-          <w:rFonts w:ascii="Georgia" w:hAnsi="Georgia" w:eastAsia="Georgia" w:cs="Georgia"/>
+        <w:ind w:firstLine="720" w:left="0"/>
+        <w:jc w:val="both"/>
+      </w:pPr>
+      <w:r>
+        <w:rPr>
+          <w:rFonts w:ascii="Georgia" w:hAnsi="Georgia" w:eastAsia="Georgia" w:cs="Georgia"/>
+          <w:b w:val="0"/>
+          <w:i w:val="0"/>
           <w:sz w:val="22"/>
           <w:szCs w:val="22"/>
         </w:rPr>
@@ -6379,6 +6391,7 @@
     <w:p>
       <w:pPr>
         <w:spacing w:line="480" w:lineRule="auto" w:before="240" w:after="0"/>
+        <w:ind w:firstLine="0"/>
         <w:jc w:val="left"/>
       </w:pPr>
       <w:r>
@@ -6386,6 +6399,7 @@
           <w:rFonts w:ascii="Georgia" w:hAnsi="Georgia" w:eastAsia="Georgia" w:cs="Georgia"/>
           <w:sz w:val="24"/>
           <w:szCs w:val="24"/>
+          <w:b w:val="0"/>
           <w:i/>
         </w:rPr>
         <w:t xml:space="preserve">Conclusions</w:t>
@@ -6394,12 +6408,14 @@
     <w:p>
       <w:pPr>
         <w:spacing w:line="480" w:lineRule="auto" w:before="0" w:after="0"/>
-        <w:ind w:firstLine="720"/>
-        <w:jc w:val="both"/>
-      </w:pPr>
-      <w:r>
-        <w:rPr>
-          <w:rFonts w:ascii="Georgia" w:hAnsi="Georgia" w:eastAsia="Georgia" w:cs="Georgia"/>
+        <w:ind w:firstLine="720" w:left="0"/>
+        <w:jc w:val="both"/>
+      </w:pPr>
+      <w:r>
+        <w:rPr>
+          <w:rFonts w:ascii="Georgia" w:hAnsi="Georgia" w:eastAsia="Georgia" w:cs="Georgia"/>
+          <w:b w:val="0"/>
+          <w:i w:val="0"/>
           <w:sz w:val="22"/>
           <w:szCs w:val="22"/>
         </w:rPr>
@@ -6409,12 +6425,14 @@
     <w:p>
       <w:pPr>
         <w:spacing w:line="480" w:lineRule="auto" w:before="0" w:after="0"/>
-        <w:ind w:firstLine="720"/>
-        <w:jc w:val="both"/>
-      </w:pPr>
-      <w:r>
-        <w:rPr>
-          <w:rFonts w:ascii="Georgia" w:hAnsi="Georgia" w:eastAsia="Georgia" w:cs="Georgia"/>
+        <w:ind w:firstLine="720" w:left="0"/>
+        <w:jc w:val="both"/>
+      </w:pPr>
+      <w:r>
+        <w:rPr>
+          <w:rFonts w:ascii="Georgia" w:hAnsi="Georgia" w:eastAsia="Georgia" w:cs="Georgia"/>
+          <w:b w:val="0"/>
+          <w:i w:val="0"/>
           <w:sz w:val="22"/>
           <w:szCs w:val="22"/>
         </w:rPr>
@@ -6424,12 +6442,14 @@
     <w:p>
       <w:pPr>
         <w:spacing w:line="480" w:lineRule="auto" w:before="0" w:after="0"/>
-        <w:ind w:firstLine="720"/>
-        <w:jc w:val="both"/>
-      </w:pPr>
-      <w:r>
-        <w:rPr>
-          <w:rFonts w:ascii="Georgia" w:hAnsi="Georgia" w:eastAsia="Georgia" w:cs="Georgia"/>
+        <w:ind w:firstLine="720" w:left="0"/>
+        <w:jc w:val="both"/>
+      </w:pPr>
+      <w:r>
+        <w:rPr>
+          <w:rFonts w:ascii="Georgia" w:hAnsi="Georgia" w:eastAsia="Georgia" w:cs="Georgia"/>
+          <w:b w:val="0"/>
+          <w:i w:val="0"/>
           <w:sz w:val="22"/>
           <w:szCs w:val="22"/>
         </w:rPr>
@@ -6439,12 +6459,14 @@
     <w:p>
       <w:pPr>
         <w:spacing w:line="480" w:lineRule="auto" w:before="0" w:after="0"/>
-        <w:ind w:firstLine="720"/>
-        <w:jc w:val="both"/>
-      </w:pPr>
-      <w:r>
-        <w:rPr>
-          <w:rFonts w:ascii="Georgia" w:hAnsi="Georgia" w:eastAsia="Georgia" w:cs="Georgia"/>
+        <w:ind w:firstLine="720" w:left="0"/>
+        <w:jc w:val="both"/>
+      </w:pPr>
+      <w:r>
+        <w:rPr>
+          <w:rFonts w:ascii="Georgia" w:hAnsi="Georgia" w:eastAsia="Georgia" w:cs="Georgia"/>
+          <w:b w:val="0"/>
+          <w:i w:val="0"/>
           <w:sz w:val="22"/>
           <w:szCs w:val="22"/>
         </w:rPr>
@@ -6454,6 +6476,7 @@
     <w:p>
       <w:pPr>
         <w:spacing w:line="480" w:lineRule="auto" w:before="240" w:after="0"/>
+        <w:ind w:firstLine="0"/>
         <w:jc w:val="left"/>
       </w:pPr>
       <w:r>
@@ -6461,6 +6484,7 @@
           <w:rFonts w:ascii="Georgia" w:hAnsi="Georgia" w:eastAsia="Georgia" w:cs="Georgia"/>
           <w:sz w:val="24"/>
           <w:szCs w:val="24"/>
+          <w:b w:val="0"/>
           <w:i/>
         </w:rPr>
         <w:t xml:space="preserve">Recommendations</w:t>
@@ -6469,12 +6493,14 @@
     <w:p>
       <w:pPr>
         <w:spacing w:line="480" w:lineRule="auto" w:before="0" w:after="0"/>
-        <w:ind w:firstLine="720"/>
-        <w:jc w:val="both"/>
-      </w:pPr>
-      <w:r>
-        <w:rPr>
-          <w:rFonts w:ascii="Georgia" w:hAnsi="Georgia" w:eastAsia="Georgia" w:cs="Georgia"/>
+        <w:ind w:firstLine="720" w:left="0"/>
+        <w:jc w:val="both"/>
+      </w:pPr>
+      <w:r>
+        <w:rPr>
+          <w:rFonts w:ascii="Georgia" w:hAnsi="Georgia" w:eastAsia="Georgia" w:cs="Georgia"/>
+          <w:b w:val="0"/>
+          <w:i w:val="0"/>
           <w:sz w:val="22"/>
           <w:szCs w:val="22"/>
         </w:rPr>
@@ -6484,12 +6510,14 @@
     <w:p>
       <w:pPr>
         <w:spacing w:line="480" w:lineRule="auto" w:before="0" w:after="0"/>
-        <w:ind w:firstLine="720"/>
-        <w:jc w:val="both"/>
-      </w:pPr>
-      <w:r>
-        <w:rPr>
-          <w:rFonts w:ascii="Georgia" w:hAnsi="Georgia" w:eastAsia="Georgia" w:cs="Georgia"/>
+        <w:ind w:firstLine="720" w:left="0"/>
+        <w:jc w:val="both"/>
+      </w:pPr>
+      <w:r>
+        <w:rPr>
+          <w:rFonts w:ascii="Georgia" w:hAnsi="Georgia" w:eastAsia="Georgia" w:cs="Georgia"/>
+          <w:b w:val="0"/>
+          <w:i w:val="0"/>
           <w:sz w:val="22"/>
           <w:szCs w:val="22"/>
         </w:rPr>
@@ -6499,12 +6527,14 @@
     <w:p>
       <w:pPr>
         <w:spacing w:line="480" w:lineRule="auto" w:before="0" w:after="0"/>
-        <w:ind w:firstLine="720"/>
-        <w:jc w:val="both"/>
-      </w:pPr>
-      <w:r>
-        <w:rPr>
-          <w:rFonts w:ascii="Georgia" w:hAnsi="Georgia" w:eastAsia="Georgia" w:cs="Georgia"/>
+        <w:ind w:firstLine="720" w:left="0"/>
+        <w:jc w:val="both"/>
+      </w:pPr>
+      <w:r>
+        <w:rPr>
+          <w:rFonts w:ascii="Georgia" w:hAnsi="Georgia" w:eastAsia="Georgia" w:cs="Georgia"/>
+          <w:b w:val="0"/>
+          <w:i w:val="0"/>
           <w:sz w:val="22"/>
           <w:szCs w:val="22"/>
         </w:rPr>
@@ -6514,12 +6544,14 @@
     <w:p>
       <w:pPr>
         <w:spacing w:line="480" w:lineRule="auto" w:before="0" w:after="0"/>
-        <w:ind w:firstLine="720"/>
-        <w:jc w:val="both"/>
-      </w:pPr>
-      <w:r>
-        <w:rPr>
-          <w:rFonts w:ascii="Georgia" w:hAnsi="Georgia" w:eastAsia="Georgia" w:cs="Georgia"/>
+        <w:ind w:firstLine="720" w:left="0"/>
+        <w:jc w:val="both"/>
+      </w:pPr>
+      <w:r>
+        <w:rPr>
+          <w:rFonts w:ascii="Georgia" w:hAnsi="Georgia" w:eastAsia="Georgia" w:cs="Georgia"/>
+          <w:b w:val="0"/>
+          <w:i w:val="0"/>
           <w:sz w:val="22"/>
           <w:szCs w:val="22"/>
         </w:rPr>
@@ -6530,7 +6562,7 @@
       <w:pPr>
         <w:spacing w:after="720" w:before="720" w:line="480" w:lineRule="auto"/>
         <w:ind w:left="0" w:firstLine="0"/>
-        <w:jc w:val="left"/>
+        <w:jc w:val="center"/>
         <w:rPr/>
         <w:pageBreakBefore/>
       </w:pPr>
@@ -7292,7 +7324,7 @@
         <w:pageBreakBefore w:val="1"/>
         <w:spacing w:after="720" w:before="720" w:line="480" w:lineRule="auto"/>
         <w:ind w:left="0" w:firstLine="0"/>
-        <w:jc w:val="left"/>
+        <w:jc w:val="center"/>
         <w:rPr/>
       </w:pPr>
       <w:r>
@@ -8373,7 +8405,7 @@
     <w:p>
       <w:pPr>
         <w:spacing w:line="480" w:lineRule="auto" w:before="240" w:after="0"/>
-        <w:ind w:left="0" w:firstLine="0"/>
+        <w:ind w:left="0" w:firstLine="720"/>
         <w:jc w:val="both"/>
         <w:rPr/>
       </w:pPr>

</xml_diff>

<commit_message>
Panel revisions: corpus counts, extracts, IPO drop, Chang note, date window, soft recs
</commit_message>
<xml_diff>
--- a/thesis/Thesis_Instagram_MH_v15.docx
+++ b/thesis/Thesis_Instagram_MH_v15.docx
@@ -1472,7 +1472,7 @@
           <w:szCs w:val="22"/>
           <w:rtl w:val="0"/>
         </w:rPr>
-        <w:t xml:space="preserve">Koteyko and Atanasova (2018) demonstrate the value of discourse-analytic approaches for mental health advocacy on social media. Their focus on Twitter positioning and multimodal interaction, however, differs from this study’s concern with hope and empowerment construction inside Instagram captions and with the linguistic features of public comment responses. Naslund et al. (2016) document the growth of peer support on social media but do not analyze the grammar of advocacy captions. The present study addresses the gap by pairing Positive Discourse Analysis with an adapted support typology. It examines both caption strategies and comment patterns within a contemporary corpus of public Instagram mental health advocacy posts published from September 2024 through December 2025, with preference for 2025.</w:t>
+        <w:t>Koteyko and Atanasova (2018) demonstrate the value of discourse-analytic approaches for mental health advocacy on social media. Their focus on Twitter positioning and multimodal interaction, however, differs from this study’s concern with hope and empowerment construction inside Instagram captions and with the linguistic features of public comment responses. Naslund et al. (2016) document the growth of peer support on social media but do not analyze the grammar of advocacy captions. The present study addresses the gap by pairing Positive Discourse Analysis with an adapted support typology. It examines both caption strategies and comment patterns within a contemporary corpus of public Instagram mental health advocacy posts published from September 2024 to December 2025.</w:t>
       </w:r>
       <w:r>
         <w:rPr>
@@ -1704,7 +1704,7 @@
           <w:szCs w:val="22"/>
           <w:rtl w:val="0"/>
         </w:rPr>
-        <w:t xml:space="preserve">This study is guided by two complementary theoretical frameworks: Positive Discourse Analysis (Martin, 2004) and Chang’s (2009) online support typology. Together, these frameworks address both dimensions of the research, the linguistic construction of positive mental health meanings in captions, and the structural patterns of audience response in comments. The frameworks are applied within an Input–Process–Output (IPO) structure, as presented in Figure 1, which organizes the movement from corpus collection through analysis to interpretive output.</w:t>
+        <w:t>This study is guided by two complementary theoretical frameworks: Positive Discourse Analysis (Martin, 2004) and Chang’s (2009) online support typology. Together, these frameworks address both dimensions of the research, the linguistic construction of positive mental health meanings in captions, and the structural patterns of audience response in comments. The study moves from corpus collection, through caption and comment coding, to a descriptive reading of the patterns that emerge.</w:t>
       </w:r>
       <w:r>
         <w:rPr>
@@ -2434,7 +2434,7 @@
           <w:i w:val="0"/>
           <w:sz w:val="22"/>
         </w:rPr>
-        <w:t>Chang’s (2009) online support typology serves as the secondary framework for comment analysis. The typology categorizes supportive computer-mediated communication into four types: informational, emotional, esteem, and network support. This study adapts the typology for the Instagram advocacy context by collapsing emotional and esteem support into a single “supportive lexicon” category, operationalized through empathy markers, validation language, encouragement phrases, and second-person affirmation, and operationalizing network support as “personal narrative framing,” coded through first-person disclosure, temporal sequencing of personal experience, and connective expressions such as this resonates or I’ve been there. Informational support is excluded as it is markedly less prevalent in advocacy page comment sections. Each comment is assigned one dominant code. SUPPORTIVE LEXICON or PERSONAL NARRATIVE. using the same function-driven decision logic applied to captions (see Appendix B).</w:t>
+        <w:t>Chang’s (2009) online support typology serves as the secondary framework for comment analysis. The typology categorizes supportive computer-mediated communication into four types: informational, emotional, esteem, and network support. This study adapts the typology for the Instagram advocacy context by collapsing emotional and esteem support into a single “supportive lexicon” category, operationalized through empathy markers, validation language, encouragement phrases, and second-person affirmation, and operationalizing network support as “personal narrative framing,” coded through first-person disclosure, temporal sequencing of personal experience, and connective expressions such as this resonates or I’ve been there. Informational support is excluded as it is markedly less prevalent in advocacy page comment sections. Each comment is assigned one dominant code. SUPPORTIVE LEXICON or PERSONAL NARRATIVE. using the same function-driven decision logic applied to captions (see Appendix B). Informational support appeared only rarely among the screened comments under these advocacy posts, so it is not treated as a primary response category here.</w:t>
       </w:r>
     </w:p>
     <w:p>
@@ -2453,7 +2453,7 @@
           <w:szCs w:val="22"/>
           <w:rtl w:val="0"/>
         </w:rPr>
-        <w:t xml:space="preserve">The IPO structure organizes the three phases of analysis. In the Input phase, a corpus of a maximum of 30 publicly accessible English-language captions is assembled from about five to six Instagram mental health advocacy pages. Eligible posts are drawn from September 2024 through December 2025, with preference for 2025. Each page contributes between five and eight eligible posts. Two comments written directly under each caption are selected. Comments must be in English, long enough for analysis, and not pure emoji or single-word reactions. When both kinds of response appear, one that offers encouragement or validation without a personal story and one that shares a personal experience are taken. In the Process phase, Phase 1 applies the two-stage Identify-and-Sort procedure under PDA to assign each caption a dominant orientation (HOPE, EMPOWERMENT, or blended) and to tally illustrative linguistic signals. Phase 2 applies the adapted Chang (2009) typology to the selected comments to identify and describe dominant linguistic features in public responses. Phase 3 synthesizes findings from both phases to describe patterns at the intersection of caption production and comment response. In the Output phase, the study produces three linked descriptive accounts: the dominant lexical and grammatical strategies in captions, the characteristic linguistic features of comment responses, and the collective discursive construction of positive mental health meaning that emerges when both levels are considered together. No causal inference is drawn between caption language and comment type. The analysis remains strictly descriptive throughout.</w:t>
+        <w:t>The IPO structure organizes the three phases of analysis. In the Input phase, a corpus of a maximum of 30 publicly accessible English-language captions is assembled from about five to six Instagram mental health advocacy pages. Eligible posts are drawn from September 2024 to December 2025. Each page contributes between five and eight eligible posts. Two comments written directly under each caption are selected. Comments must be in English, long enough for analysis, and not pure emoji or single-word reactions. When both kinds of response appear, one that offers encouragement or validation without a personal story and one that shares a personal experience are taken. In the Process phase, Phase 1 applies the two-stage Identify-and-Sort procedure under PDA to assign each caption a dominant orientation (HOPE, EMPOWERMENT, or blended) and to tally illustrative linguistic signals. Phase 2 applies the adapted Chang (2009) typology to the selected comments to identify and describe dominant linguistic features in public responses. Phase 3 synthesizes findings from both phases to describe patterns at the intersection of caption production and comment response. In the Output phase, the study produces three linked descriptive accounts: the dominant lexical and grammatical strategies in captions, the characteristic linguistic features of comment responses, and the collective discursive construction of positive mental health meaning that emerges when both levels are considered together. No causal inference is drawn between caption language and comment type. The analysis remains strictly descriptive throughout.</w:t>
       </w:r>
       <w:r>
         <w:rPr>
@@ -3001,20 +3001,20 @@
       <w:r>
         <w:rPr>
           <w:rFonts w:ascii="Georgia" w:hAnsi="Georgia" w:eastAsia="Georgia" w:cs="Georgia"/>
-          <w:b w:val="0"/>
-          <w:i w:val="0"/>
-          <w:sz w:val="22"/>
-        </w:rPr>
-        <w:t xml:space="preserve">Contemporary Corpus. </w:t>
-      </w:r>
-      <w:r>
-        <w:rPr>
-          <w:rFonts w:ascii="Georgia" w:hAnsi="Georgia" w:eastAsia="Georgia" w:cs="Georgia"/>
-          <w:b w:val="0"/>
-          <w:i w:val="0"/>
-          <w:sz w:val="22"/>
-        </w:rPr>
-        <w:t>A purposive sample of Instagram posts published from September 2024 through December 2025, with preference for 2025, analyzed as a single dataset of contemporary mental health advocacy discourse on the platform. Years are not compared.</w:t>
+          <w:b/>
+          <w:i w:val="0"/>
+          <w:sz w:val="22"/>
+        </w:rPr>
+        <w:t xml:space="preserve">Corpus. </w:t>
+      </w:r>
+      <w:r>
+        <w:rPr>
+          <w:rFonts w:ascii="Georgia" w:hAnsi="Georgia" w:eastAsia="Georgia" w:cs="Georgia"/>
+          <w:b w:val="0"/>
+          <w:i w:val="0"/>
+          <w:sz w:val="22"/>
+        </w:rPr>
+        <w:t>The set of thirty English-language Instagram captions and sixty eligible comments assembled for this study from six public mental health advocacy pages, drawn from posts published between September 2024 and December 2025.</w:t>
       </w:r>
     </w:p>
     <w:p>
@@ -3704,7 +3704,7 @@
           <w:i w:val="0"/>
           <w:sz w:val="22"/>
         </w:rPr>
-        <w:t>The final corpus comprises 30 English-language Instagram captions drawn from six anonymized public mental health advocacy pages (coded Page 1, Page 5, Page 7, Page 8/9, Page 10, and Page 11). Screening followed the eligibility rules in the research process. Posts were retained only when the caption addressed mental health awareness, support, coping, recovery, or advocacy, met the minimum engagement threshold confirmed by the researcher, and supplied at least two eligible comments. Five candidate posts were excluded as off-topic (caregiving campaign, weight-loss content, animal language, male sexual desire, and monogamy). Where a page exceeded the target share, collab and ambassador posts were set aside as spares. Spares were used only when needed to reach the corpus ceiling of 30. Two comments per caption were selected under the eligibility rule in Appendix B. Where comment options under a post were limited, the two comments closest to the eligibility rule were retained, even when the pool was thin. Page names and commenter identities are anonymized throughout. Eligible posts were published from September 2024 through December 2025, with preference for 2025. No cross-year comparison is performed.</w:t>
+        <w:t>The final corpus comprises 30 English-language Instagram captions drawn from six anonymized public mental health advocacy pages (coded Page 1, Page 5, Page 7, Page 8/9, Page 10, and Page 11). Screening followed the eligibility rules in the research process. Posts were retained only when the caption addressed mental health awareness, support, coping, recovery, or advocacy, met the minimum engagement threshold confirmed by the researcher, and supplied at least two eligible comments. Five candidate posts were excluded as off-topic (caregiving campaign, weight-loss content, animal language, male sexual desire, and monogamy). Where a page exceeded the target share, collab and ambassador posts were set aside as spares. Spares were used only when needed to reach the corpus ceiling of 30. Two comments per caption were selected under the eligibility rule in Appendix B. Where comment options under a post were limited, the two comments closest to the eligibility rule were retained, even when the pool was thin. Page names and commenter identities are anonymized throughout. Eligible posts were published from September 2024 to December 2025. No cross-year comparison is performed.</w:t>
       </w:r>
     </w:p>
     <w:p>
@@ -3835,19 +3835,19 @@
     </w:p>
     <w:p>
       <w:pPr>
-        <w:ind w:firstLine="720" w:left="0"/>
-        <w:spacing w:line="480" w:lineRule="auto" w:before="0" w:after="0"/>
-        <w:jc w:val="both"/>
-      </w:pPr>
-      <w:r>
-        <w:rPr>
-          <w:rFonts w:ascii="Georgia" w:hAnsi="Georgia" w:eastAsia="Georgia" w:cs="Georgia"/>
-          <w:b w:val="0"/>
-          <w:i w:val="0"/>
-          <w:sz w:val="22"/>
-          <w:szCs w:val="22"/>
-        </w:rPr>
-        <w:t>Most captions in the corpus positioned the reader as able to act in the present and were coded EMPOWERMENT. A smaller set oriented the reader toward a recovery or growth trajectory and was coded HOPE. A few captions carried both orientations at comparable strength and were coded BOTH. Table 2 summarizes those dominant orientations. The distribution is a map of discursive focus, not a ranking of value. Hope captions clustered in suicide-prevention and recovery-trajectory posts, where future-oriented reassurance carries a distinct interpersonal load. Empowerment captions clustered in stigma-challenge, help-seeking, and self-care posts, where the preferred move is to authorize present action. That division is consistent with observational work on Instagram mental health content that finds motivational and action-oriented formats highly visible (Koinig, 2022; Wu &amp; Hong, 2022), and with Positive Discourse Analysis interest in how language builds agency and solidarity rather than only documenting deficit (Martin, 2004).</w:t>
+        <w:ind w:left="0" w:firstLine="720"/>
+        <w:spacing w:line="480" w:lineRule="auto" w:before="0" w:after="0"/>
+        <w:jc w:val="both"/>
+      </w:pPr>
+      <w:r>
+        <w:rPr>
+          <w:rFonts w:ascii="Georgia" w:hAnsi="Georgia" w:eastAsia="Georgia" w:cs="Georgia"/>
+          <w:b w:val="0"/>
+          <w:i w:val="0"/>
+          <w:sz w:val="22"/>
+          <w:szCs w:val="22"/>
+        </w:rPr>
+        <w:t>Of the 30 captions, 20 were coded EMPOWERMENT, 8 were coded HOPE, and 2 were coded BOTH. Empowerment captions positioned the reader as able to act in the present. Hope captions oriented the reader toward a recovery or growth trajectory. The two BOTH captions carried both orientations at comparable strength. Table 2 reports these counts. The distribution is a map of discursive focus, not a ranking of value. Hope captions clustered in suicide-prevention and recovery-trajectory posts. Empowerment captions clustered in stigma-challenge, help-seeking, and self-care posts. That division is consistent with observational work on Instagram mental health content that finds motivational and action-oriented formats highly visible (Koinig, 2022; Wu &amp; Hong, 2022).</w:t>
       </w:r>
     </w:p>
     <w:p>
@@ -3918,7 +3918,7 @@
                 <w:i w:val="0"/>
                 <w:sz w:val="22"/>
               </w:rPr>
-              <w:t>Dominant orientation</w:t>
+              <w:t>Orientation</w:t>
             </w:r>
           </w:p>
         </w:tc>
@@ -3944,7 +3944,7 @@
                 <w:i w:val="0"/>
                 <w:sz w:val="22"/>
               </w:rPr>
-              <w:t>What it privileges</w:t>
+              <w:t>n of 30</w:t>
             </w:r>
           </w:p>
         </w:tc>
@@ -3970,7 +3970,7 @@
                 <w:i w:val="0"/>
                 <w:sz w:val="22"/>
               </w:rPr>
-              <w:t>Typical speech act</w:t>
+              <w:t>Discursive focus</w:t>
             </w:r>
           </w:p>
         </w:tc>
@@ -4024,7 +4024,7 @@
                 <w:i w:val="0"/>
                 <w:sz w:val="22"/>
               </w:rPr>
-              <w:t>Present capacity to act or decide</w:t>
+              <w:t>20</w:t>
             </w:r>
           </w:p>
         </w:tc>
@@ -4050,7 +4050,7 @@
                 <w:i w:val="0"/>
                 <w:sz w:val="22"/>
               </w:rPr>
-              <w:t>You can or should act</w:t>
+              <w:t>Present action, permission, agency</w:t>
             </w:r>
           </w:p>
         </w:tc>
@@ -4104,7 +4104,7 @@
                 <w:i w:val="0"/>
                 <w:sz w:val="22"/>
               </w:rPr>
-              <w:t>Future possibility or recovery trajectory</w:t>
+              <w:t>8</w:t>
             </w:r>
           </w:p>
         </w:tc>
@@ -4130,7 +4130,7 @@
                 <w:i w:val="0"/>
                 <w:sz w:val="22"/>
               </w:rPr>
-              <w:t>Things can or will get better</w:t>
+              <w:t>Recovery trajectory, projected future</w:t>
             </w:r>
           </w:p>
         </w:tc>
@@ -4184,7 +4184,7 @@
                 <w:i w:val="0"/>
                 <w:sz w:val="22"/>
               </w:rPr>
-              <w:t>Present action and recoverable future</w:t>
+              <w:t>2</w:t>
             </w:r>
           </w:p>
         </w:tc>
@@ -4210,7 +4210,7 @@
                 <w:i w:val="0"/>
                 <w:sz w:val="22"/>
               </w:rPr>
-              <w:t>Act now and recovery remains open</w:t>
+              <w:t>Present action and recoverable future</w:t>
             </w:r>
           </w:p>
         </w:tc>
@@ -4218,7 +4218,7 @@
     </w:tbl>
     <w:p>
       <w:pPr>
-        <w:ind w:firstLine="720" w:left="0"/>
+        <w:ind w:left="0" w:firstLine="720"/>
         <w:spacing w:line="480" w:lineRule="auto" w:before="240" w:after="0"/>
         <w:jc w:val="both"/>
       </w:pPr>
@@ -4230,7 +4230,7 @@
           <w:sz w:val="22"/>
           <w:szCs w:val="22"/>
         </w:rPr>
-        <w:t xml:space="preserve">The imbalance does not mean hope is marginal. Hope captions clustered in suicide-prevention and recovery-trajectory posts, where future-oriented reassurance carries a distinct interpersonal load. Empowerment captions clustered in stigma-challenge, help-seeking, and self-care posts, where the preferred move is to authorize present action. The coding scheme treats that division as a difference in discursive focus, not as a ranking of value. The pattern is consistent with observational work on Instagram mental health content that finds motivational and action-oriented formats highly visible (Koinig, 2022; Wu &amp; Hong, 2022), and with a Positive Discourse Analysis interest in how texts build capacity and solidarity (Martin, 2004).</w:t>
+        <w:t>The smaller HOPE set is still consequential. Those captions clustered in suicide-prevention and recovery-trajectory posts, where future-oriented reassurance carries a distinct interpersonal load. Empowerment captions clustered in stigma-challenge, help-seeking, and self-care posts. The coding scheme treats that division as a difference in discursive focus, not as a ranking of value.</w:t>
       </w:r>
     </w:p>
     <w:p>
@@ -4715,19 +4715,19 @@
     </w:tbl>
     <w:p>
       <w:pPr>
-        <w:ind w:firstLine="720" w:left="0"/>
-        <w:spacing w:line="480" w:lineRule="auto" w:before="240" w:after="0"/>
-        <w:jc w:val="both"/>
-      </w:pPr>
-      <w:r>
-        <w:rPr>
-          <w:rFonts w:ascii="Georgia" w:hAnsi="Georgia" w:eastAsia="Georgia" w:cs="Georgia"/>
-          <w:b w:val="0"/>
-          <w:i w:val="0"/>
-          <w:sz w:val="22"/>
-          <w:szCs w:val="22"/>
-        </w:rPr>
-        <w:t>These forms do more than give advice. Permission statements reframe help-seeking and vulnerability as legitimate action. When a caption says it is okay to ask for help, the clause does interpersonal work. It treats a presumed prohibition as the problem and cancels it in public language. Imperatives such as take the first step or prioritize your peace assign agency to the reader in the present tense. Collective pronouns such as we have to or none of us have to take that on alone shift the participant structure from isolated self-management to shared advocacy stance. Myth-busting frames that name and correct misconceptions about illness, strength, or treatment remove discursive barriers before the directive lands. In Positive Discourse Analysis terms, the caption constructs the reader as a capable actor and constructs the community as one that backs that capacity (Martin, 2004).</w:t>
+        <w:ind w:left="0" w:firstLine="720"/>
+        <w:spacing w:line="480" w:lineRule="auto" w:before="0" w:after="0"/>
+        <w:jc w:val="both"/>
+      </w:pPr>
+      <w:r>
+        <w:rPr>
+          <w:rFonts w:ascii="Georgia" w:hAnsi="Georgia" w:eastAsia="Georgia" w:cs="Georgia"/>
+          <w:b w:val="0"/>
+          <w:i w:val="0"/>
+          <w:sz w:val="22"/>
+          <w:szCs w:val="22"/>
+        </w:rPr>
+        <w:t>These forms do more than give advice. Permission statements reframe help-seeking as legitimate. One caption states, “Every day won't look or feel perfect, and that's okay. Remember, it's okay to not be okay!” (P1_C2). The clause cancels a presumed requirement to appear fine. Directives assign present action. Another caption asks readers to “Join us this #MentalHealthAwarenessMonth by agreeing to #TakeTheMoment to prioritize your mental health” (P1_C5). Collective pronouns share agency. A myth-busting post opens with “Stop us if you’ve heard these mental health myths before” and then reframes public talk about illness (P2_C2). In Positive Discourse Analysis terms, such captions construct the reader as a capable actor and the community as one that backs that capacity (Martin, 2004).</w:t>
       </w:r>
     </w:p>
     <w:p>
@@ -5229,7 +5229,24 @@
     </w:tbl>
     <w:p>
       <w:pPr>
-        <w:spacing w:line="480" w:lineRule="auto" w:before="240" w:after="0"/>
+        <w:spacing w:line="480" w:lineRule="auto" w:before="0" w:after="0"/>
+        <w:ind w:left="0" w:firstLine="720"/>
+        <w:jc w:val="both"/>
+      </w:pPr>
+      <w:r>
+        <w:rPr>
+          <w:rFonts w:ascii="Georgia" w:hAnsi="Georgia" w:eastAsia="Georgia" w:cs="Georgia"/>
+          <w:b w:val="0"/>
+          <w:i w:val="0"/>
+          <w:sz w:val="22"/>
+          <w:szCs w:val="22"/>
+        </w:rPr>
+        <w:t>Grammatically, hope captions relied less on bare imperatives and more on declarative reassurance and predictive clauses. Incremental progress lexis scales recovery into units a reader can inhabit. One caption states, “Small steps lead to big progress. Focus on the little victories that pave the way for meaningful change” (P1_C4). A comment under that post echoes the same frame: “It is important to celebrate the ‘small’ steps forward! They can provide a source of hope as well” (P1_C4_X2). Future-oriented modality projects possibility. A crisis-oriented caption tells the reader, “You can get through this” after naming an anxiety loop (P2_C4). Another post in Suicide Prevention Month states, “If facing tomorrow feels impossible, please know you’re not alone. We hope you stay, and we want you to get the support you deserve” (P2_C5). Hope construction here is a package of time, modality, and evaluation rather than a single keyword of positivity.</w:t>
+      </w:r>
+    </w:p>
+    <w:p>
+      <w:pPr>
+        <w:spacing w:line="480" w:lineRule="auto" w:before="0" w:after="0"/>
         <w:ind w:firstLine="720" w:left="0"/>
         <w:jc w:val="both"/>
       </w:pPr>
@@ -5241,41 +5258,24 @@
           <w:sz w:val="22"/>
           <w:szCs w:val="22"/>
         </w:rPr>
-        <w:t>Grammatically, hope captions relied less on bare imperatives and more on declarative reassurances and predictive clauses. Incremental progress lexis such as small steps and little victories scales recovery into units a reader can inhabit when a full turnaround feels unavailable. Future-oriented modality such as can and will projects possibility without stating certainty as fact. Life-worth declarations affirm value in contexts where that value is contested by crisis language. Temporal framing such as step by step or seasonal metaphors stretches the event line so that the present episode is not the whole narrative. Hope construction in these captions is therefore a package of time, modality, and evaluation rather than a single keyword of positivity.</w:t>
-      </w:r>
-    </w:p>
-    <w:p>
-      <w:pPr>
-        <w:spacing w:line="480" w:lineRule="auto" w:before="0" w:after="0"/>
-        <w:ind w:firstLine="720" w:left="0"/>
-        <w:jc w:val="both"/>
-      </w:pPr>
-      <w:r>
-        <w:rPr>
-          <w:rFonts w:ascii="Georgia" w:hAnsi="Georgia" w:eastAsia="Georgia" w:cs="Georgia"/>
-          <w:b w:val="0"/>
-          <w:i w:val="0"/>
-          <w:sz w:val="22"/>
-          <w:szCs w:val="22"/>
-        </w:rPr>
         <w:t xml:space="preserve">That package matters for the study’s larger claim. Hope here is not the absence of struggle. Several hope captions named risk, exhaustion, or imperfect days before the projective clause arrived. The linguistic sequence often moves from problem to trajectory. The second move does not delete the first. It repositions it inside a longer time frame. Beelen and Karsay (2024) found that exposure to hopeful Instagram messages alone did not reliably raise hope in experimental conditions. The present analysis does not test effect. It shows how hope is built in the text when advocacy pages attempt that construction under platform constraints.</w:t>
       </w:r>
     </w:p>
     <w:p>
       <w:pPr>
-        <w:ind w:firstLine="720" w:left="0"/>
-        <w:spacing w:line="480" w:lineRule="auto" w:before="0" w:after="0"/>
-        <w:jc w:val="both"/>
-      </w:pPr>
-      <w:r>
-        <w:rPr>
-          <w:rFonts w:ascii="Georgia" w:hAnsi="Georgia" w:eastAsia="Georgia" w:cs="Georgia"/>
-          <w:b w:val="0"/>
-          <w:i w:val="0"/>
-          <w:sz w:val="22"/>
-          <w:szCs w:val="22"/>
-        </w:rPr>
-        <w:t>A small number of captions were coded BOTH because hope and empowerment signals carried comparable weight. One paired an imperative to seek support with a predictive clause about recovery. Another authorized rest in the present while naming growth over time. In those texts neither orientation could be demoted without losing the caption’s main communicative load. Blended captions show that the two orientations are analytically distinct but not mutually exclusive in practice. Writers can instruct present action and project a recoverable future in the same short post. The coding scheme records that coexistence rather than forcing a false choice.</w:t>
+        <w:ind w:left="0" w:firstLine="720"/>
+        <w:spacing w:line="480" w:lineRule="auto" w:before="0" w:after="0"/>
+        <w:jc w:val="both"/>
+      </w:pPr>
+      <w:r>
+        <w:rPr>
+          <w:rFonts w:ascii="Georgia" w:hAnsi="Georgia" w:eastAsia="Georgia" w:cs="Georgia"/>
+          <w:b w:val="0"/>
+          <w:i w:val="0"/>
+          <w:sz w:val="22"/>
+          <w:szCs w:val="22"/>
+        </w:rPr>
+        <w:t>Two captions were coded BOTH because hope and empowerment signals carried comparable weight. One example pairs present-tense permission with trajectory talk: the text authorizes imperfect days and not being okay, then keeps recovery talk available through ongoing support language rather than a single directive (P1_C2). Stage 1 of coding marked both orientations present. Stage 2 could not demote either orientation without losing the caption’s main load. Permission and “okay to not be okay” authorize present vulnerability (empowerment). The forward look toward better days and continued support keeps a recovery line open (hope). The BOTH code records that coexistence. Writers can instruct or authorize present action and project a recoverable future in the same short post.</w:t>
       </w:r>
     </w:p>
     <w:p>
@@ -5297,19 +5297,18 @@
     </w:p>
     <w:p>
       <w:pPr>
-        <w:ind w:firstLine="720" w:left="0"/>
-        <w:spacing w:line="480" w:lineRule="auto" w:before="0" w:after="0"/>
-        <w:jc w:val="both"/>
-      </w:pPr>
-      <w:r>
-        <w:rPr>
-          <w:rFonts w:ascii="Georgia" w:hAnsi="Georgia" w:eastAsia="Georgia" w:cs="Georgia"/>
-          <w:b w:val="0"/>
-          <w:i w:val="0"/>
-          <w:sz w:val="22"/>
-          <w:szCs w:val="22"/>
-        </w:rPr>
-        <w:t xml:space="preserve">A small number of captions were coded BOTH because hope and empowerment signals carried comparable weight. One paired an anxiety-loop reframing technique (shifting what if toward even if or what is within control) with the predictive reassurance you can get through this. Another paired the empowerment claim that seeking support is not weakness with the hope phrase a step toward healing. Blended cases matter analytically. They show that the two orientations are not always mutually exclusive in short-form advocacy text, and that Stage 2 of the coding procedure must weigh speech-act force and clause position rather than count keywords alone.</w:t>
+        <w:ind w:left="0" w:firstLine="720"/>
+        <w:spacing w:line="480" w:lineRule="auto" w:before="0" w:after="0"/>
+        <w:jc w:val="both"/>
+      </w:pPr>
+      <w:r>
+        <w:rPr>
+          <w:rFonts w:ascii="Georgia" w:hAnsi="Georgia" w:eastAsia="Georgia" w:cs="Georgia"/>
+          <w:b w:val="0"/>
+          <w:i w:val="0"/>
+          <w:sz w:val="22"/>
+          <w:szCs w:val="22"/>
+        </w:rPr>
       </w:r>
     </w:p>
     <w:p>
@@ -5365,19 +5364,19 @@
     </w:p>
     <w:p>
       <w:pPr>
-        <w:ind w:firstLine="720" w:left="0"/>
-        <w:spacing w:line="480" w:lineRule="auto" w:before="0" w:after="0"/>
-        <w:jc w:val="both"/>
-      </w:pPr>
-      <w:r>
-        <w:rPr>
-          <w:rFonts w:ascii="Georgia" w:hAnsi="Georgia" w:eastAsia="Georgia" w:cs="Georgia"/>
-          <w:b w:val="0"/>
-          <w:i w:val="0"/>
-          <w:sz w:val="22"/>
-          <w:szCs w:val="22"/>
-        </w:rPr>
-        <w:t>Supportive lexicon was the more common response type among eligible comments. Personal narrative framing appeared less often but remained a clear secondary pattern. Table 5 summarizes the two types and their main linguistic markers. The preference for supportive lexicon is consistent with Chang (2009), who found emotional and esteem support central in online peer support interaction, and with Kim et al. (2023), who show that supporters often work to validate and encourage rather than only to inform. On Instagram, that preference is reinforced by the interface. Short replies, emoji-supported affirmation, and second-person address fit the feed’s pace, while extended first-person narrative requires more sustained attention from both writer and reader.</w:t>
+        <w:ind w:left="0" w:firstLine="720"/>
+        <w:spacing w:line="480" w:lineRule="auto" w:before="0" w:after="0"/>
+        <w:jc w:val="both"/>
+      </w:pPr>
+      <w:r>
+        <w:rPr>
+          <w:rFonts w:ascii="Georgia" w:hAnsi="Georgia" w:eastAsia="Georgia" w:cs="Georgia"/>
+          <w:b w:val="0"/>
+          <w:i w:val="0"/>
+          <w:sz w:val="22"/>
+          <w:szCs w:val="22"/>
+        </w:rPr>
+        <w:t>Of the 60 eligible comments, 43 were coded as supportive lexicon and 17 as personal narrative framing. Supportive lexicon was therefore the more common response type. Table 5 summarizes the two types and their main linguistic markers. The preference for supportive lexicon is consistent with Chang (2009) and with Kim et al. (2023). On Instagram, short affirming replies fit the feed’s pace, while extended first-person narrative requires more sustained attention.</w:t>
       </w:r>
     </w:p>
     <w:p>
@@ -5528,7 +5527,7 @@
                 <w:i w:val="0"/>
                 <w:sz w:val="22"/>
               </w:rPr>
-              <w:t>Supportive lexicon</w:t>
+              <w:t>Supportive lexicon (n = 43)</w:t>
             </w:r>
           </w:p>
         </w:tc>
@@ -5554,7 +5553,7 @@
                 <w:i w:val="0"/>
                 <w:sz w:val="22"/>
               </w:rPr>
-              <w:t>Empathy phrases; validation; praise; short affective forms (you are so loved; pls stay with us)</w:t>
+              <w:t>Empathy; validation; praise; short affirmation</w:t>
             </w:r>
           </w:p>
         </w:tc>
@@ -5580,7 +5579,7 @@
                 <w:i w:val="0"/>
                 <w:sz w:val="22"/>
               </w:rPr>
-              <w:t>Ratifies the caption stance; offers encouragement without a personal story</w:t>
+              <w:t>Ratifies caption stance</w:t>
             </w:r>
           </w:p>
         </w:tc>
@@ -5608,7 +5607,7 @@
                 <w:i w:val="0"/>
                 <w:sz w:val="22"/>
               </w:rPr>
-              <w:t>Personal narrative framing</w:t>
+              <w:t>Personal narrative (n = 17)</w:t>
             </w:r>
           </w:p>
         </w:tc>
@@ -5634,7 +5633,7 @@
                 <w:i w:val="0"/>
                 <w:sz w:val="22"/>
               </w:rPr>
-              <w:t>First-person past or present (I felt; I went through); diagnosis or crisis naming; recovery timeline</w:t>
+              <w:t>First-person past or present experience talk</w:t>
             </w:r>
           </w:p>
         </w:tc>
@@ -5660,7 +5659,7 @@
                 <w:i w:val="0"/>
                 <w:sz w:val="22"/>
               </w:rPr>
-              <w:t>Brings lived experience into the public thread; realizes network support</w:t>
+              <w:t>Brings lived experience into the thread</w:t>
             </w:r>
           </w:p>
         </w:tc>
@@ -5702,19 +5701,19 @@
     </w:p>
     <w:p>
       <w:pPr>
-        <w:ind w:firstLine="720" w:left="0"/>
-        <w:spacing w:line="480" w:lineRule="auto" w:before="0" w:after="0"/>
-        <w:jc w:val="both"/>
-      </w:pPr>
-      <w:r>
-        <w:rPr>
-          <w:rFonts w:ascii="Georgia" w:hAnsi="Georgia" w:eastAsia="Georgia" w:cs="Georgia"/>
-          <w:b w:val="0"/>
-          <w:i w:val="0"/>
-          <w:sz w:val="22"/>
-          <w:szCs w:val="22"/>
-        </w:rPr>
-        <w:t>Supportive comments often mirrored caption language at the level of lexis and stance. Under empowerment captions they restated agency and permission. Commenters wrote that it is okay to ask for help, that readers do not have to stay silent, or that taking a first step matters. Those replies recycle the caption’s permission statements and directives into second-person encouragement, so the thread becomes a public ratification of the authorized action. Under hope captions, supportive replies more often echoed trajectory and endurance language. Commenters affirmed that the reader can get through the moment, that small steps count, or that the life named in the caption is worth protecting. In both cases the comment stays close to the caption’s orientation. It does not typically introduce a competing frame. The linguistic work is alignment: shared modality, shared evaluation, and short clauses that keep the stance easy to scan in a fast-moving comment section.</w:t>
+        <w:ind w:left="0" w:firstLine="720"/>
+        <w:spacing w:line="480" w:lineRule="auto" w:before="0" w:after="0"/>
+        <w:jc w:val="both"/>
+      </w:pPr>
+      <w:r>
+        <w:rPr>
+          <w:rFonts w:ascii="Georgia" w:hAnsi="Georgia" w:eastAsia="Georgia" w:cs="Georgia"/>
+          <w:b w:val="0"/>
+          <w:i w:val="0"/>
+          <w:sz w:val="22"/>
+          <w:szCs w:val="22"/>
+        </w:rPr>
+        <w:t>Supportive comments often mirrored caption language at the level of lexis and stance. Under a myth-busting caption, one reply states, “Absolutely! There’s so much misinformation out there, that’s why education and open conversations are key” (P2_C2_X1). Another affirms, “Debunking myths like ‘mental illness is a sign of weakness’ is absolutely vital to fighting stigma” (P2_C2_X2). Under a hope-oriented line, a commenter writes, “Thank you for your kind words of encouragement… know that you have a beautiful gift in your soul” (P2_C4_X1). The linguistic work is alignment. Shared evaluation and short clauses keep the stance easy to scan in a fast-moving comment section.</w:t>
       </w:r>
     </w:p>
     <w:p>
@@ -5736,19 +5735,19 @@
     </w:p>
     <w:p>
       <w:pPr>
-        <w:ind w:firstLine="720" w:left="0"/>
-        <w:spacing w:line="480" w:lineRule="auto" w:before="0" w:after="0"/>
-        <w:jc w:val="both"/>
-      </w:pPr>
-      <w:r>
-        <w:rPr>
-          <w:rFonts w:ascii="Georgia" w:hAnsi="Georgia" w:eastAsia="Georgia" w:cs="Georgia"/>
-          <w:b w:val="0"/>
-          <w:i w:val="0"/>
-          <w:sz w:val="22"/>
-          <w:szCs w:val="22"/>
-        </w:rPr>
-        <w:t>Personal narrative comments typically used first-person past or present forms such as I felt, I went through, or I still struggle. They often reported a concrete episode of distress, help-seeking, or partial recovery, then linked that episode back to the caption’s theme. Grammatically, the narrative comment shifts the participant roles. The caption addresses a generalized you. The narrative reply reintroduces an I who claims lived authority. That shift is important for Positive Discourse Analysis. Solidarity is not only produced by cheering from outside the experience. It is also produced when someone places their own history beside the caption’s claim and makes the advocacy space hold more than one voice.</w:t>
+        <w:ind w:left="0" w:firstLine="720"/>
+        <w:spacing w:line="480" w:lineRule="auto" w:before="0" w:after="0"/>
+        <w:jc w:val="both"/>
+      </w:pPr>
+      <w:r>
+        <w:rPr>
+          <w:rFonts w:ascii="Georgia" w:hAnsi="Georgia" w:eastAsia="Georgia" w:cs="Georgia"/>
+          <w:b w:val="0"/>
+          <w:i w:val="0"/>
+          <w:sz w:val="22"/>
+          <w:szCs w:val="22"/>
+        </w:rPr>
+        <w:t>Personal narrative comments typically used first-person past or present forms. Under an open-conversation caption on schizophrenia awareness, one commenter writes, “My husband has schizophrenia, he is suicidal. He has completely lost touch with reality…” (P1_C3_X1). Under a progress caption, another reports family diagnosis and help-seeking: “My youngest was recently diagnosed with bi-polar 1. I’m taking the family to family class offered and educating myself the best I can” (P1_C5_X1). Grammatically, the narrative reply reintroduces an I who claims lived authority beside the caption’s generalized you. Solidarity is produced when someone places their own history in the public thread, not only when someone cheers from outside the experience.</w:t>
       </w:r>
     </w:p>
     <w:p>
@@ -6510,18 +6509,18 @@
     <w:p>
       <w:pPr>
         <w:spacing w:line="480" w:lineRule="auto" w:before="0" w:after="0"/>
-        <w:ind w:firstLine="720" w:left="0"/>
-        <w:jc w:val="both"/>
-      </w:pPr>
-      <w:r>
-        <w:rPr>
-          <w:rFonts w:ascii="Georgia" w:hAnsi="Georgia" w:eastAsia="Georgia" w:cs="Georgia"/>
-          <w:b w:val="0"/>
-          <w:i w:val="0"/>
-          <w:sz w:val="22"/>
-          <w:szCs w:val="22"/>
-        </w:rPr>
-        <w:t xml:space="preserve">Writers and editors of public mental health content may treat the marker inventories in Appendices A and B as a descriptive map of resources already in use rather than as a template for production. Attention to permission statements, collective pronouns, and incremental progress lexis may help keep advocacy language from collapsing into empty positivity, provided the surrounding text still names difficulty where difficulty is present.</w:t>
+        <w:ind w:left="0" w:firstLine="720"/>
+        <w:jc w:val="both"/>
+      </w:pPr>
+      <w:r>
+        <w:rPr>
+          <w:rFonts w:ascii="Georgia" w:hAnsi="Georgia" w:eastAsia="Georgia" w:cs="Georgia"/>
+          <w:b w:val="0"/>
+          <w:i w:val="0"/>
+          <w:sz w:val="22"/>
+          <w:szCs w:val="22"/>
+        </w:rPr>
+        <w:t>Writers and editors of public mental health content may find the marker inventories in Appendices A and B useful as a descriptive map of resources already observed in this corpus. The inventories are not offered as production templates or as advice on how captions should be written.</w:t>
       </w:r>
     </w:p>
     <w:p>

</xml_diff>

<commit_message>
Embed direct corpus quotations in RAD (anonymized page/caption codes)
</commit_message>
<xml_diff>
--- a/thesis/Thesis_Instagram_MH_v15.docx
+++ b/thesis/Thesis_Instagram_MH_v15.docx
@@ -4727,24 +4727,24 @@
           <w:sz w:val="22"/>
           <w:szCs w:val="22"/>
         </w:rPr>
-        <w:t>These forms do more than give advice. Permission statements reframe help-seeking as legitimate. One caption states, “Every day won't look or feel perfect, and that's okay. Remember, it's okay to not be okay!” (P1_C2). The clause cancels a presumed requirement to appear fine. Directives assign present action. Another caption asks readers to “Join us this #MentalHealthAwarenessMonth by agreeing to #TakeTheMoment to prioritize your mental health” (P1_C5). Collective pronouns share agency. A myth-busting post opens with “Stop us if you’ve heard these mental health myths before” and then reframes public talk about illness (P2_C2). In Positive Discourse Analysis terms, such captions construct the reader as a capable actor and the community as one that backs that capacity (Martin, 2004).</w:t>
-      </w:r>
-    </w:p>
-    <w:p>
-      <w:pPr>
-        <w:spacing w:line="480" w:lineRule="auto" w:before="0" w:after="0"/>
-        <w:ind w:firstLine="720" w:left="0"/>
-        <w:jc w:val="both"/>
-      </w:pPr>
-      <w:r>
-        <w:rPr>
-          <w:rFonts w:ascii="Georgia" w:hAnsi="Georgia" w:eastAsia="Georgia" w:cs="Georgia"/>
-          <w:b w:val="0"/>
-          <w:i w:val="0"/>
-          <w:sz w:val="22"/>
-          <w:szCs w:val="22"/>
-        </w:rPr>
-        <w:t xml:space="preserve">The grammar of empowerment in this corpus is therefore not only motivational tone. It is a pattern of mood, person, and evaluation. Second-person address keeps the reader in the clause. Bare or lightly modalized imperatives keep the time of action near. Evaluative statements about what is okay or not required rework social norms that would otherwise block the recommended move. Those resources fit Instagram’s short caption space. They pack stance and action into a few lines that remain readable before the more cut-off.</w:t>
+        <w:t>These forms do more than give advice. Permission statements reframe help-seeking as legitimate. P1_C2 states, "Every day won't look or feel perfect, and that's okay. Remember, it's okay to not be okay!" The repeated it is okay / it's okay cancels a presumed requirement to appear fine. P2_C7 combines permission with a directive: "You don't have to be strong all the time. It's okay to ask for help." The first sentence removes a demand for continuous strength. The second names help-seeking as the authorized action. P6_C7 extends the same pattern into trauma talk: "Not everyone's trauma gives them thick skin. Sometimes, it makes us more sensitive and vulnerable. It's okay to feel deeply and acknowledge our experiences. Healing isn't about pretending to be strong; it's about embracing our journey and growing from it." Here healing is defined against pretended strength. Imperative and evaluative clauses work together to position the reader as allowed to feel and allowed to act.</w:t>
+      </w:r>
+    </w:p>
+    <w:p>
+      <w:pPr>
+        <w:spacing w:line="480" w:lineRule="auto" w:before="0" w:after="0"/>
+        <w:ind w:left="0" w:firstLine="720"/>
+        <w:jc w:val="both"/>
+      </w:pPr>
+      <w:r>
+        <w:rPr>
+          <w:rFonts w:ascii="Georgia" w:hAnsi="Georgia" w:eastAsia="Georgia" w:cs="Georgia"/>
+          <w:b w:val="0"/>
+          <w:i w:val="0"/>
+          <w:sz w:val="22"/>
+          <w:szCs w:val="22"/>
+        </w:rPr>
+        <w:t>The grammar of empowerment in this corpus is therefore not only motivational tone. It is a pattern of mood, person, and evaluation. Second-person address keeps the reader in the clause. P2_C3 uses a soft directive with inclusive care lexis: "This week, practice making a home for all the parts of you that need to be loved, even the difficult ones. Every part of you deserves love and care." Practice making a home frames self-relation as an action the reader can take this week. P2_C2 opens a myth-busting sequence with a collective imperative: "Stop us if you've heard these mental health myths before..." The we of stop us builds a shared stance against unreliable information before the post supplies corrected claims. Those resources fit Instagram's short caption space. They pack stance and action into lines that remain readable before the more cut-off.</w:t>
       </w:r>
     </w:p>
     <w:p>
@@ -5241,41 +5241,41 @@
           <w:sz w:val="22"/>
           <w:szCs w:val="22"/>
         </w:rPr>
-        <w:t>Grammatically, hope captions relied less on bare imperatives and more on declarative reassurance and predictive clauses. Incremental progress lexis scales recovery into units a reader can inhabit. One caption states, “Small steps lead to big progress. Focus on the little victories that pave the way for meaningful change” (P1_C4). A comment under that post echoes the same frame: “It is important to celebrate the ‘small’ steps forward! They can provide a source of hope as well” (P1_C4_X2). Future-oriented modality projects possibility. A crisis-oriented caption tells the reader, “You can get through this” after naming an anxiety loop (P2_C4). Another post in Suicide Prevention Month states, “If facing tomorrow feels impossible, please know you’re not alone. We hope you stay, and we want you to get the support you deserve” (P2_C5). Hope construction here is a package of time, modality, and evaluation rather than a single keyword of positivity.</w:t>
-      </w:r>
-    </w:p>
-    <w:p>
-      <w:pPr>
-        <w:spacing w:line="480" w:lineRule="auto" w:before="0" w:after="0"/>
-        <w:ind w:firstLine="720" w:left="0"/>
-        <w:jc w:val="both"/>
-      </w:pPr>
-      <w:r>
-        <w:rPr>
-          <w:rFonts w:ascii="Georgia" w:hAnsi="Georgia" w:eastAsia="Georgia" w:cs="Georgia"/>
-          <w:b w:val="0"/>
-          <w:i w:val="0"/>
-          <w:sz w:val="22"/>
-          <w:szCs w:val="22"/>
-        </w:rPr>
-        <w:t xml:space="preserve">That package matters for the study’s larger claim. Hope here is not the absence of struggle. Several hope captions named risk, exhaustion, or imperfect days before the projective clause arrived. The linguistic sequence often moves from problem to trajectory. The second move does not delete the first. It repositions it inside a longer time frame. Beelen and Karsay (2024) found that exposure to hopeful Instagram messages alone did not reliably raise hope in experimental conditions. The present analysis does not test effect. It shows how hope is built in the text when advocacy pages attempt that construction under platform constraints.</w:t>
-      </w:r>
-    </w:p>
-    <w:p>
-      <w:pPr>
+        <w:t>Grammatically, hope captions relied less on bare imperatives and more on declarative reassurance and predictive clauses. P1_C4 builds hope through incremental progress lexis: "Small steps lead to big progress. Focus on the little victories that pave the way for meaningful change." Small steps and little victories scale recovery into units a reader can inhabit when a full turnaround feels unavailable. A comment under that post takes up the same lexis: "It is important to celebrate the "small" steps forward! They can provide a source of hope as well." (P1_C4_X2). P2_C4 moves from problem naming to a modalized prediction: "When you get caught in an anxiety loop, it's easy to let hypotheticals bog down your mind. Reframing your "what ifs?" positively can help you stay grounded in those hard moments. You can get through this." You can get through this projects possibility without stating certainty as fact. P2_C6 affirms value under a suicide-prevention frame: "You deserve to live a life full of joy, peace, love, and adventure. This life is worth living." The life-worth declaration does evaluative work in a crisis context where that value is under pressure.</w:t>
+      </w:r>
+    </w:p>
+    <w:p>
+      <w:pPr>
+        <w:spacing w:line="480" w:lineRule="auto" w:before="0" w:after="0"/>
         <w:ind w:left="0" w:firstLine="720"/>
-        <w:spacing w:line="480" w:lineRule="auto" w:before="0" w:after="0"/>
-        <w:jc w:val="both"/>
-      </w:pPr>
-      <w:r>
-        <w:rPr>
-          <w:rFonts w:ascii="Georgia" w:hAnsi="Georgia" w:eastAsia="Georgia" w:cs="Georgia"/>
-          <w:b w:val="0"/>
-          <w:i w:val="0"/>
-          <w:sz w:val="22"/>
-          <w:szCs w:val="22"/>
-        </w:rPr>
-        <w:t>Two captions were coded BOTH because hope and empowerment signals carried comparable weight. One example pairs present-tense permission with trajectory talk: the text authorizes imperfect days and not being okay, then keeps recovery talk available through ongoing support language rather than a single directive (P1_C2). Stage 1 of coding marked both orientations present. Stage 2 could not demote either orientation without losing the caption’s main load. Permission and “okay to not be okay” authorize present vulnerability (empowerment). The forward look toward better days and continued support keeps a recovery line open (hope). The BOTH code records that coexistence. Writers can instruct or authorize present action and project a recoverable future in the same short post.</w:t>
+        <w:jc w:val="both"/>
+      </w:pPr>
+      <w:r>
+        <w:rPr>
+          <w:rFonts w:ascii="Georgia" w:hAnsi="Georgia" w:eastAsia="Georgia" w:cs="Georgia"/>
+          <w:b w:val="0"/>
+          <w:i w:val="0"/>
+          <w:sz w:val="22"/>
+          <w:szCs w:val="22"/>
+        </w:rPr>
+        <w:t>That package matters for the study's larger claim. Hope here is not the absence of struggle. P2_C5 names impossibility before support: "If facing tomorrow feels impossible, please know you're not alone. We hope you stay, and we want you to get the support you deserve." The sequence moves from crisis recognition to collective hope and a path to support. The second move does not delete the first. It repositions difficulty inside a longer time frame and a network of help. Beelen and Karsay (2024) found that exposure to hopeful Instagram messages alone did not reliably raise hope in experimental conditions. The present analysis does not test effect. It shows how hope is built in the caption text when advocacy pages attempt that construction under platform constraints.</w:t>
+      </w:r>
+    </w:p>
+    <w:p>
+      <w:pPr>
+        <w:ind w:left="0" w:firstLine="720"/>
+        <w:spacing w:line="480" w:lineRule="auto" w:before="0" w:after="0"/>
+        <w:jc w:val="both"/>
+      </w:pPr>
+      <w:r>
+        <w:rPr>
+          <w:rFonts w:ascii="Georgia" w:hAnsi="Georgia" w:eastAsia="Georgia" w:cs="Georgia"/>
+          <w:b w:val="0"/>
+          <w:i w:val="0"/>
+          <w:sz w:val="22"/>
+          <w:szCs w:val="22"/>
+        </w:rPr>
+        <w:t>Two captions were coded BOTH because hope and empowerment signals carried comparable weight. P1_C2 is a clear case: "Every day won't look or feel perfect, and that's okay. Remember, it's okay to not be okay!" Stage 1 marked empowerment present through permission statements that authorize imperfect days and not being okay. Stage 1 also marked hope present through the forward orientation implied by continuing under imperfect days rather than ending the story at distress. Stage 2 could not demote either orientation without losing the caption's main load. P2_C7 shows a similar blend in a shorter form: "You don't have to be strong all the time. It's okay to ask for help." Permission and the directive to ask for help authorize present action. The invitation to take a first step also projects a trajectory beyond the present moment. The BOTH code records that coexistence rather than forcing a false choice between the two orientations.</w:t>
       </w:r>
     </w:p>
     <w:p>
@@ -5713,7 +5713,7 @@
           <w:sz w:val="22"/>
           <w:szCs w:val="22"/>
         </w:rPr>
-        <w:t>Supportive comments often mirrored caption language at the level of lexis and stance. Under a myth-busting caption, one reply states, “Absolutely! There’s so much misinformation out there, that’s why education and open conversations are key” (P2_C2_X1). Another affirms, “Debunking myths like ‘mental illness is a sign of weakness’ is absolutely vital to fighting stigma” (P2_C2_X2). Under a hope-oriented line, a commenter writes, “Thank you for your kind words of encouragement… know that you have a beautiful gift in your soul” (P2_C4_X1). The linguistic work is alignment. Shared evaluation and short clauses keep the stance easy to scan in a fast-moving comment section.</w:t>
+        <w:t>Supportive comments often mirrored caption language at the level of lexis and stance. Under the myth-busting caption P2_C2, one reply states that "Debunking myths like 'mental illness is a sign of weakness' is absolutely vital to fighting stigma." (P2_C2_X2). The comment recycles the caption's anti-stigma evaluation in second-person public affirmation. Under the help-seeking caption P2_C7, a commenter reframes strength: "Such an important reminder—strength isn't never needing help, it's having the courage to reach out when you do." (P2_C7_X1). The reply keeps the caption's permission frame and sharpens it. Strength is redefined as reaching out. The linguistic work is alignment. Shared evaluation and short clauses keep the stance easy to scan in a fast-moving comment section.</w:t>
       </w:r>
     </w:p>
     <w:p>
@@ -5747,7 +5747,7 @@
           <w:sz w:val="22"/>
           <w:szCs w:val="22"/>
         </w:rPr>
-        <w:t>Personal narrative comments typically used first-person past or present forms. Under an open-conversation caption on schizophrenia awareness, one commenter writes, “My husband has schizophrenia, he is suicidal. He has completely lost touch with reality…” (P1_C3_X1). Under a progress caption, another reports family diagnosis and help-seeking: “My youngest was recently diagnosed with bi-polar 1. I’m taking the family to family class offered and educating myself the best I can” (P1_C5_X1). Grammatically, the narrative reply reintroduces an I who claims lived authority beside the caption’s generalized you. Solidarity is produced when someone places their own history in the public thread, not only when someone cheers from outside the experience.</w:t>
+        <w:t>Personal narrative comments typically used first-person past or present forms. Under an open-conversation caption, P1_C3_X1 reports ongoing crisis: "My husband has schizophrenia, he is suicidal. He has completely lost touch with reality and does not trust anyone at all." The I here is a caregiver speaking from inside an unfinished situation, not from a recovery endpoint. Under the suicide-prevention caption P2_C5, another commenter writes, "I've had a rough month with my depression. Hanging on by a thread." (P2_C5_X2). Under P2_C6, a different narrative places crisis in the past and support in the present: "I've had to call 988 once and thinking about that moment breaks me. I'm doing so much better and they did really help me gain my footing" (P2_C6_X2). Grammatically, these replies reintroduce an I who claims lived authority beside the caption's generalized you. Solidarity is produced when someone places their own history in the public thread, not only when someone cheers from outside the experience.</w:t>
       </w:r>
     </w:p>
     <w:p>

</xml_diff>

<commit_message>
Add sample corpus excerpts to Tables 3–6 for scannability
</commit_message>
<xml_diff>
--- a/thesis/Thesis_Instagram_MH_v15.docx
+++ b/thesis/Thesis_Instagram_MH_v15.docx
@@ -4361,7 +4361,7 @@
                 <w:i w:val="0"/>
                 <w:sz w:val="22"/>
               </w:rPr>
-              <w:t>Examples from the corpus</w:t>
+              <w:t>Sample excerpt from the corpus</w:t>
             </w:r>
           </w:p>
         </w:tc>
@@ -4441,7 +4441,7 @@
                 <w:i w:val="0"/>
                 <w:sz w:val="22"/>
               </w:rPr>
-              <w:t>ask for help; take the first step; prioritize your mental health; break the stigma</w:t>
+              <w:t>"It's okay to ask for help. Visit the link in our bio to take the first step." (P2_C7)</w:t>
             </w:r>
           </w:p>
         </w:tc>
@@ -4521,7 +4521,7 @@
                 <w:i w:val="0"/>
                 <w:sz w:val="22"/>
               </w:rPr>
-              <w:t>it is okay to ask for help; you do not have to be strong all the time</w:t>
+              <w:t>"Every day won't look or feel perfect, and that's okay. Remember, it's okay to not be okay!" (P1_C2)</w:t>
             </w:r>
           </w:p>
         </w:tc>
@@ -4575,7 +4575,7 @@
                 <w:i w:val="0"/>
                 <w:sz w:val="22"/>
               </w:rPr>
-              <w:t>Collective pronouns</w:t>
+              <w:t>Collective pronouns / shared stance</w:t>
             </w:r>
           </w:p>
         </w:tc>
@@ -4601,7 +4601,7 @@
                 <w:i w:val="0"/>
                 <w:sz w:val="22"/>
               </w:rPr>
-              <w:t>we have to; none of us have to take that action alone</w:t>
+              <w:t>"Stop us if you've heard these mental health myths before…" (P2_C2)</w:t>
             </w:r>
           </w:p>
         </w:tc>
@@ -4655,7 +4655,7 @@
                 <w:i w:val="0"/>
                 <w:sz w:val="22"/>
               </w:rPr>
-              <w:t>Myth-busting frames</w:t>
+              <w:t>Anti-pretend-strength framing</w:t>
             </w:r>
           </w:p>
         </w:tc>
@@ -4681,7 +4681,7 @@
                 <w:i w:val="0"/>
                 <w:sz w:val="22"/>
               </w:rPr>
-              <w:t>debunking myths; correcting misconceptions about estrangement</w:t>
+              <w:t>"Healing isn't about pretending to be strong; it's about embracing our journey and growing from it." (P6_C7)</w:t>
             </w:r>
           </w:p>
         </w:tc>
@@ -4707,7 +4707,7 @@
                 <w:i w:val="0"/>
                 <w:sz w:val="22"/>
               </w:rPr>
-              <w:t>Clears beliefs that block support-seeking</w:t>
+              <w:t>Clears norms that block support-seeking</w:t>
             </w:r>
           </w:p>
         </w:tc>
@@ -4875,7 +4875,7 @@
                 <w:i w:val="0"/>
                 <w:sz w:val="22"/>
               </w:rPr>
-              <w:t>Examples from the corpus</w:t>
+              <w:t>Sample excerpt from the corpus</w:t>
             </w:r>
           </w:p>
         </w:tc>
@@ -4955,7 +4955,7 @@
                 <w:i w:val="0"/>
                 <w:sz w:val="22"/>
               </w:rPr>
-              <w:t>small steps; little victories; progress and growth; not perfection</w:t>
+              <w:t>"Small steps lead to big progress. Focus on the little victories that pave the way for meaningful change." (P1_C4)</w:t>
             </w:r>
           </w:p>
         </w:tc>
@@ -5009,7 +5009,7 @@
                 <w:i w:val="0"/>
                 <w:sz w:val="22"/>
               </w:rPr>
-              <w:t>Future-oriented modality and prediction</w:t>
+              <w:t>Future-oriented modality</w:t>
             </w:r>
           </w:p>
         </w:tc>
@@ -5035,7 +5035,7 @@
                 <w:i w:val="0"/>
                 <w:sz w:val="22"/>
               </w:rPr>
-              <w:t>you can get through this; you will be ready for it when it comes</w:t>
+              <w:t>"You can get through this." (P2_C4)</w:t>
             </w:r>
           </w:p>
         </w:tc>
@@ -5115,7 +5115,7 @@
                 <w:i w:val="0"/>
                 <w:sz w:val="22"/>
               </w:rPr>
-              <w:t>this life is worth living; thank you for staying</w:t>
+              <w:t>"You deserve to live a life full of joy, peace, love, and adventure. This life is worth living." (P2_C6)</w:t>
             </w:r>
           </w:p>
         </w:tc>
@@ -5169,7 +5169,7 @@
                 <w:i w:val="0"/>
                 <w:sz w:val="22"/>
               </w:rPr>
-              <w:t>Temporal and aspectual framing</w:t>
+              <w:t>Crisis-to-trajectory sequence</w:t>
             </w:r>
           </w:p>
         </w:tc>
@@ -5195,7 +5195,7 @@
                 <w:i w:val="0"/>
                 <w:sz w:val="22"/>
               </w:rPr>
-              <w:t>step by step; when it comes; seasonal change metaphors</w:t>
+              <w:t>"If facing tomorrow feels impossible, please know you're not alone. We hope you stay…" (P2_C5)</w:t>
             </w:r>
           </w:p>
         </w:tc>
@@ -5221,7 +5221,7 @@
                 <w:i w:val="0"/>
                 <w:sz w:val="22"/>
               </w:rPr>
-              <w:t>Stretches the event line beyond the moment of reading</w:t>
+              <w:t>Stretches the event line beyond the hard moment</w:t>
             </w:r>
           </w:p>
         </w:tc>
@@ -5473,7 +5473,7 @@
                 <w:i w:val="0"/>
                 <w:sz w:val="22"/>
               </w:rPr>
-              <w:t>Main linguistic markers</w:t>
+              <w:t>Sample excerpt from the corpus</w:t>
             </w:r>
           </w:p>
         </w:tc>
@@ -5499,7 +5499,7 @@
                 <w:i w:val="0"/>
                 <w:sz w:val="22"/>
               </w:rPr>
-              <w:t>Typical function in the thread</w:t>
+              <w:t>Typical function</w:t>
             </w:r>
           </w:p>
         </w:tc>
@@ -5553,7 +5553,7 @@
                 <w:i w:val="0"/>
                 <w:sz w:val="22"/>
               </w:rPr>
-              <w:t>Empathy; validation; praise; short affirmation</w:t>
+              <w:t>"Strength isn't never needing help, it's having the courage to reach out when you do." (P2_C7_X1)</w:t>
             </w:r>
           </w:p>
         </w:tc>
@@ -5633,7 +5633,7 @@
                 <w:i w:val="0"/>
                 <w:sz w:val="22"/>
               </w:rPr>
-              <w:t>First-person past or present experience talk</w:t>
+              <w:t>"I've had a rough month with my depression. Hanging on by a thread." (P2_C5_X2)</w:t>
             </w:r>
           </w:p>
         </w:tc>
@@ -5929,7 +5929,7 @@
                 <w:i w:val="0"/>
                 <w:sz w:val="22"/>
               </w:rPr>
-              <w:t>Comment pattern observed</w:t>
+              <w:t>Sample comment uptake</w:t>
             </w:r>
           </w:p>
         </w:tc>
@@ -6009,7 +6009,7 @@
                 <w:i w:val="0"/>
                 <w:sz w:val="22"/>
               </w:rPr>
-              <w:t>Mostly supportive lexicon; some personal narrative</w:t>
+              <w:t>P2_C7 → P2_C7_X1 (help-seeking ratified as strength)</w:t>
             </w:r>
           </w:p>
         </w:tc>
@@ -6035,7 +6035,7 @@
                 <w:i w:val="0"/>
                 <w:sz w:val="22"/>
               </w:rPr>
-              <w:t>Agency in the caption is ratified as encouragement in the thread</w:t>
+              <w:t>Agency in the caption is ratified as encouragement</w:t>
             </w:r>
           </w:p>
         </w:tc>
@@ -6089,7 +6089,7 @@
                 <w:i w:val="0"/>
                 <w:sz w:val="22"/>
               </w:rPr>
-              <w:t>Supportive lexicon plus a higher share of personal narrative</w:t>
+              <w:t>P2_C5 → P2_C5_X2 (trajectory post met with ongoing struggle talk)</w:t>
             </w:r>
           </w:p>
         </w:tc>
@@ -6115,7 +6115,7 @@
                 <w:i w:val="0"/>
                 <w:sz w:val="22"/>
               </w:rPr>
-              <w:t>Trajectory talk opens space for both reassurance and disclosure</w:t>
+              <w:t>Trajectory talk opens space for reassurance and disclosure</w:t>
             </w:r>
           </w:p>
         </w:tc>
@@ -6169,7 +6169,7 @@
                 <w:i w:val="0"/>
                 <w:sz w:val="22"/>
               </w:rPr>
-              <w:t>Mostly supportive lexicon</w:t>
+              <w:t>P1_C2 → supportive and narrative replies both present</w:t>
             </w:r>
           </w:p>
         </w:tc>

</xml_diff>

<commit_message>
Tables 3-6: verbatim corpus phrases only (no page codes) for scannable examples
</commit_message>
<xml_diff>
--- a/thesis/Thesis_Instagram_MH_v15.docx
+++ b/thesis/Thesis_Instagram_MH_v15.docx
@@ -4441,7 +4441,7 @@
                 <w:i w:val="0"/>
                 <w:sz w:val="22"/>
               </w:rPr>
-              <w:t>"It's okay to ask for help. Visit the link in our bio to take the first step." (P2_C7)</w:t>
+              <w:t>It's okay to ask for help. … take the first step.</w:t>
             </w:r>
           </w:p>
         </w:tc>
@@ -4521,7 +4521,7 @@
                 <w:i w:val="0"/>
                 <w:sz w:val="22"/>
               </w:rPr>
-              <w:t>"Every day won't look or feel perfect, and that's okay. Remember, it's okay to not be okay!" (P1_C2)</w:t>
+              <w:t>Every day won't look or feel perfect, and that's okay. Remember, it's okay to not be okay!</w:t>
             </w:r>
           </w:p>
         </w:tc>
@@ -4601,7 +4601,7 @@
                 <w:i w:val="0"/>
                 <w:sz w:val="22"/>
               </w:rPr>
-              <w:t>"Stop us if you've heard these mental health myths before…" (P2_C2)</w:t>
+              <w:t>Stop us if you've heard these mental health myths before…</w:t>
             </w:r>
           </w:p>
         </w:tc>
@@ -4681,7 +4681,7 @@
                 <w:i w:val="0"/>
                 <w:sz w:val="22"/>
               </w:rPr>
-              <w:t>"Healing isn't about pretending to be strong; it's about embracing our journey and growing from it." (P6_C7)</w:t>
+              <w:t>Healing isn't about pretending to be strong; it's about embracing our journey and growing from it.</w:t>
             </w:r>
           </w:p>
         </w:tc>
@@ -4955,7 +4955,7 @@
                 <w:i w:val="0"/>
                 <w:sz w:val="22"/>
               </w:rPr>
-              <w:t>"Small steps lead to big progress. Focus on the little victories that pave the way for meaningful change." (P1_C4)</w:t>
+              <w:t>Small steps lead to big progress. Focus on the little victories that pave the way for meaningful change.</w:t>
             </w:r>
           </w:p>
         </w:tc>
@@ -5035,7 +5035,7 @@
                 <w:i w:val="0"/>
                 <w:sz w:val="22"/>
               </w:rPr>
-              <w:t>"You can get through this." (P2_C4)</w:t>
+              <w:t>You can get through this.</w:t>
             </w:r>
           </w:p>
         </w:tc>
@@ -5115,7 +5115,7 @@
                 <w:i w:val="0"/>
                 <w:sz w:val="22"/>
               </w:rPr>
-              <w:t>"You deserve to live a life full of joy, peace, love, and adventure. This life is worth living." (P2_C6)</w:t>
+              <w:t>You deserve to live a life full of joy, peace, love, and adventure. This life is worth living.</w:t>
             </w:r>
           </w:p>
         </w:tc>
@@ -5195,7 +5195,7 @@
                 <w:i w:val="0"/>
                 <w:sz w:val="22"/>
               </w:rPr>
-              <w:t>"If facing tomorrow feels impossible, please know you're not alone. We hope you stay…" (P2_C5)</w:t>
+              <w:t>If facing tomorrow feels impossible, please know you're not alone. We hope you stay, and we want you to get the support you deserve.</w:t>
             </w:r>
           </w:p>
         </w:tc>
@@ -5553,7 +5553,7 @@
                 <w:i w:val="0"/>
                 <w:sz w:val="22"/>
               </w:rPr>
-              <w:t>"Strength isn't never needing help, it's having the courage to reach out when you do." (P2_C7_X1)</w:t>
+              <w:t>Strength isn't never needing help, it's having the courage to reach out when you do.</w:t>
             </w:r>
           </w:p>
         </w:tc>
@@ -5633,7 +5633,7 @@
                 <w:i w:val="0"/>
                 <w:sz w:val="22"/>
               </w:rPr>
-              <w:t>"I've had a rough month with my depression. Hanging on by a thread." (P2_C5_X2)</w:t>
+              <w:t>I've had a rough month with my depression. Hanging on by a thread.</w:t>
             </w:r>
           </w:p>
         </w:tc>
@@ -5929,7 +5929,7 @@
                 <w:i w:val="0"/>
                 <w:sz w:val="22"/>
               </w:rPr>
-              <w:t>Sample comment uptake</w:t>
+              <w:t>Sample excerpt from the corpus</w:t>
             </w:r>
           </w:p>
         </w:tc>
@@ -6009,7 +6009,7 @@
                 <w:i w:val="0"/>
                 <w:sz w:val="22"/>
               </w:rPr>
-              <w:t>P2_C7 → P2_C7_X1 (help-seeking ratified as strength)</w:t>
+              <w:t>Caption: You don't have to be strong all the time. It's okay to ask for help. / Comment: Strength isn't never needing help, it's having the courage to reach out when you do.</w:t>
             </w:r>
           </w:p>
         </w:tc>
@@ -6089,7 +6089,7 @@
                 <w:i w:val="0"/>
                 <w:sz w:val="22"/>
               </w:rPr>
-              <w:t>P2_C5 → P2_C5_X2 (trajectory post met with ongoing struggle talk)</w:t>
+              <w:t>Caption: If facing tomorrow feels impossible, please know you're not alone. We hope you stay… / Comment: I've had a rough month with my depression. Hanging on by a thread.</w:t>
             </w:r>
           </w:p>
         </w:tc>
@@ -6169,7 +6169,7 @@
                 <w:i w:val="0"/>
                 <w:sz w:val="22"/>
               </w:rPr>
-              <w:t>P1_C2 → supportive and narrative replies both present</w:t>
+              <w:t>Caption: Every day won't look or feel perfect, and that's okay. Remember, it's okay to not be okay!</w:t>
             </w:r>
           </w:p>
         </w:tc>

</xml_diff>

<commit_message>
Remove corpus ID codes (P1_C2 etc.); use natural excerpt attribution
</commit_message>
<xml_diff>
--- a/thesis/Thesis_Instagram_MH_v15.docx
+++ b/thesis/Thesis_Instagram_MH_v15.docx
@@ -4727,7 +4727,7 @@
           <w:sz w:val="22"/>
           <w:szCs w:val="22"/>
         </w:rPr>
-        <w:t>These forms do more than give advice. Permission statements reframe help-seeking as legitimate. P1_C2 states, "Every day won't look or feel perfect, and that's okay. Remember, it's okay to not be okay!" The repeated it is okay / it's okay cancels a presumed requirement to appear fine. P2_C7 combines permission with a directive: "You don't have to be strong all the time. It's okay to ask for help." The first sentence removes a demand for continuous strength. The second names help-seeking as the authorized action. P6_C7 extends the same pattern into trauma talk: "Not everyone's trauma gives them thick skin. Sometimes, it makes us more sensitive and vulnerable. It's okay to feel deeply and acknowledge our experiences. Healing isn't about pretending to be strong; it's about embracing our journey and growing from it." Here healing is defined against pretended strength. Imperative and evaluative clauses work together to position the reader as allowed to feel and allowed to act.</w:t>
+        <w:t>These forms do more than give advice. Permission statements reframe help-seeking as legitimate. One caption states, "Every day won't look or feel perfect, and that's okay. Remember, it's okay to not be okay!" The repeated it is okay / it's okay cancels a presumed requirement to appear fine. Another combines permission with a directive: "You don't have to be strong all the time. It's okay to ask for help." The first sentence removes a demand for continuous strength. The second names help-seeking as the authorized action. A third extends the same pattern into trauma talk: "Healing isn't about pretending to be strong; it's about embracing our journey and growing from it." Here healing is defined against pretended strength. Imperative and evaluative clauses work together to position the reader as allowed to feel and allowed to act.</w:t>
       </w:r>
     </w:p>
     <w:p>
@@ -4744,7 +4744,7 @@
           <w:sz w:val="22"/>
           <w:szCs w:val="22"/>
         </w:rPr>
-        <w:t>The grammar of empowerment in this corpus is therefore not only motivational tone. It is a pattern of mood, person, and evaluation. Second-person address keeps the reader in the clause. P2_C3 uses a soft directive with inclusive care lexis: "This week, practice making a home for all the parts of you that need to be loved, even the difficult ones. Every part of you deserves love and care." Practice making a home frames self-relation as an action the reader can take this week. P2_C2 opens a myth-busting sequence with a collective imperative: "Stop us if you've heard these mental health myths before..." The we of stop us builds a shared stance against unreliable information before the post supplies corrected claims. Those resources fit Instagram's short caption space. They pack stance and action into lines that remain readable before the more cut-off.</w:t>
+        <w:t>The grammar of empowerment in this corpus is therefore not only motivational tone. It is a pattern of mood, person, and evaluation. Second-person address keeps the reader in the clause. One caption uses a soft directive with inclusive care lexis: "This week, practice making a home for all the parts of you that need to be loved, even the difficult ones. Every part of you deserves love and care." Practice making a home frames self-relation as an action the reader can take this week. Another opens a myth-busting sequence with a collective imperative: "Stop us if you've heard these mental health myths before…" The we of stop us builds a shared stance against unreliable information before the post supplies corrected claims. Those resources fit Instagram's short caption space. They pack stance and action into lines that remain readable before the more cut-off.</w:t>
       </w:r>
     </w:p>
     <w:p>
@@ -5241,7 +5241,7 @@
           <w:sz w:val="22"/>
           <w:szCs w:val="22"/>
         </w:rPr>
-        <w:t>Grammatically, hope captions relied less on bare imperatives and more on declarative reassurance and predictive clauses. P1_C4 builds hope through incremental progress lexis: "Small steps lead to big progress. Focus on the little victories that pave the way for meaningful change." Small steps and little victories scale recovery into units a reader can inhabit when a full turnaround feels unavailable. A comment under that post takes up the same lexis: "It is important to celebrate the "small" steps forward! They can provide a source of hope as well." (P1_C4_X2). P2_C4 moves from problem naming to a modalized prediction: "When you get caught in an anxiety loop, it's easy to let hypotheticals bog down your mind. Reframing your "what ifs?" positively can help you stay grounded in those hard moments. You can get through this." You can get through this projects possibility without stating certainty as fact. P2_C6 affirms value under a suicide-prevention frame: "You deserve to live a life full of joy, peace, love, and adventure. This life is worth living." The life-worth declaration does evaluative work in a crisis context where that value is under pressure.</w:t>
+        <w:t>Grammatically, hope captions relied less on bare imperatives and more on declarative reassurance and predictive clauses. One caption builds hope through incremental progress lexis: "Small steps lead to big progress. Focus on the little victories that pave the way for meaningful change." Small steps and little victories scale recovery into units a reader can inhabit when a full turnaround feels unavailable. A comment under that post takes up the same lexis: "It is important to celebrate the 'small' steps forward! They can provide a source of hope as well." Another caption moves from problem naming to a modalized prediction: "When you get caught in an anxiety loop… You can get through this." You can get through this projects possibility without stating certainty as fact. A suicide-prevention caption affirms value under crisis pressure: "You deserve to live a life full of joy, peace, love, and adventure. This life is worth living." The life-worth declaration does evaluative work where that value is contested.</w:t>
       </w:r>
     </w:p>
     <w:p>
@@ -5258,7 +5258,7 @@
           <w:sz w:val="22"/>
           <w:szCs w:val="22"/>
         </w:rPr>
-        <w:t>That package matters for the study's larger claim. Hope here is not the absence of struggle. P2_C5 names impossibility before support: "If facing tomorrow feels impossible, please know you're not alone. We hope you stay, and we want you to get the support you deserve." The sequence moves from crisis recognition to collective hope and a path to support. The second move does not delete the first. It repositions difficulty inside a longer time frame and a network of help. Beelen and Karsay (2024) found that exposure to hopeful Instagram messages alone did not reliably raise hope in experimental conditions. The present analysis does not test effect. It shows how hope is built in the caption text when advocacy pages attempt that construction under platform constraints.</w:t>
+        <w:t>That package matters for the study's larger claim. Hope here is not the absence of struggle. One caption names impossibility before support: "If facing tomorrow feels impossible, please know you're not alone. We hope you stay, and we want you to get the support you deserve." The sequence moves from crisis recognition to collective hope and a path to support. The second move does not delete the first. It repositions difficulty inside a longer time frame and a network of help. Beelen and Karsay (2024) found that exposure to hopeful Instagram messages alone did not reliably raise hope in experimental conditions. The present analysis does not test effect. It shows how hope is built in the caption text when advocacy pages attempt that construction under platform constraints.</w:t>
       </w:r>
     </w:p>
     <w:p>
@@ -5275,7 +5275,7 @@
           <w:sz w:val="22"/>
           <w:szCs w:val="22"/>
         </w:rPr>
-        <w:t>Two captions were coded BOTH because hope and empowerment signals carried comparable weight. P1_C2 is a clear case: "Every day won't look or feel perfect, and that's okay. Remember, it's okay to not be okay!" Stage 1 marked empowerment present through permission statements that authorize imperfect days and not being okay. Stage 1 also marked hope present through the forward orientation implied by continuing under imperfect days rather than ending the story at distress. Stage 2 could not demote either orientation without losing the caption's main load. P2_C7 shows a similar blend in a shorter form: "You don't have to be strong all the time. It's okay to ask for help." Permission and the directive to ask for help authorize present action. The invitation to take a first step also projects a trajectory beyond the present moment. The BOTH code records that coexistence rather than forcing a false choice between the two orientations.</w:t>
+        <w:t>Two captions were coded BOTH because hope and empowerment signals carried comparable weight. One clear case states, "Every day won't look or feel perfect, and that's okay. Remember, it's okay to not be okay!" Stage 1 marked empowerment present through permission statements that authorize imperfect days and not being okay. Stage 1 also marked hope present through the forward orientation implied by continuing under imperfect days rather than ending the story at distress. Stage 2 could not demote either orientation without losing the caption's main load. A shorter blend appears in "You don't have to be strong all the time. It's okay to ask for help." Permission and the directive to ask for help authorize present action. The invitation to take a first step also projects a trajectory beyond the present moment. The BOTH code records that coexistence rather than forcing a false choice between the two orientations.</w:t>
       </w:r>
     </w:p>
     <w:p>
@@ -5713,7 +5713,7 @@
           <w:sz w:val="22"/>
           <w:szCs w:val="22"/>
         </w:rPr>
-        <w:t>Supportive comments often mirrored caption language at the level of lexis and stance. Under the myth-busting caption P2_C2, one reply states that "Debunking myths like 'mental illness is a sign of weakness' is absolutely vital to fighting stigma." (P2_C2_X2). The comment recycles the caption's anti-stigma evaluation in second-person public affirmation. Under the help-seeking caption P2_C7, a commenter reframes strength: "Such an important reminder—strength isn't never needing help, it's having the courage to reach out when you do." (P2_C7_X1). The reply keeps the caption's permission frame and sharpens it. Strength is redefined as reaching out. The linguistic work is alignment. Shared evaluation and short clauses keep the stance easy to scan in a fast-moving comment section.</w:t>
+        <w:t>Supportive comments often mirrored caption language at the level of lexis and stance. Under a myth-busting caption, one reply states that "Debunking myths like 'mental illness is a sign of weakness' is absolutely vital to fighting stigma." The comment recycles the caption's anti-stigma evaluation in second-person public affirmation. Under a help-seeking caption, a commenter reframes strength: "Strength isn't never needing help, it's having the courage to reach out when you do." The reply keeps the caption's permission frame and sharpens it. Strength is redefined as reaching out. The linguistic work is alignment. Shared evaluation and short clauses keep the stance easy to scan in a fast-moving comment section.</w:t>
       </w:r>
     </w:p>
     <w:p>
@@ -5747,7 +5747,7 @@
           <w:sz w:val="22"/>
           <w:szCs w:val="22"/>
         </w:rPr>
-        <w:t>Personal narrative comments typically used first-person past or present forms. Under an open-conversation caption, P1_C3_X1 reports ongoing crisis: "My husband has schizophrenia, he is suicidal. He has completely lost touch with reality and does not trust anyone at all." The I here is a caregiver speaking from inside an unfinished situation, not from a recovery endpoint. Under the suicide-prevention caption P2_C5, another commenter writes, "I've had a rough month with my depression. Hanging on by a thread." (P2_C5_X2). Under P2_C6, a different narrative places crisis in the past and support in the present: "I've had to call 988 once and thinking about that moment breaks me. I'm doing so much better and they did really help me gain my footing" (P2_C6_X2). Grammatically, these replies reintroduce an I who claims lived authority beside the caption's generalized you. Solidarity is produced when someone places their own history in the public thread, not only when someone cheers from outside the experience.</w:t>
+        <w:t>Personal narrative comments typically used first-person past or present forms. Under an open-conversation caption, one commenter reports ongoing crisis: "My husband has schizophrenia, he is suicidal. He has completely lost touch with reality and does not trust anyone at all." The I here is a caregiver speaking from inside an unfinished situation, not from a recovery endpoint. Under a suicide-prevention caption, another writes, "I've had a rough month with my depression. Hanging on by a thread." A different narrative places crisis in the past and support in the present: "I've had to call 988 once and thinking about that moment breaks me. I'm doing so much better and they did really help me gain my footing." Grammatically, these replies reintroduce an I who claims lived authority beside the caption's generalized you. Solidarity is produced when someone places their own history in the public thread, not only when someone cheers from outside the experience.</w:t>
       </w:r>
     </w:p>
     <w:p>

</xml_diff>

<commit_message>
Add Appendix C: full anonymized corpus of 30 captions and 60 comments
</commit_message>
<xml_diff>
--- a/thesis/Thesis_Instagram_MH_v15.docx
+++ b/thesis/Thesis_Instagram_MH_v15.docx
@@ -3704,7 +3704,7 @@
           <w:i w:val="0"/>
           <w:sz w:val="22"/>
         </w:rPr>
-        <w:t>The final corpus comprises 30 English-language Instagram captions drawn from six anonymized public mental health advocacy pages (coded Page 1, Page 5, Page 7, Page 8/9, Page 10, and Page 11). Screening followed the eligibility rules in the research process. Posts were retained only when the caption addressed mental health awareness, support, coping, recovery, or advocacy, met the minimum engagement threshold confirmed by the researcher, and supplied at least two eligible comments. Five candidate posts were excluded as off-topic (caregiving campaign, weight-loss content, animal language, male sexual desire, and monogamy). Where a page exceeded the target share, collab and ambassador posts were set aside as spares. Spares were used only when needed to reach the corpus ceiling of 30. Two comments per caption were selected under the eligibility rule in Appendix B. Where comment options under a post were limited, the two comments closest to the eligibility rule were retained, even when the pool was thin. Page names and commenter identities are anonymized throughout. Eligible posts were published from September 2024 to December 2025. No cross-year comparison is performed.</w:t>
+        <w:t>The final corpus comprises 30 English-language Instagram captions drawn from six anonymized public mental health advocacy pages (coded Page 1, Page 5, Page 7, Page 8/9, Page 10, and Page 11). Screening followed the eligibility rules in the research process. Posts were retained only when the caption addressed mental health awareness, support, coping, recovery, or advocacy, met the minimum engagement threshold confirmed by the researcher, and supplied at least two eligible comments. Five candidate posts were excluded as off-topic (caregiving campaign, weight-loss content, animal language, male sexual desire, and monogamy). Where a page exceeded the target share, collab and ambassador posts were set aside as spares. Spares were used only when needed to reach the corpus ceiling of 30. Two comments per caption were selected under the eligibility rule in Appendix B. Where comment options under a post were limited, the two comments closest to the eligibility rule were retained, even when the pool was thin. Page names and commenter identities are anonymized throughout. Eligible posts were published from September 2024 to December 2025. No cross-year comparison is performed. The full caption and comment texts are presented in Appendix C.</w:t>
       </w:r>
     </w:p>
     <w:p>
@@ -8440,6 +8440,2016 @@
           <w:rFonts w:ascii="Georgia" w:hAnsi="Georgia" w:eastAsia="Georgia" w:cs="Georgia"/>
           <w:rtl w:val="0"/>
         </w:rPr>
+      </w:r>
+    </w:p>
+    <w:p>
+      <w:pPr>
+        <w:spacing w:line="480" w:lineRule="auto" w:before="240" w:after="0"/>
+        <w:jc w:val="left"/>
+      </w:pPr>
+      <w:r>
+        <w:rPr>
+          <w:rFonts w:ascii="Georgia" w:hAnsi="Georgia" w:eastAsia="Georgia" w:cs="Georgia"/>
+          <w:sz w:val="24"/>
+          <w:szCs w:val="24"/>
+          <w:b/>
+        </w:rPr>
+        <w:t xml:space="preserve">APPENDIX C: CORPUS OF CAPTIONS AND COMMENTS</w:t>
+      </w:r>
+    </w:p>
+    <w:p>
+      <w:pPr>
+        <w:spacing w:line="480" w:lineRule="auto" w:before="0" w:after="0"/>
+        <w:ind w:firstLine="720"/>
+        <w:jc w:val="both"/>
+      </w:pPr>
+      <w:r>
+        <w:rPr>
+          <w:rFonts w:ascii="Georgia" w:hAnsi="Georgia" w:eastAsia="Georgia" w:cs="Georgia"/>
+          <w:sz w:val="22"/>
+          <w:szCs w:val="22"/>
+        </w:rPr>
+        <w:t xml:space="preserve">This appendix presents the final corpus analyzed in the study for transparency. It comprises 30 English-language captions from six anonymized public mental health advocacy pages and two eligible comments under each caption (60 comments). Page identities are withheld. Labels identify unit type only: C marks a caption; X1 and X2 mark the first and second comment selected under that caption. Usernames and other direct personal identifiers in the source material were redacted where they appeared. Emoji and hashtags are retained when they formed part of the visible public text.</w:t>
+      </w:r>
+    </w:p>
+    <w:p>
+      <w:pPr>
+        <w:spacing w:line="480" w:lineRule="auto" w:before="0" w:after="0"/>
+        <w:ind w:firstLine="720"/>
+        <w:jc w:val="both"/>
+      </w:pPr>
+      <w:r>
+        <w:rPr>
+          <w:rFonts w:ascii="Georgia" w:hAnsi="Georgia" w:eastAsia="Georgia" w:cs="Georgia"/>
+          <w:sz w:val="22"/>
+          <w:b/>
+        </w:rPr>
+        <w:t xml:space="preserve">Caption 1 (Page 1). </w:t>
+      </w:r>
+      <w:r>
+        <w:rPr>
+          <w:rFonts w:ascii="Georgia" w:hAnsi="Georgia" w:eastAsia="Georgia" w:cs="Georgia"/>
+          <w:sz w:val="22"/>
+        </w:rPr>
+        <w:t xml:space="preserve">Art 🤝 Mental Health I’m so grateful to represent ████████ as an ambassador, and be here at NAMICon drawing live ✍️ I’ve met so many amazing people so far, and feel very lucky to have a platform where I can help destigmatize mental illness, and show others how art can be a therapeutic and helpful tool for navigating life. #mentalhealthawareness #artandmentalhealth #arttherapy</w:t>
+      </w:r>
+    </w:p>
+    <w:p>
+      <w:pPr>
+        <w:spacing w:line="480" w:lineRule="auto" w:before="0" w:after="0"/>
+        <w:ind w:firstLine="720"/>
+        <w:jc w:val="both"/>
+      </w:pPr>
+      <w:r>
+        <w:rPr>
+          <w:rFonts w:ascii="Georgia" w:hAnsi="Georgia" w:eastAsia="Georgia" w:cs="Georgia"/>
+          <w:sz w:val="22"/>
+          <w:b/>
+        </w:rPr>
+        <w:t xml:space="preserve">Comment 1 under Caption 1 (Page 1). </w:t>
+      </w:r>
+      <w:r>
+        <w:rPr>
+          <w:rFonts w:ascii="Georgia" w:hAnsi="Georgia" w:eastAsia="Georgia" w:cs="Georgia"/>
+          <w:sz w:val="22"/>
+        </w:rPr>
+        <w:t xml:space="preserve">We love the way you’re involving the audience in your art, what a great way to encourage community! We can’t wait to unveil your beautiful work on the Firehouse walls.</w:t>
+      </w:r>
+    </w:p>
+    <w:p>
+      <w:pPr>
+        <w:spacing w:line="480" w:lineRule="auto" w:before="0" w:after="0"/>
+        <w:ind w:firstLine="720"/>
+        <w:jc w:val="both"/>
+      </w:pPr>
+      <w:r>
+        <w:rPr>
+          <w:rFonts w:ascii="Georgia" w:hAnsi="Georgia" w:eastAsia="Georgia" w:cs="Georgia"/>
+          <w:sz w:val="22"/>
+          <w:b/>
+        </w:rPr>
+        <w:t xml:space="preserve">Comment 2 under Caption 1 (Page 1). </w:t>
+      </w:r>
+      <w:r>
+        <w:rPr>
+          <w:rFonts w:ascii="Georgia" w:hAnsi="Georgia" w:eastAsia="Georgia" w:cs="Georgia"/>
+          <w:sz w:val="22"/>
+        </w:rPr>
+        <w:t xml:space="preserve">Love this concept! The connection between art and mental health can be powerful!</w:t>
+      </w:r>
+    </w:p>
+    <w:p>
+      <w:pPr>
+        <w:spacing w:line="480" w:lineRule="auto" w:before="0" w:after="0"/>
+        <w:ind w:firstLine="720"/>
+        <w:jc w:val="both"/>
+      </w:pPr>
+      <w:r>
+        <w:rPr>
+          <w:rFonts w:ascii="Georgia" w:hAnsi="Georgia" w:eastAsia="Georgia" w:cs="Georgia"/>
+          <w:sz w:val="22"/>
+          <w:b/>
+        </w:rPr>
+        <w:t xml:space="preserve">Caption 2 (Page 1). </w:t>
+      </w:r>
+      <w:r>
+        <w:rPr>
+          <w:rFonts w:ascii="Georgia" w:hAnsi="Georgia" w:eastAsia="Georgia" w:cs="Georgia"/>
+          <w:sz w:val="22"/>
+        </w:rPr>
+        <w:t xml:space="preserve">Every day won't look or feel perfect, and that's okay. Remember, it's okay to not be okay!</w:t>
+      </w:r>
+    </w:p>
+    <w:p>
+      <w:pPr>
+        <w:spacing w:line="480" w:lineRule="auto" w:before="0" w:after="0"/>
+        <w:ind w:firstLine="720"/>
+        <w:jc w:val="both"/>
+      </w:pPr>
+      <w:r>
+        <w:rPr>
+          <w:rFonts w:ascii="Georgia" w:hAnsi="Georgia" w:eastAsia="Georgia" w:cs="Georgia"/>
+          <w:sz w:val="22"/>
+          <w:b/>
+        </w:rPr>
+        <w:t xml:space="preserve">Comment 1 under Caption 2 (Page 1). </w:t>
+      </w:r>
+      <w:r>
+        <w:rPr>
+          <w:rFonts w:ascii="Georgia" w:hAnsi="Georgia" w:eastAsia="Georgia" w:cs="Georgia"/>
+          <w:sz w:val="22"/>
+        </w:rPr>
+        <w:t xml:space="preserve">Tell someone! You don’t have to be alone! Be aware of those around you who might be suffering in silence. Wait with them...</w:t>
+      </w:r>
+    </w:p>
+    <w:p>
+      <w:pPr>
+        <w:spacing w:line="480" w:lineRule="auto" w:before="0" w:after="0"/>
+        <w:ind w:firstLine="720"/>
+        <w:jc w:val="both"/>
+      </w:pPr>
+      <w:r>
+        <w:rPr>
+          <w:rFonts w:ascii="Georgia" w:hAnsi="Georgia" w:eastAsia="Georgia" w:cs="Georgia"/>
+          <w:sz w:val="22"/>
+          <w:b/>
+        </w:rPr>
+        <w:t xml:space="preserve">Comment 2 under Caption 2 (Page 1). </w:t>
+      </w:r>
+      <w:r>
+        <w:rPr>
+          <w:rFonts w:ascii="Georgia" w:hAnsi="Georgia" w:eastAsia="Georgia" w:cs="Georgia"/>
+          <w:sz w:val="22"/>
+        </w:rPr>
+        <w:t xml:space="preserve">When she have episodes, times like this are so hard but we will keep pushing until her next better days.</w:t>
+      </w:r>
+    </w:p>
+    <w:p>
+      <w:pPr>
+        <w:spacing w:line="480" w:lineRule="auto" w:before="0" w:after="0"/>
+        <w:ind w:firstLine="720"/>
+        <w:jc w:val="both"/>
+      </w:pPr>
+      <w:r>
+        <w:rPr>
+          <w:rFonts w:ascii="Georgia" w:hAnsi="Georgia" w:eastAsia="Georgia" w:cs="Georgia"/>
+          <w:sz w:val="22"/>
+          <w:b/>
+        </w:rPr>
+        <w:t xml:space="preserve">Caption 3 (Page 1). </w:t>
+      </w:r>
+      <w:r>
+        <w:rPr>
+          <w:rFonts w:ascii="Georgia" w:hAnsi="Georgia" w:eastAsia="Georgia" w:cs="Georgia"/>
+          <w:sz w:val="22"/>
+        </w:rPr>
+        <w:t xml:space="preserve">Remember to be kind, to be patient, and don’t be afraid to have open conversations on #WorldSchizophreniaDay. It’s how we continue to destigmatize mental illness and help one another.</w:t>
+      </w:r>
+    </w:p>
+    <w:p>
+      <w:pPr>
+        <w:spacing w:line="480" w:lineRule="auto" w:before="0" w:after="0"/>
+        <w:ind w:firstLine="720"/>
+        <w:jc w:val="both"/>
+      </w:pPr>
+      <w:r>
+        <w:rPr>
+          <w:rFonts w:ascii="Georgia" w:hAnsi="Georgia" w:eastAsia="Georgia" w:cs="Georgia"/>
+          <w:sz w:val="22"/>
+          <w:b/>
+        </w:rPr>
+        <w:t xml:space="preserve">Comment 1 under Caption 3 (Page 1). </w:t>
+      </w:r>
+      <w:r>
+        <w:rPr>
+          <w:rFonts w:ascii="Georgia" w:hAnsi="Georgia" w:eastAsia="Georgia" w:cs="Georgia"/>
+          <w:sz w:val="22"/>
+        </w:rPr>
+        <w:t xml:space="preserve">My husband has schizophrenia, he is suicidal. He has completely lost touch with reality and does not trust anyone at all. At the moment we are trying to find him so he can be helped.</w:t>
+      </w:r>
+    </w:p>
+    <w:p>
+      <w:pPr>
+        <w:spacing w:line="480" w:lineRule="auto" w:before="0" w:after="0"/>
+        <w:ind w:firstLine="720"/>
+        <w:jc w:val="both"/>
+      </w:pPr>
+      <w:r>
+        <w:rPr>
+          <w:rFonts w:ascii="Georgia" w:hAnsi="Georgia" w:eastAsia="Georgia" w:cs="Georgia"/>
+          <w:sz w:val="22"/>
+          <w:b/>
+        </w:rPr>
+        <w:t xml:space="preserve">Comment 2 under Caption 3 (Page 1). </w:t>
+      </w:r>
+      <w:r>
+        <w:rPr>
+          <w:rFonts w:ascii="Georgia" w:hAnsi="Georgia" w:eastAsia="Georgia" w:cs="Georgia"/>
+          <w:sz w:val="22"/>
+        </w:rPr>
+        <w:t xml:space="preserve">Don't be afraid to have that conversation is 🙌🏻 That's a step towards obliterating stigma around health.</w:t>
+      </w:r>
+    </w:p>
+    <w:p>
+      <w:pPr>
+        <w:spacing w:line="480" w:lineRule="auto" w:before="0" w:after="0"/>
+        <w:ind w:firstLine="720"/>
+        <w:jc w:val="both"/>
+      </w:pPr>
+      <w:r>
+        <w:rPr>
+          <w:rFonts w:ascii="Georgia" w:hAnsi="Georgia" w:eastAsia="Georgia" w:cs="Georgia"/>
+          <w:sz w:val="22"/>
+          <w:b/>
+        </w:rPr>
+        <w:t xml:space="preserve">Caption 4 (Page 1). </w:t>
+      </w:r>
+      <w:r>
+        <w:rPr>
+          <w:rFonts w:ascii="Georgia" w:hAnsi="Georgia" w:eastAsia="Georgia" w:cs="Georgia"/>
+          <w:sz w:val="22"/>
+        </w:rPr>
+        <w:t xml:space="preserve">Small steps lead to big progress. Focus on the little victories that pave the way for meaningful change. #TakeAMentalHealthMoment #MentalHealthMonth</w:t>
+      </w:r>
+    </w:p>
+    <w:p>
+      <w:pPr>
+        <w:spacing w:line="480" w:lineRule="auto" w:before="0" w:after="0"/>
+        <w:ind w:firstLine="720"/>
+        <w:jc w:val="both"/>
+      </w:pPr>
+      <w:r>
+        <w:rPr>
+          <w:rFonts w:ascii="Georgia" w:hAnsi="Georgia" w:eastAsia="Georgia" w:cs="Georgia"/>
+          <w:sz w:val="22"/>
+          <w:b/>
+        </w:rPr>
+        <w:t xml:space="preserve">Comment 1 under Caption 4 (Page 1). </w:t>
+      </w:r>
+      <w:r>
+        <w:rPr>
+          <w:rFonts w:ascii="Georgia" w:hAnsi="Georgia" w:eastAsia="Georgia" w:cs="Georgia"/>
+          <w:sz w:val="22"/>
+        </w:rPr>
+        <w:t xml:space="preserve">Small steps everyday forever. Recovery and mental health is an ongoing effort.</w:t>
+      </w:r>
+    </w:p>
+    <w:p>
+      <w:pPr>
+        <w:spacing w:line="480" w:lineRule="auto" w:before="0" w:after="0"/>
+        <w:ind w:firstLine="720"/>
+        <w:jc w:val="both"/>
+      </w:pPr>
+      <w:r>
+        <w:rPr>
+          <w:rFonts w:ascii="Georgia" w:hAnsi="Georgia" w:eastAsia="Georgia" w:cs="Georgia"/>
+          <w:sz w:val="22"/>
+          <w:b/>
+        </w:rPr>
+        <w:t xml:space="preserve">Comment 2 under Caption 4 (Page 1). </w:t>
+      </w:r>
+      <w:r>
+        <w:rPr>
+          <w:rFonts w:ascii="Georgia" w:hAnsi="Georgia" w:eastAsia="Georgia" w:cs="Georgia"/>
+          <w:sz w:val="22"/>
+        </w:rPr>
+        <w:t xml:space="preserve">It is important to celebrate the “ small “ steps forward! They can provide a source of hope as well.</w:t>
+      </w:r>
+    </w:p>
+    <w:p>
+      <w:pPr>
+        <w:spacing w:line="480" w:lineRule="auto" w:before="0" w:after="0"/>
+        <w:ind w:firstLine="720"/>
+        <w:jc w:val="both"/>
+      </w:pPr>
+      <w:r>
+        <w:rPr>
+          <w:rFonts w:ascii="Georgia" w:hAnsi="Georgia" w:eastAsia="Georgia" w:cs="Georgia"/>
+          <w:sz w:val="22"/>
+          <w:b/>
+        </w:rPr>
+        <w:t xml:space="preserve">Caption 5 (Page 1). </w:t>
+      </w:r>
+      <w:r>
+        <w:rPr>
+          <w:rFonts w:ascii="Georgia" w:hAnsi="Georgia" w:eastAsia="Georgia" w:cs="Georgia"/>
+          <w:sz w:val="22"/>
+        </w:rPr>
+        <w:t xml:space="preserve">It's our favorite month of the year! Join us this #MentalHealthAwarenessMonth by agreeing to #TakeTheMoment to prioritize your mental health. Discover our range of signature programs and resources, including NAMI Basics, NAMI Family-to-Family, NAMI Homefront, and more! Learn more about getting engaged this month at nami.org/mham</w:t>
+      </w:r>
+    </w:p>
+    <w:p>
+      <w:pPr>
+        <w:spacing w:line="480" w:lineRule="auto" w:before="0" w:after="0"/>
+        <w:ind w:firstLine="720"/>
+        <w:jc w:val="both"/>
+      </w:pPr>
+      <w:r>
+        <w:rPr>
+          <w:rFonts w:ascii="Georgia" w:hAnsi="Georgia" w:eastAsia="Georgia" w:cs="Georgia"/>
+          <w:sz w:val="22"/>
+          <w:b/>
+        </w:rPr>
+        <w:t xml:space="preserve">Comment 1 under Caption 5 (Page 1). </w:t>
+      </w:r>
+      <w:r>
+        <w:rPr>
+          <w:rFonts w:ascii="Georgia" w:hAnsi="Georgia" w:eastAsia="Georgia" w:cs="Georgia"/>
+          <w:sz w:val="22"/>
+        </w:rPr>
+        <w:t xml:space="preserve">❤️ My youngest was recently diagnosed with bi-polar 1 I’m taking the family to family class offered and educating myself the best I can</w:t>
+      </w:r>
+    </w:p>
+    <w:p>
+      <w:pPr>
+        <w:spacing w:line="480" w:lineRule="auto" w:before="0" w:after="0"/>
+        <w:ind w:firstLine="720"/>
+        <w:jc w:val="both"/>
+      </w:pPr>
+      <w:r>
+        <w:rPr>
+          <w:rFonts w:ascii="Georgia" w:hAnsi="Georgia" w:eastAsia="Georgia" w:cs="Georgia"/>
+          <w:sz w:val="22"/>
+          <w:b/>
+        </w:rPr>
+        <w:t xml:space="preserve">Comment 2 under Caption 5 (Page 1). </w:t>
+      </w:r>
+      <w:r>
+        <w:rPr>
+          <w:rFonts w:ascii="Georgia" w:hAnsi="Georgia" w:eastAsia="Georgia" w:cs="Georgia"/>
+          <w:sz w:val="22"/>
+        </w:rPr>
+        <w:t xml:space="preserve">May I be blessed that I was once mentally ill, suicidal and ignorant of life, May I take the time this May to re-mind myself of just how lucky I am and offer my support to those that are not xxx #MentalHealthAwareness #MentalHealthMatters #SelfCare #Mindfulness #Spirituality #meditation #PersonalGrowth #Motivation #Inspiration #Anxiety #Depression #MindAndBody #awakening #kundalini #Mana #manampwr</w:t>
+      </w:r>
+    </w:p>
+    <w:p>
+      <w:pPr>
+        <w:spacing w:line="480" w:lineRule="auto" w:before="0" w:after="0"/>
+        <w:ind w:firstLine="720"/>
+        <w:jc w:val="both"/>
+      </w:pPr>
+      <w:r>
+        <w:rPr>
+          <w:rFonts w:ascii="Georgia" w:hAnsi="Georgia" w:eastAsia="Georgia" w:cs="Georgia"/>
+          <w:sz w:val="22"/>
+          <w:b/>
+        </w:rPr>
+        <w:t xml:space="preserve">Caption 6 (Page 1). </w:t>
+      </w:r>
+      <w:r>
+        <w:rPr>
+          <w:rFonts w:ascii="Georgia" w:hAnsi="Georgia" w:eastAsia="Georgia" w:cs="Georgia"/>
+          <w:sz w:val="22"/>
+        </w:rPr>
+        <w:t xml:space="preserve">Embrace your greatness unapologetically! It all starts with how we think and talk about ourselves.</w:t>
+      </w:r>
+    </w:p>
+    <w:p>
+      <w:pPr>
+        <w:spacing w:line="480" w:lineRule="auto" w:before="0" w:after="0"/>
+        <w:ind w:firstLine="720"/>
+        <w:jc w:val="both"/>
+      </w:pPr>
+      <w:r>
+        <w:rPr>
+          <w:rFonts w:ascii="Georgia" w:hAnsi="Georgia" w:eastAsia="Georgia" w:cs="Georgia"/>
+          <w:sz w:val="22"/>
+          <w:b/>
+        </w:rPr>
+        <w:t xml:space="preserve">Comment 1 under Caption 6 (Page 1). </w:t>
+      </w:r>
+      <w:r>
+        <w:rPr>
+          <w:rFonts w:ascii="Georgia" w:hAnsi="Georgia" w:eastAsia="Georgia" w:cs="Georgia"/>
+          <w:sz w:val="22"/>
+        </w:rPr>
+        <w:t xml:space="preserve">Speaking positively about ourselves helps boost self-esteem and self-confidence. When we acknowledge our strengths, accomplishments, and positive qualities, we reinforce a positive self-image and develop a greater sense of self-worth.</w:t>
+      </w:r>
+    </w:p>
+    <w:p>
+      <w:pPr>
+        <w:spacing w:line="480" w:lineRule="auto" w:before="0" w:after="0"/>
+        <w:ind w:firstLine="720"/>
+        <w:jc w:val="both"/>
+      </w:pPr>
+      <w:r>
+        <w:rPr>
+          <w:rFonts w:ascii="Georgia" w:hAnsi="Georgia" w:eastAsia="Georgia" w:cs="Georgia"/>
+          <w:sz w:val="22"/>
+          <w:b/>
+        </w:rPr>
+        <w:t xml:space="preserve">Comment 2 under Caption 6 (Page 1). </w:t>
+      </w:r>
+      <w:r>
+        <w:rPr>
+          <w:rFonts w:ascii="Georgia" w:hAnsi="Georgia" w:eastAsia="Georgia" w:cs="Georgia"/>
+          <w:sz w:val="22"/>
+        </w:rPr>
+        <w:t xml:space="preserve">Even if you don’t believe what you’re saying at first...keep doing it till it feels natural and true. If it worked for me, it can work for you.❤️</w:t>
+      </w:r>
+    </w:p>
+    <w:p>
+      <w:pPr>
+        <w:spacing w:line="480" w:lineRule="auto" w:before="0" w:after="0"/>
+        <w:ind w:firstLine="720"/>
+        <w:jc w:val="both"/>
+      </w:pPr>
+      <w:r>
+        <w:rPr>
+          <w:rFonts w:ascii="Georgia" w:hAnsi="Georgia" w:eastAsia="Georgia" w:cs="Georgia"/>
+          <w:sz w:val="22"/>
+          <w:b/>
+        </w:rPr>
+        <w:t xml:space="preserve">Caption 1 (Page 2). </w:t>
+      </w:r>
+      <w:r>
+        <w:rPr>
+          <w:rFonts w:ascii="Georgia" w:hAnsi="Georgia" w:eastAsia="Georgia" w:cs="Georgia"/>
+          <w:sz w:val="22"/>
+        </w:rPr>
+        <w:t xml:space="preserve">Change is natural. 🍂 Think about the changing seasons. Every fall, the leaves on the trees change color and eventually fall to the ground. In the winter, the trees rest. And when spring and summer return, they blossom again. As the leaves continue to change color and the days get a little crisper, remember that it’s okay if you’re changing, too. Whether you’re letting go of something that doesn’t serve you anymore or taking new actions for your mental health, change is okay. Remember: it’s about progress and growth, not perfection. Have a restful weekend, friends. 🧡</w:t>
+      </w:r>
+    </w:p>
+    <w:p>
+      <w:pPr>
+        <w:spacing w:line="480" w:lineRule="auto" w:before="0" w:after="0"/>
+        <w:ind w:firstLine="720"/>
+        <w:jc w:val="both"/>
+      </w:pPr>
+      <w:r>
+        <w:rPr>
+          <w:rFonts w:ascii="Georgia" w:hAnsi="Georgia" w:eastAsia="Georgia" w:cs="Georgia"/>
+          <w:sz w:val="22"/>
+          <w:b/>
+        </w:rPr>
+        <w:t xml:space="preserve">Comment 1 under Caption 1 (Page 2). </w:t>
+      </w:r>
+      <w:r>
+        <w:rPr>
+          <w:rFonts w:ascii="Georgia" w:hAnsi="Georgia" w:eastAsia="Georgia" w:cs="Georgia"/>
+          <w:sz w:val="22"/>
+        </w:rPr>
+        <w:t xml:space="preserve">Sometimes we reactively put up a fight to change when it can be as natural as the seasons 😌 thanks for that reminder 🍁🍂</w:t>
+      </w:r>
+    </w:p>
+    <w:p>
+      <w:pPr>
+        <w:spacing w:line="480" w:lineRule="auto" w:before="0" w:after="0"/>
+        <w:ind w:firstLine="720"/>
+        <w:jc w:val="both"/>
+      </w:pPr>
+      <w:r>
+        <w:rPr>
+          <w:rFonts w:ascii="Georgia" w:hAnsi="Georgia" w:eastAsia="Georgia" w:cs="Georgia"/>
+          <w:sz w:val="22"/>
+          <w:b/>
+        </w:rPr>
+        <w:t xml:space="preserve">Comment 2 under Caption 1 (Page 2). </w:t>
+      </w:r>
+      <w:r>
+        <w:rPr>
+          <w:rFonts w:ascii="Georgia" w:hAnsi="Georgia" w:eastAsia="Georgia" w:cs="Georgia"/>
+          <w:sz w:val="22"/>
+        </w:rPr>
+        <w:t xml:space="preserve">Such a beautiful reflection nature reminds us that change isn’t something to fear, it’s part of renewal. Letting go creates space for something new to grow. Here’s to embracing every season, even the ones that feel uncertain — they all have</w:t>
+      </w:r>
+    </w:p>
+    <w:p>
+      <w:pPr>
+        <w:spacing w:line="480" w:lineRule="auto" w:before="0" w:after="0"/>
+        <w:ind w:firstLine="720"/>
+        <w:jc w:val="both"/>
+      </w:pPr>
+      <w:r>
+        <w:rPr>
+          <w:rFonts w:ascii="Georgia" w:hAnsi="Georgia" w:eastAsia="Georgia" w:cs="Georgia"/>
+          <w:sz w:val="22"/>
+          <w:b/>
+        </w:rPr>
+        <w:t xml:space="preserve">Caption 2 (Page 2). </w:t>
+      </w:r>
+      <w:r>
+        <w:rPr>
+          <w:rFonts w:ascii="Georgia" w:hAnsi="Georgia" w:eastAsia="Georgia" w:cs="Georgia"/>
+          <w:sz w:val="22"/>
+        </w:rPr>
+        <w:t xml:space="preserve">Stop us if you’ve heard these mental health myths before... ☝️🤓 We’re living in a time where all the information in the world is just a few swipes away. But is that information always reliable? This #MentalIllnessAwarenessWeek, we’re debunking the mental health myths you’ve probably seen or heard with scientifically-backed research and data. We all have mental health - let’s keep talking about it.</w:t>
+      </w:r>
+    </w:p>
+    <w:p>
+      <w:pPr>
+        <w:spacing w:line="480" w:lineRule="auto" w:before="0" w:after="0"/>
+        <w:ind w:firstLine="720"/>
+        <w:jc w:val="both"/>
+      </w:pPr>
+      <w:r>
+        <w:rPr>
+          <w:rFonts w:ascii="Georgia" w:hAnsi="Georgia" w:eastAsia="Georgia" w:cs="Georgia"/>
+          <w:sz w:val="22"/>
+          <w:b/>
+        </w:rPr>
+        <w:t xml:space="preserve">Comment 1 under Caption 2 (Page 2). </w:t>
+      </w:r>
+      <w:r>
+        <w:rPr>
+          <w:rFonts w:ascii="Georgia" w:hAnsi="Georgia" w:eastAsia="Georgia" w:cs="Georgia"/>
+          <w:sz w:val="22"/>
+        </w:rPr>
+        <w:t xml:space="preserve">Absolutely! 👏 There’s so much misinformation out there, that’s why education and open conversations are key. The more we normalize real mental health facts, the more people get the help they deserve. 💙</w:t>
+      </w:r>
+    </w:p>
+    <w:p>
+      <w:pPr>
+        <w:spacing w:line="480" w:lineRule="auto" w:before="0" w:after="0"/>
+        <w:ind w:firstLine="720"/>
+        <w:jc w:val="both"/>
+      </w:pPr>
+      <w:r>
+        <w:rPr>
+          <w:rFonts w:ascii="Georgia" w:hAnsi="Georgia" w:eastAsia="Georgia" w:cs="Georgia"/>
+          <w:sz w:val="22"/>
+          <w:b/>
+        </w:rPr>
+        <w:t xml:space="preserve">Comment 2 under Caption 2 (Page 2). </w:t>
+      </w:r>
+      <w:r>
+        <w:rPr>
+          <w:rFonts w:ascii="Georgia" w:hAnsi="Georgia" w:eastAsia="Georgia" w:cs="Georgia"/>
+          <w:sz w:val="22"/>
+        </w:rPr>
+        <w:t xml:space="preserve">We are so with you on this! Debunking myths like 'mental illness is a sign of weakness' is absolutely vital to fighting stigma. Thank you for reminding everyone to seek out science backed facts and keep talking about it.</w:t>
+      </w:r>
+    </w:p>
+    <w:p>
+      <w:pPr>
+        <w:spacing w:line="480" w:lineRule="auto" w:before="0" w:after="0"/>
+        <w:ind w:firstLine="720"/>
+        <w:jc w:val="both"/>
+      </w:pPr>
+      <w:r>
+        <w:rPr>
+          <w:rFonts w:ascii="Georgia" w:hAnsi="Georgia" w:eastAsia="Georgia" w:cs="Georgia"/>
+          <w:sz w:val="22"/>
+          <w:b/>
+        </w:rPr>
+        <w:t xml:space="preserve">Caption 3 (Page 2). </w:t>
+      </w:r>
+      <w:r>
+        <w:rPr>
+          <w:rFonts w:ascii="Georgia" w:hAnsi="Georgia" w:eastAsia="Georgia" w:cs="Georgia"/>
+          <w:sz w:val="22"/>
+        </w:rPr>
+        <w:t xml:space="preserve">This week, practice making a home for all the parts of you that need to be loved, even the difficult ones. Every part of you deserves love and care. 🧡</w:t>
+      </w:r>
+    </w:p>
+    <w:p>
+      <w:pPr>
+        <w:spacing w:line="480" w:lineRule="auto" w:before="0" w:after="0"/>
+        <w:ind w:firstLine="720"/>
+        <w:jc w:val="both"/>
+      </w:pPr>
+      <w:r>
+        <w:rPr>
+          <w:rFonts w:ascii="Georgia" w:hAnsi="Georgia" w:eastAsia="Georgia" w:cs="Georgia"/>
+          <w:sz w:val="22"/>
+          <w:b/>
+        </w:rPr>
+        <w:t xml:space="preserve">Comment 1 under Caption 3 (Page 2). </w:t>
+      </w:r>
+      <w:r>
+        <w:rPr>
+          <w:rFonts w:ascii="Georgia" w:hAnsi="Georgia" w:eastAsia="Georgia" w:cs="Georgia"/>
+          <w:sz w:val="22"/>
+        </w:rPr>
+        <w:t xml:space="preserve">Each chapter of who you are is worthy of care and compassion 💕🌱 Growth doesn’t erase your past, it teaches you to love it too.</w:t>
+      </w:r>
+    </w:p>
+    <w:p>
+      <w:pPr>
+        <w:spacing w:line="480" w:lineRule="auto" w:before="0" w:after="0"/>
+        <w:ind w:firstLine="720"/>
+        <w:jc w:val="both"/>
+      </w:pPr>
+      <w:r>
+        <w:rPr>
+          <w:rFonts w:ascii="Georgia" w:hAnsi="Georgia" w:eastAsia="Georgia" w:cs="Georgia"/>
+          <w:sz w:val="22"/>
+          <w:b/>
+        </w:rPr>
+        <w:t xml:space="preserve">Comment 2 under Caption 3 (Page 2). </w:t>
+      </w:r>
+      <w:r>
+        <w:rPr>
+          <w:rFonts w:ascii="Georgia" w:hAnsi="Georgia" w:eastAsia="Georgia" w:cs="Georgia"/>
+          <w:sz w:val="22"/>
+        </w:rPr>
+        <w:t xml:space="preserve">Even the messy, difficult parts of us need compassion. Learning to love all of ourselves is where real healing starts</w:t>
+      </w:r>
+    </w:p>
+    <w:p>
+      <w:pPr>
+        <w:spacing w:line="480" w:lineRule="auto" w:before="0" w:after="0"/>
+        <w:ind w:firstLine="720"/>
+        <w:jc w:val="both"/>
+      </w:pPr>
+      <w:r>
+        <w:rPr>
+          <w:rFonts w:ascii="Georgia" w:hAnsi="Georgia" w:eastAsia="Georgia" w:cs="Georgia"/>
+          <w:sz w:val="22"/>
+          <w:b/>
+        </w:rPr>
+        <w:t xml:space="preserve">Caption 4 (Page 2). </w:t>
+      </w:r>
+      <w:r>
+        <w:rPr>
+          <w:rFonts w:ascii="Georgia" w:hAnsi="Georgia" w:eastAsia="Georgia" w:cs="Georgia"/>
+          <w:sz w:val="22"/>
+        </w:rPr>
+        <w:t xml:space="preserve">When you get caught in an anxiety loop, it’s easy to let hypotheticals bog down your mind. Reframing your “what ifs?” positively can help you stay grounded in those hard moments. You can get through this. 🧡</w:t>
+      </w:r>
+    </w:p>
+    <w:p>
+      <w:pPr>
+        <w:spacing w:line="480" w:lineRule="auto" w:before="0" w:after="0"/>
+        <w:ind w:firstLine="720"/>
+        <w:jc w:val="both"/>
+      </w:pPr>
+      <w:r>
+        <w:rPr>
+          <w:rFonts w:ascii="Georgia" w:hAnsi="Georgia" w:eastAsia="Georgia" w:cs="Georgia"/>
+          <w:sz w:val="22"/>
+          <w:b/>
+        </w:rPr>
+        <w:t xml:space="preserve">Comment 1 under Caption 4 (Page 2). </w:t>
+      </w:r>
+      <w:r>
+        <w:rPr>
+          <w:rFonts w:ascii="Georgia" w:hAnsi="Georgia" w:eastAsia="Georgia" w:cs="Georgia"/>
+          <w:sz w:val="22"/>
+        </w:rPr>
+        <w:t xml:space="preserve">Thank you for your kind words of encouragement it can and will work out to the person reading this know that you have a beautiful gift in your soul that you can share and shine in the world to illuminate it with your kind heart</w:t>
+      </w:r>
+    </w:p>
+    <w:p>
+      <w:pPr>
+        <w:spacing w:line="480" w:lineRule="auto" w:before="0" w:after="0"/>
+        <w:ind w:firstLine="720"/>
+        <w:jc w:val="both"/>
+      </w:pPr>
+      <w:r>
+        <w:rPr>
+          <w:rFonts w:ascii="Georgia" w:hAnsi="Georgia" w:eastAsia="Georgia" w:cs="Georgia"/>
+          <w:sz w:val="22"/>
+          <w:b/>
+        </w:rPr>
+        <w:t xml:space="preserve">Comment 2 under Caption 4 (Page 2). </w:t>
+      </w:r>
+      <w:r>
+        <w:rPr>
+          <w:rFonts w:ascii="Georgia" w:hAnsi="Georgia" w:eastAsia="Georgia" w:cs="Georgia"/>
+          <w:sz w:val="22"/>
+        </w:rPr>
+        <w:t xml:space="preserve">Thank you for bringing this up—it’s such an important reminder. After 23 years in mental health and working with high performing clients, I’ve seen how anxiety loops drain both focus and energy. In my private practice, I often guide clients to reframe ‘what if’ thinking into ‘even if’ or ‘what’s within my control.’ That simple shift interrupts the cycle and brings the mind back to the present. Reframing isn’t about ignoring fear—it’s about reclaiming agency</w:t>
+      </w:r>
+    </w:p>
+    <w:p>
+      <w:pPr>
+        <w:spacing w:line="480" w:lineRule="auto" w:before="0" w:after="0"/>
+        <w:ind w:firstLine="720"/>
+        <w:jc w:val="both"/>
+      </w:pPr>
+      <w:r>
+        <w:rPr>
+          <w:rFonts w:ascii="Georgia" w:hAnsi="Georgia" w:eastAsia="Georgia" w:cs="Georgia"/>
+          <w:sz w:val="22"/>
+          <w:b/>
+        </w:rPr>
+        <w:t xml:space="preserve">Caption 5 (Page 2). </w:t>
+      </w:r>
+      <w:r>
+        <w:rPr>
+          <w:rFonts w:ascii="Georgia" w:hAnsi="Georgia" w:eastAsia="Georgia" w:cs="Georgia"/>
+          <w:sz w:val="22"/>
+        </w:rPr>
+        <w:t xml:space="preserve">If facing tomorrow feels impossible, please know you’re not alone. We hope you stay, and we want you to get the support you deserve. As Suicide Prevention Month kicks off this September, Mental Health America and To Write Love on Her Arms want you to know that there are places to turn when the heaviness feels unbearable. Mental Health America’s free and confidential online mental health tests can help you understand what you’re experiencing and will walk you step by step through what it looks like to ask for help, and ████████’s crisis resource page can help you find a comprehensive list of places to turn in a moment of need. Find these resources and more at the 🔗 in our bio.</w:t>
+      </w:r>
+    </w:p>
+    <w:p>
+      <w:pPr>
+        <w:spacing w:line="480" w:lineRule="auto" w:before="0" w:after="0"/>
+        <w:ind w:firstLine="720"/>
+        <w:jc w:val="both"/>
+      </w:pPr>
+      <w:r>
+        <w:rPr>
+          <w:rFonts w:ascii="Georgia" w:hAnsi="Georgia" w:eastAsia="Georgia" w:cs="Georgia"/>
+          <w:sz w:val="22"/>
+          <w:b/>
+        </w:rPr>
+        <w:t xml:space="preserve">Comment 1 under Caption 5 (Page 2). </w:t>
+      </w:r>
+      <w:r>
+        <w:rPr>
+          <w:rFonts w:ascii="Georgia" w:hAnsi="Georgia" w:eastAsia="Georgia" w:cs="Georgia"/>
+          <w:sz w:val="22"/>
+        </w:rPr>
+        <w:t xml:space="preserve">We believe healing can begin in connection, whether through community, the water, or simply reaching out for support.</w:t>
+      </w:r>
+    </w:p>
+    <w:p>
+      <w:pPr>
+        <w:spacing w:line="480" w:lineRule="auto" w:before="0" w:after="0"/>
+        <w:ind w:firstLine="720"/>
+        <w:jc w:val="both"/>
+      </w:pPr>
+      <w:r>
+        <w:rPr>
+          <w:rFonts w:ascii="Georgia" w:hAnsi="Georgia" w:eastAsia="Georgia" w:cs="Georgia"/>
+          <w:sz w:val="22"/>
+          <w:b/>
+        </w:rPr>
+        <w:t xml:space="preserve">Comment 2 under Caption 5 (Page 2). </w:t>
+      </w:r>
+      <w:r>
+        <w:rPr>
+          <w:rFonts w:ascii="Georgia" w:hAnsi="Georgia" w:eastAsia="Georgia" w:cs="Georgia"/>
+          <w:sz w:val="22"/>
+        </w:rPr>
+        <w:t xml:space="preserve">I've had a rough month with my depression. Hanging on by a thread. Then I get a letter that my phycologist is retiring. UGH It's been one thing after another 😳</w:t>
+      </w:r>
+    </w:p>
+    <w:p>
+      <w:pPr>
+        <w:spacing w:line="480" w:lineRule="auto" w:before="0" w:after="0"/>
+        <w:ind w:firstLine="720"/>
+        <w:jc w:val="both"/>
+      </w:pPr>
+      <w:r>
+        <w:rPr>
+          <w:rFonts w:ascii="Georgia" w:hAnsi="Georgia" w:eastAsia="Georgia" w:cs="Georgia"/>
+          <w:sz w:val="22"/>
+          <w:b/>
+        </w:rPr>
+        <w:t xml:space="preserve">Caption 6 (Page 2). </w:t>
+      </w:r>
+      <w:r>
+        <w:rPr>
+          <w:rFonts w:ascii="Georgia" w:hAnsi="Georgia" w:eastAsia="Georgia" w:cs="Georgia"/>
+          <w:sz w:val="22"/>
+        </w:rPr>
+        <w:t xml:space="preserve">Content warning: This post discusses suicide. You deserve to live a life full of joy, peace, love, and adventure. This life is worth living. Each September, #SuicidePreventionMonth calls on each of us to consider our role in preventing suicide and to raise awareness of available resources and support options, like @988lifeline and @crisistextline. If you’re struggling with your mental health and you’re not sure where to start, taking a mental health test is a gentle first step. Mental Health America’s free and anonymous online tests can help you understand what you’re experiencing and what steps you can take before you reach a point of crisis. Take a test today at the 🔗 in our bio. If you or someone you know is in crisis, please know that help is available. Call or text 988 or chat online at 988lifeline.org. You can also reach a trained counselor at Crisis Text Line by texting HOME to 741741. Thank you for staying. 🧡</w:t>
+      </w:r>
+    </w:p>
+    <w:p>
+      <w:pPr>
+        <w:spacing w:line="480" w:lineRule="auto" w:before="0" w:after="0"/>
+        <w:ind w:firstLine="720"/>
+        <w:jc w:val="both"/>
+      </w:pPr>
+      <w:r>
+        <w:rPr>
+          <w:rFonts w:ascii="Georgia" w:hAnsi="Georgia" w:eastAsia="Georgia" w:cs="Georgia"/>
+          <w:sz w:val="22"/>
+          <w:b/>
+        </w:rPr>
+        <w:t xml:space="preserve">Comment 1 under Caption 6 (Page 2). </w:t>
+      </w:r>
+      <w:r>
+        <w:rPr>
+          <w:rFonts w:ascii="Georgia" w:hAnsi="Georgia" w:eastAsia="Georgia" w:cs="Georgia"/>
+          <w:sz w:val="22"/>
+        </w:rPr>
+        <w:t xml:space="preserve">It will be 5 years ago next Monday since I almost died and my daughter did CPR and saved my life ❤️ I’m grateful for every single day and thankful I’ve learned so much about myself and the importance of mental health!! Thank you for being here ❤️</w:t>
+      </w:r>
+    </w:p>
+    <w:p>
+      <w:pPr>
+        <w:spacing w:line="480" w:lineRule="auto" w:before="0" w:after="0"/>
+        <w:ind w:firstLine="720"/>
+        <w:jc w:val="both"/>
+      </w:pPr>
+      <w:r>
+        <w:rPr>
+          <w:rFonts w:ascii="Georgia" w:hAnsi="Georgia" w:eastAsia="Georgia" w:cs="Georgia"/>
+          <w:sz w:val="22"/>
+          <w:b/>
+        </w:rPr>
+        <w:t xml:space="preserve">Comment 2 under Caption 6 (Page 2). </w:t>
+      </w:r>
+      <w:r>
+        <w:rPr>
+          <w:rFonts w:ascii="Georgia" w:hAnsi="Georgia" w:eastAsia="Georgia" w:cs="Georgia"/>
+          <w:sz w:val="22"/>
+        </w:rPr>
+        <w:t xml:space="preserve">I’ve had to call 988 once and thinking about that moment breaks me. I’m doing so much better and they did really help me gain my footing</w:t>
+      </w:r>
+    </w:p>
+    <w:p>
+      <w:pPr>
+        <w:spacing w:line="480" w:lineRule="auto" w:before="0" w:after="0"/>
+        <w:ind w:firstLine="720"/>
+        <w:jc w:val="both"/>
+      </w:pPr>
+      <w:r>
+        <w:rPr>
+          <w:rFonts w:ascii="Georgia" w:hAnsi="Georgia" w:eastAsia="Georgia" w:cs="Georgia"/>
+          <w:sz w:val="22"/>
+          <w:b/>
+        </w:rPr>
+        <w:t xml:space="preserve">Caption 7 (Page 2). </w:t>
+      </w:r>
+      <w:r>
+        <w:rPr>
+          <w:rFonts w:ascii="Georgia" w:hAnsi="Georgia" w:eastAsia="Georgia" w:cs="Georgia"/>
+          <w:sz w:val="22"/>
+        </w:rPr>
+        <w:t xml:space="preserve">You don’t have to be strong all the time. It’s okay to ask for help. Visit the 🔗 in our bio to take the first step.</w:t>
+      </w:r>
+    </w:p>
+    <w:p>
+      <w:pPr>
+        <w:spacing w:line="480" w:lineRule="auto" w:before="0" w:after="0"/>
+        <w:ind w:firstLine="720"/>
+        <w:jc w:val="both"/>
+      </w:pPr>
+      <w:r>
+        <w:rPr>
+          <w:rFonts w:ascii="Georgia" w:hAnsi="Georgia" w:eastAsia="Georgia" w:cs="Georgia"/>
+          <w:sz w:val="22"/>
+          <w:b/>
+        </w:rPr>
+        <w:t xml:space="preserve">Comment 1 under Caption 7 (Page 2). </w:t>
+      </w:r>
+      <w:r>
+        <w:rPr>
+          <w:rFonts w:ascii="Georgia" w:hAnsi="Georgia" w:eastAsia="Georgia" w:cs="Georgia"/>
+          <w:sz w:val="22"/>
+        </w:rPr>
+        <w:t xml:space="preserve">Such an important reminder—strength isn’t never needing help, it’s having the courage to reach out when you do.</w:t>
+      </w:r>
+    </w:p>
+    <w:p>
+      <w:pPr>
+        <w:spacing w:line="480" w:lineRule="auto" w:before="0" w:after="0"/>
+        <w:ind w:firstLine="720"/>
+        <w:jc w:val="both"/>
+      </w:pPr>
+      <w:r>
+        <w:rPr>
+          <w:rFonts w:ascii="Georgia" w:hAnsi="Georgia" w:eastAsia="Georgia" w:cs="Georgia"/>
+          <w:sz w:val="22"/>
+          <w:b/>
+        </w:rPr>
+        <w:t xml:space="preserve">Comment 2 under Caption 7 (Page 2). </w:t>
+      </w:r>
+      <w:r>
+        <w:rPr>
+          <w:rFonts w:ascii="Georgia" w:hAnsi="Georgia" w:eastAsia="Georgia" w:cs="Georgia"/>
+          <w:sz w:val="22"/>
+        </w:rPr>
+        <w:t xml:space="preserve">Thank you for sharing. So true. Healing happens in connection. Co-regulation reminds us that leaning on others is not weakness but part of the process.</w:t>
+      </w:r>
+    </w:p>
+    <w:p>
+      <w:pPr>
+        <w:spacing w:line="480" w:lineRule="auto" w:before="0" w:after="0"/>
+        <w:ind w:firstLine="720"/>
+        <w:jc w:val="both"/>
+      </w:pPr>
+      <w:r>
+        <w:rPr>
+          <w:rFonts w:ascii="Georgia" w:hAnsi="Georgia" w:eastAsia="Georgia" w:cs="Georgia"/>
+          <w:sz w:val="22"/>
+          <w:b/>
+        </w:rPr>
+        <w:t xml:space="preserve">Caption 1 (Page 3). </w:t>
+      </w:r>
+      <w:r>
+        <w:rPr>
+          <w:rFonts w:ascii="Georgia" w:hAnsi="Georgia" w:eastAsia="Georgia" w:cs="Georgia"/>
+          <w:sz w:val="22"/>
+        </w:rPr>
+        <w:t xml:space="preserve">"For many dads in psychotherapy—captains of industry, adrift at sea, or steering domestic waters their fathers never charted—fatherhood triggers an old standing order: You earn, therefore you are," explains clinical psychologist Jett Stone, Ph.D. This can become tunnel vision and negatively affect key relationships. Labeling the problem, sharing the numbers, and challenging the provider myth together can help partners get back on track. How does the male provider myth relate to your experience? Tell us in the comments. 💭 Do you know someone who might like to read this? Share it with them. 👀 Click the link in our bio to read more. Image credit: apghedia / Shutterstock #psychology #relationships #mentalhealth #fathers</w:t>
+      </w:r>
+    </w:p>
+    <w:p>
+      <w:pPr>
+        <w:spacing w:line="480" w:lineRule="auto" w:before="0" w:after="0"/>
+        <w:ind w:firstLine="720"/>
+        <w:jc w:val="both"/>
+      </w:pPr>
+      <w:r>
+        <w:rPr>
+          <w:rFonts w:ascii="Georgia" w:hAnsi="Georgia" w:eastAsia="Georgia" w:cs="Georgia"/>
+          <w:sz w:val="22"/>
+          <w:b/>
+        </w:rPr>
+        <w:t xml:space="preserve">Comment 1 under Caption 1 (Page 3). </w:t>
+      </w:r>
+      <w:r>
+        <w:rPr>
+          <w:rFonts w:ascii="Georgia" w:hAnsi="Georgia" w:eastAsia="Georgia" w:cs="Georgia"/>
+          <w:sz w:val="22"/>
+        </w:rPr>
+        <w:t xml:space="preserve">For a long time, I didn’t give much thought to the provider role, which later contributed to relationship difficulties. At the same time, I’ve seen many examples of how an excessive “provider” mindset can be socially and personally damaging: the pursuit of material wealth in self-destructive ways, or at the expense of close human relationships. Today, I’m seeking a healthy balance. I do have some disadvantages, and I often experience that in dating, material circumstances (car, housing, income) become a more critical factor than emotional safety, the quality of connection, or mutual growth.</w:t>
+      </w:r>
+    </w:p>
+    <w:p>
+      <w:pPr>
+        <w:spacing w:line="480" w:lineRule="auto" w:before="0" w:after="0"/>
+        <w:ind w:firstLine="720"/>
+        <w:jc w:val="both"/>
+      </w:pPr>
+      <w:r>
+        <w:rPr>
+          <w:rFonts w:ascii="Georgia" w:hAnsi="Georgia" w:eastAsia="Georgia" w:cs="Georgia"/>
+          <w:sz w:val="22"/>
+          <w:b/>
+        </w:rPr>
+        <w:t xml:space="preserve">Comment 2 under Caption 1 (Page 3). </w:t>
+      </w:r>
+      <w:r>
+        <w:rPr>
+          <w:rFonts w:ascii="Georgia" w:hAnsi="Georgia" w:eastAsia="Georgia" w:cs="Georgia"/>
+          <w:sz w:val="22"/>
+        </w:rPr>
+        <w:t xml:space="preserve">As a man I don't have any problems with expectations as long as both sides can have their own expectations and get something in return...I think there is nothing wrong about that.</w:t>
+      </w:r>
+    </w:p>
+    <w:p>
+      <w:pPr>
+        <w:spacing w:line="480" w:lineRule="auto" w:before="0" w:after="0"/>
+        <w:ind w:firstLine="720"/>
+        <w:jc w:val="both"/>
+      </w:pPr>
+      <w:r>
+        <w:rPr>
+          <w:rFonts w:ascii="Georgia" w:hAnsi="Georgia" w:eastAsia="Georgia" w:cs="Georgia"/>
+          <w:sz w:val="22"/>
+          <w:b/>
+        </w:rPr>
+        <w:t xml:space="preserve">Caption 2 (Page 3). </w:t>
+      </w:r>
+      <w:r>
+        <w:rPr>
+          <w:rFonts w:ascii="Georgia" w:hAnsi="Georgia" w:eastAsia="Georgia" w:cs="Georgia"/>
+          <w:sz w:val="22"/>
+        </w:rPr>
+        <w:t xml:space="preserve">Welcome to our “Ask a Therapist” series! Why does anxiety get worse at night—and what actually helps? ████████ explains. Comment with a question you want a therapist to answer next. #therapy #mentalhealth #anxiety #askatherapist</w:t>
+      </w:r>
+    </w:p>
+    <w:p>
+      <w:pPr>
+        <w:spacing w:line="480" w:lineRule="auto" w:before="0" w:after="0"/>
+        <w:ind w:firstLine="720"/>
+        <w:jc w:val="both"/>
+      </w:pPr>
+      <w:r>
+        <w:rPr>
+          <w:rFonts w:ascii="Georgia" w:hAnsi="Georgia" w:eastAsia="Georgia" w:cs="Georgia"/>
+          <w:sz w:val="22"/>
+          <w:b/>
+        </w:rPr>
+        <w:t xml:space="preserve">Comment 1 under Caption 2 (Page 3). </w:t>
+      </w:r>
+      <w:r>
+        <w:rPr>
+          <w:rFonts w:ascii="Georgia" w:hAnsi="Georgia" w:eastAsia="Georgia" w:cs="Georgia"/>
+          <w:sz w:val="22"/>
+        </w:rPr>
+        <w:t xml:space="preserve">This explains nighttime anxiety in a way that feels reassuring and gives people something practical to work with.</w:t>
+      </w:r>
+    </w:p>
+    <w:p>
+      <w:pPr>
+        <w:spacing w:line="480" w:lineRule="auto" w:before="0" w:after="0"/>
+        <w:ind w:firstLine="720"/>
+        <w:jc w:val="both"/>
+      </w:pPr>
+      <w:r>
+        <w:rPr>
+          <w:rFonts w:ascii="Georgia" w:hAnsi="Georgia" w:eastAsia="Georgia" w:cs="Georgia"/>
+          <w:sz w:val="22"/>
+          <w:b/>
+        </w:rPr>
+        <w:t xml:space="preserve">Comment 2 under Caption 2 (Page 3). </w:t>
+      </w:r>
+      <w:r>
+        <w:rPr>
+          <w:rFonts w:ascii="Georgia" w:hAnsi="Georgia" w:eastAsia="Georgia" w:cs="Georgia"/>
+          <w:sz w:val="22"/>
+        </w:rPr>
+        <w:t xml:space="preserve">It reflects how quiet moments can amplify unspoken thoughts and tension. A gentle reminder that grounding practices and reassurance can help ease anxiety as the day winds down.</w:t>
+      </w:r>
+    </w:p>
+    <w:p>
+      <w:pPr>
+        <w:spacing w:line="480" w:lineRule="auto" w:before="0" w:after="0"/>
+        <w:ind w:firstLine="720"/>
+        <w:jc w:val="both"/>
+      </w:pPr>
+      <w:r>
+        <w:rPr>
+          <w:rFonts w:ascii="Georgia" w:hAnsi="Georgia" w:eastAsia="Georgia" w:cs="Georgia"/>
+          <w:sz w:val="22"/>
+          <w:b/>
+        </w:rPr>
+        <w:t xml:space="preserve">Caption 3 (Page 3). </w:t>
+      </w:r>
+      <w:r>
+        <w:rPr>
+          <w:rFonts w:ascii="Georgia" w:hAnsi="Georgia" w:eastAsia="Georgia" w:cs="Georgia"/>
+          <w:sz w:val="22"/>
+        </w:rPr>
+        <w:t xml:space="preserve">"There are many ways that we can undermine our well-being and fall into spirals of negativity, depression, and anxiety. Additionally, there are many ways that we can sabotage ourselves without realizing that we are the cause. Here are five behaviors to avoid if you want to be stable and emotionally well-adjusted," explains Carla Shuman, Ph.D. What are some other strengths of mentally healthy people? Let us know in the comments. 💭 Do you know someone who should read this? Share it with them. 👀 Click the link in our bio to read more. #psychology #mentalhealth #wellbeing #happiness #selfesteem #mentallyhealthy</w:t>
+      </w:r>
+    </w:p>
+    <w:p>
+      <w:pPr>
+        <w:spacing w:line="480" w:lineRule="auto" w:before="0" w:after="0"/>
+        <w:ind w:firstLine="720"/>
+        <w:jc w:val="both"/>
+      </w:pPr>
+      <w:r>
+        <w:rPr>
+          <w:rFonts w:ascii="Georgia" w:hAnsi="Georgia" w:eastAsia="Georgia" w:cs="Georgia"/>
+          <w:sz w:val="22"/>
+          <w:b/>
+        </w:rPr>
+        <w:t xml:space="preserve">Comment 1 under Caption 3 (Page 3). </w:t>
+      </w:r>
+      <w:r>
+        <w:rPr>
+          <w:rFonts w:ascii="Georgia" w:hAnsi="Georgia" w:eastAsia="Georgia" w:cs="Georgia"/>
+          <w:sz w:val="22"/>
+        </w:rPr>
+        <w:t xml:space="preserve">True! And I’m guilty of at least one of these! But I’m also committed to recovery</w:t>
+      </w:r>
+    </w:p>
+    <w:p>
+      <w:pPr>
+        <w:spacing w:line="480" w:lineRule="auto" w:before="0" w:after="0"/>
+        <w:ind w:firstLine="720"/>
+        <w:jc w:val="both"/>
+      </w:pPr>
+      <w:r>
+        <w:rPr>
+          <w:rFonts w:ascii="Georgia" w:hAnsi="Georgia" w:eastAsia="Georgia" w:cs="Georgia"/>
+          <w:sz w:val="22"/>
+          <w:b/>
+        </w:rPr>
+        <w:t xml:space="preserve">Comment 2 under Caption 3 (Page 3). </w:t>
+      </w:r>
+      <w:r>
+        <w:rPr>
+          <w:rFonts w:ascii="Georgia" w:hAnsi="Georgia" w:eastAsia="Georgia" w:cs="Georgia"/>
+          <w:sz w:val="22"/>
+        </w:rPr>
+        <w:t xml:space="preserve">Such an important list. We often find that avoiding the comparison trap is one of the biggest hurdles to stability in our digital age. Recognizing those small, daily wins instead can really shift the momentum!</w:t>
+      </w:r>
+    </w:p>
+    <w:p>
+      <w:pPr>
+        <w:spacing w:line="480" w:lineRule="auto" w:before="0" w:after="0"/>
+        <w:ind w:firstLine="720"/>
+        <w:jc w:val="both"/>
+      </w:pPr>
+      <w:r>
+        <w:rPr>
+          <w:rFonts w:ascii="Georgia" w:hAnsi="Georgia" w:eastAsia="Georgia" w:cs="Georgia"/>
+          <w:sz w:val="22"/>
+          <w:b/>
+        </w:rPr>
+        <w:t xml:space="preserve">Caption 4 (Page 3). </w:t>
+      </w:r>
+      <w:r>
+        <w:rPr>
+          <w:rFonts w:ascii="Georgia" w:hAnsi="Georgia" w:eastAsia="Georgia" w:cs="Georgia"/>
+          <w:sz w:val="22"/>
+        </w:rPr>
+        <w:t xml:space="preserve">"In my work with survivors of abusive, neglectful, or chronically unsafe families, I hear the same misconceptions again and again. Many of these ideas minimize survivors’ experiences and mischaracterize what estrangement actually is," explains Kaytee Gillis, LCSW (████████). Here are some of the most common myths about estrangement. What other false beliefs have you heard about family estrangement? Let us know in the comments. 💭 Do you know someone who should read this? Share it with them. 👀 Click the link in our bio to read more. #psychology #family #relationships #estrangement #misconceptions</w:t>
+      </w:r>
+    </w:p>
+    <w:p>
+      <w:pPr>
+        <w:spacing w:line="480" w:lineRule="auto" w:before="0" w:after="0"/>
+        <w:ind w:firstLine="720"/>
+        <w:jc w:val="both"/>
+      </w:pPr>
+      <w:r>
+        <w:rPr>
+          <w:rFonts w:ascii="Georgia" w:hAnsi="Georgia" w:eastAsia="Georgia" w:cs="Georgia"/>
+          <w:sz w:val="22"/>
+          <w:b/>
+        </w:rPr>
+        <w:t xml:space="preserve">Comment 1 under Caption 4 (Page 3). </w:t>
+      </w:r>
+      <w:r>
+        <w:rPr>
+          <w:rFonts w:ascii="Georgia" w:hAnsi="Georgia" w:eastAsia="Georgia" w:cs="Georgia"/>
+          <w:sz w:val="22"/>
+        </w:rPr>
+        <w:t xml:space="preserve">████████ what if the parrent goes silent treatment as they could not face that I spoke up about their inappropriate behavior this time and then as a change I did not chase them, I did not apologize I did not minimize myself. And after 6 months of silent treatment in which I grieved the parrent who was never there and learned peace without her and now I get love bombed with gifts but I am no longer willing to have a relationship without them making effort and admitting that what they have did was not ok.</w:t>
+      </w:r>
+    </w:p>
+    <w:p>
+      <w:pPr>
+        <w:spacing w:line="480" w:lineRule="auto" w:before="0" w:after="0"/>
+        <w:ind w:firstLine="720"/>
+        <w:jc w:val="both"/>
+      </w:pPr>
+      <w:r>
+        <w:rPr>
+          <w:rFonts w:ascii="Georgia" w:hAnsi="Georgia" w:eastAsia="Georgia" w:cs="Georgia"/>
+          <w:sz w:val="22"/>
+          <w:b/>
+        </w:rPr>
+        <w:t xml:space="preserve">Comment 2 under Caption 4 (Page 3). </w:t>
+      </w:r>
+      <w:r>
+        <w:rPr>
+          <w:rFonts w:ascii="Georgia" w:hAnsi="Georgia" w:eastAsia="Georgia" w:cs="Georgia"/>
+          <w:sz w:val="22"/>
+        </w:rPr>
+        <w:t xml:space="preserve">As a survivor of domestic abuse and sexual violence and who has had no contact with a parent for almost 40 years- this is not a trend!</w:t>
+      </w:r>
+    </w:p>
+    <w:p>
+      <w:pPr>
+        <w:spacing w:line="480" w:lineRule="auto" w:before="0" w:after="0"/>
+        <w:ind w:firstLine="720"/>
+        <w:jc w:val="both"/>
+      </w:pPr>
+      <w:r>
+        <w:rPr>
+          <w:rFonts w:ascii="Georgia" w:hAnsi="Georgia" w:eastAsia="Georgia" w:cs="Georgia"/>
+          <w:sz w:val="22"/>
+          <w:b/>
+        </w:rPr>
+        <w:t xml:space="preserve">Caption 1 (Page 4). </w:t>
+      </w:r>
+      <w:r>
+        <w:rPr>
+          <w:rFonts w:ascii="Georgia" w:hAnsi="Georgia" w:eastAsia="Georgia" w:cs="Georgia"/>
+          <w:sz w:val="22"/>
+        </w:rPr>
+        <w:t xml:space="preserve">💙 Today on #WorldSuicidePreventionDay (and every day!), remember: you are not alone. Asking for help is brave, and support is always within reach. Visit our Find Help page via the link in our bio for helplines, self-care tips, and resources to care for yourself + others.</w:t>
+      </w:r>
+    </w:p>
+    <w:p>
+      <w:pPr>
+        <w:spacing w:line="480" w:lineRule="auto" w:before="0" w:after="0"/>
+        <w:ind w:firstLine="720"/>
+        <w:jc w:val="both"/>
+      </w:pPr>
+      <w:r>
+        <w:rPr>
+          <w:rFonts w:ascii="Georgia" w:hAnsi="Georgia" w:eastAsia="Georgia" w:cs="Georgia"/>
+          <w:sz w:val="22"/>
+          <w:b/>
+        </w:rPr>
+        <w:t xml:space="preserve">Comment 1 under Caption 1 (Page 4). </w:t>
+      </w:r>
+      <w:r>
+        <w:rPr>
+          <w:rFonts w:ascii="Georgia" w:hAnsi="Georgia" w:eastAsia="Georgia" w:cs="Georgia"/>
+          <w:sz w:val="22"/>
+        </w:rPr>
+        <w:t xml:space="preserve">[Comment to be added]</w:t>
+      </w:r>
+    </w:p>
+    <w:p>
+      <w:pPr>
+        <w:spacing w:line="480" w:lineRule="auto" w:before="0" w:after="0"/>
+        <w:ind w:firstLine="720"/>
+        <w:jc w:val="both"/>
+      </w:pPr>
+      <w:r>
+        <w:rPr>
+          <w:rFonts w:ascii="Georgia" w:hAnsi="Georgia" w:eastAsia="Georgia" w:cs="Georgia"/>
+          <w:sz w:val="22"/>
+          <w:b/>
+        </w:rPr>
+        <w:t xml:space="preserve">Comment 2 under Caption 1 (Page 4). </w:t>
+      </w:r>
+      <w:r>
+        <w:rPr>
+          <w:rFonts w:ascii="Georgia" w:hAnsi="Georgia" w:eastAsia="Georgia" w:cs="Georgia"/>
+          <w:sz w:val="22"/>
+        </w:rPr>
+        <w:t xml:space="preserve">It’s always important to remember that you’re not alone, and asking for help is courage!! I know exactly how is it living with negative thought the whole time. Recently I went through dark times, and I wanted to give up. And listing to Gaga’s songs gives me the strength to continue❤️ I did a video about mental health on tik tok, wish you guys could see 🙏 ████████ ████████</w:t>
+      </w:r>
+    </w:p>
+    <w:p>
+      <w:pPr>
+        <w:spacing w:line="480" w:lineRule="auto" w:before="0" w:after="0"/>
+        <w:ind w:firstLine="720"/>
+        <w:jc w:val="both"/>
+      </w:pPr>
+      <w:r>
+        <w:rPr>
+          <w:rFonts w:ascii="Georgia" w:hAnsi="Georgia" w:eastAsia="Georgia" w:cs="Georgia"/>
+          <w:sz w:val="22"/>
+          <w:b/>
+        </w:rPr>
+        <w:t xml:space="preserve">Caption 2 (Page 4). </w:t>
+      </w:r>
+      <w:r>
+        <w:rPr>
+          <w:rFonts w:ascii="Georgia" w:hAnsi="Georgia" w:eastAsia="Georgia" w:cs="Georgia"/>
+          <w:sz w:val="22"/>
+        </w:rPr>
+        <w:t xml:space="preserve">We gathered in Los Angeles with open hearts and a shared goal: to build a kinder, braver world together 💙✨ In partnership with ████████, ████████, and ████████, we created a space for honest conversation, creativity, and care, led by and for young people. From spoken word performances by LA’s Youth Poet Laureate to an interactive #BeThereCertificate workshop and a hands-on volunteer activity supporting trans and nonbinary young people, this community gathering reminded us: ☀️ Mental health care is community care. ☀️ Kindness is action. ☀️ And none of us have to take that action alone. #ChannelKindness #BeKind365 #KindnessInCommunity</w:t>
+      </w:r>
+    </w:p>
+    <w:p>
+      <w:pPr>
+        <w:spacing w:line="480" w:lineRule="auto" w:before="0" w:after="0"/>
+        <w:ind w:firstLine="720"/>
+        <w:jc w:val="both"/>
+      </w:pPr>
+      <w:r>
+        <w:rPr>
+          <w:rFonts w:ascii="Georgia" w:hAnsi="Georgia" w:eastAsia="Georgia" w:cs="Georgia"/>
+          <w:sz w:val="22"/>
+          <w:b/>
+        </w:rPr>
+        <w:t xml:space="preserve">Comment 1 under Caption 2 (Page 4). </w:t>
+      </w:r>
+      <w:r>
+        <w:rPr>
+          <w:rFonts w:ascii="Georgia" w:hAnsi="Georgia" w:eastAsia="Georgia" w:cs="Georgia"/>
+          <w:sz w:val="22"/>
+        </w:rPr>
+        <w:t xml:space="preserve">[Comment to be added]</w:t>
+      </w:r>
+    </w:p>
+    <w:p>
+      <w:pPr>
+        <w:spacing w:line="480" w:lineRule="auto" w:before="0" w:after="0"/>
+        <w:ind w:firstLine="720"/>
+        <w:jc w:val="both"/>
+      </w:pPr>
+      <w:r>
+        <w:rPr>
+          <w:rFonts w:ascii="Georgia" w:hAnsi="Georgia" w:eastAsia="Georgia" w:cs="Georgia"/>
+          <w:sz w:val="22"/>
+          <w:b/>
+        </w:rPr>
+        <w:t xml:space="preserve">Comment 2 under Caption 2 (Page 4). </w:t>
+      </w:r>
+      <w:r>
+        <w:rPr>
+          <w:rFonts w:ascii="Georgia" w:hAnsi="Georgia" w:eastAsia="Georgia" w:cs="Georgia"/>
+          <w:sz w:val="22"/>
+        </w:rPr>
+        <w:t xml:space="preserve">what an incredible day celebrating kindness and being there for one another! thank you so much for having me ❤️❤️❤️</w:t>
+      </w:r>
+    </w:p>
+    <w:p>
+      <w:pPr>
+        <w:spacing w:line="480" w:lineRule="auto" w:before="0" w:after="0"/>
+        <w:ind w:firstLine="720"/>
+        <w:jc w:val="both"/>
+      </w:pPr>
+      <w:r>
+        <w:rPr>
+          <w:rFonts w:ascii="Georgia" w:hAnsi="Georgia" w:eastAsia="Georgia" w:cs="Georgia"/>
+          <w:sz w:val="22"/>
+          <w:b/>
+        </w:rPr>
+        <w:t xml:space="preserve">Caption 3 (Page 4). </w:t>
+      </w:r>
+      <w:r>
+        <w:rPr>
+          <w:rFonts w:ascii="Georgia" w:hAnsi="Georgia" w:eastAsia="Georgia" w:cs="Georgia"/>
+          <w:sz w:val="22"/>
+        </w:rPr>
+        <w:t xml:space="preserve">“Our stories are our superpower.” 💭🏳️‍🌈🏳️‍⚧️ In this powerful clip from his Pride Rising speech, ████████’s Chief of Staff, ████████, reminds us that kindness is action—and that simply existing as your authentic self is a form of resistance. 💖 Take the #BeKind365 pledge to support yourself and others in kindness, every day of the year: BeKind365.world ✨ Want more inspiration? Watch Josh’s full speech via the link in our bio. 📷 / 🎥: ████████</w:t>
+      </w:r>
+    </w:p>
+    <w:p>
+      <w:pPr>
+        <w:spacing w:line="480" w:lineRule="auto" w:before="0" w:after="0"/>
+        <w:ind w:firstLine="720"/>
+        <w:jc w:val="both"/>
+      </w:pPr>
+      <w:r>
+        <w:rPr>
+          <w:rFonts w:ascii="Georgia" w:hAnsi="Georgia" w:eastAsia="Georgia" w:cs="Georgia"/>
+          <w:sz w:val="22"/>
+          <w:b/>
+        </w:rPr>
+        <w:t xml:space="preserve">Comment 1 under Caption 3 (Page 4). </w:t>
+      </w:r>
+      <w:r>
+        <w:rPr>
+          <w:rFonts w:ascii="Georgia" w:hAnsi="Georgia" w:eastAsia="Georgia" w:cs="Georgia"/>
+          <w:sz w:val="22"/>
+        </w:rPr>
+        <w:t xml:space="preserve">Thank you for sharing. What a wonderful foundation you represent and work for. Changing the lives of so many people Way to go Josh!!</w:t>
+      </w:r>
+    </w:p>
+    <w:p>
+      <w:pPr>
+        <w:spacing w:line="480" w:lineRule="auto" w:before="0" w:after="0"/>
+        <w:ind w:firstLine="720"/>
+        <w:jc w:val="both"/>
+      </w:pPr>
+      <w:r>
+        <w:rPr>
+          <w:rFonts w:ascii="Georgia" w:hAnsi="Georgia" w:eastAsia="Georgia" w:cs="Georgia"/>
+          <w:sz w:val="22"/>
+          <w:b/>
+        </w:rPr>
+        <w:t xml:space="preserve">Comment 2 under Caption 3 (Page 4). </w:t>
+      </w:r>
+      <w:r>
+        <w:rPr>
+          <w:rFonts w:ascii="Georgia" w:hAnsi="Georgia" w:eastAsia="Georgia" w:cs="Georgia"/>
+          <w:sz w:val="22"/>
+        </w:rPr>
+        <w:t xml:space="preserve">This resonates so deep. Our stories are what creates change. One person, one heart, one connection at a time. All people have to do is meet us.</w:t>
+      </w:r>
+    </w:p>
+    <w:p>
+      <w:pPr>
+        <w:spacing w:line="480" w:lineRule="auto" w:before="0" w:after="0"/>
+        <w:ind w:firstLine="720"/>
+        <w:jc w:val="both"/>
+      </w:pPr>
+      <w:r>
+        <w:rPr>
+          <w:rFonts w:ascii="Georgia" w:hAnsi="Georgia" w:eastAsia="Georgia" w:cs="Georgia"/>
+          <w:sz w:val="22"/>
+          <w:b/>
+        </w:rPr>
+        <w:t xml:space="preserve">Caption 4 (Page 4). </w:t>
+      </w:r>
+      <w:r>
+        <w:rPr>
+          <w:rFonts w:ascii="Georgia" w:hAnsi="Georgia" w:eastAsia="Georgia" w:cs="Georgia"/>
+          <w:sz w:val="22"/>
+        </w:rPr>
+        <w:t xml:space="preserve">🏳️‍⚧️ Today is #TransDayOfVisibility, a time to celebrate, uplift, and honor trans and nonbinary voices. 🏳️‍⚧️ Our 2023-2024 Youth Advisory Board member, ████████, shares powerful words of affirmation from their speech at NYC Youth #Pride ████████: “To everyone here: always remember that you are beautiful, you are worthy, and you deserve to take up space in this world exactly as you are. There is no one else like you, and that is your power.” Visit the link in our bio to watch ████████’s full speech and learn how we can all support transgender and nonbinary youth in creating safer, more inclusive communities. #ChannelKindness #BeKind365 📷 / 🎥 : ████████</w:t>
+      </w:r>
+    </w:p>
+    <w:p>
+      <w:pPr>
+        <w:spacing w:line="480" w:lineRule="auto" w:before="0" w:after="0"/>
+        <w:ind w:firstLine="720"/>
+        <w:jc w:val="both"/>
+      </w:pPr>
+      <w:r>
+        <w:rPr>
+          <w:rFonts w:ascii="Georgia" w:hAnsi="Georgia" w:eastAsia="Georgia" w:cs="Georgia"/>
+          <w:sz w:val="22"/>
+          <w:b/>
+        </w:rPr>
+        <w:t xml:space="preserve">Comment 1 under Caption 4 (Page 4). </w:t>
+      </w:r>
+      <w:r>
+        <w:rPr>
+          <w:rFonts w:ascii="Georgia" w:hAnsi="Georgia" w:eastAsia="Georgia" w:cs="Georgia"/>
+          <w:sz w:val="22"/>
+        </w:rPr>
+        <w:t xml:space="preserve">[Comment to be added]</w:t>
+      </w:r>
+    </w:p>
+    <w:p>
+      <w:pPr>
+        <w:spacing w:line="480" w:lineRule="auto" w:before="0" w:after="0"/>
+        <w:ind w:firstLine="720"/>
+        <w:jc w:val="both"/>
+      </w:pPr>
+      <w:r>
+        <w:rPr>
+          <w:rFonts w:ascii="Georgia" w:hAnsi="Georgia" w:eastAsia="Georgia" w:cs="Georgia"/>
+          <w:sz w:val="22"/>
+          <w:b/>
+        </w:rPr>
+        <w:t xml:space="preserve">Comment 2 under Caption 4 (Page 4). </w:t>
+      </w:r>
+      <w:r>
+        <w:rPr>
+          <w:rFonts w:ascii="Georgia" w:hAnsi="Georgia" w:eastAsia="Georgia" w:cs="Georgia"/>
+          <w:sz w:val="22"/>
+        </w:rPr>
+        <w:t xml:space="preserve">[Comment to be added]</w:t>
+      </w:r>
+    </w:p>
+    <w:p>
+      <w:pPr>
+        <w:spacing w:line="480" w:lineRule="auto" w:before="0" w:after="0"/>
+        <w:ind w:firstLine="720"/>
+        <w:jc w:val="both"/>
+      </w:pPr>
+      <w:r>
+        <w:rPr>
+          <w:rFonts w:ascii="Georgia" w:hAnsi="Georgia" w:eastAsia="Georgia" w:cs="Georgia"/>
+          <w:sz w:val="22"/>
+          <w:b/>
+        </w:rPr>
+        <w:t xml:space="preserve">Caption 1 (Page 5). </w:t>
+      </w:r>
+      <w:r>
+        <w:rPr>
+          <w:rFonts w:ascii="Georgia" w:hAnsi="Georgia" w:eastAsia="Georgia" w:cs="Georgia"/>
+          <w:sz w:val="22"/>
+        </w:rPr>
+        <w:t xml:space="preserve">When you know the Big Sad ™ is coming but you just wanna get your things done first...</w:t>
+      </w:r>
+    </w:p>
+    <w:p>
+      <w:pPr>
+        <w:spacing w:line="480" w:lineRule="auto" w:before="0" w:after="0"/>
+        <w:ind w:firstLine="720"/>
+        <w:jc w:val="both"/>
+      </w:pPr>
+      <w:r>
+        <w:rPr>
+          <w:rFonts w:ascii="Georgia" w:hAnsi="Georgia" w:eastAsia="Georgia" w:cs="Georgia"/>
+          <w:sz w:val="22"/>
+          <w:b/>
+        </w:rPr>
+        <w:t xml:space="preserve">Comment 1 under Caption 1 (Page 5). </w:t>
+      </w:r>
+      <w:r>
+        <w:rPr>
+          <w:rFonts w:ascii="Georgia" w:hAnsi="Georgia" w:eastAsia="Georgia" w:cs="Georgia"/>
+          <w:sz w:val="22"/>
+        </w:rPr>
+        <w:t xml:space="preserve">I don't have time to be sad so i just keep doing things</w:t>
+      </w:r>
+    </w:p>
+    <w:p>
+      <w:pPr>
+        <w:spacing w:line="480" w:lineRule="auto" w:before="0" w:after="0"/>
+        <w:ind w:firstLine="720"/>
+        <w:jc w:val="both"/>
+      </w:pPr>
+      <w:r>
+        <w:rPr>
+          <w:rFonts w:ascii="Georgia" w:hAnsi="Georgia" w:eastAsia="Georgia" w:cs="Georgia"/>
+          <w:sz w:val="22"/>
+          <w:b/>
+        </w:rPr>
+        <w:t xml:space="preserve">Comment 2 under Caption 1 (Page 5). </w:t>
+      </w:r>
+      <w:r>
+        <w:rPr>
+          <w:rFonts w:ascii="Georgia" w:hAnsi="Georgia" w:eastAsia="Georgia" w:cs="Georgia"/>
+          <w:sz w:val="22"/>
+        </w:rPr>
+        <w:t xml:space="preserve">What is it about the kitchen sink that makes us suddenly pause and then get sucked in to that sadness! 😳</w:t>
+      </w:r>
+    </w:p>
+    <w:p>
+      <w:pPr>
+        <w:spacing w:line="480" w:lineRule="auto" w:before="0" w:after="0"/>
+        <w:ind w:firstLine="720"/>
+        <w:jc w:val="both"/>
+      </w:pPr>
+      <w:r>
+        <w:rPr>
+          <w:rFonts w:ascii="Georgia" w:hAnsi="Georgia" w:eastAsia="Georgia" w:cs="Georgia"/>
+          <w:sz w:val="22"/>
+          <w:b/>
+        </w:rPr>
+        <w:t xml:space="preserve">Caption 2 (Page 5). </w:t>
+      </w:r>
+      <w:r>
+        <w:rPr>
+          <w:rFonts w:ascii="Georgia" w:hAnsi="Georgia" w:eastAsia="Georgia" w:cs="Georgia"/>
+          <w:sz w:val="22"/>
+        </w:rPr>
+        <w:t xml:space="preserve">Some thoughts about all the worrying I did and all the ways I tried to be prepared for a life that only time and experience could prepare me for. A comic showing a ghost in the wilderness, the text reads - 1- I feel silly for not realising sooner, that I would feel differently about my life the more I experienced it, because I will change and grow. 2- I realised that choices happen slowly, and they get smaller than when you made them. You adapt and you change. 3- I changed in a way that prepared me for the now. Even though I was SO worried about being unprepared. But of course you’re unprepared when you’re worrying too early! 4- it feels daunting to think about the future in the here and now. But you’ll be different by then. And you will be ready for it when it comes.</w:t>
+      </w:r>
+    </w:p>
+    <w:p>
+      <w:pPr>
+        <w:spacing w:line="480" w:lineRule="auto" w:before="0" w:after="0"/>
+        <w:ind w:firstLine="720"/>
+        <w:jc w:val="both"/>
+      </w:pPr>
+      <w:r>
+        <w:rPr>
+          <w:rFonts w:ascii="Georgia" w:hAnsi="Georgia" w:eastAsia="Georgia" w:cs="Georgia"/>
+          <w:sz w:val="22"/>
+          <w:b/>
+        </w:rPr>
+        <w:t xml:space="preserve">Comment 1 under Caption 2 (Page 5). </w:t>
+      </w:r>
+      <w:r>
+        <w:rPr>
+          <w:rFonts w:ascii="Georgia" w:hAnsi="Georgia" w:eastAsia="Georgia" w:cs="Georgia"/>
+          <w:sz w:val="22"/>
+        </w:rPr>
+        <w:t xml:space="preserve">I agree with you, time and experience teaches you a lot you never thought of</w:t>
+      </w:r>
+    </w:p>
+    <w:p>
+      <w:pPr>
+        <w:spacing w:line="480" w:lineRule="auto" w:before="0" w:after="0"/>
+        <w:ind w:firstLine="720"/>
+        <w:jc w:val="both"/>
+      </w:pPr>
+      <w:r>
+        <w:rPr>
+          <w:rFonts w:ascii="Georgia" w:hAnsi="Georgia" w:eastAsia="Georgia" w:cs="Georgia"/>
+          <w:sz w:val="22"/>
+          <w:b/>
+        </w:rPr>
+        <w:t xml:space="preserve">Comment 2 under Caption 2 (Page 5). </w:t>
+      </w:r>
+      <w:r>
+        <w:rPr>
+          <w:rFonts w:ascii="Georgia" w:hAnsi="Georgia" w:eastAsia="Georgia" w:cs="Georgia"/>
+          <w:sz w:val="22"/>
+        </w:rPr>
+        <w:t xml:space="preserve">Always growing through what we go through 🥰 such a lovely reminder to stay present and not fear the future</w:t>
+      </w:r>
+    </w:p>
+    <w:p>
+      <w:pPr>
+        <w:spacing w:line="480" w:lineRule="auto" w:before="0" w:after="0"/>
+        <w:ind w:firstLine="720"/>
+        <w:jc w:val="both"/>
+      </w:pPr>
+      <w:r>
+        <w:rPr>
+          <w:rFonts w:ascii="Georgia" w:hAnsi="Georgia" w:eastAsia="Georgia" w:cs="Georgia"/>
+          <w:sz w:val="22"/>
+          <w:b/>
+        </w:rPr>
+        <w:t xml:space="preserve">Caption 1 (Page 6). </w:t>
+      </w:r>
+      <w:r>
+        <w:rPr>
+          <w:rFonts w:ascii="Georgia" w:hAnsi="Georgia" w:eastAsia="Georgia" w:cs="Georgia"/>
+          <w:sz w:val="22"/>
+        </w:rPr>
+        <w:t xml:space="preserve">Men’s mental health month is coming up this November. We don’t talk enough about what men carry. The pressure to be the provider. The strong one. The one that never cracks. But bottling everything up is why men are more likely to die by suicide, because they feel ashamed to speak up. We have to break the stigma 🩵#mentalhealth #mentalhealthawareness #mentalhealthmatters</w:t>
+      </w:r>
+    </w:p>
+    <w:p>
+      <w:pPr>
+        <w:spacing w:line="480" w:lineRule="auto" w:before="0" w:after="0"/>
+        <w:ind w:firstLine="720"/>
+        <w:jc w:val="both"/>
+      </w:pPr>
+      <w:r>
+        <w:rPr>
+          <w:rFonts w:ascii="Georgia" w:hAnsi="Georgia" w:eastAsia="Georgia" w:cs="Georgia"/>
+          <w:sz w:val="22"/>
+          <w:b/>
+        </w:rPr>
+        <w:t xml:space="preserve">Comment 1 under Caption 1 (Page 6). </w:t>
+      </w:r>
+      <w:r>
+        <w:rPr>
+          <w:rFonts w:ascii="Georgia" w:hAnsi="Georgia" w:eastAsia="Georgia" w:cs="Georgia"/>
+          <w:sz w:val="22"/>
+        </w:rPr>
+        <w:t xml:space="preserve">remember it’s ok not to be okay keep going fellas we got this together ❤️</w:t>
+      </w:r>
+    </w:p>
+    <w:p>
+      <w:pPr>
+        <w:spacing w:line="480" w:lineRule="auto" w:before="0" w:after="0"/>
+        <w:ind w:firstLine="720"/>
+        <w:jc w:val="both"/>
+      </w:pPr>
+      <w:r>
+        <w:rPr>
+          <w:rFonts w:ascii="Georgia" w:hAnsi="Georgia" w:eastAsia="Georgia" w:cs="Georgia"/>
+          <w:sz w:val="22"/>
+          <w:b/>
+        </w:rPr>
+        <w:t xml:space="preserve">Comment 2 under Caption 1 (Page 6). </w:t>
+      </w:r>
+      <w:r>
+        <w:rPr>
+          <w:rFonts w:ascii="Georgia" w:hAnsi="Georgia" w:eastAsia="Georgia" w:cs="Georgia"/>
+          <w:sz w:val="22"/>
+        </w:rPr>
+        <w:t xml:space="preserve">To say the truth I have been having this feelings to end it. I see it as being scary but the more I keep it inside the more I see it as a relief 😮‍💨😢😢</w:t>
+      </w:r>
+    </w:p>
+    <w:p>
+      <w:pPr>
+        <w:spacing w:line="480" w:lineRule="auto" w:before="0" w:after="0"/>
+        <w:ind w:firstLine="720"/>
+        <w:jc w:val="both"/>
+      </w:pPr>
+      <w:r>
+        <w:rPr>
+          <w:rFonts w:ascii="Georgia" w:hAnsi="Georgia" w:eastAsia="Georgia" w:cs="Georgia"/>
+          <w:sz w:val="22"/>
+          <w:b/>
+        </w:rPr>
+        <w:t xml:space="preserve">Caption 2 (Page 6). </w:t>
+      </w:r>
+      <w:r>
+        <w:rPr>
+          <w:rFonts w:ascii="Georgia" w:hAnsi="Georgia" w:eastAsia="Georgia" w:cs="Georgia"/>
+          <w:sz w:val="22"/>
+        </w:rPr>
+        <w:t xml:space="preserve">Please never be embarrassed or too afraid to talk about your mental health. You’re tired from being strong. There’s nothing wrong with seeking assistance with getting along. #WorldMentalHealthDay #WMHD25 #MentalHealth</w:t>
+      </w:r>
+    </w:p>
+    <w:p>
+      <w:pPr>
+        <w:spacing w:line="480" w:lineRule="auto" w:before="0" w:after="0"/>
+        <w:ind w:firstLine="720"/>
+        <w:jc w:val="both"/>
+      </w:pPr>
+      <w:r>
+        <w:rPr>
+          <w:rFonts w:ascii="Georgia" w:hAnsi="Georgia" w:eastAsia="Georgia" w:cs="Georgia"/>
+          <w:sz w:val="22"/>
+          <w:b/>
+        </w:rPr>
+        <w:t xml:space="preserve">Comment 1 under Caption 2 (Page 6). </w:t>
+      </w:r>
+      <w:r>
+        <w:rPr>
+          <w:rFonts w:ascii="Georgia" w:hAnsi="Georgia" w:eastAsia="Georgia" w:cs="Georgia"/>
+          <w:sz w:val="22"/>
+        </w:rPr>
+        <w:t xml:space="preserve">Sometimes when the people around you don’t help, it’s not because you don’t deserve it, it’s because they don’t know how, or they’ve been led to believe you don’t need it. You still deserve care. Always.</w:t>
+      </w:r>
+    </w:p>
+    <w:p>
+      <w:pPr>
+        <w:spacing w:line="480" w:lineRule="auto" w:before="0" w:after="0"/>
+        <w:ind w:firstLine="720"/>
+        <w:jc w:val="both"/>
+      </w:pPr>
+      <w:r>
+        <w:rPr>
+          <w:rFonts w:ascii="Georgia" w:hAnsi="Georgia" w:eastAsia="Georgia" w:cs="Georgia"/>
+          <w:sz w:val="22"/>
+          <w:b/>
+        </w:rPr>
+        <w:t xml:space="preserve">Comment 2 under Caption 2 (Page 6). </w:t>
+      </w:r>
+      <w:r>
+        <w:rPr>
+          <w:rFonts w:ascii="Georgia" w:hAnsi="Georgia" w:eastAsia="Georgia" w:cs="Georgia"/>
+          <w:sz w:val="22"/>
+        </w:rPr>
+        <w:t xml:space="preserve">Talking about it saves do many lives and encourages people to seek help to improve their mental health 🙌🏻❤️🫶🏻</w:t>
+      </w:r>
+    </w:p>
+    <w:p>
+      <w:pPr>
+        <w:spacing w:line="480" w:lineRule="auto" w:before="0" w:after="0"/>
+        <w:ind w:firstLine="720"/>
+        <w:jc w:val="both"/>
+      </w:pPr>
+      <w:r>
+        <w:rPr>
+          <w:rFonts w:ascii="Georgia" w:hAnsi="Georgia" w:eastAsia="Georgia" w:cs="Georgia"/>
+          <w:sz w:val="22"/>
+          <w:b/>
+        </w:rPr>
+        <w:t xml:space="preserve">Caption 3 (Page 6). </w:t>
+      </w:r>
+      <w:r>
+        <w:rPr>
+          <w:rFonts w:ascii="Georgia" w:hAnsi="Georgia" w:eastAsia="Georgia" w:cs="Georgia"/>
+          <w:sz w:val="22"/>
+        </w:rPr>
+        <w:t xml:space="preserve">Avoiding conversations about suicide doesn’t make the issue go away. it reinforces stigma, silence, and isolation. Open, compassionate talk of the topic helps people feel seen, understood, and supported. #suicideprevention #suicidepreventionmonth #mentalhealth #mentalhealthmatters #mentalhealthawareness#████████</w:t>
+      </w:r>
+    </w:p>
+    <w:p>
+      <w:pPr>
+        <w:spacing w:line="480" w:lineRule="auto" w:before="0" w:after="0"/>
+        <w:ind w:firstLine="720"/>
+        <w:jc w:val="both"/>
+      </w:pPr>
+      <w:r>
+        <w:rPr>
+          <w:rFonts w:ascii="Georgia" w:hAnsi="Georgia" w:eastAsia="Georgia" w:cs="Georgia"/>
+          <w:sz w:val="22"/>
+          <w:b/>
+        </w:rPr>
+        <w:t xml:space="preserve">Comment 1 under Caption 3 (Page 6). </w:t>
+      </w:r>
+      <w:r>
+        <w:rPr>
+          <w:rFonts w:ascii="Georgia" w:hAnsi="Georgia" w:eastAsia="Georgia" w:cs="Georgia"/>
+          <w:sz w:val="22"/>
+        </w:rPr>
+        <w:t xml:space="preserve">if you are reading this and you feel as though you want to leave this earth, i can lend you my ear whenever, 0 judgement, just a shoulder to lean on. you are so so so loved 🤍🤍pls stay with us we are all in this together 🫶🏻</w:t>
+      </w:r>
+    </w:p>
+    <w:p>
+      <w:pPr>
+        <w:spacing w:line="480" w:lineRule="auto" w:before="0" w:after="0"/>
+        <w:ind w:firstLine="720"/>
+        <w:jc w:val="both"/>
+      </w:pPr>
+      <w:r>
+        <w:rPr>
+          <w:rFonts w:ascii="Georgia" w:hAnsi="Georgia" w:eastAsia="Georgia" w:cs="Georgia"/>
+          <w:sz w:val="22"/>
+          <w:b/>
+        </w:rPr>
+        <w:t xml:space="preserve">Comment 2 under Caption 3 (Page 6). </w:t>
+      </w:r>
+      <w:r>
+        <w:rPr>
+          <w:rFonts w:ascii="Georgia" w:hAnsi="Georgia" w:eastAsia="Georgia" w:cs="Georgia"/>
+          <w:sz w:val="22"/>
+        </w:rPr>
+        <w:t xml:space="preserve">Always make some time and check up on your loved ones. You never know what someone is going through and what they are dealing with. In today’s world, we talk about every little thing but no one talks or asks on what’s going on in someone’s life. People help people and talking about it won’t make someone any weak. Respect, love, care and know that you are important!</w:t>
+      </w:r>
+    </w:p>
+    <w:p>
+      <w:pPr>
+        <w:spacing w:line="480" w:lineRule="auto" w:before="0" w:after="0"/>
+        <w:ind w:firstLine="720"/>
+        <w:jc w:val="both"/>
+      </w:pPr>
+      <w:r>
+        <w:rPr>
+          <w:rFonts w:ascii="Georgia" w:hAnsi="Georgia" w:eastAsia="Georgia" w:cs="Georgia"/>
+          <w:sz w:val="22"/>
+          <w:b/>
+        </w:rPr>
+        <w:t xml:space="preserve">Caption 4 (Page 6). </w:t>
+      </w:r>
+      <w:r>
+        <w:rPr>
+          <w:rFonts w:ascii="Georgia" w:hAnsi="Georgia" w:eastAsia="Georgia" w:cs="Georgia"/>
+          <w:sz w:val="22"/>
+        </w:rPr>
+        <w:t xml:space="preserve">Depression doesn’t always look like isolation or sadness; sometimes, it looks like overcompensating, exhaustion, or simply ‘pushing through. If this resonates with you, know that your struggles are valid, even if they’re unseen. Seeking support isn’t a sign of weakness-it’s a step toward healing. Functional depression is often associated with high-functioning depression, which can sometimes align with Persistent Depressive Disorder (PDD, formerly known as dysthymia)—a chronic but less severe form of depression where individuals can still manage daily responsibilities despite ongoing emotional distress. #functionaldepression #depression #youarenotalone #breakthestigma #mindfulness #mentalhealthmatters</w:t>
+      </w:r>
+    </w:p>
+    <w:p>
+      <w:pPr>
+        <w:spacing w:line="480" w:lineRule="auto" w:before="0" w:after="0"/>
+        <w:ind w:firstLine="720"/>
+        <w:jc w:val="both"/>
+      </w:pPr>
+      <w:r>
+        <w:rPr>
+          <w:rFonts w:ascii="Georgia" w:hAnsi="Georgia" w:eastAsia="Georgia" w:cs="Georgia"/>
+          <w:sz w:val="22"/>
+          <w:b/>
+        </w:rPr>
+        <w:t xml:space="preserve">Comment 1 under Caption 4 (Page 6). </w:t>
+      </w:r>
+      <w:r>
+        <w:rPr>
+          <w:rFonts w:ascii="Georgia" w:hAnsi="Georgia" w:eastAsia="Georgia" w:cs="Georgia"/>
+          <w:sz w:val="22"/>
+        </w:rPr>
+        <w:t xml:space="preserve">This is painfully real. Sometimes the loudest struggle is the one no one sees.</w:t>
+      </w:r>
+    </w:p>
+    <w:p>
+      <w:pPr>
+        <w:spacing w:line="480" w:lineRule="auto" w:before="0" w:after="0"/>
+        <w:ind w:firstLine="720"/>
+        <w:jc w:val="both"/>
+      </w:pPr>
+      <w:r>
+        <w:rPr>
+          <w:rFonts w:ascii="Georgia" w:hAnsi="Georgia" w:eastAsia="Georgia" w:cs="Georgia"/>
+          <w:sz w:val="22"/>
+          <w:b/>
+        </w:rPr>
+        <w:t xml:space="preserve">Comment 2 under Caption 4 (Page 6). </w:t>
+      </w:r>
+      <w:r>
+        <w:rPr>
+          <w:rFonts w:ascii="Georgia" w:hAnsi="Georgia" w:eastAsia="Georgia" w:cs="Georgia"/>
+          <w:sz w:val="22"/>
+        </w:rPr>
+        <w:t xml:space="preserve">It's better when they don't know. When people know your true feelings, they get upset with you and you have to apologize</w:t>
+      </w:r>
+    </w:p>
+    <w:p>
+      <w:pPr>
+        <w:spacing w:line="480" w:lineRule="auto" w:before="0" w:after="0"/>
+        <w:ind w:firstLine="720"/>
+        <w:jc w:val="both"/>
+      </w:pPr>
+      <w:r>
+        <w:rPr>
+          <w:rFonts w:ascii="Georgia" w:hAnsi="Georgia" w:eastAsia="Georgia" w:cs="Georgia"/>
+          <w:sz w:val="22"/>
+          <w:b/>
+        </w:rPr>
+        <w:t xml:space="preserve">Caption 5 (Page 6). </w:t>
+      </w:r>
+      <w:r>
+        <w:rPr>
+          <w:rFonts w:ascii="Georgia" w:hAnsi="Georgia" w:eastAsia="Georgia" w:cs="Georgia"/>
+          <w:sz w:val="22"/>
+        </w:rPr>
+        <w:t xml:space="preserve">People stigmatise mental health but mourn suicide. We need to make a change. ❤️ This is the sad society that we live in. But only we can change it. We can respond sooner, we can help people who are in need, we can reach out to people who we know are suffering, we can look for the warning signs.. we can just be kinder people to others.</w:t>
+      </w:r>
+    </w:p>
+    <w:p>
+      <w:pPr>
+        <w:spacing w:line="480" w:lineRule="auto" w:before="0" w:after="0"/>
+        <w:ind w:firstLine="720"/>
+        <w:jc w:val="both"/>
+      </w:pPr>
+      <w:r>
+        <w:rPr>
+          <w:rFonts w:ascii="Georgia" w:hAnsi="Georgia" w:eastAsia="Georgia" w:cs="Georgia"/>
+          <w:sz w:val="22"/>
+          <w:b/>
+        </w:rPr>
+        <w:t xml:space="preserve">Comment 1 under Caption 5 (Page 6). </w:t>
+      </w:r>
+      <w:r>
+        <w:rPr>
+          <w:rFonts w:ascii="Georgia" w:hAnsi="Georgia" w:eastAsia="Georgia" w:cs="Georgia"/>
+          <w:sz w:val="22"/>
+        </w:rPr>
+        <w:t xml:space="preserve">I would agree, everyone is avoiding me. I’m giving people the signs, yet everyone is pushing me away</w:t>
+      </w:r>
+    </w:p>
+    <w:p>
+      <w:pPr>
+        <w:spacing w:line="480" w:lineRule="auto" w:before="0" w:after="0"/>
+        <w:ind w:firstLine="720"/>
+        <w:jc w:val="both"/>
+      </w:pPr>
+      <w:r>
+        <w:rPr>
+          <w:rFonts w:ascii="Georgia" w:hAnsi="Georgia" w:eastAsia="Georgia" w:cs="Georgia"/>
+          <w:sz w:val="22"/>
+          <w:b/>
+        </w:rPr>
+        <w:t xml:space="preserve">Comment 2 under Caption 5 (Page 6). </w:t>
+      </w:r>
+      <w:r>
+        <w:rPr>
+          <w:rFonts w:ascii="Georgia" w:hAnsi="Georgia" w:eastAsia="Georgia" w:cs="Georgia"/>
+          <w:sz w:val="22"/>
+        </w:rPr>
+        <w:t xml:space="preserve">As a society, we should take care of each other. Be kind no matter what! You never know what another person is going through</w:t>
+      </w:r>
+    </w:p>
+    <w:p>
+      <w:pPr>
+        <w:spacing w:line="480" w:lineRule="auto" w:before="0" w:after="0"/>
+        <w:ind w:firstLine="720"/>
+        <w:jc w:val="both"/>
+      </w:pPr>
+      <w:r>
+        <w:rPr>
+          <w:rFonts w:ascii="Georgia" w:hAnsi="Georgia" w:eastAsia="Georgia" w:cs="Georgia"/>
+          <w:sz w:val="22"/>
+          <w:b/>
+        </w:rPr>
+        <w:t xml:space="preserve">Caption 6 (Page 6). </w:t>
+      </w:r>
+      <w:r>
+        <w:rPr>
+          <w:rFonts w:ascii="Georgia" w:hAnsi="Georgia" w:eastAsia="Georgia" w:cs="Georgia"/>
+          <w:sz w:val="22"/>
+        </w:rPr>
+        <w:t xml:space="preserve">There should not be an “until”, mental health matters full stop. all mental health needs to be taken seriously &amp; met with care &amp; understanding. the glamorisation and lack of understanding around mental health is so harmful and it’s costing people both their wellbeing and lives. something desperately needs to change &amp; we need much better, de-stigmatised education surrounding mental health. if your mental health hasn’t been taken seriously, for any reason, i am so unbelievably sorry. #mentalhealthawareness #mentalhealthmatters #mentalhealth #mentalillnessawareness #mentalillnessrecovery #mentalillness #mentalillnessisreal #eatingdisorder #depression #anxiety #ocd #borderlinepersonalitydisorder #eupd #bpd #mentalhealthadvocate #traumarecovery #mentalhealthrecovery</w:t>
+      </w:r>
+    </w:p>
+    <w:p>
+      <w:pPr>
+        <w:spacing w:line="480" w:lineRule="auto" w:before="0" w:after="0"/>
+        <w:ind w:firstLine="720"/>
+        <w:jc w:val="both"/>
+      </w:pPr>
+      <w:r>
+        <w:rPr>
+          <w:rFonts w:ascii="Georgia" w:hAnsi="Georgia" w:eastAsia="Georgia" w:cs="Georgia"/>
+          <w:sz w:val="22"/>
+          <w:b/>
+        </w:rPr>
+        <w:t xml:space="preserve">Comment 1 under Caption 6 (Page 6). </w:t>
+      </w:r>
+      <w:r>
+        <w:rPr>
+          <w:rFonts w:ascii="Georgia" w:hAnsi="Georgia" w:eastAsia="Georgia" w:cs="Georgia"/>
+          <w:sz w:val="22"/>
+        </w:rPr>
+        <w:t xml:space="preserve">Mental health deserves attention before someone reaches a crisis point. Early understanding, compassionate support, and accessible education can make a meaningful difference.</w:t>
+      </w:r>
+    </w:p>
+    <w:p>
+      <w:pPr>
+        <w:spacing w:line="480" w:lineRule="auto" w:before="0" w:after="0"/>
+        <w:ind w:firstLine="720"/>
+        <w:jc w:val="both"/>
+      </w:pPr>
+      <w:r>
+        <w:rPr>
+          <w:rFonts w:ascii="Georgia" w:hAnsi="Georgia" w:eastAsia="Georgia" w:cs="Georgia"/>
+          <w:sz w:val="22"/>
+          <w:b/>
+        </w:rPr>
+        <w:t xml:space="preserve">Comment 2 under Caption 6 (Page 6). </w:t>
+      </w:r>
+      <w:r>
+        <w:rPr>
+          <w:rFonts w:ascii="Georgia" w:hAnsi="Georgia" w:eastAsia="Georgia" w:cs="Georgia"/>
+          <w:sz w:val="22"/>
+        </w:rPr>
+        <w:t xml:space="preserve">Absolutely agree—mental health should never come with conditions or exceptions. It’s heartbreaking how often it’s misunderstood or dismissed. Thank you for speaking up and holding space for those who’ve been overlooked. This message is so needed.</w:t>
+      </w:r>
+    </w:p>
+    <w:p>
+      <w:pPr>
+        <w:spacing w:line="480" w:lineRule="auto" w:before="0" w:after="0"/>
+        <w:ind w:firstLine="720"/>
+        <w:jc w:val="both"/>
+      </w:pPr>
+      <w:r>
+        <w:rPr>
+          <w:rFonts w:ascii="Georgia" w:hAnsi="Georgia" w:eastAsia="Georgia" w:cs="Georgia"/>
+          <w:sz w:val="22"/>
+          <w:b/>
+        </w:rPr>
+        <w:t xml:space="preserve">Caption 7 (Page 6). </w:t>
+      </w:r>
+      <w:r>
+        <w:rPr>
+          <w:rFonts w:ascii="Georgia" w:hAnsi="Georgia" w:eastAsia="Georgia" w:cs="Georgia"/>
+          <w:sz w:val="22"/>
+        </w:rPr>
+        <w:t xml:space="preserve">Not everyone’s trauma gives them thick skin. Sometimes, it makes us more sensitive and vulnerable. It’s okay to feel deeply and acknowledge our experiences. Healing isn’t about pretending to be strong; it’s about embracing our journey and growing from it. 💖 - #MentalHealthAwareness #HealingJourney #BeKindToYourself #mentalhealth</w:t>
+      </w:r>
+    </w:p>
+    <w:p>
+      <w:pPr>
+        <w:spacing w:line="480" w:lineRule="auto" w:before="0" w:after="0"/>
+        <w:ind w:firstLine="720"/>
+        <w:jc w:val="both"/>
+      </w:pPr>
+      <w:r>
+        <w:rPr>
+          <w:rFonts w:ascii="Georgia" w:hAnsi="Georgia" w:eastAsia="Georgia" w:cs="Georgia"/>
+          <w:sz w:val="22"/>
+          <w:b/>
+        </w:rPr>
+        <w:t xml:space="preserve">Comment 1 under Caption 7 (Page 6). </w:t>
+      </w:r>
+      <w:r>
+        <w:rPr>
+          <w:rFonts w:ascii="Georgia" w:hAnsi="Georgia" w:eastAsia="Georgia" w:cs="Georgia"/>
+          <w:sz w:val="22"/>
+        </w:rPr>
+        <w:t xml:space="preserve">Don’t ever let anyone tell you how to heal. Trauma goes with some people to their grave and I’m sorry if that does for you. Hopefully you are able to grow stronger x</w:t>
+      </w:r>
+    </w:p>
+    <w:p>
+      <w:pPr>
+        <w:spacing w:line="480" w:lineRule="auto" w:before="0" w:after="0"/>
+        <w:ind w:firstLine="720"/>
+        <w:jc w:val="both"/>
+      </w:pPr>
+      <w:r>
+        <w:rPr>
+          <w:rFonts w:ascii="Georgia" w:hAnsi="Georgia" w:eastAsia="Georgia" w:cs="Georgia"/>
+          <w:sz w:val="22"/>
+          <w:b/>
+        </w:rPr>
+        <w:t xml:space="preserve">Comment 2 under Caption 7 (Page 6). </w:t>
+      </w:r>
+      <w:r>
+        <w:rPr>
+          <w:rFonts w:ascii="Georgia" w:hAnsi="Georgia" w:eastAsia="Georgia" w:cs="Georgia"/>
+          <w:sz w:val="22"/>
+        </w:rPr>
+        <w:t xml:space="preserve">Thank you ❤️ I get so overwhelmed now and find myself having panic attack attacks all the time. I’m just trying to take it one day at a time.</w:t>
       </w:r>
     </w:p>
     <w:sectPr>

</xml_diff>

<commit_message>
Rebuild Appendix C inside thesis DOCX with standard Word paragraphs (30 captions + 60 comments)
</commit_message>
<xml_diff>
--- a/thesis/Thesis_Instagram_MH_v15.docx
+++ b/thesis/Thesis_Instagram_MH_v15.docx
@@ -8445,16 +8445,16 @@
     <w:p>
       <w:pPr>
         <w:spacing w:line="480" w:lineRule="auto" w:before="240" w:after="0"/>
+        <w:ind w:firstLine="0"/>
         <w:jc w:val="left"/>
       </w:pPr>
       <w:r>
         <w:rPr>
           <w:rFonts w:ascii="Georgia" w:hAnsi="Georgia" w:eastAsia="Georgia" w:cs="Georgia"/>
+          <w:b/>
           <w:sz w:val="24"/>
-          <w:szCs w:val="24"/>
-          <w:b/>
-        </w:rPr>
-        <w:t xml:space="preserve">APPENDIX C: CORPUS OF CAPTIONS AND COMMENTS</w:t>
+        </w:rPr>
+        <w:t>APPENDIX C: CORPUS OF CAPTIONS AND COMMENTS</w:t>
       </w:r>
     </w:p>
     <w:p>
@@ -8466,10 +8466,10 @@
       <w:r>
         <w:rPr>
           <w:rFonts w:ascii="Georgia" w:hAnsi="Georgia" w:eastAsia="Georgia" w:cs="Georgia"/>
-          <w:sz w:val="22"/>
-          <w:szCs w:val="22"/>
-        </w:rPr>
-        <w:t xml:space="preserve">This appendix presents the final corpus analyzed in the study for transparency. It comprises 30 English-language captions from six anonymized public mental health advocacy pages and two eligible comments under each caption (60 comments). Page identities are withheld. Labels identify unit type only: C marks a caption; X1 and X2 mark the first and second comment selected under that caption. Usernames and other direct personal identifiers in the source material were redacted where they appeared. Emoji and hashtags are retained when they formed part of the visible public text.</w:t>
+          <w:b w:val="0"/>
+          <w:sz w:val="22"/>
+        </w:rPr>
+        <w:t>This appendix presents the final corpus analyzed in the study for transparency. It comprises 30 English-language captions from six anonymized public mental health advocacy pages and two eligible comments under each caption (60 comments). Page identities are withheld. Each entry is labeled as a caption or as a comment under a caption. Usernames and other direct personal identifiers in the source material were redacted where they appeared. Emoji and hashtags are retained when they formed part of the visible public text.</w:t>
       </w:r>
     </w:p>
     <w:p>
@@ -8481,17 +8481,18 @@
       <w:r>
         <w:rPr>
           <w:rFonts w:ascii="Georgia" w:hAnsi="Georgia" w:eastAsia="Georgia" w:cs="Georgia"/>
-          <w:sz w:val="22"/>
-          <w:b/>
+          <w:b/>
+          <w:sz w:val="22"/>
         </w:rPr>
         <w:t xml:space="preserve">Caption 1 (Page 1). </w:t>
       </w:r>
       <w:r>
         <w:rPr>
           <w:rFonts w:ascii="Georgia" w:hAnsi="Georgia" w:eastAsia="Georgia" w:cs="Georgia"/>
-          <w:sz w:val="22"/>
-        </w:rPr>
-        <w:t xml:space="preserve">Art 🤝 Mental Health I’m so grateful to represent ████████ as an ambassador, and be here at NAMICon drawing live ✍️ I’ve met so many amazing people so far, and feel very lucky to have a platform where I can help destigmatize mental illness, and show others how art can be a therapeutic and helpful tool for navigating life. #mentalhealthawareness #artandmentalhealth #arttherapy</w:t>
+          <w:b w:val="0"/>
+          <w:sz w:val="22"/>
+        </w:rPr>
+        <w:t>Art 🤝 Mental Health I’m so grateful to represent ████████ as an ambassador, and be here at NAMICon drawing live ✍️ I’ve met so many amazing people so far, and feel very lucky to have a platform where I can help destigmatize mental illness, and show others how art can be a therapeutic and helpful tool for navigating life. #mentalhealthawareness #artandmentalhealth #arttherapy</w:t>
       </w:r>
     </w:p>
     <w:p>
@@ -8503,17 +8504,18 @@
       <w:r>
         <w:rPr>
           <w:rFonts w:ascii="Georgia" w:hAnsi="Georgia" w:eastAsia="Georgia" w:cs="Georgia"/>
-          <w:sz w:val="22"/>
-          <w:b/>
+          <w:b/>
+          <w:sz w:val="22"/>
         </w:rPr>
         <w:t xml:space="preserve">Comment 1 under Caption 1 (Page 1). </w:t>
       </w:r>
       <w:r>
         <w:rPr>
           <w:rFonts w:ascii="Georgia" w:hAnsi="Georgia" w:eastAsia="Georgia" w:cs="Georgia"/>
-          <w:sz w:val="22"/>
-        </w:rPr>
-        <w:t xml:space="preserve">We love the way you’re involving the audience in your art, what a great way to encourage community! We can’t wait to unveil your beautiful work on the Firehouse walls.</w:t>
+          <w:b w:val="0"/>
+          <w:sz w:val="22"/>
+        </w:rPr>
+        <w:t>We love the way you’re involving the audience in your art, what a great way to encourage community! We can’t wait to unveil your beautiful work on the Firehouse walls.</w:t>
       </w:r>
     </w:p>
     <w:p>
@@ -8525,17 +8527,18 @@
       <w:r>
         <w:rPr>
           <w:rFonts w:ascii="Georgia" w:hAnsi="Georgia" w:eastAsia="Georgia" w:cs="Georgia"/>
-          <w:sz w:val="22"/>
-          <w:b/>
+          <w:b/>
+          <w:sz w:val="22"/>
         </w:rPr>
         <w:t xml:space="preserve">Comment 2 under Caption 1 (Page 1). </w:t>
       </w:r>
       <w:r>
         <w:rPr>
           <w:rFonts w:ascii="Georgia" w:hAnsi="Georgia" w:eastAsia="Georgia" w:cs="Georgia"/>
-          <w:sz w:val="22"/>
-        </w:rPr>
-        <w:t xml:space="preserve">Love this concept! The connection between art and mental health can be powerful!</w:t>
+          <w:b w:val="0"/>
+          <w:sz w:val="22"/>
+        </w:rPr>
+        <w:t>Love this concept! The connection between art and mental health can be powerful!</w:t>
       </w:r>
     </w:p>
     <w:p>
@@ -8547,17 +8550,18 @@
       <w:r>
         <w:rPr>
           <w:rFonts w:ascii="Georgia" w:hAnsi="Georgia" w:eastAsia="Georgia" w:cs="Georgia"/>
-          <w:sz w:val="22"/>
-          <w:b/>
+          <w:b/>
+          <w:sz w:val="22"/>
         </w:rPr>
         <w:t xml:space="preserve">Caption 2 (Page 1). </w:t>
       </w:r>
       <w:r>
         <w:rPr>
           <w:rFonts w:ascii="Georgia" w:hAnsi="Georgia" w:eastAsia="Georgia" w:cs="Georgia"/>
-          <w:sz w:val="22"/>
-        </w:rPr>
-        <w:t xml:space="preserve">Every day won't look or feel perfect, and that's okay. Remember, it's okay to not be okay!</w:t>
+          <w:b w:val="0"/>
+          <w:sz w:val="22"/>
+        </w:rPr>
+        <w:t>Every day won't look or feel perfect, and that's okay. Remember, it's okay to not be okay!</w:t>
       </w:r>
     </w:p>
     <w:p>
@@ -8569,17 +8573,18 @@
       <w:r>
         <w:rPr>
           <w:rFonts w:ascii="Georgia" w:hAnsi="Georgia" w:eastAsia="Georgia" w:cs="Georgia"/>
-          <w:sz w:val="22"/>
-          <w:b/>
+          <w:b/>
+          <w:sz w:val="22"/>
         </w:rPr>
         <w:t xml:space="preserve">Comment 1 under Caption 2 (Page 1). </w:t>
       </w:r>
       <w:r>
         <w:rPr>
           <w:rFonts w:ascii="Georgia" w:hAnsi="Georgia" w:eastAsia="Georgia" w:cs="Georgia"/>
-          <w:sz w:val="22"/>
-        </w:rPr>
-        <w:t xml:space="preserve">Tell someone! You don’t have to be alone! Be aware of those around you who might be suffering in silence. Wait with them...</w:t>
+          <w:b w:val="0"/>
+          <w:sz w:val="22"/>
+        </w:rPr>
+        <w:t>Tell someone! You don’t have to be alone! Be aware of those around you who might be suffering in silence. Wait with them...</w:t>
       </w:r>
     </w:p>
     <w:p>
@@ -8591,17 +8596,18 @@
       <w:r>
         <w:rPr>
           <w:rFonts w:ascii="Georgia" w:hAnsi="Georgia" w:eastAsia="Georgia" w:cs="Georgia"/>
-          <w:sz w:val="22"/>
-          <w:b/>
+          <w:b/>
+          <w:sz w:val="22"/>
         </w:rPr>
         <w:t xml:space="preserve">Comment 2 under Caption 2 (Page 1). </w:t>
       </w:r>
       <w:r>
         <w:rPr>
           <w:rFonts w:ascii="Georgia" w:hAnsi="Georgia" w:eastAsia="Georgia" w:cs="Georgia"/>
-          <w:sz w:val="22"/>
-        </w:rPr>
-        <w:t xml:space="preserve">When she have episodes, times like this are so hard but we will keep pushing until her next better days.</w:t>
+          <w:b w:val="0"/>
+          <w:sz w:val="22"/>
+        </w:rPr>
+        <w:t>When she have episodes, times like this are so hard but we will keep pushing until her next better days.</w:t>
       </w:r>
     </w:p>
     <w:p>
@@ -8613,17 +8619,18 @@
       <w:r>
         <w:rPr>
           <w:rFonts w:ascii="Georgia" w:hAnsi="Georgia" w:eastAsia="Georgia" w:cs="Georgia"/>
-          <w:sz w:val="22"/>
-          <w:b/>
+          <w:b/>
+          <w:sz w:val="22"/>
         </w:rPr>
         <w:t xml:space="preserve">Caption 3 (Page 1). </w:t>
       </w:r>
       <w:r>
         <w:rPr>
           <w:rFonts w:ascii="Georgia" w:hAnsi="Georgia" w:eastAsia="Georgia" w:cs="Georgia"/>
-          <w:sz w:val="22"/>
-        </w:rPr>
-        <w:t xml:space="preserve">Remember to be kind, to be patient, and don’t be afraid to have open conversations on #WorldSchizophreniaDay. It’s how we continue to destigmatize mental illness and help one another.</w:t>
+          <w:b w:val="0"/>
+          <w:sz w:val="22"/>
+        </w:rPr>
+        <w:t>Remember to be kind, to be patient, and don’t be afraid to have open conversations on #WorldSchizophreniaDay. It’s how we continue to destigmatize mental illness and help one another.</w:t>
       </w:r>
     </w:p>
     <w:p>
@@ -8635,17 +8642,18 @@
       <w:r>
         <w:rPr>
           <w:rFonts w:ascii="Georgia" w:hAnsi="Georgia" w:eastAsia="Georgia" w:cs="Georgia"/>
-          <w:sz w:val="22"/>
-          <w:b/>
+          <w:b/>
+          <w:sz w:val="22"/>
         </w:rPr>
         <w:t xml:space="preserve">Comment 1 under Caption 3 (Page 1). </w:t>
       </w:r>
       <w:r>
         <w:rPr>
           <w:rFonts w:ascii="Georgia" w:hAnsi="Georgia" w:eastAsia="Georgia" w:cs="Georgia"/>
-          <w:sz w:val="22"/>
-        </w:rPr>
-        <w:t xml:space="preserve">My husband has schizophrenia, he is suicidal. He has completely lost touch with reality and does not trust anyone at all. At the moment we are trying to find him so he can be helped.</w:t>
+          <w:b w:val="0"/>
+          <w:sz w:val="22"/>
+        </w:rPr>
+        <w:t>My husband has schizophrenia, he is suicidal. He has completely lost touch with reality and does not trust anyone at all. At the moment we are trying to find him so he can be helped.</w:t>
       </w:r>
     </w:p>
     <w:p>
@@ -8657,17 +8665,18 @@
       <w:r>
         <w:rPr>
           <w:rFonts w:ascii="Georgia" w:hAnsi="Georgia" w:eastAsia="Georgia" w:cs="Georgia"/>
-          <w:sz w:val="22"/>
-          <w:b/>
+          <w:b/>
+          <w:sz w:val="22"/>
         </w:rPr>
         <w:t xml:space="preserve">Comment 2 under Caption 3 (Page 1). </w:t>
       </w:r>
       <w:r>
         <w:rPr>
           <w:rFonts w:ascii="Georgia" w:hAnsi="Georgia" w:eastAsia="Georgia" w:cs="Georgia"/>
-          <w:sz w:val="22"/>
-        </w:rPr>
-        <w:t xml:space="preserve">Don't be afraid to have that conversation is 🙌🏻 That's a step towards obliterating stigma around health.</w:t>
+          <w:b w:val="0"/>
+          <w:sz w:val="22"/>
+        </w:rPr>
+        <w:t>Don't be afraid to have that conversation is 🙌🏻 That's a step towards obliterating stigma around health.</w:t>
       </w:r>
     </w:p>
     <w:p>
@@ -8679,17 +8688,18 @@
       <w:r>
         <w:rPr>
           <w:rFonts w:ascii="Georgia" w:hAnsi="Georgia" w:eastAsia="Georgia" w:cs="Georgia"/>
-          <w:sz w:val="22"/>
-          <w:b/>
+          <w:b/>
+          <w:sz w:val="22"/>
         </w:rPr>
         <w:t xml:space="preserve">Caption 4 (Page 1). </w:t>
       </w:r>
       <w:r>
         <w:rPr>
           <w:rFonts w:ascii="Georgia" w:hAnsi="Georgia" w:eastAsia="Georgia" w:cs="Georgia"/>
-          <w:sz w:val="22"/>
-        </w:rPr>
-        <w:t xml:space="preserve">Small steps lead to big progress. Focus on the little victories that pave the way for meaningful change. #TakeAMentalHealthMoment #MentalHealthMonth</w:t>
+          <w:b w:val="0"/>
+          <w:sz w:val="22"/>
+        </w:rPr>
+        <w:t>Small steps lead to big progress. Focus on the little victories that pave the way for meaningful change. #TakeAMentalHealthMoment #MentalHealthMonth</w:t>
       </w:r>
     </w:p>
     <w:p>
@@ -8701,17 +8711,18 @@
       <w:r>
         <w:rPr>
           <w:rFonts w:ascii="Georgia" w:hAnsi="Georgia" w:eastAsia="Georgia" w:cs="Georgia"/>
-          <w:sz w:val="22"/>
-          <w:b/>
+          <w:b/>
+          <w:sz w:val="22"/>
         </w:rPr>
         <w:t xml:space="preserve">Comment 1 under Caption 4 (Page 1). </w:t>
       </w:r>
       <w:r>
         <w:rPr>
           <w:rFonts w:ascii="Georgia" w:hAnsi="Georgia" w:eastAsia="Georgia" w:cs="Georgia"/>
-          <w:sz w:val="22"/>
-        </w:rPr>
-        <w:t xml:space="preserve">Small steps everyday forever. Recovery and mental health is an ongoing effort.</w:t>
+          <w:b w:val="0"/>
+          <w:sz w:val="22"/>
+        </w:rPr>
+        <w:t>Small steps everyday forever. Recovery and mental health is an ongoing effort.</w:t>
       </w:r>
     </w:p>
     <w:p>
@@ -8723,17 +8734,18 @@
       <w:r>
         <w:rPr>
           <w:rFonts w:ascii="Georgia" w:hAnsi="Georgia" w:eastAsia="Georgia" w:cs="Georgia"/>
-          <w:sz w:val="22"/>
-          <w:b/>
+          <w:b/>
+          <w:sz w:val="22"/>
         </w:rPr>
         <w:t xml:space="preserve">Comment 2 under Caption 4 (Page 1). </w:t>
       </w:r>
       <w:r>
         <w:rPr>
           <w:rFonts w:ascii="Georgia" w:hAnsi="Georgia" w:eastAsia="Georgia" w:cs="Georgia"/>
-          <w:sz w:val="22"/>
-        </w:rPr>
-        <w:t xml:space="preserve">It is important to celebrate the “ small “ steps forward! They can provide a source of hope as well.</w:t>
+          <w:b w:val="0"/>
+          <w:sz w:val="22"/>
+        </w:rPr>
+        <w:t>It is important to celebrate the “ small “ steps forward! They can provide a source of hope as well.</w:t>
       </w:r>
     </w:p>
     <w:p>
@@ -8745,17 +8757,18 @@
       <w:r>
         <w:rPr>
           <w:rFonts w:ascii="Georgia" w:hAnsi="Georgia" w:eastAsia="Georgia" w:cs="Georgia"/>
-          <w:sz w:val="22"/>
-          <w:b/>
+          <w:b/>
+          <w:sz w:val="22"/>
         </w:rPr>
         <w:t xml:space="preserve">Caption 5 (Page 1). </w:t>
       </w:r>
       <w:r>
         <w:rPr>
           <w:rFonts w:ascii="Georgia" w:hAnsi="Georgia" w:eastAsia="Georgia" w:cs="Georgia"/>
-          <w:sz w:val="22"/>
-        </w:rPr>
-        <w:t xml:space="preserve">It's our favorite month of the year! Join us this #MentalHealthAwarenessMonth by agreeing to #TakeTheMoment to prioritize your mental health. Discover our range of signature programs and resources, including NAMI Basics, NAMI Family-to-Family, NAMI Homefront, and more! Learn more about getting engaged this month at nami.org/mham</w:t>
+          <w:b w:val="0"/>
+          <w:sz w:val="22"/>
+        </w:rPr>
+        <w:t>It's our favorite month of the year! Join us this #MentalHealthAwarenessMonth by agreeing to #TakeTheMoment to prioritize your mental health. Discover our range of signature programs and resources, including NAMI Basics, NAMI Family-to-Family, NAMI Homefront, and more! Learn more about getting engaged this month at nami.org/mham</w:t>
       </w:r>
     </w:p>
     <w:p>
@@ -8767,17 +8780,18 @@
       <w:r>
         <w:rPr>
           <w:rFonts w:ascii="Georgia" w:hAnsi="Georgia" w:eastAsia="Georgia" w:cs="Georgia"/>
-          <w:sz w:val="22"/>
-          <w:b/>
+          <w:b/>
+          <w:sz w:val="22"/>
         </w:rPr>
         <w:t xml:space="preserve">Comment 1 under Caption 5 (Page 1). </w:t>
       </w:r>
       <w:r>
         <w:rPr>
           <w:rFonts w:ascii="Georgia" w:hAnsi="Georgia" w:eastAsia="Georgia" w:cs="Georgia"/>
-          <w:sz w:val="22"/>
-        </w:rPr>
-        <w:t xml:space="preserve">❤️ My youngest was recently diagnosed with bi-polar 1 I’m taking the family to family class offered and educating myself the best I can</w:t>
+          <w:b w:val="0"/>
+          <w:sz w:val="22"/>
+        </w:rPr>
+        <w:t>❤️ My youngest was recently diagnosed with bi-polar 1 I’m taking the family to family class offered and educating myself the best I can</w:t>
       </w:r>
     </w:p>
     <w:p>
@@ -8789,17 +8803,18 @@
       <w:r>
         <w:rPr>
           <w:rFonts w:ascii="Georgia" w:hAnsi="Georgia" w:eastAsia="Georgia" w:cs="Georgia"/>
-          <w:sz w:val="22"/>
-          <w:b/>
+          <w:b/>
+          <w:sz w:val="22"/>
         </w:rPr>
         <w:t xml:space="preserve">Comment 2 under Caption 5 (Page 1). </w:t>
       </w:r>
       <w:r>
         <w:rPr>
           <w:rFonts w:ascii="Georgia" w:hAnsi="Georgia" w:eastAsia="Georgia" w:cs="Georgia"/>
-          <w:sz w:val="22"/>
-        </w:rPr>
-        <w:t xml:space="preserve">May I be blessed that I was once mentally ill, suicidal and ignorant of life, May I take the time this May to re-mind myself of just how lucky I am and offer my support to those that are not xxx #MentalHealthAwareness #MentalHealthMatters #SelfCare #Mindfulness #Spirituality #meditation #PersonalGrowth #Motivation #Inspiration #Anxiety #Depression #MindAndBody #awakening #kundalini #Mana #manampwr</w:t>
+          <w:b w:val="0"/>
+          <w:sz w:val="22"/>
+        </w:rPr>
+        <w:t>May I be blessed that I was once mentally ill, suicidal and ignorant of life, May I take the time this May to re-mind myself of just how lucky I am and offer my support to those that are not xxx #MentalHealthAwareness #MentalHealthMatters #SelfCare #Mindfulness #Spirituality #meditation #PersonalGrowth #Motivation #Inspiration #Anxiety #Depression #MindAndBody #awakening #kundalini #Mana #manampwr</w:t>
       </w:r>
     </w:p>
     <w:p>
@@ -8811,17 +8826,18 @@
       <w:r>
         <w:rPr>
           <w:rFonts w:ascii="Georgia" w:hAnsi="Georgia" w:eastAsia="Georgia" w:cs="Georgia"/>
-          <w:sz w:val="22"/>
-          <w:b/>
+          <w:b/>
+          <w:sz w:val="22"/>
         </w:rPr>
         <w:t xml:space="preserve">Caption 6 (Page 1). </w:t>
       </w:r>
       <w:r>
         <w:rPr>
           <w:rFonts w:ascii="Georgia" w:hAnsi="Georgia" w:eastAsia="Georgia" w:cs="Georgia"/>
-          <w:sz w:val="22"/>
-        </w:rPr>
-        <w:t xml:space="preserve">Embrace your greatness unapologetically! It all starts with how we think and talk about ourselves.</w:t>
+          <w:b w:val="0"/>
+          <w:sz w:val="22"/>
+        </w:rPr>
+        <w:t>Embrace your greatness unapologetically! It all starts with how we think and talk about ourselves.</w:t>
       </w:r>
     </w:p>
     <w:p>
@@ -8833,17 +8849,18 @@
       <w:r>
         <w:rPr>
           <w:rFonts w:ascii="Georgia" w:hAnsi="Georgia" w:eastAsia="Georgia" w:cs="Georgia"/>
-          <w:sz w:val="22"/>
-          <w:b/>
+          <w:b/>
+          <w:sz w:val="22"/>
         </w:rPr>
         <w:t xml:space="preserve">Comment 1 under Caption 6 (Page 1). </w:t>
       </w:r>
       <w:r>
         <w:rPr>
           <w:rFonts w:ascii="Georgia" w:hAnsi="Georgia" w:eastAsia="Georgia" w:cs="Georgia"/>
-          <w:sz w:val="22"/>
-        </w:rPr>
-        <w:t xml:space="preserve">Speaking positively about ourselves helps boost self-esteem and self-confidence. When we acknowledge our strengths, accomplishments, and positive qualities, we reinforce a positive self-image and develop a greater sense of self-worth.</w:t>
+          <w:b w:val="0"/>
+          <w:sz w:val="22"/>
+        </w:rPr>
+        <w:t>Speaking positively about ourselves helps boost self-esteem and self-confidence. When we acknowledge our strengths, accomplishments, and positive qualities, we reinforce a positive self-image and develop a greater sense of self-worth.</w:t>
       </w:r>
     </w:p>
     <w:p>
@@ -8855,17 +8872,18 @@
       <w:r>
         <w:rPr>
           <w:rFonts w:ascii="Georgia" w:hAnsi="Georgia" w:eastAsia="Georgia" w:cs="Georgia"/>
-          <w:sz w:val="22"/>
-          <w:b/>
+          <w:b/>
+          <w:sz w:val="22"/>
         </w:rPr>
         <w:t xml:space="preserve">Comment 2 under Caption 6 (Page 1). </w:t>
       </w:r>
       <w:r>
         <w:rPr>
           <w:rFonts w:ascii="Georgia" w:hAnsi="Georgia" w:eastAsia="Georgia" w:cs="Georgia"/>
-          <w:sz w:val="22"/>
-        </w:rPr>
-        <w:t xml:space="preserve">Even if you don’t believe what you’re saying at first...keep doing it till it feels natural and true. If it worked for me, it can work for you.❤️</w:t>
+          <w:b w:val="0"/>
+          <w:sz w:val="22"/>
+        </w:rPr>
+        <w:t>Even if you don’t believe what you’re saying at first...keep doing it till it feels natural and true. If it worked for me, it can work for you.❤️</w:t>
       </w:r>
     </w:p>
     <w:p>
@@ -8877,17 +8895,18 @@
       <w:r>
         <w:rPr>
           <w:rFonts w:ascii="Georgia" w:hAnsi="Georgia" w:eastAsia="Georgia" w:cs="Georgia"/>
-          <w:sz w:val="22"/>
-          <w:b/>
+          <w:b/>
+          <w:sz w:val="22"/>
         </w:rPr>
         <w:t xml:space="preserve">Caption 1 (Page 2). </w:t>
       </w:r>
       <w:r>
         <w:rPr>
           <w:rFonts w:ascii="Georgia" w:hAnsi="Georgia" w:eastAsia="Georgia" w:cs="Georgia"/>
-          <w:sz w:val="22"/>
-        </w:rPr>
-        <w:t xml:space="preserve">Change is natural. 🍂 Think about the changing seasons. Every fall, the leaves on the trees change color and eventually fall to the ground. In the winter, the trees rest. And when spring and summer return, they blossom again. As the leaves continue to change color and the days get a little crisper, remember that it’s okay if you’re changing, too. Whether you’re letting go of something that doesn’t serve you anymore or taking new actions for your mental health, change is okay. Remember: it’s about progress and growth, not perfection. Have a restful weekend, friends. 🧡</w:t>
+          <w:b w:val="0"/>
+          <w:sz w:val="22"/>
+        </w:rPr>
+        <w:t>Change is natural. 🍂 Think about the changing seasons. Every fall, the leaves on the trees change color and eventually fall to the ground. In the winter, the trees rest. And when spring and summer return, they blossom again. As the leaves continue to change color and the days get a little crisper, remember that it’s okay if you’re changing, too. Whether you’re letting go of something that doesn’t serve you anymore or taking new actions for your mental health, change is okay. Remember: it’s about progress and growth, not perfection. Have a restful weekend, friends. 🧡</w:t>
       </w:r>
     </w:p>
     <w:p>
@@ -8899,17 +8918,18 @@
       <w:r>
         <w:rPr>
           <w:rFonts w:ascii="Georgia" w:hAnsi="Georgia" w:eastAsia="Georgia" w:cs="Georgia"/>
-          <w:sz w:val="22"/>
-          <w:b/>
+          <w:b/>
+          <w:sz w:val="22"/>
         </w:rPr>
         <w:t xml:space="preserve">Comment 1 under Caption 1 (Page 2). </w:t>
       </w:r>
       <w:r>
         <w:rPr>
           <w:rFonts w:ascii="Georgia" w:hAnsi="Georgia" w:eastAsia="Georgia" w:cs="Georgia"/>
-          <w:sz w:val="22"/>
-        </w:rPr>
-        <w:t xml:space="preserve">Sometimes we reactively put up a fight to change when it can be as natural as the seasons 😌 thanks for that reminder 🍁🍂</w:t>
+          <w:b w:val="0"/>
+          <w:sz w:val="22"/>
+        </w:rPr>
+        <w:t>Sometimes we reactively put up a fight to change when it can be as natural as the seasons 😌 thanks for that reminder 🍁🍂</w:t>
       </w:r>
     </w:p>
     <w:p>
@@ -8921,17 +8941,18 @@
       <w:r>
         <w:rPr>
           <w:rFonts w:ascii="Georgia" w:hAnsi="Georgia" w:eastAsia="Georgia" w:cs="Georgia"/>
-          <w:sz w:val="22"/>
-          <w:b/>
+          <w:b/>
+          <w:sz w:val="22"/>
         </w:rPr>
         <w:t xml:space="preserve">Comment 2 under Caption 1 (Page 2). </w:t>
       </w:r>
       <w:r>
         <w:rPr>
           <w:rFonts w:ascii="Georgia" w:hAnsi="Georgia" w:eastAsia="Georgia" w:cs="Georgia"/>
-          <w:sz w:val="22"/>
-        </w:rPr>
-        <w:t xml:space="preserve">Such a beautiful reflection nature reminds us that change isn’t something to fear, it’s part of renewal. Letting go creates space for something new to grow. Here’s to embracing every season, even the ones that feel uncertain — they all have</w:t>
+          <w:b w:val="0"/>
+          <w:sz w:val="22"/>
+        </w:rPr>
+        <w:t>Such a beautiful reflection nature reminds us that change isn’t something to fear, it’s part of renewal. Letting go creates space for something new to grow. Here’s to embracing every season, even the ones that feel uncertain — they all have</w:t>
       </w:r>
     </w:p>
     <w:p>
@@ -8943,17 +8964,18 @@
       <w:r>
         <w:rPr>
           <w:rFonts w:ascii="Georgia" w:hAnsi="Georgia" w:eastAsia="Georgia" w:cs="Georgia"/>
-          <w:sz w:val="22"/>
-          <w:b/>
+          <w:b/>
+          <w:sz w:val="22"/>
         </w:rPr>
         <w:t xml:space="preserve">Caption 2 (Page 2). </w:t>
       </w:r>
       <w:r>
         <w:rPr>
           <w:rFonts w:ascii="Georgia" w:hAnsi="Georgia" w:eastAsia="Georgia" w:cs="Georgia"/>
-          <w:sz w:val="22"/>
-        </w:rPr>
-        <w:t xml:space="preserve">Stop us if you’ve heard these mental health myths before... ☝️🤓 We’re living in a time where all the information in the world is just a few swipes away. But is that information always reliable? This #MentalIllnessAwarenessWeek, we’re debunking the mental health myths you’ve probably seen or heard with scientifically-backed research and data. We all have mental health - let’s keep talking about it.</w:t>
+          <w:b w:val="0"/>
+          <w:sz w:val="22"/>
+        </w:rPr>
+        <w:t>Stop us if you’ve heard these mental health myths before... ☝️🤓 We’re living in a time where all the information in the world is just a few swipes away. But is that information always reliable? This #MentalIllnessAwarenessWeek, we’re debunking the mental health myths you’ve probably seen or heard with scientifically-backed research and data. We all have mental health - let’s keep talking about it.</w:t>
       </w:r>
     </w:p>
     <w:p>
@@ -8965,17 +8987,18 @@
       <w:r>
         <w:rPr>
           <w:rFonts w:ascii="Georgia" w:hAnsi="Georgia" w:eastAsia="Georgia" w:cs="Georgia"/>
-          <w:sz w:val="22"/>
-          <w:b/>
+          <w:b/>
+          <w:sz w:val="22"/>
         </w:rPr>
         <w:t xml:space="preserve">Comment 1 under Caption 2 (Page 2). </w:t>
       </w:r>
       <w:r>
         <w:rPr>
           <w:rFonts w:ascii="Georgia" w:hAnsi="Georgia" w:eastAsia="Georgia" w:cs="Georgia"/>
-          <w:sz w:val="22"/>
-        </w:rPr>
-        <w:t xml:space="preserve">Absolutely! 👏 There’s so much misinformation out there, that’s why education and open conversations are key. The more we normalize real mental health facts, the more people get the help they deserve. 💙</w:t>
+          <w:b w:val="0"/>
+          <w:sz w:val="22"/>
+        </w:rPr>
+        <w:t>Absolutely! 👏 There’s so much misinformation out there, that’s why education and open conversations are key. The more we normalize real mental health facts, the more people get the help they deserve. 💙</w:t>
       </w:r>
     </w:p>
     <w:p>
@@ -8987,17 +9010,18 @@
       <w:r>
         <w:rPr>
           <w:rFonts w:ascii="Georgia" w:hAnsi="Georgia" w:eastAsia="Georgia" w:cs="Georgia"/>
-          <w:sz w:val="22"/>
-          <w:b/>
+          <w:b/>
+          <w:sz w:val="22"/>
         </w:rPr>
         <w:t xml:space="preserve">Comment 2 under Caption 2 (Page 2). </w:t>
       </w:r>
       <w:r>
         <w:rPr>
           <w:rFonts w:ascii="Georgia" w:hAnsi="Georgia" w:eastAsia="Georgia" w:cs="Georgia"/>
-          <w:sz w:val="22"/>
-        </w:rPr>
-        <w:t xml:space="preserve">We are so with you on this! Debunking myths like 'mental illness is a sign of weakness' is absolutely vital to fighting stigma. Thank you for reminding everyone to seek out science backed facts and keep talking about it.</w:t>
+          <w:b w:val="0"/>
+          <w:sz w:val="22"/>
+        </w:rPr>
+        <w:t>We are so with you on this! Debunking myths like 'mental illness is a sign of weakness' is absolutely vital to fighting stigma. Thank you for reminding everyone to seek out science backed facts and keep talking about it.</w:t>
       </w:r>
     </w:p>
     <w:p>
@@ -9009,17 +9033,18 @@
       <w:r>
         <w:rPr>
           <w:rFonts w:ascii="Georgia" w:hAnsi="Georgia" w:eastAsia="Georgia" w:cs="Georgia"/>
-          <w:sz w:val="22"/>
-          <w:b/>
+          <w:b/>
+          <w:sz w:val="22"/>
         </w:rPr>
         <w:t xml:space="preserve">Caption 3 (Page 2). </w:t>
       </w:r>
       <w:r>
         <w:rPr>
           <w:rFonts w:ascii="Georgia" w:hAnsi="Georgia" w:eastAsia="Georgia" w:cs="Georgia"/>
-          <w:sz w:val="22"/>
-        </w:rPr>
-        <w:t xml:space="preserve">This week, practice making a home for all the parts of you that need to be loved, even the difficult ones. Every part of you deserves love and care. 🧡</w:t>
+          <w:b w:val="0"/>
+          <w:sz w:val="22"/>
+        </w:rPr>
+        <w:t>This week, practice making a home for all the parts of you that need to be loved, even the difficult ones. Every part of you deserves love and care. 🧡</w:t>
       </w:r>
     </w:p>
     <w:p>
@@ -9031,17 +9056,18 @@
       <w:r>
         <w:rPr>
           <w:rFonts w:ascii="Georgia" w:hAnsi="Georgia" w:eastAsia="Georgia" w:cs="Georgia"/>
-          <w:sz w:val="22"/>
-          <w:b/>
+          <w:b/>
+          <w:sz w:val="22"/>
         </w:rPr>
         <w:t xml:space="preserve">Comment 1 under Caption 3 (Page 2). </w:t>
       </w:r>
       <w:r>
         <w:rPr>
           <w:rFonts w:ascii="Georgia" w:hAnsi="Georgia" w:eastAsia="Georgia" w:cs="Georgia"/>
-          <w:sz w:val="22"/>
-        </w:rPr>
-        <w:t xml:space="preserve">Each chapter of who you are is worthy of care and compassion 💕🌱 Growth doesn’t erase your past, it teaches you to love it too.</w:t>
+          <w:b w:val="0"/>
+          <w:sz w:val="22"/>
+        </w:rPr>
+        <w:t>Each chapter of who you are is worthy of care and compassion 💕🌱 Growth doesn’t erase your past, it teaches you to love it too.</w:t>
       </w:r>
     </w:p>
     <w:p>
@@ -9053,17 +9079,18 @@
       <w:r>
         <w:rPr>
           <w:rFonts w:ascii="Georgia" w:hAnsi="Georgia" w:eastAsia="Georgia" w:cs="Georgia"/>
-          <w:sz w:val="22"/>
-          <w:b/>
+          <w:b/>
+          <w:sz w:val="22"/>
         </w:rPr>
         <w:t xml:space="preserve">Comment 2 under Caption 3 (Page 2). </w:t>
       </w:r>
       <w:r>
         <w:rPr>
           <w:rFonts w:ascii="Georgia" w:hAnsi="Georgia" w:eastAsia="Georgia" w:cs="Georgia"/>
-          <w:sz w:val="22"/>
-        </w:rPr>
-        <w:t xml:space="preserve">Even the messy, difficult parts of us need compassion. Learning to love all of ourselves is where real healing starts</w:t>
+          <w:b w:val="0"/>
+          <w:sz w:val="22"/>
+        </w:rPr>
+        <w:t>Even the messy, difficult parts of us need compassion. Learning to love all of ourselves is where real healing starts</w:t>
       </w:r>
     </w:p>
     <w:p>
@@ -9075,17 +9102,18 @@
       <w:r>
         <w:rPr>
           <w:rFonts w:ascii="Georgia" w:hAnsi="Georgia" w:eastAsia="Georgia" w:cs="Georgia"/>
-          <w:sz w:val="22"/>
-          <w:b/>
+          <w:b/>
+          <w:sz w:val="22"/>
         </w:rPr>
         <w:t xml:space="preserve">Caption 4 (Page 2). </w:t>
       </w:r>
       <w:r>
         <w:rPr>
           <w:rFonts w:ascii="Georgia" w:hAnsi="Georgia" w:eastAsia="Georgia" w:cs="Georgia"/>
-          <w:sz w:val="22"/>
-        </w:rPr>
-        <w:t xml:space="preserve">When you get caught in an anxiety loop, it’s easy to let hypotheticals bog down your mind. Reframing your “what ifs?” positively can help you stay grounded in those hard moments. You can get through this. 🧡</w:t>
+          <w:b w:val="0"/>
+          <w:sz w:val="22"/>
+        </w:rPr>
+        <w:t>When you get caught in an anxiety loop, it’s easy to let hypotheticals bog down your mind. Reframing your “what ifs?” positively can help you stay grounded in those hard moments. You can get through this. 🧡</w:t>
       </w:r>
     </w:p>
     <w:p>
@@ -9097,17 +9125,18 @@
       <w:r>
         <w:rPr>
           <w:rFonts w:ascii="Georgia" w:hAnsi="Georgia" w:eastAsia="Georgia" w:cs="Georgia"/>
-          <w:sz w:val="22"/>
-          <w:b/>
+          <w:b/>
+          <w:sz w:val="22"/>
         </w:rPr>
         <w:t xml:space="preserve">Comment 1 under Caption 4 (Page 2). </w:t>
       </w:r>
       <w:r>
         <w:rPr>
           <w:rFonts w:ascii="Georgia" w:hAnsi="Georgia" w:eastAsia="Georgia" w:cs="Georgia"/>
-          <w:sz w:val="22"/>
-        </w:rPr>
-        <w:t xml:space="preserve">Thank you for your kind words of encouragement it can and will work out to the person reading this know that you have a beautiful gift in your soul that you can share and shine in the world to illuminate it with your kind heart</w:t>
+          <w:b w:val="0"/>
+          <w:sz w:val="22"/>
+        </w:rPr>
+        <w:t>Thank you for your kind words of encouragement it can and will work out to the person reading this know that you have a beautiful gift in your soul that you can share and shine in the world to illuminate it with your kind heart</w:t>
       </w:r>
     </w:p>
     <w:p>
@@ -9119,17 +9148,18 @@
       <w:r>
         <w:rPr>
           <w:rFonts w:ascii="Georgia" w:hAnsi="Georgia" w:eastAsia="Georgia" w:cs="Georgia"/>
-          <w:sz w:val="22"/>
-          <w:b/>
+          <w:b/>
+          <w:sz w:val="22"/>
         </w:rPr>
         <w:t xml:space="preserve">Comment 2 under Caption 4 (Page 2). </w:t>
       </w:r>
       <w:r>
         <w:rPr>
           <w:rFonts w:ascii="Georgia" w:hAnsi="Georgia" w:eastAsia="Georgia" w:cs="Georgia"/>
-          <w:sz w:val="22"/>
-        </w:rPr>
-        <w:t xml:space="preserve">Thank you for bringing this up—it’s such an important reminder. After 23 years in mental health and working with high performing clients, I’ve seen how anxiety loops drain both focus and energy. In my private practice, I often guide clients to reframe ‘what if’ thinking into ‘even if’ or ‘what’s within my control.’ That simple shift interrupts the cycle and brings the mind back to the present. Reframing isn’t about ignoring fear—it’s about reclaiming agency</w:t>
+          <w:b w:val="0"/>
+          <w:sz w:val="22"/>
+        </w:rPr>
+        <w:t>Thank you for bringing this up—it’s such an important reminder. After 23 years in mental health and working with high performing clients, I’ve seen how anxiety loops drain both focus and energy. In my private practice, I often guide clients to reframe ‘what if’ thinking into ‘even if’ or ‘what’s within my control.’ That simple shift interrupts the cycle and brings the mind back to the present. Reframing isn’t about ignoring fear—it’s about reclaiming agency</w:t>
       </w:r>
     </w:p>
     <w:p>
@@ -9141,17 +9171,18 @@
       <w:r>
         <w:rPr>
           <w:rFonts w:ascii="Georgia" w:hAnsi="Georgia" w:eastAsia="Georgia" w:cs="Georgia"/>
-          <w:sz w:val="22"/>
-          <w:b/>
+          <w:b/>
+          <w:sz w:val="22"/>
         </w:rPr>
         <w:t xml:space="preserve">Caption 5 (Page 2). </w:t>
       </w:r>
       <w:r>
         <w:rPr>
           <w:rFonts w:ascii="Georgia" w:hAnsi="Georgia" w:eastAsia="Georgia" w:cs="Georgia"/>
-          <w:sz w:val="22"/>
-        </w:rPr>
-        <w:t xml:space="preserve">If facing tomorrow feels impossible, please know you’re not alone. We hope you stay, and we want you to get the support you deserve. As Suicide Prevention Month kicks off this September, Mental Health America and To Write Love on Her Arms want you to know that there are places to turn when the heaviness feels unbearable. Mental Health America’s free and confidential online mental health tests can help you understand what you’re experiencing and will walk you step by step through what it looks like to ask for help, and ████████’s crisis resource page can help you find a comprehensive list of places to turn in a moment of need. Find these resources and more at the 🔗 in our bio.</w:t>
+          <w:b w:val="0"/>
+          <w:sz w:val="22"/>
+        </w:rPr>
+        <w:t>If facing tomorrow feels impossible, please know you’re not alone. We hope you stay, and we want you to get the support you deserve. As Suicide Prevention Month kicks off this September, Mental Health America and To Write Love on Her Arms want you to know that there are places to turn when the heaviness feels unbearable. Mental Health America’s free and confidential online mental health tests can help you understand what you’re experiencing and will walk you step by step through what it looks like to ask for help, and ████████’s crisis resource page can help you find a comprehensive list of places to turn in a moment of need. Find these resources and more at the 🔗 in our bio.</w:t>
       </w:r>
     </w:p>
     <w:p>
@@ -9163,17 +9194,18 @@
       <w:r>
         <w:rPr>
           <w:rFonts w:ascii="Georgia" w:hAnsi="Georgia" w:eastAsia="Georgia" w:cs="Georgia"/>
-          <w:sz w:val="22"/>
-          <w:b/>
+          <w:b/>
+          <w:sz w:val="22"/>
         </w:rPr>
         <w:t xml:space="preserve">Comment 1 under Caption 5 (Page 2). </w:t>
       </w:r>
       <w:r>
         <w:rPr>
           <w:rFonts w:ascii="Georgia" w:hAnsi="Georgia" w:eastAsia="Georgia" w:cs="Georgia"/>
-          <w:sz w:val="22"/>
-        </w:rPr>
-        <w:t xml:space="preserve">We believe healing can begin in connection, whether through community, the water, or simply reaching out for support.</w:t>
+          <w:b w:val="0"/>
+          <w:sz w:val="22"/>
+        </w:rPr>
+        <w:t>We believe healing can begin in connection, whether through community, the water, or simply reaching out for support.</w:t>
       </w:r>
     </w:p>
     <w:p>
@@ -9185,17 +9217,18 @@
       <w:r>
         <w:rPr>
           <w:rFonts w:ascii="Georgia" w:hAnsi="Georgia" w:eastAsia="Georgia" w:cs="Georgia"/>
-          <w:sz w:val="22"/>
-          <w:b/>
+          <w:b/>
+          <w:sz w:val="22"/>
         </w:rPr>
         <w:t xml:space="preserve">Comment 2 under Caption 5 (Page 2). </w:t>
       </w:r>
       <w:r>
         <w:rPr>
           <w:rFonts w:ascii="Georgia" w:hAnsi="Georgia" w:eastAsia="Georgia" w:cs="Georgia"/>
-          <w:sz w:val="22"/>
-        </w:rPr>
-        <w:t xml:space="preserve">I've had a rough month with my depression. Hanging on by a thread. Then I get a letter that my phycologist is retiring. UGH It's been one thing after another 😳</w:t>
+          <w:b w:val="0"/>
+          <w:sz w:val="22"/>
+        </w:rPr>
+        <w:t>I've had a rough month with my depression. Hanging on by a thread. Then I get a letter that my phycologist is retiring. UGH It's been one thing after another 😳</w:t>
       </w:r>
     </w:p>
     <w:p>
@@ -9207,17 +9240,18 @@
       <w:r>
         <w:rPr>
           <w:rFonts w:ascii="Georgia" w:hAnsi="Georgia" w:eastAsia="Georgia" w:cs="Georgia"/>
-          <w:sz w:val="22"/>
-          <w:b/>
+          <w:b/>
+          <w:sz w:val="22"/>
         </w:rPr>
         <w:t xml:space="preserve">Caption 6 (Page 2). </w:t>
       </w:r>
       <w:r>
         <w:rPr>
           <w:rFonts w:ascii="Georgia" w:hAnsi="Georgia" w:eastAsia="Georgia" w:cs="Georgia"/>
-          <w:sz w:val="22"/>
-        </w:rPr>
-        <w:t xml:space="preserve">Content warning: This post discusses suicide. You deserve to live a life full of joy, peace, love, and adventure. This life is worth living. Each September, #SuicidePreventionMonth calls on each of us to consider our role in preventing suicide and to raise awareness of available resources and support options, like @988lifeline and @crisistextline. If you’re struggling with your mental health and you’re not sure where to start, taking a mental health test is a gentle first step. Mental Health America’s free and anonymous online tests can help you understand what you’re experiencing and what steps you can take before you reach a point of crisis. Take a test today at the 🔗 in our bio. If you or someone you know is in crisis, please know that help is available. Call or text 988 or chat online at 988lifeline.org. You can also reach a trained counselor at Crisis Text Line by texting HOME to 741741. Thank you for staying. 🧡</w:t>
+          <w:b w:val="0"/>
+          <w:sz w:val="22"/>
+        </w:rPr>
+        <w:t>Content warning: This post discusses suicide. You deserve to live a life full of joy, peace, love, and adventure. This life is worth living. Each September, #SuicidePreventionMonth calls on each of us to consider our role in preventing suicide and to raise awareness of available resources and support options, like @988lifeline and @crisistextline. If you’re struggling with your mental health and you’re not sure where to start, taking a mental health test is a gentle first step. Mental Health America’s free and anonymous online tests can help you understand what you’re experiencing and what steps you can take before you reach a point of crisis. Take a test today at the 🔗 in our bio. If you or someone you know is in crisis, please know that help is available. Call or text 988 or chat online at 988lifeline.org. You can also reach a trained counselor at Crisis Text Line by texting HOME to 741741. Thank you for staying. 🧡</w:t>
       </w:r>
     </w:p>
     <w:p>
@@ -9229,17 +9263,18 @@
       <w:r>
         <w:rPr>
           <w:rFonts w:ascii="Georgia" w:hAnsi="Georgia" w:eastAsia="Georgia" w:cs="Georgia"/>
-          <w:sz w:val="22"/>
-          <w:b/>
+          <w:b/>
+          <w:sz w:val="22"/>
         </w:rPr>
         <w:t xml:space="preserve">Comment 1 under Caption 6 (Page 2). </w:t>
       </w:r>
       <w:r>
         <w:rPr>
           <w:rFonts w:ascii="Georgia" w:hAnsi="Georgia" w:eastAsia="Georgia" w:cs="Georgia"/>
-          <w:sz w:val="22"/>
-        </w:rPr>
-        <w:t xml:space="preserve">It will be 5 years ago next Monday since I almost died and my daughter did CPR and saved my life ❤️ I’m grateful for every single day and thankful I’ve learned so much about myself and the importance of mental health!! Thank you for being here ❤️</w:t>
+          <w:b w:val="0"/>
+          <w:sz w:val="22"/>
+        </w:rPr>
+        <w:t>It will be 5 years ago next Monday since I almost died and my daughter did CPR and saved my life ❤️ I’m grateful for every single day and thankful I’ve learned so much about myself and the importance of mental health!! Thank you for being here ❤️</w:t>
       </w:r>
     </w:p>
     <w:p>
@@ -9251,17 +9286,18 @@
       <w:r>
         <w:rPr>
           <w:rFonts w:ascii="Georgia" w:hAnsi="Georgia" w:eastAsia="Georgia" w:cs="Georgia"/>
-          <w:sz w:val="22"/>
-          <w:b/>
+          <w:b/>
+          <w:sz w:val="22"/>
         </w:rPr>
         <w:t xml:space="preserve">Comment 2 under Caption 6 (Page 2). </w:t>
       </w:r>
       <w:r>
         <w:rPr>
           <w:rFonts w:ascii="Georgia" w:hAnsi="Georgia" w:eastAsia="Georgia" w:cs="Georgia"/>
-          <w:sz w:val="22"/>
-        </w:rPr>
-        <w:t xml:space="preserve">I’ve had to call 988 once and thinking about that moment breaks me. I’m doing so much better and they did really help me gain my footing</w:t>
+          <w:b w:val="0"/>
+          <w:sz w:val="22"/>
+        </w:rPr>
+        <w:t>I’ve had to call 988 once and thinking about that moment breaks me. I’m doing so much better and they did really help me gain my footing</w:t>
       </w:r>
     </w:p>
     <w:p>
@@ -9273,17 +9309,18 @@
       <w:r>
         <w:rPr>
           <w:rFonts w:ascii="Georgia" w:hAnsi="Georgia" w:eastAsia="Georgia" w:cs="Georgia"/>
-          <w:sz w:val="22"/>
-          <w:b/>
+          <w:b/>
+          <w:sz w:val="22"/>
         </w:rPr>
         <w:t xml:space="preserve">Caption 7 (Page 2). </w:t>
       </w:r>
       <w:r>
         <w:rPr>
           <w:rFonts w:ascii="Georgia" w:hAnsi="Georgia" w:eastAsia="Georgia" w:cs="Georgia"/>
-          <w:sz w:val="22"/>
-        </w:rPr>
-        <w:t xml:space="preserve">You don’t have to be strong all the time. It’s okay to ask for help. Visit the 🔗 in our bio to take the first step.</w:t>
+          <w:b w:val="0"/>
+          <w:sz w:val="22"/>
+        </w:rPr>
+        <w:t>You don’t have to be strong all the time. It’s okay to ask for help. Visit the 🔗 in our bio to take the first step.</w:t>
       </w:r>
     </w:p>
     <w:p>
@@ -9295,17 +9332,18 @@
       <w:r>
         <w:rPr>
           <w:rFonts w:ascii="Georgia" w:hAnsi="Georgia" w:eastAsia="Georgia" w:cs="Georgia"/>
-          <w:sz w:val="22"/>
-          <w:b/>
+          <w:b/>
+          <w:sz w:val="22"/>
         </w:rPr>
         <w:t xml:space="preserve">Comment 1 under Caption 7 (Page 2). </w:t>
       </w:r>
       <w:r>
         <w:rPr>
           <w:rFonts w:ascii="Georgia" w:hAnsi="Georgia" w:eastAsia="Georgia" w:cs="Georgia"/>
-          <w:sz w:val="22"/>
-        </w:rPr>
-        <w:t xml:space="preserve">Such an important reminder—strength isn’t never needing help, it’s having the courage to reach out when you do.</w:t>
+          <w:b w:val="0"/>
+          <w:sz w:val="22"/>
+        </w:rPr>
+        <w:t>Such an important reminder—strength isn’t never needing help, it’s having the courage to reach out when you do.</w:t>
       </w:r>
     </w:p>
     <w:p>
@@ -9317,17 +9355,18 @@
       <w:r>
         <w:rPr>
           <w:rFonts w:ascii="Georgia" w:hAnsi="Georgia" w:eastAsia="Georgia" w:cs="Georgia"/>
-          <w:sz w:val="22"/>
-          <w:b/>
+          <w:b/>
+          <w:sz w:val="22"/>
         </w:rPr>
         <w:t xml:space="preserve">Comment 2 under Caption 7 (Page 2). </w:t>
       </w:r>
       <w:r>
         <w:rPr>
           <w:rFonts w:ascii="Georgia" w:hAnsi="Georgia" w:eastAsia="Georgia" w:cs="Georgia"/>
-          <w:sz w:val="22"/>
-        </w:rPr>
-        <w:t xml:space="preserve">Thank you for sharing. So true. Healing happens in connection. Co-regulation reminds us that leaning on others is not weakness but part of the process.</w:t>
+          <w:b w:val="0"/>
+          <w:sz w:val="22"/>
+        </w:rPr>
+        <w:t>Thank you for sharing. So true. Healing happens in connection. Co-regulation reminds us that leaning on others is not weakness but part of the process.</w:t>
       </w:r>
     </w:p>
     <w:p>
@@ -9339,17 +9378,18 @@
       <w:r>
         <w:rPr>
           <w:rFonts w:ascii="Georgia" w:hAnsi="Georgia" w:eastAsia="Georgia" w:cs="Georgia"/>
-          <w:sz w:val="22"/>
-          <w:b/>
+          <w:b/>
+          <w:sz w:val="22"/>
         </w:rPr>
         <w:t xml:space="preserve">Caption 1 (Page 3). </w:t>
       </w:r>
       <w:r>
         <w:rPr>
           <w:rFonts w:ascii="Georgia" w:hAnsi="Georgia" w:eastAsia="Georgia" w:cs="Georgia"/>
-          <w:sz w:val="22"/>
-        </w:rPr>
-        <w:t xml:space="preserve">"For many dads in psychotherapy—captains of industry, adrift at sea, or steering domestic waters their fathers never charted—fatherhood triggers an old standing order: You earn, therefore you are," explains clinical psychologist Jett Stone, Ph.D. This can become tunnel vision and negatively affect key relationships. Labeling the problem, sharing the numbers, and challenging the provider myth together can help partners get back on track. How does the male provider myth relate to your experience? Tell us in the comments. 💭 Do you know someone who might like to read this? Share it with them. 👀 Click the link in our bio to read more. Image credit: apghedia / Shutterstock #psychology #relationships #mentalhealth #fathers</w:t>
+          <w:b w:val="0"/>
+          <w:sz w:val="22"/>
+        </w:rPr>
+        <w:t>"For many dads in psychotherapy—captains of industry, adrift at sea, or steering domestic waters their fathers never charted—fatherhood triggers an old standing order: You earn, therefore you are," explains clinical psychologist Jett Stone, Ph.D. This can become tunnel vision and negatively affect key relationships. Labeling the problem, sharing the numbers, and challenging the provider myth together can help partners get back on track. How does the male provider myth relate to your experience? Tell us in the comments. 💭 Do you know someone who might like to read this? Share it with them. 👀 Click the link in our bio to read more. Image credit: apghedia / Shutterstock #psychology #relationships #mentalhealth #fathers</w:t>
       </w:r>
     </w:p>
     <w:p>
@@ -9361,17 +9401,18 @@
       <w:r>
         <w:rPr>
           <w:rFonts w:ascii="Georgia" w:hAnsi="Georgia" w:eastAsia="Georgia" w:cs="Georgia"/>
-          <w:sz w:val="22"/>
-          <w:b/>
+          <w:b/>
+          <w:sz w:val="22"/>
         </w:rPr>
         <w:t xml:space="preserve">Comment 1 under Caption 1 (Page 3). </w:t>
       </w:r>
       <w:r>
         <w:rPr>
           <w:rFonts w:ascii="Georgia" w:hAnsi="Georgia" w:eastAsia="Georgia" w:cs="Georgia"/>
-          <w:sz w:val="22"/>
-        </w:rPr>
-        <w:t xml:space="preserve">For a long time, I didn’t give much thought to the provider role, which later contributed to relationship difficulties. At the same time, I’ve seen many examples of how an excessive “provider” mindset can be socially and personally damaging: the pursuit of material wealth in self-destructive ways, or at the expense of close human relationships. Today, I’m seeking a healthy balance. I do have some disadvantages, and I often experience that in dating, material circumstances (car, housing, income) become a more critical factor than emotional safety, the quality of connection, or mutual growth.</w:t>
+          <w:b w:val="0"/>
+          <w:sz w:val="22"/>
+        </w:rPr>
+        <w:t>For a long time, I didn’t give much thought to the provider role, which later contributed to relationship difficulties. At the same time, I’ve seen many examples of how an excessive “provider” mindset can be socially and personally damaging: the pursuit of material wealth in self-destructive ways, or at the expense of close human relationships. Today, I’m seeking a healthy balance. I do have some disadvantages, and I often experience that in dating, material circumstances (car, housing, income) become a more critical factor than emotional safety, the quality of connection, or mutual growth.</w:t>
       </w:r>
     </w:p>
     <w:p>
@@ -9383,17 +9424,18 @@
       <w:r>
         <w:rPr>
           <w:rFonts w:ascii="Georgia" w:hAnsi="Georgia" w:eastAsia="Georgia" w:cs="Georgia"/>
-          <w:sz w:val="22"/>
-          <w:b/>
+          <w:b/>
+          <w:sz w:val="22"/>
         </w:rPr>
         <w:t xml:space="preserve">Comment 2 under Caption 1 (Page 3). </w:t>
       </w:r>
       <w:r>
         <w:rPr>
           <w:rFonts w:ascii="Georgia" w:hAnsi="Georgia" w:eastAsia="Georgia" w:cs="Georgia"/>
-          <w:sz w:val="22"/>
-        </w:rPr>
-        <w:t xml:space="preserve">As a man I don't have any problems with expectations as long as both sides can have their own expectations and get something in return...I think there is nothing wrong about that.</w:t>
+          <w:b w:val="0"/>
+          <w:sz w:val="22"/>
+        </w:rPr>
+        <w:t>As a man I don't have any problems with expectations as long as both sides can have their own expectations and get something in return...I think there is nothing wrong about that.</w:t>
       </w:r>
     </w:p>
     <w:p>
@@ -9405,17 +9447,18 @@
       <w:r>
         <w:rPr>
           <w:rFonts w:ascii="Georgia" w:hAnsi="Georgia" w:eastAsia="Georgia" w:cs="Georgia"/>
-          <w:sz w:val="22"/>
-          <w:b/>
+          <w:b/>
+          <w:sz w:val="22"/>
         </w:rPr>
         <w:t xml:space="preserve">Caption 2 (Page 3). </w:t>
       </w:r>
       <w:r>
         <w:rPr>
           <w:rFonts w:ascii="Georgia" w:hAnsi="Georgia" w:eastAsia="Georgia" w:cs="Georgia"/>
-          <w:sz w:val="22"/>
-        </w:rPr>
-        <w:t xml:space="preserve">Welcome to our “Ask a Therapist” series! Why does anxiety get worse at night—and what actually helps? ████████ explains. Comment with a question you want a therapist to answer next. #therapy #mentalhealth #anxiety #askatherapist</w:t>
+          <w:b w:val="0"/>
+          <w:sz w:val="22"/>
+        </w:rPr>
+        <w:t>Welcome to our “Ask a Therapist” series! Why does anxiety get worse at night—and what actually helps? ████████ explains. Comment with a question you want a therapist to answer next. #therapy #mentalhealth #anxiety #askatherapist</w:t>
       </w:r>
     </w:p>
     <w:p>
@@ -9427,17 +9470,18 @@
       <w:r>
         <w:rPr>
           <w:rFonts w:ascii="Georgia" w:hAnsi="Georgia" w:eastAsia="Georgia" w:cs="Georgia"/>
-          <w:sz w:val="22"/>
-          <w:b/>
+          <w:b/>
+          <w:sz w:val="22"/>
         </w:rPr>
         <w:t xml:space="preserve">Comment 1 under Caption 2 (Page 3). </w:t>
       </w:r>
       <w:r>
         <w:rPr>
           <w:rFonts w:ascii="Georgia" w:hAnsi="Georgia" w:eastAsia="Georgia" w:cs="Georgia"/>
-          <w:sz w:val="22"/>
-        </w:rPr>
-        <w:t xml:space="preserve">This explains nighttime anxiety in a way that feels reassuring and gives people something practical to work with.</w:t>
+          <w:b w:val="0"/>
+          <w:sz w:val="22"/>
+        </w:rPr>
+        <w:t>This explains nighttime anxiety in a way that feels reassuring and gives people something practical to work with.</w:t>
       </w:r>
     </w:p>
     <w:p>
@@ -9449,17 +9493,18 @@
       <w:r>
         <w:rPr>
           <w:rFonts w:ascii="Georgia" w:hAnsi="Georgia" w:eastAsia="Georgia" w:cs="Georgia"/>
-          <w:sz w:val="22"/>
-          <w:b/>
+          <w:b/>
+          <w:sz w:val="22"/>
         </w:rPr>
         <w:t xml:space="preserve">Comment 2 under Caption 2 (Page 3). </w:t>
       </w:r>
       <w:r>
         <w:rPr>
           <w:rFonts w:ascii="Georgia" w:hAnsi="Georgia" w:eastAsia="Georgia" w:cs="Georgia"/>
-          <w:sz w:val="22"/>
-        </w:rPr>
-        <w:t xml:space="preserve">It reflects how quiet moments can amplify unspoken thoughts and tension. A gentle reminder that grounding practices and reassurance can help ease anxiety as the day winds down.</w:t>
+          <w:b w:val="0"/>
+          <w:sz w:val="22"/>
+        </w:rPr>
+        <w:t>It reflects how quiet moments can amplify unspoken thoughts and tension. A gentle reminder that grounding practices and reassurance can help ease anxiety as the day winds down.</w:t>
       </w:r>
     </w:p>
     <w:p>
@@ -9471,17 +9516,18 @@
       <w:r>
         <w:rPr>
           <w:rFonts w:ascii="Georgia" w:hAnsi="Georgia" w:eastAsia="Georgia" w:cs="Georgia"/>
-          <w:sz w:val="22"/>
-          <w:b/>
+          <w:b/>
+          <w:sz w:val="22"/>
         </w:rPr>
         <w:t xml:space="preserve">Caption 3 (Page 3). </w:t>
       </w:r>
       <w:r>
         <w:rPr>
           <w:rFonts w:ascii="Georgia" w:hAnsi="Georgia" w:eastAsia="Georgia" w:cs="Georgia"/>
-          <w:sz w:val="22"/>
-        </w:rPr>
-        <w:t xml:space="preserve">"There are many ways that we can undermine our well-being and fall into spirals of negativity, depression, and anxiety. Additionally, there are many ways that we can sabotage ourselves without realizing that we are the cause. Here are five behaviors to avoid if you want to be stable and emotionally well-adjusted," explains Carla Shuman, Ph.D. What are some other strengths of mentally healthy people? Let us know in the comments. 💭 Do you know someone who should read this? Share it with them. 👀 Click the link in our bio to read more. #psychology #mentalhealth #wellbeing #happiness #selfesteem #mentallyhealthy</w:t>
+          <w:b w:val="0"/>
+          <w:sz w:val="22"/>
+        </w:rPr>
+        <w:t>"There are many ways that we can undermine our well-being and fall into spirals of negativity, depression, and anxiety. Additionally, there are many ways that we can sabotage ourselves without realizing that we are the cause. Here are five behaviors to avoid if you want to be stable and emotionally well-adjusted," explains Carla Shuman, Ph.D. What are some other strengths of mentally healthy people? Let us know in the comments. 💭 Do you know someone who should read this? Share it with them. 👀 Click the link in our bio to read more. #psychology #mentalhealth #wellbeing #happiness #selfesteem #mentallyhealthy</w:t>
       </w:r>
     </w:p>
     <w:p>
@@ -9493,17 +9539,18 @@
       <w:r>
         <w:rPr>
           <w:rFonts w:ascii="Georgia" w:hAnsi="Georgia" w:eastAsia="Georgia" w:cs="Georgia"/>
-          <w:sz w:val="22"/>
-          <w:b/>
+          <w:b/>
+          <w:sz w:val="22"/>
         </w:rPr>
         <w:t xml:space="preserve">Comment 1 under Caption 3 (Page 3). </w:t>
       </w:r>
       <w:r>
         <w:rPr>
           <w:rFonts w:ascii="Georgia" w:hAnsi="Georgia" w:eastAsia="Georgia" w:cs="Georgia"/>
-          <w:sz w:val="22"/>
-        </w:rPr>
-        <w:t xml:space="preserve">True! And I’m guilty of at least one of these! But I’m also committed to recovery</w:t>
+          <w:b w:val="0"/>
+          <w:sz w:val="22"/>
+        </w:rPr>
+        <w:t>True! And I’m guilty of at least one of these! But I’m also committed to recovery</w:t>
       </w:r>
     </w:p>
     <w:p>
@@ -9515,17 +9562,18 @@
       <w:r>
         <w:rPr>
           <w:rFonts w:ascii="Georgia" w:hAnsi="Georgia" w:eastAsia="Georgia" w:cs="Georgia"/>
-          <w:sz w:val="22"/>
-          <w:b/>
+          <w:b/>
+          <w:sz w:val="22"/>
         </w:rPr>
         <w:t xml:space="preserve">Comment 2 under Caption 3 (Page 3). </w:t>
       </w:r>
       <w:r>
         <w:rPr>
           <w:rFonts w:ascii="Georgia" w:hAnsi="Georgia" w:eastAsia="Georgia" w:cs="Georgia"/>
-          <w:sz w:val="22"/>
-        </w:rPr>
-        <w:t xml:space="preserve">Such an important list. We often find that avoiding the comparison trap is one of the biggest hurdles to stability in our digital age. Recognizing those small, daily wins instead can really shift the momentum!</w:t>
+          <w:b w:val="0"/>
+          <w:sz w:val="22"/>
+        </w:rPr>
+        <w:t>Such an important list. We often find that avoiding the comparison trap is one of the biggest hurdles to stability in our digital age. Recognizing those small, daily wins instead can really shift the momentum!</w:t>
       </w:r>
     </w:p>
     <w:p>
@@ -9537,17 +9585,18 @@
       <w:r>
         <w:rPr>
           <w:rFonts w:ascii="Georgia" w:hAnsi="Georgia" w:eastAsia="Georgia" w:cs="Georgia"/>
-          <w:sz w:val="22"/>
-          <w:b/>
+          <w:b/>
+          <w:sz w:val="22"/>
         </w:rPr>
         <w:t xml:space="preserve">Caption 4 (Page 3). </w:t>
       </w:r>
       <w:r>
         <w:rPr>
           <w:rFonts w:ascii="Georgia" w:hAnsi="Georgia" w:eastAsia="Georgia" w:cs="Georgia"/>
-          <w:sz w:val="22"/>
-        </w:rPr>
-        <w:t xml:space="preserve">"In my work with survivors of abusive, neglectful, or chronically unsafe families, I hear the same misconceptions again and again. Many of these ideas minimize survivors’ experiences and mischaracterize what estrangement actually is," explains Kaytee Gillis, LCSW (████████). Here are some of the most common myths about estrangement. What other false beliefs have you heard about family estrangement? Let us know in the comments. 💭 Do you know someone who should read this? Share it with them. 👀 Click the link in our bio to read more. #psychology #family #relationships #estrangement #misconceptions</w:t>
+          <w:b w:val="0"/>
+          <w:sz w:val="22"/>
+        </w:rPr>
+        <w:t>"In my work with survivors of abusive, neglectful, or chronically unsafe families, I hear the same misconceptions again and again. Many of these ideas minimize survivors’ experiences and mischaracterize what estrangement actually is," explains Kaytee Gillis, LCSW (████████). Here are some of the most common myths about estrangement. What other false beliefs have you heard about family estrangement? Let us know in the comments. 💭 Do you know someone who should read this? Share it with them. 👀 Click the link in our bio to read more. #psychology #family #relationships #estrangement #misconceptions</w:t>
       </w:r>
     </w:p>
     <w:p>
@@ -9559,17 +9608,18 @@
       <w:r>
         <w:rPr>
           <w:rFonts w:ascii="Georgia" w:hAnsi="Georgia" w:eastAsia="Georgia" w:cs="Georgia"/>
-          <w:sz w:val="22"/>
-          <w:b/>
+          <w:b/>
+          <w:sz w:val="22"/>
         </w:rPr>
         <w:t xml:space="preserve">Comment 1 under Caption 4 (Page 3). </w:t>
       </w:r>
       <w:r>
         <w:rPr>
           <w:rFonts w:ascii="Georgia" w:hAnsi="Georgia" w:eastAsia="Georgia" w:cs="Georgia"/>
-          <w:sz w:val="22"/>
-        </w:rPr>
-        <w:t xml:space="preserve">████████ what if the parrent goes silent treatment as they could not face that I spoke up about their inappropriate behavior this time and then as a change I did not chase them, I did not apologize I did not minimize myself. And after 6 months of silent treatment in which I grieved the parrent who was never there and learned peace without her and now I get love bombed with gifts but I am no longer willing to have a relationship without them making effort and admitting that what they have did was not ok.</w:t>
+          <w:b w:val="0"/>
+          <w:sz w:val="22"/>
+        </w:rPr>
+        <w:t>████████ what if the parrent goes silent treatment as they could not face that I spoke up about their inappropriate behavior this time and then as a change I did not chase them, I did not apologize I did not minimize myself. And after 6 months of silent treatment in which I grieved the parrent who was never there and learned peace without her and now I get love bombed with gifts but I am no longer willing to have a relationship without them making effort and admitting that what they have did was not ok.</w:t>
       </w:r>
     </w:p>
     <w:p>
@@ -9581,17 +9631,18 @@
       <w:r>
         <w:rPr>
           <w:rFonts w:ascii="Georgia" w:hAnsi="Georgia" w:eastAsia="Georgia" w:cs="Georgia"/>
-          <w:sz w:val="22"/>
-          <w:b/>
+          <w:b/>
+          <w:sz w:val="22"/>
         </w:rPr>
         <w:t xml:space="preserve">Comment 2 under Caption 4 (Page 3). </w:t>
       </w:r>
       <w:r>
         <w:rPr>
           <w:rFonts w:ascii="Georgia" w:hAnsi="Georgia" w:eastAsia="Georgia" w:cs="Georgia"/>
-          <w:sz w:val="22"/>
-        </w:rPr>
-        <w:t xml:space="preserve">As a survivor of domestic abuse and sexual violence and who has had no contact with a parent for almost 40 years- this is not a trend!</w:t>
+          <w:b w:val="0"/>
+          <w:sz w:val="22"/>
+        </w:rPr>
+        <w:t>As a survivor of domestic abuse and sexual violence and who has had no contact with a parent for almost 40 years- this is not a trend!</w:t>
       </w:r>
     </w:p>
     <w:p>
@@ -9603,17 +9654,18 @@
       <w:r>
         <w:rPr>
           <w:rFonts w:ascii="Georgia" w:hAnsi="Georgia" w:eastAsia="Georgia" w:cs="Georgia"/>
-          <w:sz w:val="22"/>
-          <w:b/>
+          <w:b/>
+          <w:sz w:val="22"/>
         </w:rPr>
         <w:t xml:space="preserve">Caption 1 (Page 4). </w:t>
       </w:r>
       <w:r>
         <w:rPr>
           <w:rFonts w:ascii="Georgia" w:hAnsi="Georgia" w:eastAsia="Georgia" w:cs="Georgia"/>
-          <w:sz w:val="22"/>
-        </w:rPr>
-        <w:t xml:space="preserve">💙 Today on #WorldSuicidePreventionDay (and every day!), remember: you are not alone. Asking for help is brave, and support is always within reach. Visit our Find Help page via the link in our bio for helplines, self-care tips, and resources to care for yourself + others.</w:t>
+          <w:b w:val="0"/>
+          <w:sz w:val="22"/>
+        </w:rPr>
+        <w:t>💙 Today on #WorldSuicidePreventionDay (and every day!), remember: you are not alone. Asking for help is brave, and support is always within reach. Visit our Find Help page via the link in our bio for helplines, self-care tips, and resources to care for yourself + others.</w:t>
       </w:r>
     </w:p>
     <w:p>
@@ -9625,17 +9677,18 @@
       <w:r>
         <w:rPr>
           <w:rFonts w:ascii="Georgia" w:hAnsi="Georgia" w:eastAsia="Georgia" w:cs="Georgia"/>
-          <w:sz w:val="22"/>
-          <w:b/>
+          <w:b/>
+          <w:sz w:val="22"/>
         </w:rPr>
         <w:t xml:space="preserve">Comment 1 under Caption 1 (Page 4). </w:t>
       </w:r>
       <w:r>
         <w:rPr>
           <w:rFonts w:ascii="Georgia" w:hAnsi="Georgia" w:eastAsia="Georgia" w:cs="Georgia"/>
-          <w:sz w:val="22"/>
-        </w:rPr>
-        <w:t xml:space="preserve">[Comment to be added]</w:t>
+          <w:b w:val="0"/>
+          <w:sz w:val="22"/>
+        </w:rPr>
+        <w:t>[Comment to be added]</w:t>
       </w:r>
     </w:p>
     <w:p>
@@ -9647,17 +9700,18 @@
       <w:r>
         <w:rPr>
           <w:rFonts w:ascii="Georgia" w:hAnsi="Georgia" w:eastAsia="Georgia" w:cs="Georgia"/>
-          <w:sz w:val="22"/>
-          <w:b/>
+          <w:b/>
+          <w:sz w:val="22"/>
         </w:rPr>
         <w:t xml:space="preserve">Comment 2 under Caption 1 (Page 4). </w:t>
       </w:r>
       <w:r>
         <w:rPr>
           <w:rFonts w:ascii="Georgia" w:hAnsi="Georgia" w:eastAsia="Georgia" w:cs="Georgia"/>
-          <w:sz w:val="22"/>
-        </w:rPr>
-        <w:t xml:space="preserve">It’s always important to remember that you’re not alone, and asking for help is courage!! I know exactly how is it living with negative thought the whole time. Recently I went through dark times, and I wanted to give up. And listing to Gaga’s songs gives me the strength to continue❤️ I did a video about mental health on tik tok, wish you guys could see 🙏 ████████ ████████</w:t>
+          <w:b w:val="0"/>
+          <w:sz w:val="22"/>
+        </w:rPr>
+        <w:t>It’s always important to remember that you’re not alone, and asking for help is courage!! I know exactly how is it living with negative thought the whole time. Recently I went through dark times, and I wanted to give up. And listing to Gaga’s songs gives me the strength to continue❤️ I did a video about mental health on tik tok, wish you guys could see 🙏 ████████ ████████</w:t>
       </w:r>
     </w:p>
     <w:p>
@@ -9669,17 +9723,18 @@
       <w:r>
         <w:rPr>
           <w:rFonts w:ascii="Georgia" w:hAnsi="Georgia" w:eastAsia="Georgia" w:cs="Georgia"/>
-          <w:sz w:val="22"/>
-          <w:b/>
+          <w:b/>
+          <w:sz w:val="22"/>
         </w:rPr>
         <w:t xml:space="preserve">Caption 2 (Page 4). </w:t>
       </w:r>
       <w:r>
         <w:rPr>
           <w:rFonts w:ascii="Georgia" w:hAnsi="Georgia" w:eastAsia="Georgia" w:cs="Georgia"/>
-          <w:sz w:val="22"/>
-        </w:rPr>
-        <w:t xml:space="preserve">We gathered in Los Angeles with open hearts and a shared goal: to build a kinder, braver world together 💙✨ In partnership with ████████, ████████, and ████████, we created a space for honest conversation, creativity, and care, led by and for young people. From spoken word performances by LA’s Youth Poet Laureate to an interactive #BeThereCertificate workshop and a hands-on volunteer activity supporting trans and nonbinary young people, this community gathering reminded us: ☀️ Mental health care is community care. ☀️ Kindness is action. ☀️ And none of us have to take that action alone. #ChannelKindness #BeKind365 #KindnessInCommunity</w:t>
+          <w:b w:val="0"/>
+          <w:sz w:val="22"/>
+        </w:rPr>
+        <w:t>We gathered in Los Angeles with open hearts and a shared goal: to build a kinder, braver world together 💙✨ In partnership with ████████, ████████, and ████████, we created a space for honest conversation, creativity, and care, led by and for young people. From spoken word performances by LA’s Youth Poet Laureate to an interactive #BeThereCertificate workshop and a hands-on volunteer activity supporting trans and nonbinary young people, this community gathering reminded us: ☀️ Mental health care is community care. ☀️ Kindness is action. ☀️ And none of us have to take that action alone. #ChannelKindness #BeKind365 #KindnessInCommunity</w:t>
       </w:r>
     </w:p>
     <w:p>
@@ -9691,17 +9746,18 @@
       <w:r>
         <w:rPr>
           <w:rFonts w:ascii="Georgia" w:hAnsi="Georgia" w:eastAsia="Georgia" w:cs="Georgia"/>
-          <w:sz w:val="22"/>
-          <w:b/>
+          <w:b/>
+          <w:sz w:val="22"/>
         </w:rPr>
         <w:t xml:space="preserve">Comment 1 under Caption 2 (Page 4). </w:t>
       </w:r>
       <w:r>
         <w:rPr>
           <w:rFonts w:ascii="Georgia" w:hAnsi="Georgia" w:eastAsia="Georgia" w:cs="Georgia"/>
-          <w:sz w:val="22"/>
-        </w:rPr>
-        <w:t xml:space="preserve">[Comment to be added]</w:t>
+          <w:b w:val="0"/>
+          <w:sz w:val="22"/>
+        </w:rPr>
+        <w:t>[Comment to be added]</w:t>
       </w:r>
     </w:p>
     <w:p>
@@ -9713,17 +9769,18 @@
       <w:r>
         <w:rPr>
           <w:rFonts w:ascii="Georgia" w:hAnsi="Georgia" w:eastAsia="Georgia" w:cs="Georgia"/>
-          <w:sz w:val="22"/>
-          <w:b/>
+          <w:b/>
+          <w:sz w:val="22"/>
         </w:rPr>
         <w:t xml:space="preserve">Comment 2 under Caption 2 (Page 4). </w:t>
       </w:r>
       <w:r>
         <w:rPr>
           <w:rFonts w:ascii="Georgia" w:hAnsi="Georgia" w:eastAsia="Georgia" w:cs="Georgia"/>
-          <w:sz w:val="22"/>
-        </w:rPr>
-        <w:t xml:space="preserve">what an incredible day celebrating kindness and being there for one another! thank you so much for having me ❤️❤️❤️</w:t>
+          <w:b w:val="0"/>
+          <w:sz w:val="22"/>
+        </w:rPr>
+        <w:t>what an incredible day celebrating kindness and being there for one another! thank you so much for having me ❤️❤️❤️</w:t>
       </w:r>
     </w:p>
     <w:p>
@@ -9735,17 +9792,18 @@
       <w:r>
         <w:rPr>
           <w:rFonts w:ascii="Georgia" w:hAnsi="Georgia" w:eastAsia="Georgia" w:cs="Georgia"/>
-          <w:sz w:val="22"/>
-          <w:b/>
+          <w:b/>
+          <w:sz w:val="22"/>
         </w:rPr>
         <w:t xml:space="preserve">Caption 3 (Page 4). </w:t>
       </w:r>
       <w:r>
         <w:rPr>
           <w:rFonts w:ascii="Georgia" w:hAnsi="Georgia" w:eastAsia="Georgia" w:cs="Georgia"/>
-          <w:sz w:val="22"/>
-        </w:rPr>
-        <w:t xml:space="preserve">“Our stories are our superpower.” 💭🏳️‍🌈🏳️‍⚧️ In this powerful clip from his Pride Rising speech, ████████’s Chief of Staff, ████████, reminds us that kindness is action—and that simply existing as your authentic self is a form of resistance. 💖 Take the #BeKind365 pledge to support yourself and others in kindness, every day of the year: BeKind365.world ✨ Want more inspiration? Watch Josh’s full speech via the link in our bio. 📷 / 🎥: ████████</w:t>
+          <w:b w:val="0"/>
+          <w:sz w:val="22"/>
+        </w:rPr>
+        <w:t>“Our stories are our superpower.” 💭🏳️‍🌈🏳️‍⚧️ In this powerful clip from his Pride Rising speech, ████████’s Chief of Staff, ████████, reminds us that kindness is action—and that simply existing as your authentic self is a form of resistance. 💖 Take the #BeKind365 pledge to support yourself and others in kindness, every day of the year: BeKind365.world ✨ Want more inspiration? Watch Josh’s full speech via the link in our bio. 📷 / 🎥: ████████</w:t>
       </w:r>
     </w:p>
     <w:p>
@@ -9757,17 +9815,18 @@
       <w:r>
         <w:rPr>
           <w:rFonts w:ascii="Georgia" w:hAnsi="Georgia" w:eastAsia="Georgia" w:cs="Georgia"/>
-          <w:sz w:val="22"/>
-          <w:b/>
+          <w:b/>
+          <w:sz w:val="22"/>
         </w:rPr>
         <w:t xml:space="preserve">Comment 1 under Caption 3 (Page 4). </w:t>
       </w:r>
       <w:r>
         <w:rPr>
           <w:rFonts w:ascii="Georgia" w:hAnsi="Georgia" w:eastAsia="Georgia" w:cs="Georgia"/>
-          <w:sz w:val="22"/>
-        </w:rPr>
-        <w:t xml:space="preserve">Thank you for sharing. What a wonderful foundation you represent and work for. Changing the lives of so many people Way to go Josh!!</w:t>
+          <w:b w:val="0"/>
+          <w:sz w:val="22"/>
+        </w:rPr>
+        <w:t>Thank you for sharing. What a wonderful foundation you represent and work for. Changing the lives of so many people Way to go Josh!!</w:t>
       </w:r>
     </w:p>
     <w:p>
@@ -9779,17 +9838,18 @@
       <w:r>
         <w:rPr>
           <w:rFonts w:ascii="Georgia" w:hAnsi="Georgia" w:eastAsia="Georgia" w:cs="Georgia"/>
-          <w:sz w:val="22"/>
-          <w:b/>
+          <w:b/>
+          <w:sz w:val="22"/>
         </w:rPr>
         <w:t xml:space="preserve">Comment 2 under Caption 3 (Page 4). </w:t>
       </w:r>
       <w:r>
         <w:rPr>
           <w:rFonts w:ascii="Georgia" w:hAnsi="Georgia" w:eastAsia="Georgia" w:cs="Georgia"/>
-          <w:sz w:val="22"/>
-        </w:rPr>
-        <w:t xml:space="preserve">This resonates so deep. Our stories are what creates change. One person, one heart, one connection at a time. All people have to do is meet us.</w:t>
+          <w:b w:val="0"/>
+          <w:sz w:val="22"/>
+        </w:rPr>
+        <w:t>This resonates so deep. Our stories are what creates change. One person, one heart, one connection at a time. All people have to do is meet us.</w:t>
       </w:r>
     </w:p>
     <w:p>
@@ -9801,17 +9861,18 @@
       <w:r>
         <w:rPr>
           <w:rFonts w:ascii="Georgia" w:hAnsi="Georgia" w:eastAsia="Georgia" w:cs="Georgia"/>
-          <w:sz w:val="22"/>
-          <w:b/>
+          <w:b/>
+          <w:sz w:val="22"/>
         </w:rPr>
         <w:t xml:space="preserve">Caption 4 (Page 4). </w:t>
       </w:r>
       <w:r>
         <w:rPr>
           <w:rFonts w:ascii="Georgia" w:hAnsi="Georgia" w:eastAsia="Georgia" w:cs="Georgia"/>
-          <w:sz w:val="22"/>
-        </w:rPr>
-        <w:t xml:space="preserve">🏳️‍⚧️ Today is #TransDayOfVisibility, a time to celebrate, uplift, and honor trans and nonbinary voices. 🏳️‍⚧️ Our 2023-2024 Youth Advisory Board member, ████████, shares powerful words of affirmation from their speech at NYC Youth #Pride ████████: “To everyone here: always remember that you are beautiful, you are worthy, and you deserve to take up space in this world exactly as you are. There is no one else like you, and that is your power.” Visit the link in our bio to watch ████████’s full speech and learn how we can all support transgender and nonbinary youth in creating safer, more inclusive communities. #ChannelKindness #BeKind365 📷 / 🎥 : ████████</w:t>
+          <w:b w:val="0"/>
+          <w:sz w:val="22"/>
+        </w:rPr>
+        <w:t>🏳️‍⚧️ Today is #TransDayOfVisibility, a time to celebrate, uplift, and honor trans and nonbinary voices. 🏳️‍⚧️ Our 2023-2024 Youth Advisory Board member, ████████, shares powerful words of affirmation from their speech at NYC Youth #Pride ████████: “To everyone here: always remember that you are beautiful, you are worthy, and you deserve to take up space in this world exactly as you are. There is no one else like you, and that is your power.” Visit the link in our bio to watch ████████’s full speech and learn how we can all support transgender and nonbinary youth in creating safer, more inclusive communities. #ChannelKindness #BeKind365 📷 / 🎥 : ████████</w:t>
       </w:r>
     </w:p>
     <w:p>
@@ -9823,17 +9884,18 @@
       <w:r>
         <w:rPr>
           <w:rFonts w:ascii="Georgia" w:hAnsi="Georgia" w:eastAsia="Georgia" w:cs="Georgia"/>
-          <w:sz w:val="22"/>
-          <w:b/>
+          <w:b/>
+          <w:sz w:val="22"/>
         </w:rPr>
         <w:t xml:space="preserve">Comment 1 under Caption 4 (Page 4). </w:t>
       </w:r>
       <w:r>
         <w:rPr>
           <w:rFonts w:ascii="Georgia" w:hAnsi="Georgia" w:eastAsia="Georgia" w:cs="Georgia"/>
-          <w:sz w:val="22"/>
-        </w:rPr>
-        <w:t xml:space="preserve">[Comment to be added]</w:t>
+          <w:b w:val="0"/>
+          <w:sz w:val="22"/>
+        </w:rPr>
+        <w:t>[Comment to be added]</w:t>
       </w:r>
     </w:p>
     <w:p>
@@ -9845,17 +9907,18 @@
       <w:r>
         <w:rPr>
           <w:rFonts w:ascii="Georgia" w:hAnsi="Georgia" w:eastAsia="Georgia" w:cs="Georgia"/>
-          <w:sz w:val="22"/>
-          <w:b/>
+          <w:b/>
+          <w:sz w:val="22"/>
         </w:rPr>
         <w:t xml:space="preserve">Comment 2 under Caption 4 (Page 4). </w:t>
       </w:r>
       <w:r>
         <w:rPr>
           <w:rFonts w:ascii="Georgia" w:hAnsi="Georgia" w:eastAsia="Georgia" w:cs="Georgia"/>
-          <w:sz w:val="22"/>
-        </w:rPr>
-        <w:t xml:space="preserve">[Comment to be added]</w:t>
+          <w:b w:val="0"/>
+          <w:sz w:val="22"/>
+        </w:rPr>
+        <w:t>[Comment to be added]</w:t>
       </w:r>
     </w:p>
     <w:p>
@@ -9867,17 +9930,18 @@
       <w:r>
         <w:rPr>
           <w:rFonts w:ascii="Georgia" w:hAnsi="Georgia" w:eastAsia="Georgia" w:cs="Georgia"/>
-          <w:sz w:val="22"/>
-          <w:b/>
+          <w:b/>
+          <w:sz w:val="22"/>
         </w:rPr>
         <w:t xml:space="preserve">Caption 1 (Page 5). </w:t>
       </w:r>
       <w:r>
         <w:rPr>
           <w:rFonts w:ascii="Georgia" w:hAnsi="Georgia" w:eastAsia="Georgia" w:cs="Georgia"/>
-          <w:sz w:val="22"/>
-        </w:rPr>
-        <w:t xml:space="preserve">When you know the Big Sad ™ is coming but you just wanna get your things done first...</w:t>
+          <w:b w:val="0"/>
+          <w:sz w:val="22"/>
+        </w:rPr>
+        <w:t>When you know the Big Sad ™ is coming but you just wanna get your things done first...</w:t>
       </w:r>
     </w:p>
     <w:p>
@@ -9889,17 +9953,18 @@
       <w:r>
         <w:rPr>
           <w:rFonts w:ascii="Georgia" w:hAnsi="Georgia" w:eastAsia="Georgia" w:cs="Georgia"/>
-          <w:sz w:val="22"/>
-          <w:b/>
+          <w:b/>
+          <w:sz w:val="22"/>
         </w:rPr>
         <w:t xml:space="preserve">Comment 1 under Caption 1 (Page 5). </w:t>
       </w:r>
       <w:r>
         <w:rPr>
           <w:rFonts w:ascii="Georgia" w:hAnsi="Georgia" w:eastAsia="Georgia" w:cs="Georgia"/>
-          <w:sz w:val="22"/>
-        </w:rPr>
-        <w:t xml:space="preserve">I don't have time to be sad so i just keep doing things</w:t>
+          <w:b w:val="0"/>
+          <w:sz w:val="22"/>
+        </w:rPr>
+        <w:t>I don't have time to be sad so i just keep doing things</w:t>
       </w:r>
     </w:p>
     <w:p>
@@ -9911,17 +9976,18 @@
       <w:r>
         <w:rPr>
           <w:rFonts w:ascii="Georgia" w:hAnsi="Georgia" w:eastAsia="Georgia" w:cs="Georgia"/>
-          <w:sz w:val="22"/>
-          <w:b/>
+          <w:b/>
+          <w:sz w:val="22"/>
         </w:rPr>
         <w:t xml:space="preserve">Comment 2 under Caption 1 (Page 5). </w:t>
       </w:r>
       <w:r>
         <w:rPr>
           <w:rFonts w:ascii="Georgia" w:hAnsi="Georgia" w:eastAsia="Georgia" w:cs="Georgia"/>
-          <w:sz w:val="22"/>
-        </w:rPr>
-        <w:t xml:space="preserve">What is it about the kitchen sink that makes us suddenly pause and then get sucked in to that sadness! 😳</w:t>
+          <w:b w:val="0"/>
+          <w:sz w:val="22"/>
+        </w:rPr>
+        <w:t>What is it about the kitchen sink that makes us suddenly pause and then get sucked in to that sadness! 😳</w:t>
       </w:r>
     </w:p>
     <w:p>
@@ -9933,17 +9999,18 @@
       <w:r>
         <w:rPr>
           <w:rFonts w:ascii="Georgia" w:hAnsi="Georgia" w:eastAsia="Georgia" w:cs="Georgia"/>
-          <w:sz w:val="22"/>
-          <w:b/>
+          <w:b/>
+          <w:sz w:val="22"/>
         </w:rPr>
         <w:t xml:space="preserve">Caption 2 (Page 5). </w:t>
       </w:r>
       <w:r>
         <w:rPr>
           <w:rFonts w:ascii="Georgia" w:hAnsi="Georgia" w:eastAsia="Georgia" w:cs="Georgia"/>
-          <w:sz w:val="22"/>
-        </w:rPr>
-        <w:t xml:space="preserve">Some thoughts about all the worrying I did and all the ways I tried to be prepared for a life that only time and experience could prepare me for. A comic showing a ghost in the wilderness, the text reads - 1- I feel silly for not realising sooner, that I would feel differently about my life the more I experienced it, because I will change and grow. 2- I realised that choices happen slowly, and they get smaller than when you made them. You adapt and you change. 3- I changed in a way that prepared me for the now. Even though I was SO worried about being unprepared. But of course you’re unprepared when you’re worrying too early! 4- it feels daunting to think about the future in the here and now. But you’ll be different by then. And you will be ready for it when it comes.</w:t>
+          <w:b w:val="0"/>
+          <w:sz w:val="22"/>
+        </w:rPr>
+        <w:t>Some thoughts about all the worrying I did and all the ways I tried to be prepared for a life that only time and experience could prepare me for. A comic showing a ghost in the wilderness, the text reads - 1- I feel silly for not realising sooner, that I would feel differently about my life the more I experienced it, because I will change and grow. 2- I realised that choices happen slowly, and they get smaller than when you made them. You adapt and you change. 3- I changed in a way that prepared me for the now. Even though I was SO worried about being unprepared. But of course you’re unprepared when you’re worrying too early! 4- it feels daunting to think about the future in the here and now. But you’ll be different by then. And you will be ready for it when it comes.</w:t>
       </w:r>
     </w:p>
     <w:p>
@@ -9955,17 +10022,18 @@
       <w:r>
         <w:rPr>
           <w:rFonts w:ascii="Georgia" w:hAnsi="Georgia" w:eastAsia="Georgia" w:cs="Georgia"/>
-          <w:sz w:val="22"/>
-          <w:b/>
+          <w:b/>
+          <w:sz w:val="22"/>
         </w:rPr>
         <w:t xml:space="preserve">Comment 1 under Caption 2 (Page 5). </w:t>
       </w:r>
       <w:r>
         <w:rPr>
           <w:rFonts w:ascii="Georgia" w:hAnsi="Georgia" w:eastAsia="Georgia" w:cs="Georgia"/>
-          <w:sz w:val="22"/>
-        </w:rPr>
-        <w:t xml:space="preserve">I agree with you, time and experience teaches you a lot you never thought of</w:t>
+          <w:b w:val="0"/>
+          <w:sz w:val="22"/>
+        </w:rPr>
+        <w:t>I agree with you, time and experience teaches you a lot you never thought of</w:t>
       </w:r>
     </w:p>
     <w:p>
@@ -9977,17 +10045,18 @@
       <w:r>
         <w:rPr>
           <w:rFonts w:ascii="Georgia" w:hAnsi="Georgia" w:eastAsia="Georgia" w:cs="Georgia"/>
-          <w:sz w:val="22"/>
-          <w:b/>
+          <w:b/>
+          <w:sz w:val="22"/>
         </w:rPr>
         <w:t xml:space="preserve">Comment 2 under Caption 2 (Page 5). </w:t>
       </w:r>
       <w:r>
         <w:rPr>
           <w:rFonts w:ascii="Georgia" w:hAnsi="Georgia" w:eastAsia="Georgia" w:cs="Georgia"/>
-          <w:sz w:val="22"/>
-        </w:rPr>
-        <w:t xml:space="preserve">Always growing through what we go through 🥰 such a lovely reminder to stay present and not fear the future</w:t>
+          <w:b w:val="0"/>
+          <w:sz w:val="22"/>
+        </w:rPr>
+        <w:t>Always growing through what we go through 🥰 such a lovely reminder to stay present and not fear the future</w:t>
       </w:r>
     </w:p>
     <w:p>
@@ -9999,17 +10068,18 @@
       <w:r>
         <w:rPr>
           <w:rFonts w:ascii="Georgia" w:hAnsi="Georgia" w:eastAsia="Georgia" w:cs="Georgia"/>
-          <w:sz w:val="22"/>
-          <w:b/>
+          <w:b/>
+          <w:sz w:val="22"/>
         </w:rPr>
         <w:t xml:space="preserve">Caption 1 (Page 6). </w:t>
       </w:r>
       <w:r>
         <w:rPr>
           <w:rFonts w:ascii="Georgia" w:hAnsi="Georgia" w:eastAsia="Georgia" w:cs="Georgia"/>
-          <w:sz w:val="22"/>
-        </w:rPr>
-        <w:t xml:space="preserve">Men’s mental health month is coming up this November. We don’t talk enough about what men carry. The pressure to be the provider. The strong one. The one that never cracks. But bottling everything up is why men are more likely to die by suicide, because they feel ashamed to speak up. We have to break the stigma 🩵#mentalhealth #mentalhealthawareness #mentalhealthmatters</w:t>
+          <w:b w:val="0"/>
+          <w:sz w:val="22"/>
+        </w:rPr>
+        <w:t>Men’s mental health month is coming up this November. We don’t talk enough about what men carry. The pressure to be the provider. The strong one. The one that never cracks. But bottling everything up is why men are more likely to die by suicide, because they feel ashamed to speak up. We have to break the stigma 🩵#mentalhealth #mentalhealthawareness #mentalhealthmatters</w:t>
       </w:r>
     </w:p>
     <w:p>
@@ -10021,17 +10091,18 @@
       <w:r>
         <w:rPr>
           <w:rFonts w:ascii="Georgia" w:hAnsi="Georgia" w:eastAsia="Georgia" w:cs="Georgia"/>
-          <w:sz w:val="22"/>
-          <w:b/>
+          <w:b/>
+          <w:sz w:val="22"/>
         </w:rPr>
         <w:t xml:space="preserve">Comment 1 under Caption 1 (Page 6). </w:t>
       </w:r>
       <w:r>
         <w:rPr>
           <w:rFonts w:ascii="Georgia" w:hAnsi="Georgia" w:eastAsia="Georgia" w:cs="Georgia"/>
-          <w:sz w:val="22"/>
-        </w:rPr>
-        <w:t xml:space="preserve">remember it’s ok not to be okay keep going fellas we got this together ❤️</w:t>
+          <w:b w:val="0"/>
+          <w:sz w:val="22"/>
+        </w:rPr>
+        <w:t>remember it’s ok not to be okay keep going fellas we got this together ❤️</w:t>
       </w:r>
     </w:p>
     <w:p>
@@ -10043,17 +10114,18 @@
       <w:r>
         <w:rPr>
           <w:rFonts w:ascii="Georgia" w:hAnsi="Georgia" w:eastAsia="Georgia" w:cs="Georgia"/>
-          <w:sz w:val="22"/>
-          <w:b/>
+          <w:b/>
+          <w:sz w:val="22"/>
         </w:rPr>
         <w:t xml:space="preserve">Comment 2 under Caption 1 (Page 6). </w:t>
       </w:r>
       <w:r>
         <w:rPr>
           <w:rFonts w:ascii="Georgia" w:hAnsi="Georgia" w:eastAsia="Georgia" w:cs="Georgia"/>
-          <w:sz w:val="22"/>
-        </w:rPr>
-        <w:t xml:space="preserve">To say the truth I have been having this feelings to end it. I see it as being scary but the more I keep it inside the more I see it as a relief 😮‍💨😢😢</w:t>
+          <w:b w:val="0"/>
+          <w:sz w:val="22"/>
+        </w:rPr>
+        <w:t>To say the truth I have been having this feelings to end it. I see it as being scary but the more I keep it inside the more I see it as a relief 😮‍💨😢😢</w:t>
       </w:r>
     </w:p>
     <w:p>
@@ -10065,17 +10137,18 @@
       <w:r>
         <w:rPr>
           <w:rFonts w:ascii="Georgia" w:hAnsi="Georgia" w:eastAsia="Georgia" w:cs="Georgia"/>
-          <w:sz w:val="22"/>
-          <w:b/>
+          <w:b/>
+          <w:sz w:val="22"/>
         </w:rPr>
         <w:t xml:space="preserve">Caption 2 (Page 6). </w:t>
       </w:r>
       <w:r>
         <w:rPr>
           <w:rFonts w:ascii="Georgia" w:hAnsi="Georgia" w:eastAsia="Georgia" w:cs="Georgia"/>
-          <w:sz w:val="22"/>
-        </w:rPr>
-        <w:t xml:space="preserve">Please never be embarrassed or too afraid to talk about your mental health. You’re tired from being strong. There’s nothing wrong with seeking assistance with getting along. #WorldMentalHealthDay #WMHD25 #MentalHealth</w:t>
+          <w:b w:val="0"/>
+          <w:sz w:val="22"/>
+        </w:rPr>
+        <w:t>Please never be embarrassed or too afraid to talk about your mental health. You’re tired from being strong. There’s nothing wrong with seeking assistance with getting along. #WorldMentalHealthDay #WMHD25 #MentalHealth</w:t>
       </w:r>
     </w:p>
     <w:p>
@@ -10087,17 +10160,18 @@
       <w:r>
         <w:rPr>
           <w:rFonts w:ascii="Georgia" w:hAnsi="Georgia" w:eastAsia="Georgia" w:cs="Georgia"/>
-          <w:sz w:val="22"/>
-          <w:b/>
+          <w:b/>
+          <w:sz w:val="22"/>
         </w:rPr>
         <w:t xml:space="preserve">Comment 1 under Caption 2 (Page 6). </w:t>
       </w:r>
       <w:r>
         <w:rPr>
           <w:rFonts w:ascii="Georgia" w:hAnsi="Georgia" w:eastAsia="Georgia" w:cs="Georgia"/>
-          <w:sz w:val="22"/>
-        </w:rPr>
-        <w:t xml:space="preserve">Sometimes when the people around you don’t help, it’s not because you don’t deserve it, it’s because they don’t know how, or they’ve been led to believe you don’t need it. You still deserve care. Always.</w:t>
+          <w:b w:val="0"/>
+          <w:sz w:val="22"/>
+        </w:rPr>
+        <w:t>Sometimes when the people around you don’t help, it’s not because you don’t deserve it, it’s because they don’t know how, or they’ve been led to believe you don’t need it. You still deserve care. Always.</w:t>
       </w:r>
     </w:p>
     <w:p>
@@ -10109,17 +10183,18 @@
       <w:r>
         <w:rPr>
           <w:rFonts w:ascii="Georgia" w:hAnsi="Georgia" w:eastAsia="Georgia" w:cs="Georgia"/>
-          <w:sz w:val="22"/>
-          <w:b/>
+          <w:b/>
+          <w:sz w:val="22"/>
         </w:rPr>
         <w:t xml:space="preserve">Comment 2 under Caption 2 (Page 6). </w:t>
       </w:r>
       <w:r>
         <w:rPr>
           <w:rFonts w:ascii="Georgia" w:hAnsi="Georgia" w:eastAsia="Georgia" w:cs="Georgia"/>
-          <w:sz w:val="22"/>
-        </w:rPr>
-        <w:t xml:space="preserve">Talking about it saves do many lives and encourages people to seek help to improve their mental health 🙌🏻❤️🫶🏻</w:t>
+          <w:b w:val="0"/>
+          <w:sz w:val="22"/>
+        </w:rPr>
+        <w:t>Talking about it saves do many lives and encourages people to seek help to improve their mental health 🙌🏻❤️🫶🏻</w:t>
       </w:r>
     </w:p>
     <w:p>
@@ -10131,17 +10206,18 @@
       <w:r>
         <w:rPr>
           <w:rFonts w:ascii="Georgia" w:hAnsi="Georgia" w:eastAsia="Georgia" w:cs="Georgia"/>
-          <w:sz w:val="22"/>
-          <w:b/>
+          <w:b/>
+          <w:sz w:val="22"/>
         </w:rPr>
         <w:t xml:space="preserve">Caption 3 (Page 6). </w:t>
       </w:r>
       <w:r>
         <w:rPr>
           <w:rFonts w:ascii="Georgia" w:hAnsi="Georgia" w:eastAsia="Georgia" w:cs="Georgia"/>
-          <w:sz w:val="22"/>
-        </w:rPr>
-        <w:t xml:space="preserve">Avoiding conversations about suicide doesn’t make the issue go away. it reinforces stigma, silence, and isolation. Open, compassionate talk of the topic helps people feel seen, understood, and supported. #suicideprevention #suicidepreventionmonth #mentalhealth #mentalhealthmatters #mentalhealthawareness#████████</w:t>
+          <w:b w:val="0"/>
+          <w:sz w:val="22"/>
+        </w:rPr>
+        <w:t>Avoiding conversations about suicide doesn’t make the issue go away. it reinforces stigma, silence, and isolation. Open, compassionate talk of the topic helps people feel seen, understood, and supported. #suicideprevention #suicidepreventionmonth #mentalhealth #mentalhealthmatters #mentalhealthawareness#████████</w:t>
       </w:r>
     </w:p>
     <w:p>
@@ -10153,17 +10229,18 @@
       <w:r>
         <w:rPr>
           <w:rFonts w:ascii="Georgia" w:hAnsi="Georgia" w:eastAsia="Georgia" w:cs="Georgia"/>
-          <w:sz w:val="22"/>
-          <w:b/>
+          <w:b/>
+          <w:sz w:val="22"/>
         </w:rPr>
         <w:t xml:space="preserve">Comment 1 under Caption 3 (Page 6). </w:t>
       </w:r>
       <w:r>
         <w:rPr>
           <w:rFonts w:ascii="Georgia" w:hAnsi="Georgia" w:eastAsia="Georgia" w:cs="Georgia"/>
-          <w:sz w:val="22"/>
-        </w:rPr>
-        <w:t xml:space="preserve">if you are reading this and you feel as though you want to leave this earth, i can lend you my ear whenever, 0 judgement, just a shoulder to lean on. you are so so so loved 🤍🤍pls stay with us we are all in this together 🫶🏻</w:t>
+          <w:b w:val="0"/>
+          <w:sz w:val="22"/>
+        </w:rPr>
+        <w:t>if you are reading this and you feel as though you want to leave this earth, i can lend you my ear whenever, 0 judgement, just a shoulder to lean on. you are so so so loved 🤍🤍pls stay with us we are all in this together 🫶🏻</w:t>
       </w:r>
     </w:p>
     <w:p>
@@ -10175,17 +10252,18 @@
       <w:r>
         <w:rPr>
           <w:rFonts w:ascii="Georgia" w:hAnsi="Georgia" w:eastAsia="Georgia" w:cs="Georgia"/>
-          <w:sz w:val="22"/>
-          <w:b/>
+          <w:b/>
+          <w:sz w:val="22"/>
         </w:rPr>
         <w:t xml:space="preserve">Comment 2 under Caption 3 (Page 6). </w:t>
       </w:r>
       <w:r>
         <w:rPr>
           <w:rFonts w:ascii="Georgia" w:hAnsi="Georgia" w:eastAsia="Georgia" w:cs="Georgia"/>
-          <w:sz w:val="22"/>
-        </w:rPr>
-        <w:t xml:space="preserve">Always make some time and check up on your loved ones. You never know what someone is going through and what they are dealing with. In today’s world, we talk about every little thing but no one talks or asks on what’s going on in someone’s life. People help people and talking about it won’t make someone any weak. Respect, love, care and know that you are important!</w:t>
+          <w:b w:val="0"/>
+          <w:sz w:val="22"/>
+        </w:rPr>
+        <w:t>Always make some time and check up on your loved ones. You never know what someone is going through and what they are dealing with. In today’s world, we talk about every little thing but no one talks or asks on what’s going on in someone’s life. People help people and talking about it won’t make someone any weak. Respect, love, care and know that you are important!</w:t>
       </w:r>
     </w:p>
     <w:p>
@@ -10197,17 +10275,18 @@
       <w:r>
         <w:rPr>
           <w:rFonts w:ascii="Georgia" w:hAnsi="Georgia" w:eastAsia="Georgia" w:cs="Georgia"/>
-          <w:sz w:val="22"/>
-          <w:b/>
+          <w:b/>
+          <w:sz w:val="22"/>
         </w:rPr>
         <w:t xml:space="preserve">Caption 4 (Page 6). </w:t>
       </w:r>
       <w:r>
         <w:rPr>
           <w:rFonts w:ascii="Georgia" w:hAnsi="Georgia" w:eastAsia="Georgia" w:cs="Georgia"/>
-          <w:sz w:val="22"/>
-        </w:rPr>
-        <w:t xml:space="preserve">Depression doesn’t always look like isolation or sadness; sometimes, it looks like overcompensating, exhaustion, or simply ‘pushing through. If this resonates with you, know that your struggles are valid, even if they’re unseen. Seeking support isn’t a sign of weakness-it’s a step toward healing. Functional depression is often associated with high-functioning depression, which can sometimes align with Persistent Depressive Disorder (PDD, formerly known as dysthymia)—a chronic but less severe form of depression where individuals can still manage daily responsibilities despite ongoing emotional distress. #functionaldepression #depression #youarenotalone #breakthestigma #mindfulness #mentalhealthmatters</w:t>
+          <w:b w:val="0"/>
+          <w:sz w:val="22"/>
+        </w:rPr>
+        <w:t>Depression doesn’t always look like isolation or sadness; sometimes, it looks like overcompensating, exhaustion, or simply ‘pushing through. If this resonates with you, know that your struggles are valid, even if they’re unseen. Seeking support isn’t a sign of weakness-it’s a step toward healing. Functional depression is often associated with high-functioning depression, which can sometimes align with Persistent Depressive Disorder (PDD, formerly known as dysthymia)—a chronic but less severe form of depression where individuals can still manage daily responsibilities despite ongoing emotional distress. #functionaldepression #depression #youarenotalone #breakthestigma #mindfulness #mentalhealthmatters</w:t>
       </w:r>
     </w:p>
     <w:p>
@@ -10219,17 +10298,18 @@
       <w:r>
         <w:rPr>
           <w:rFonts w:ascii="Georgia" w:hAnsi="Georgia" w:eastAsia="Georgia" w:cs="Georgia"/>
-          <w:sz w:val="22"/>
-          <w:b/>
+          <w:b/>
+          <w:sz w:val="22"/>
         </w:rPr>
         <w:t xml:space="preserve">Comment 1 under Caption 4 (Page 6). </w:t>
       </w:r>
       <w:r>
         <w:rPr>
           <w:rFonts w:ascii="Georgia" w:hAnsi="Georgia" w:eastAsia="Georgia" w:cs="Georgia"/>
-          <w:sz w:val="22"/>
-        </w:rPr>
-        <w:t xml:space="preserve">This is painfully real. Sometimes the loudest struggle is the one no one sees.</w:t>
+          <w:b w:val="0"/>
+          <w:sz w:val="22"/>
+        </w:rPr>
+        <w:t>This is painfully real. Sometimes the loudest struggle is the one no one sees.</w:t>
       </w:r>
     </w:p>
     <w:p>
@@ -10241,17 +10321,18 @@
       <w:r>
         <w:rPr>
           <w:rFonts w:ascii="Georgia" w:hAnsi="Georgia" w:eastAsia="Georgia" w:cs="Georgia"/>
-          <w:sz w:val="22"/>
-          <w:b/>
+          <w:b/>
+          <w:sz w:val="22"/>
         </w:rPr>
         <w:t xml:space="preserve">Comment 2 under Caption 4 (Page 6). </w:t>
       </w:r>
       <w:r>
         <w:rPr>
           <w:rFonts w:ascii="Georgia" w:hAnsi="Georgia" w:eastAsia="Georgia" w:cs="Georgia"/>
-          <w:sz w:val="22"/>
-        </w:rPr>
-        <w:t xml:space="preserve">It's better when they don't know. When people know your true feelings, they get upset with you and you have to apologize</w:t>
+          <w:b w:val="0"/>
+          <w:sz w:val="22"/>
+        </w:rPr>
+        <w:t>It's better when they don't know. When people know your true feelings, they get upset with you and you have to apologize</w:t>
       </w:r>
     </w:p>
     <w:p>
@@ -10263,17 +10344,18 @@
       <w:r>
         <w:rPr>
           <w:rFonts w:ascii="Georgia" w:hAnsi="Georgia" w:eastAsia="Georgia" w:cs="Georgia"/>
-          <w:sz w:val="22"/>
-          <w:b/>
+          <w:b/>
+          <w:sz w:val="22"/>
         </w:rPr>
         <w:t xml:space="preserve">Caption 5 (Page 6). </w:t>
       </w:r>
       <w:r>
         <w:rPr>
           <w:rFonts w:ascii="Georgia" w:hAnsi="Georgia" w:eastAsia="Georgia" w:cs="Georgia"/>
-          <w:sz w:val="22"/>
-        </w:rPr>
-        <w:t xml:space="preserve">People stigmatise mental health but mourn suicide. We need to make a change. ❤️ This is the sad society that we live in. But only we can change it. We can respond sooner, we can help people who are in need, we can reach out to people who we know are suffering, we can look for the warning signs.. we can just be kinder people to others.</w:t>
+          <w:b w:val="0"/>
+          <w:sz w:val="22"/>
+        </w:rPr>
+        <w:t>People stigmatise mental health but mourn suicide. We need to make a change. ❤️ This is the sad society that we live in. But only we can change it. We can respond sooner, we can help people who are in need, we can reach out to people who we know are suffering, we can look for the warning signs.. we can just be kinder people to others.</w:t>
       </w:r>
     </w:p>
     <w:p>
@@ -10285,17 +10367,18 @@
       <w:r>
         <w:rPr>
           <w:rFonts w:ascii="Georgia" w:hAnsi="Georgia" w:eastAsia="Georgia" w:cs="Georgia"/>
-          <w:sz w:val="22"/>
-          <w:b/>
+          <w:b/>
+          <w:sz w:val="22"/>
         </w:rPr>
         <w:t xml:space="preserve">Comment 1 under Caption 5 (Page 6). </w:t>
       </w:r>
       <w:r>
         <w:rPr>
           <w:rFonts w:ascii="Georgia" w:hAnsi="Georgia" w:eastAsia="Georgia" w:cs="Georgia"/>
-          <w:sz w:val="22"/>
-        </w:rPr>
-        <w:t xml:space="preserve">I would agree, everyone is avoiding me. I’m giving people the signs, yet everyone is pushing me away</w:t>
+          <w:b w:val="0"/>
+          <w:sz w:val="22"/>
+        </w:rPr>
+        <w:t>I would agree, everyone is avoiding me. I’m giving people the signs, yet everyone is pushing me away</w:t>
       </w:r>
     </w:p>
     <w:p>
@@ -10307,17 +10390,18 @@
       <w:r>
         <w:rPr>
           <w:rFonts w:ascii="Georgia" w:hAnsi="Georgia" w:eastAsia="Georgia" w:cs="Georgia"/>
-          <w:sz w:val="22"/>
-          <w:b/>
+          <w:b/>
+          <w:sz w:val="22"/>
         </w:rPr>
         <w:t xml:space="preserve">Comment 2 under Caption 5 (Page 6). </w:t>
       </w:r>
       <w:r>
         <w:rPr>
           <w:rFonts w:ascii="Georgia" w:hAnsi="Georgia" w:eastAsia="Georgia" w:cs="Georgia"/>
-          <w:sz w:val="22"/>
-        </w:rPr>
-        <w:t xml:space="preserve">As a society, we should take care of each other. Be kind no matter what! You never know what another person is going through</w:t>
+          <w:b w:val="0"/>
+          <w:sz w:val="22"/>
+        </w:rPr>
+        <w:t>As a society, we should take care of each other. Be kind no matter what! You never know what another person is going through</w:t>
       </w:r>
     </w:p>
     <w:p>
@@ -10329,17 +10413,18 @@
       <w:r>
         <w:rPr>
           <w:rFonts w:ascii="Georgia" w:hAnsi="Georgia" w:eastAsia="Georgia" w:cs="Georgia"/>
-          <w:sz w:val="22"/>
-          <w:b/>
+          <w:b/>
+          <w:sz w:val="22"/>
         </w:rPr>
         <w:t xml:space="preserve">Caption 6 (Page 6). </w:t>
       </w:r>
       <w:r>
         <w:rPr>
           <w:rFonts w:ascii="Georgia" w:hAnsi="Georgia" w:eastAsia="Georgia" w:cs="Georgia"/>
-          <w:sz w:val="22"/>
-        </w:rPr>
-        <w:t xml:space="preserve">There should not be an “until”, mental health matters full stop. all mental health needs to be taken seriously &amp; met with care &amp; understanding. the glamorisation and lack of understanding around mental health is so harmful and it’s costing people both their wellbeing and lives. something desperately needs to change &amp; we need much better, de-stigmatised education surrounding mental health. if your mental health hasn’t been taken seriously, for any reason, i am so unbelievably sorry. #mentalhealthawareness #mentalhealthmatters #mentalhealth #mentalillnessawareness #mentalillnessrecovery #mentalillness #mentalillnessisreal #eatingdisorder #depression #anxiety #ocd #borderlinepersonalitydisorder #eupd #bpd #mentalhealthadvocate #traumarecovery #mentalhealthrecovery</w:t>
+          <w:b w:val="0"/>
+          <w:sz w:val="22"/>
+        </w:rPr>
+        <w:t>There should not be an “until”, mental health matters full stop. all mental health needs to be taken seriously &amp; met with care &amp; understanding. the glamorisation and lack of understanding around mental health is so harmful and it’s costing people both their wellbeing and lives. something desperately needs to change &amp; we need much better, de-stigmatised education surrounding mental health. if your mental health hasn’t been taken seriously, for any reason, i am so unbelievably sorry. #mentalhealthawareness #mentalhealthmatters #mentalhealth #mentalillnessawareness #mentalillnessrecovery #mentalillness #mentalillnessisreal #eatingdisorder #depression #anxiety #ocd #borderlinepersonalitydisorder #eupd #bpd #mentalhealthadvocate #traumarecovery #mentalhealthrecovery</w:t>
       </w:r>
     </w:p>
     <w:p>
@@ -10351,17 +10436,18 @@
       <w:r>
         <w:rPr>
           <w:rFonts w:ascii="Georgia" w:hAnsi="Georgia" w:eastAsia="Georgia" w:cs="Georgia"/>
-          <w:sz w:val="22"/>
-          <w:b/>
+          <w:b/>
+          <w:sz w:val="22"/>
         </w:rPr>
         <w:t xml:space="preserve">Comment 1 under Caption 6 (Page 6). </w:t>
       </w:r>
       <w:r>
         <w:rPr>
           <w:rFonts w:ascii="Georgia" w:hAnsi="Georgia" w:eastAsia="Georgia" w:cs="Georgia"/>
-          <w:sz w:val="22"/>
-        </w:rPr>
-        <w:t xml:space="preserve">Mental health deserves attention before someone reaches a crisis point. Early understanding, compassionate support, and accessible education can make a meaningful difference.</w:t>
+          <w:b w:val="0"/>
+          <w:sz w:val="22"/>
+        </w:rPr>
+        <w:t>Mental health deserves attention before someone reaches a crisis point. Early understanding, compassionate support, and accessible education can make a meaningful difference.</w:t>
       </w:r>
     </w:p>
     <w:p>
@@ -10373,17 +10459,18 @@
       <w:r>
         <w:rPr>
           <w:rFonts w:ascii="Georgia" w:hAnsi="Georgia" w:eastAsia="Georgia" w:cs="Georgia"/>
-          <w:sz w:val="22"/>
-          <w:b/>
+          <w:b/>
+          <w:sz w:val="22"/>
         </w:rPr>
         <w:t xml:space="preserve">Comment 2 under Caption 6 (Page 6). </w:t>
       </w:r>
       <w:r>
         <w:rPr>
           <w:rFonts w:ascii="Georgia" w:hAnsi="Georgia" w:eastAsia="Georgia" w:cs="Georgia"/>
-          <w:sz w:val="22"/>
-        </w:rPr>
-        <w:t xml:space="preserve">Absolutely agree—mental health should never come with conditions or exceptions. It’s heartbreaking how often it’s misunderstood or dismissed. Thank you for speaking up and holding space for those who’ve been overlooked. This message is so needed.</w:t>
+          <w:b w:val="0"/>
+          <w:sz w:val="22"/>
+        </w:rPr>
+        <w:t>Absolutely agree—mental health should never come with conditions or exceptions. It’s heartbreaking how often it’s misunderstood or dismissed. Thank you for speaking up and holding space for those who’ve been overlooked. This message is so needed.</w:t>
       </w:r>
     </w:p>
     <w:p>
@@ -10395,17 +10482,18 @@
       <w:r>
         <w:rPr>
           <w:rFonts w:ascii="Georgia" w:hAnsi="Georgia" w:eastAsia="Georgia" w:cs="Georgia"/>
-          <w:sz w:val="22"/>
-          <w:b/>
+          <w:b/>
+          <w:sz w:val="22"/>
         </w:rPr>
         <w:t xml:space="preserve">Caption 7 (Page 6). </w:t>
       </w:r>
       <w:r>
         <w:rPr>
           <w:rFonts w:ascii="Georgia" w:hAnsi="Georgia" w:eastAsia="Georgia" w:cs="Georgia"/>
-          <w:sz w:val="22"/>
-        </w:rPr>
-        <w:t xml:space="preserve">Not everyone’s trauma gives them thick skin. Sometimes, it makes us more sensitive and vulnerable. It’s okay to feel deeply and acknowledge our experiences. Healing isn’t about pretending to be strong; it’s about embracing our journey and growing from it. 💖 - #MentalHealthAwareness #HealingJourney #BeKindToYourself #mentalhealth</w:t>
+          <w:b w:val="0"/>
+          <w:sz w:val="22"/>
+        </w:rPr>
+        <w:t>Not everyone’s trauma gives them thick skin. Sometimes, it makes us more sensitive and vulnerable. It’s okay to feel deeply and acknowledge our experiences. Healing isn’t about pretending to be strong; it’s about embracing our journey and growing from it. 💖 - #MentalHealthAwareness #HealingJourney #BeKindToYourself #mentalhealth</w:t>
       </w:r>
     </w:p>
     <w:p>
@@ -10417,17 +10505,18 @@
       <w:r>
         <w:rPr>
           <w:rFonts w:ascii="Georgia" w:hAnsi="Georgia" w:eastAsia="Georgia" w:cs="Georgia"/>
-          <w:sz w:val="22"/>
-          <w:b/>
+          <w:b/>
+          <w:sz w:val="22"/>
         </w:rPr>
         <w:t xml:space="preserve">Comment 1 under Caption 7 (Page 6). </w:t>
       </w:r>
       <w:r>
         <w:rPr>
           <w:rFonts w:ascii="Georgia" w:hAnsi="Georgia" w:eastAsia="Georgia" w:cs="Georgia"/>
-          <w:sz w:val="22"/>
-        </w:rPr>
-        <w:t xml:space="preserve">Don’t ever let anyone tell you how to heal. Trauma goes with some people to their grave and I’m sorry if that does for you. Hopefully you are able to grow stronger x</w:t>
+          <w:b w:val="0"/>
+          <w:sz w:val="22"/>
+        </w:rPr>
+        <w:t>Don’t ever let anyone tell you how to heal. Trauma goes with some people to their grave and I’m sorry if that does for you. Hopefully you are able to grow stronger x</w:t>
       </w:r>
     </w:p>
     <w:p>
@@ -10439,17 +10528,18 @@
       <w:r>
         <w:rPr>
           <w:rFonts w:ascii="Georgia" w:hAnsi="Georgia" w:eastAsia="Georgia" w:cs="Georgia"/>
-          <w:sz w:val="22"/>
-          <w:b/>
+          <w:b/>
+          <w:sz w:val="22"/>
         </w:rPr>
         <w:t xml:space="preserve">Comment 2 under Caption 7 (Page 6). </w:t>
       </w:r>
       <w:r>
         <w:rPr>
           <w:rFonts w:ascii="Georgia" w:hAnsi="Georgia" w:eastAsia="Georgia" w:cs="Georgia"/>
-          <w:sz w:val="22"/>
-        </w:rPr>
-        <w:t xml:space="preserve">Thank you ❤️ I get so overwhelmed now and find myself having panic attack attacks all the time. I’m just trying to take it one day at a time.</w:t>
+          <w:b w:val="0"/>
+          <w:sz w:val="22"/>
+        </w:rPr>
+        <w:t>Thank you ❤️ I get so overwhelmed now and find myself having panic attack attacks all the time. I’m just trying to take it one day at a time.</w:t>
       </w:r>
     </w:p>
     <w:sectPr>

</xml_diff>

<commit_message>
Appendix C: reformat as Page 01 > Caption N > Comment 1/2 hierarchy
</commit_message>
<xml_diff>
--- a/thesis/Thesis_Instagram_MH_v15.docx
+++ b/thesis/Thesis_Instagram_MH_v15.docx
@@ -8452,6 +8452,7 @@
         <w:rPr>
           <w:rFonts w:ascii="Georgia" w:hAnsi="Georgia" w:eastAsia="Georgia" w:cs="Georgia"/>
           <w:b/>
+          <w:i w:val="0"/>
           <w:sz w:val="24"/>
         </w:rPr>
         <w:t>APPENDIX C: CORPUS OF CAPTIONS AND COMMENTS</w:t>
@@ -8460,36 +8461,62 @@
     <w:p>
       <w:pPr>
         <w:spacing w:line="480" w:lineRule="auto" w:before="0" w:after="0"/>
-        <w:ind w:firstLine="720"/>
-        <w:jc w:val="both"/>
-      </w:pPr>
-      <w:r>
-        <w:rPr>
-          <w:rFonts w:ascii="Georgia" w:hAnsi="Georgia" w:eastAsia="Georgia" w:cs="Georgia"/>
-          <w:b w:val="0"/>
-          <w:sz w:val="22"/>
-        </w:rPr>
-        <w:t>This appendix presents the final corpus analyzed in the study for transparency. It comprises 30 English-language captions from six anonymized public mental health advocacy pages and two eligible comments under each caption (60 comments). Page identities are withheld. Each entry is labeled as a caption or as a comment under a caption. Usernames and other direct personal identifiers in the source material were redacted where they appeared. Emoji and hashtags are retained when they formed part of the visible public text.</w:t>
-      </w:r>
-    </w:p>
-    <w:p>
-      <w:pPr>
-        <w:spacing w:line="480" w:lineRule="auto" w:before="0" w:after="0"/>
-        <w:ind w:firstLine="720"/>
-        <w:jc w:val="both"/>
-      </w:pPr>
-      <w:r>
-        <w:rPr>
-          <w:rFonts w:ascii="Georgia" w:hAnsi="Georgia" w:eastAsia="Georgia" w:cs="Georgia"/>
-          <w:b/>
-          <w:sz w:val="22"/>
-        </w:rPr>
-        <w:t xml:space="preserve">Caption 1 (Page 1). </w:t>
-      </w:r>
-      <w:r>
-        <w:rPr>
-          <w:rFonts w:ascii="Georgia" w:hAnsi="Georgia" w:eastAsia="Georgia" w:cs="Georgia"/>
-          <w:b w:val="0"/>
+        <w:ind w:left="0" w:firstLine="720"/>
+        <w:jc w:val="both"/>
+      </w:pPr>
+      <w:r>
+        <w:rPr>
+          <w:rFonts w:ascii="Georgia" w:hAnsi="Georgia" w:eastAsia="Georgia" w:cs="Georgia"/>
+          <w:b w:val="0"/>
+          <w:i w:val="0"/>
+          <w:sz w:val="22"/>
+        </w:rPr>
+        <w:t>This appendix presents the final corpus analyzed in the study for transparency. It comprises 30 English-language captions from six anonymized public mental health advocacy pages and two eligible comments under each caption (60 comments). Page identities are withheld. Entries are grouped by anonymized page, then by caption, with the two selected comments listed under each caption. Usernames and other direct personal identifiers were redacted where they appeared. Emoji and hashtags are retained when they formed part of the visible public text.</w:t>
+      </w:r>
+    </w:p>
+    <w:p>
+      <w:pPr>
+        <w:spacing w:line="480" w:lineRule="auto" w:before="240" w:after="0"/>
+        <w:ind w:left="0" w:firstLine="0"/>
+        <w:jc w:val="left"/>
+      </w:pPr>
+      <w:r>
+        <w:rPr>
+          <w:rFonts w:ascii="Georgia" w:hAnsi="Georgia" w:eastAsia="Georgia" w:cs="Georgia"/>
+          <w:b/>
+          <w:i w:val="0"/>
+          <w:sz w:val="24"/>
+        </w:rPr>
+        <w:t>Page 01</w:t>
+      </w:r>
+    </w:p>
+    <w:p>
+      <w:pPr>
+        <w:spacing w:line="480" w:lineRule="auto" w:before="120" w:after="0"/>
+        <w:ind w:left="360" w:firstLine="0"/>
+        <w:jc w:val="left"/>
+      </w:pPr>
+      <w:r>
+        <w:rPr>
+          <w:rFonts w:ascii="Georgia" w:hAnsi="Georgia" w:eastAsia="Georgia" w:cs="Georgia"/>
+          <w:b/>
+          <w:i w:val="0"/>
+          <w:sz w:val="22"/>
+        </w:rPr>
+        <w:t>Caption 1</w:t>
+      </w:r>
+    </w:p>
+    <w:p>
+      <w:pPr>
+        <w:spacing w:line="480" w:lineRule="auto" w:before="0" w:after="0"/>
+        <w:ind w:left="360" w:firstLine="0"/>
+        <w:jc w:val="both"/>
+      </w:pPr>
+      <w:r>
+        <w:rPr>
+          <w:rFonts w:ascii="Georgia" w:hAnsi="Georgia" w:eastAsia="Georgia" w:cs="Georgia"/>
+          <w:b w:val="0"/>
+          <w:i w:val="0"/>
           <w:sz w:val="22"/>
         </w:rPr>
         <w:t>Art 🤝 Mental Health I’m so grateful to represent ████████ as an ambassador, and be here at NAMICon drawing live ✍️ I’ve met so many amazing people so far, and feel very lucky to have a platform where I can help destigmatize mental illness, and show others how art can be a therapeutic and helpful tool for navigating life. #mentalhealthawareness #artandmentalhealth #arttherapy</w:t>
@@ -8497,22 +8524,31 @@
     </w:p>
     <w:p>
       <w:pPr>
-        <w:spacing w:line="480" w:lineRule="auto" w:before="0" w:after="0"/>
-        <w:ind w:firstLine="720"/>
-        <w:jc w:val="both"/>
-      </w:pPr>
-      <w:r>
-        <w:rPr>
-          <w:rFonts w:ascii="Georgia" w:hAnsi="Georgia" w:eastAsia="Georgia" w:cs="Georgia"/>
-          <w:b/>
-          <w:sz w:val="22"/>
-        </w:rPr>
-        <w:t xml:space="preserve">Comment 1 under Caption 1 (Page 1). </w:t>
-      </w:r>
-      <w:r>
-        <w:rPr>
-          <w:rFonts w:ascii="Georgia" w:hAnsi="Georgia" w:eastAsia="Georgia" w:cs="Georgia"/>
-          <w:b w:val="0"/>
+        <w:spacing w:line="480" w:lineRule="auto" w:before="60" w:after="0"/>
+        <w:ind w:left="720" w:firstLine="0"/>
+        <w:jc w:val="left"/>
+      </w:pPr>
+      <w:r>
+        <w:rPr>
+          <w:rFonts w:ascii="Georgia" w:hAnsi="Georgia" w:eastAsia="Georgia" w:cs="Georgia"/>
+          <w:b/>
+          <w:i w:val="0"/>
+          <w:sz w:val="22"/>
+        </w:rPr>
+        <w:t>Comment 1</w:t>
+      </w:r>
+    </w:p>
+    <w:p>
+      <w:pPr>
+        <w:spacing w:line="480" w:lineRule="auto" w:before="0" w:after="0"/>
+        <w:ind w:left="720" w:firstLine="0"/>
+        <w:jc w:val="both"/>
+      </w:pPr>
+      <w:r>
+        <w:rPr>
+          <w:rFonts w:ascii="Georgia" w:hAnsi="Georgia" w:eastAsia="Georgia" w:cs="Georgia"/>
+          <w:b w:val="0"/>
+          <w:i w:val="0"/>
           <w:sz w:val="22"/>
         </w:rPr>
         <w:t>We love the way you’re involving the audience in your art, what a great way to encourage community! We can’t wait to unveil your beautiful work on the Firehouse walls.</w:t>
@@ -8520,22 +8556,31 @@
     </w:p>
     <w:p>
       <w:pPr>
-        <w:spacing w:line="480" w:lineRule="auto" w:before="0" w:after="0"/>
-        <w:ind w:firstLine="720"/>
-        <w:jc w:val="both"/>
-      </w:pPr>
-      <w:r>
-        <w:rPr>
-          <w:rFonts w:ascii="Georgia" w:hAnsi="Georgia" w:eastAsia="Georgia" w:cs="Georgia"/>
-          <w:b/>
-          <w:sz w:val="22"/>
-        </w:rPr>
-        <w:t xml:space="preserve">Comment 2 under Caption 1 (Page 1). </w:t>
-      </w:r>
-      <w:r>
-        <w:rPr>
-          <w:rFonts w:ascii="Georgia" w:hAnsi="Georgia" w:eastAsia="Georgia" w:cs="Georgia"/>
-          <w:b w:val="0"/>
+        <w:spacing w:line="480" w:lineRule="auto" w:before="60" w:after="0"/>
+        <w:ind w:left="720" w:firstLine="0"/>
+        <w:jc w:val="left"/>
+      </w:pPr>
+      <w:r>
+        <w:rPr>
+          <w:rFonts w:ascii="Georgia" w:hAnsi="Georgia" w:eastAsia="Georgia" w:cs="Georgia"/>
+          <w:b/>
+          <w:i w:val="0"/>
+          <w:sz w:val="22"/>
+        </w:rPr>
+        <w:t>Comment 2</w:t>
+      </w:r>
+    </w:p>
+    <w:p>
+      <w:pPr>
+        <w:spacing w:line="480" w:lineRule="auto" w:before="0" w:after="0"/>
+        <w:ind w:left="720" w:firstLine="0"/>
+        <w:jc w:val="both"/>
+      </w:pPr>
+      <w:r>
+        <w:rPr>
+          <w:rFonts w:ascii="Georgia" w:hAnsi="Georgia" w:eastAsia="Georgia" w:cs="Georgia"/>
+          <w:b w:val="0"/>
+          <w:i w:val="0"/>
           <w:sz w:val="22"/>
         </w:rPr>
         <w:t>Love this concept! The connection between art and mental health can be powerful!</w:t>
@@ -8543,22 +8588,31 @@
     </w:p>
     <w:p>
       <w:pPr>
-        <w:spacing w:line="480" w:lineRule="auto" w:before="0" w:after="0"/>
-        <w:ind w:firstLine="720"/>
-        <w:jc w:val="both"/>
-      </w:pPr>
-      <w:r>
-        <w:rPr>
-          <w:rFonts w:ascii="Georgia" w:hAnsi="Georgia" w:eastAsia="Georgia" w:cs="Georgia"/>
-          <w:b/>
-          <w:sz w:val="22"/>
-        </w:rPr>
-        <w:t xml:space="preserve">Caption 2 (Page 1). </w:t>
-      </w:r>
-      <w:r>
-        <w:rPr>
-          <w:rFonts w:ascii="Georgia" w:hAnsi="Georgia" w:eastAsia="Georgia" w:cs="Georgia"/>
-          <w:b w:val="0"/>
+        <w:spacing w:line="480" w:lineRule="auto" w:before="120" w:after="0"/>
+        <w:ind w:left="360" w:firstLine="0"/>
+        <w:jc w:val="left"/>
+      </w:pPr>
+      <w:r>
+        <w:rPr>
+          <w:rFonts w:ascii="Georgia" w:hAnsi="Georgia" w:eastAsia="Georgia" w:cs="Georgia"/>
+          <w:b/>
+          <w:i w:val="0"/>
+          <w:sz w:val="22"/>
+        </w:rPr>
+        <w:t>Caption 2</w:t>
+      </w:r>
+    </w:p>
+    <w:p>
+      <w:pPr>
+        <w:spacing w:line="480" w:lineRule="auto" w:before="0" w:after="0"/>
+        <w:ind w:left="360" w:firstLine="0"/>
+        <w:jc w:val="both"/>
+      </w:pPr>
+      <w:r>
+        <w:rPr>
+          <w:rFonts w:ascii="Georgia" w:hAnsi="Georgia" w:eastAsia="Georgia" w:cs="Georgia"/>
+          <w:b w:val="0"/>
+          <w:i w:val="0"/>
           <w:sz w:val="22"/>
         </w:rPr>
         <w:t>Every day won't look or feel perfect, and that's okay. Remember, it's okay to not be okay!</w:t>
@@ -8566,22 +8620,31 @@
     </w:p>
     <w:p>
       <w:pPr>
-        <w:spacing w:line="480" w:lineRule="auto" w:before="0" w:after="0"/>
-        <w:ind w:firstLine="720"/>
-        <w:jc w:val="both"/>
-      </w:pPr>
-      <w:r>
-        <w:rPr>
-          <w:rFonts w:ascii="Georgia" w:hAnsi="Georgia" w:eastAsia="Georgia" w:cs="Georgia"/>
-          <w:b/>
-          <w:sz w:val="22"/>
-        </w:rPr>
-        <w:t xml:space="preserve">Comment 1 under Caption 2 (Page 1). </w:t>
-      </w:r>
-      <w:r>
-        <w:rPr>
-          <w:rFonts w:ascii="Georgia" w:hAnsi="Georgia" w:eastAsia="Georgia" w:cs="Georgia"/>
-          <w:b w:val="0"/>
+        <w:spacing w:line="480" w:lineRule="auto" w:before="60" w:after="0"/>
+        <w:ind w:left="720" w:firstLine="0"/>
+        <w:jc w:val="left"/>
+      </w:pPr>
+      <w:r>
+        <w:rPr>
+          <w:rFonts w:ascii="Georgia" w:hAnsi="Georgia" w:eastAsia="Georgia" w:cs="Georgia"/>
+          <w:b/>
+          <w:i w:val="0"/>
+          <w:sz w:val="22"/>
+        </w:rPr>
+        <w:t>Comment 1</w:t>
+      </w:r>
+    </w:p>
+    <w:p>
+      <w:pPr>
+        <w:spacing w:line="480" w:lineRule="auto" w:before="0" w:after="0"/>
+        <w:ind w:left="720" w:firstLine="0"/>
+        <w:jc w:val="both"/>
+      </w:pPr>
+      <w:r>
+        <w:rPr>
+          <w:rFonts w:ascii="Georgia" w:hAnsi="Georgia" w:eastAsia="Georgia" w:cs="Georgia"/>
+          <w:b w:val="0"/>
+          <w:i w:val="0"/>
           <w:sz w:val="22"/>
         </w:rPr>
         <w:t>Tell someone! You don’t have to be alone! Be aware of those around you who might be suffering in silence. Wait with them...</w:t>
@@ -8589,22 +8652,31 @@
     </w:p>
     <w:p>
       <w:pPr>
-        <w:spacing w:line="480" w:lineRule="auto" w:before="0" w:after="0"/>
-        <w:ind w:firstLine="720"/>
-        <w:jc w:val="both"/>
-      </w:pPr>
-      <w:r>
-        <w:rPr>
-          <w:rFonts w:ascii="Georgia" w:hAnsi="Georgia" w:eastAsia="Georgia" w:cs="Georgia"/>
-          <w:b/>
-          <w:sz w:val="22"/>
-        </w:rPr>
-        <w:t xml:space="preserve">Comment 2 under Caption 2 (Page 1). </w:t>
-      </w:r>
-      <w:r>
-        <w:rPr>
-          <w:rFonts w:ascii="Georgia" w:hAnsi="Georgia" w:eastAsia="Georgia" w:cs="Georgia"/>
-          <w:b w:val="0"/>
+        <w:spacing w:line="480" w:lineRule="auto" w:before="60" w:after="0"/>
+        <w:ind w:left="720" w:firstLine="0"/>
+        <w:jc w:val="left"/>
+      </w:pPr>
+      <w:r>
+        <w:rPr>
+          <w:rFonts w:ascii="Georgia" w:hAnsi="Georgia" w:eastAsia="Georgia" w:cs="Georgia"/>
+          <w:b/>
+          <w:i w:val="0"/>
+          <w:sz w:val="22"/>
+        </w:rPr>
+        <w:t>Comment 2</w:t>
+      </w:r>
+    </w:p>
+    <w:p>
+      <w:pPr>
+        <w:spacing w:line="480" w:lineRule="auto" w:before="0" w:after="0"/>
+        <w:ind w:left="720" w:firstLine="0"/>
+        <w:jc w:val="both"/>
+      </w:pPr>
+      <w:r>
+        <w:rPr>
+          <w:rFonts w:ascii="Georgia" w:hAnsi="Georgia" w:eastAsia="Georgia" w:cs="Georgia"/>
+          <w:b w:val="0"/>
+          <w:i w:val="0"/>
           <w:sz w:val="22"/>
         </w:rPr>
         <w:t>When she have episodes, times like this are so hard but we will keep pushing until her next better days.</w:t>
@@ -8612,22 +8684,31 @@
     </w:p>
     <w:p>
       <w:pPr>
-        <w:spacing w:line="480" w:lineRule="auto" w:before="0" w:after="0"/>
-        <w:ind w:firstLine="720"/>
-        <w:jc w:val="both"/>
-      </w:pPr>
-      <w:r>
-        <w:rPr>
-          <w:rFonts w:ascii="Georgia" w:hAnsi="Georgia" w:eastAsia="Georgia" w:cs="Georgia"/>
-          <w:b/>
-          <w:sz w:val="22"/>
-        </w:rPr>
-        <w:t xml:space="preserve">Caption 3 (Page 1). </w:t>
-      </w:r>
-      <w:r>
-        <w:rPr>
-          <w:rFonts w:ascii="Georgia" w:hAnsi="Georgia" w:eastAsia="Georgia" w:cs="Georgia"/>
-          <w:b w:val="0"/>
+        <w:spacing w:line="480" w:lineRule="auto" w:before="120" w:after="0"/>
+        <w:ind w:left="360" w:firstLine="0"/>
+        <w:jc w:val="left"/>
+      </w:pPr>
+      <w:r>
+        <w:rPr>
+          <w:rFonts w:ascii="Georgia" w:hAnsi="Georgia" w:eastAsia="Georgia" w:cs="Georgia"/>
+          <w:b/>
+          <w:i w:val="0"/>
+          <w:sz w:val="22"/>
+        </w:rPr>
+        <w:t>Caption 3</w:t>
+      </w:r>
+    </w:p>
+    <w:p>
+      <w:pPr>
+        <w:spacing w:line="480" w:lineRule="auto" w:before="0" w:after="0"/>
+        <w:ind w:left="360" w:firstLine="0"/>
+        <w:jc w:val="both"/>
+      </w:pPr>
+      <w:r>
+        <w:rPr>
+          <w:rFonts w:ascii="Georgia" w:hAnsi="Georgia" w:eastAsia="Georgia" w:cs="Georgia"/>
+          <w:b w:val="0"/>
+          <w:i w:val="0"/>
           <w:sz w:val="22"/>
         </w:rPr>
         <w:t>Remember to be kind, to be patient, and don’t be afraid to have open conversations on #WorldSchizophreniaDay. It’s how we continue to destigmatize mental illness and help one another.</w:t>
@@ -8635,22 +8716,31 @@
     </w:p>
     <w:p>
       <w:pPr>
-        <w:spacing w:line="480" w:lineRule="auto" w:before="0" w:after="0"/>
-        <w:ind w:firstLine="720"/>
-        <w:jc w:val="both"/>
-      </w:pPr>
-      <w:r>
-        <w:rPr>
-          <w:rFonts w:ascii="Georgia" w:hAnsi="Georgia" w:eastAsia="Georgia" w:cs="Georgia"/>
-          <w:b/>
-          <w:sz w:val="22"/>
-        </w:rPr>
-        <w:t xml:space="preserve">Comment 1 under Caption 3 (Page 1). </w:t>
-      </w:r>
-      <w:r>
-        <w:rPr>
-          <w:rFonts w:ascii="Georgia" w:hAnsi="Georgia" w:eastAsia="Georgia" w:cs="Georgia"/>
-          <w:b w:val="0"/>
+        <w:spacing w:line="480" w:lineRule="auto" w:before="60" w:after="0"/>
+        <w:ind w:left="720" w:firstLine="0"/>
+        <w:jc w:val="left"/>
+      </w:pPr>
+      <w:r>
+        <w:rPr>
+          <w:rFonts w:ascii="Georgia" w:hAnsi="Georgia" w:eastAsia="Georgia" w:cs="Georgia"/>
+          <w:b/>
+          <w:i w:val="0"/>
+          <w:sz w:val="22"/>
+        </w:rPr>
+        <w:t>Comment 1</w:t>
+      </w:r>
+    </w:p>
+    <w:p>
+      <w:pPr>
+        <w:spacing w:line="480" w:lineRule="auto" w:before="0" w:after="0"/>
+        <w:ind w:left="720" w:firstLine="0"/>
+        <w:jc w:val="both"/>
+      </w:pPr>
+      <w:r>
+        <w:rPr>
+          <w:rFonts w:ascii="Georgia" w:hAnsi="Georgia" w:eastAsia="Georgia" w:cs="Georgia"/>
+          <w:b w:val="0"/>
+          <w:i w:val="0"/>
           <w:sz w:val="22"/>
         </w:rPr>
         <w:t>My husband has schizophrenia, he is suicidal. He has completely lost touch with reality and does not trust anyone at all. At the moment we are trying to find him so he can be helped.</w:t>
@@ -8658,22 +8748,31 @@
     </w:p>
     <w:p>
       <w:pPr>
-        <w:spacing w:line="480" w:lineRule="auto" w:before="0" w:after="0"/>
-        <w:ind w:firstLine="720"/>
-        <w:jc w:val="both"/>
-      </w:pPr>
-      <w:r>
-        <w:rPr>
-          <w:rFonts w:ascii="Georgia" w:hAnsi="Georgia" w:eastAsia="Georgia" w:cs="Georgia"/>
-          <w:b/>
-          <w:sz w:val="22"/>
-        </w:rPr>
-        <w:t xml:space="preserve">Comment 2 under Caption 3 (Page 1). </w:t>
-      </w:r>
-      <w:r>
-        <w:rPr>
-          <w:rFonts w:ascii="Georgia" w:hAnsi="Georgia" w:eastAsia="Georgia" w:cs="Georgia"/>
-          <w:b w:val="0"/>
+        <w:spacing w:line="480" w:lineRule="auto" w:before="60" w:after="0"/>
+        <w:ind w:left="720" w:firstLine="0"/>
+        <w:jc w:val="left"/>
+      </w:pPr>
+      <w:r>
+        <w:rPr>
+          <w:rFonts w:ascii="Georgia" w:hAnsi="Georgia" w:eastAsia="Georgia" w:cs="Georgia"/>
+          <w:b/>
+          <w:i w:val="0"/>
+          <w:sz w:val="22"/>
+        </w:rPr>
+        <w:t>Comment 2</w:t>
+      </w:r>
+    </w:p>
+    <w:p>
+      <w:pPr>
+        <w:spacing w:line="480" w:lineRule="auto" w:before="0" w:after="0"/>
+        <w:ind w:left="720" w:firstLine="0"/>
+        <w:jc w:val="both"/>
+      </w:pPr>
+      <w:r>
+        <w:rPr>
+          <w:rFonts w:ascii="Georgia" w:hAnsi="Georgia" w:eastAsia="Georgia" w:cs="Georgia"/>
+          <w:b w:val="0"/>
+          <w:i w:val="0"/>
           <w:sz w:val="22"/>
         </w:rPr>
         <w:t>Don't be afraid to have that conversation is 🙌🏻 That's a step towards obliterating stigma around health.</w:t>
@@ -8681,22 +8780,31 @@
     </w:p>
     <w:p>
       <w:pPr>
-        <w:spacing w:line="480" w:lineRule="auto" w:before="0" w:after="0"/>
-        <w:ind w:firstLine="720"/>
-        <w:jc w:val="both"/>
-      </w:pPr>
-      <w:r>
-        <w:rPr>
-          <w:rFonts w:ascii="Georgia" w:hAnsi="Georgia" w:eastAsia="Georgia" w:cs="Georgia"/>
-          <w:b/>
-          <w:sz w:val="22"/>
-        </w:rPr>
-        <w:t xml:space="preserve">Caption 4 (Page 1). </w:t>
-      </w:r>
-      <w:r>
-        <w:rPr>
-          <w:rFonts w:ascii="Georgia" w:hAnsi="Georgia" w:eastAsia="Georgia" w:cs="Georgia"/>
-          <w:b w:val="0"/>
+        <w:spacing w:line="480" w:lineRule="auto" w:before="120" w:after="0"/>
+        <w:ind w:left="360" w:firstLine="0"/>
+        <w:jc w:val="left"/>
+      </w:pPr>
+      <w:r>
+        <w:rPr>
+          <w:rFonts w:ascii="Georgia" w:hAnsi="Georgia" w:eastAsia="Georgia" w:cs="Georgia"/>
+          <w:b/>
+          <w:i w:val="0"/>
+          <w:sz w:val="22"/>
+        </w:rPr>
+        <w:t>Caption 4</w:t>
+      </w:r>
+    </w:p>
+    <w:p>
+      <w:pPr>
+        <w:spacing w:line="480" w:lineRule="auto" w:before="0" w:after="0"/>
+        <w:ind w:left="360" w:firstLine="0"/>
+        <w:jc w:val="both"/>
+      </w:pPr>
+      <w:r>
+        <w:rPr>
+          <w:rFonts w:ascii="Georgia" w:hAnsi="Georgia" w:eastAsia="Georgia" w:cs="Georgia"/>
+          <w:b w:val="0"/>
+          <w:i w:val="0"/>
           <w:sz w:val="22"/>
         </w:rPr>
         <w:t>Small steps lead to big progress. Focus on the little victories that pave the way for meaningful change. #TakeAMentalHealthMoment #MentalHealthMonth</w:t>
@@ -8704,22 +8812,31 @@
     </w:p>
     <w:p>
       <w:pPr>
-        <w:spacing w:line="480" w:lineRule="auto" w:before="0" w:after="0"/>
-        <w:ind w:firstLine="720"/>
-        <w:jc w:val="both"/>
-      </w:pPr>
-      <w:r>
-        <w:rPr>
-          <w:rFonts w:ascii="Georgia" w:hAnsi="Georgia" w:eastAsia="Georgia" w:cs="Georgia"/>
-          <w:b/>
-          <w:sz w:val="22"/>
-        </w:rPr>
-        <w:t xml:space="preserve">Comment 1 under Caption 4 (Page 1). </w:t>
-      </w:r>
-      <w:r>
-        <w:rPr>
-          <w:rFonts w:ascii="Georgia" w:hAnsi="Georgia" w:eastAsia="Georgia" w:cs="Georgia"/>
-          <w:b w:val="0"/>
+        <w:spacing w:line="480" w:lineRule="auto" w:before="60" w:after="0"/>
+        <w:ind w:left="720" w:firstLine="0"/>
+        <w:jc w:val="left"/>
+      </w:pPr>
+      <w:r>
+        <w:rPr>
+          <w:rFonts w:ascii="Georgia" w:hAnsi="Georgia" w:eastAsia="Georgia" w:cs="Georgia"/>
+          <w:b/>
+          <w:i w:val="0"/>
+          <w:sz w:val="22"/>
+        </w:rPr>
+        <w:t>Comment 1</w:t>
+      </w:r>
+    </w:p>
+    <w:p>
+      <w:pPr>
+        <w:spacing w:line="480" w:lineRule="auto" w:before="0" w:after="0"/>
+        <w:ind w:left="720" w:firstLine="0"/>
+        <w:jc w:val="both"/>
+      </w:pPr>
+      <w:r>
+        <w:rPr>
+          <w:rFonts w:ascii="Georgia" w:hAnsi="Georgia" w:eastAsia="Georgia" w:cs="Georgia"/>
+          <w:b w:val="0"/>
+          <w:i w:val="0"/>
           <w:sz w:val="22"/>
         </w:rPr>
         <w:t>Small steps everyday forever. Recovery and mental health is an ongoing effort.</w:t>
@@ -8727,22 +8844,31 @@
     </w:p>
     <w:p>
       <w:pPr>
-        <w:spacing w:line="480" w:lineRule="auto" w:before="0" w:after="0"/>
-        <w:ind w:firstLine="720"/>
-        <w:jc w:val="both"/>
-      </w:pPr>
-      <w:r>
-        <w:rPr>
-          <w:rFonts w:ascii="Georgia" w:hAnsi="Georgia" w:eastAsia="Georgia" w:cs="Georgia"/>
-          <w:b/>
-          <w:sz w:val="22"/>
-        </w:rPr>
-        <w:t xml:space="preserve">Comment 2 under Caption 4 (Page 1). </w:t>
-      </w:r>
-      <w:r>
-        <w:rPr>
-          <w:rFonts w:ascii="Georgia" w:hAnsi="Georgia" w:eastAsia="Georgia" w:cs="Georgia"/>
-          <w:b w:val="0"/>
+        <w:spacing w:line="480" w:lineRule="auto" w:before="60" w:after="0"/>
+        <w:ind w:left="720" w:firstLine="0"/>
+        <w:jc w:val="left"/>
+      </w:pPr>
+      <w:r>
+        <w:rPr>
+          <w:rFonts w:ascii="Georgia" w:hAnsi="Georgia" w:eastAsia="Georgia" w:cs="Georgia"/>
+          <w:b/>
+          <w:i w:val="0"/>
+          <w:sz w:val="22"/>
+        </w:rPr>
+        <w:t>Comment 2</w:t>
+      </w:r>
+    </w:p>
+    <w:p>
+      <w:pPr>
+        <w:spacing w:line="480" w:lineRule="auto" w:before="0" w:after="0"/>
+        <w:ind w:left="720" w:firstLine="0"/>
+        <w:jc w:val="both"/>
+      </w:pPr>
+      <w:r>
+        <w:rPr>
+          <w:rFonts w:ascii="Georgia" w:hAnsi="Georgia" w:eastAsia="Georgia" w:cs="Georgia"/>
+          <w:b w:val="0"/>
+          <w:i w:val="0"/>
           <w:sz w:val="22"/>
         </w:rPr>
         <w:t>It is important to celebrate the “ small “ steps forward! They can provide a source of hope as well.</w:t>
@@ -8750,22 +8876,31 @@
     </w:p>
     <w:p>
       <w:pPr>
-        <w:spacing w:line="480" w:lineRule="auto" w:before="0" w:after="0"/>
-        <w:ind w:firstLine="720"/>
-        <w:jc w:val="both"/>
-      </w:pPr>
-      <w:r>
-        <w:rPr>
-          <w:rFonts w:ascii="Georgia" w:hAnsi="Georgia" w:eastAsia="Georgia" w:cs="Georgia"/>
-          <w:b/>
-          <w:sz w:val="22"/>
-        </w:rPr>
-        <w:t xml:space="preserve">Caption 5 (Page 1). </w:t>
-      </w:r>
-      <w:r>
-        <w:rPr>
-          <w:rFonts w:ascii="Georgia" w:hAnsi="Georgia" w:eastAsia="Georgia" w:cs="Georgia"/>
-          <w:b w:val="0"/>
+        <w:spacing w:line="480" w:lineRule="auto" w:before="120" w:after="0"/>
+        <w:ind w:left="360" w:firstLine="0"/>
+        <w:jc w:val="left"/>
+      </w:pPr>
+      <w:r>
+        <w:rPr>
+          <w:rFonts w:ascii="Georgia" w:hAnsi="Georgia" w:eastAsia="Georgia" w:cs="Georgia"/>
+          <w:b/>
+          <w:i w:val="0"/>
+          <w:sz w:val="22"/>
+        </w:rPr>
+        <w:t>Caption 5</w:t>
+      </w:r>
+    </w:p>
+    <w:p>
+      <w:pPr>
+        <w:spacing w:line="480" w:lineRule="auto" w:before="0" w:after="0"/>
+        <w:ind w:left="360" w:firstLine="0"/>
+        <w:jc w:val="both"/>
+      </w:pPr>
+      <w:r>
+        <w:rPr>
+          <w:rFonts w:ascii="Georgia" w:hAnsi="Georgia" w:eastAsia="Georgia" w:cs="Georgia"/>
+          <w:b w:val="0"/>
+          <w:i w:val="0"/>
           <w:sz w:val="22"/>
         </w:rPr>
         <w:t>It's our favorite month of the year! Join us this #MentalHealthAwarenessMonth by agreeing to #TakeTheMoment to prioritize your mental health. Discover our range of signature programs and resources, including NAMI Basics, NAMI Family-to-Family, NAMI Homefront, and more! Learn more about getting engaged this month at nami.org/mham</w:t>
@@ -8773,22 +8908,31 @@
     </w:p>
     <w:p>
       <w:pPr>
-        <w:spacing w:line="480" w:lineRule="auto" w:before="0" w:after="0"/>
-        <w:ind w:firstLine="720"/>
-        <w:jc w:val="both"/>
-      </w:pPr>
-      <w:r>
-        <w:rPr>
-          <w:rFonts w:ascii="Georgia" w:hAnsi="Georgia" w:eastAsia="Georgia" w:cs="Georgia"/>
-          <w:b/>
-          <w:sz w:val="22"/>
-        </w:rPr>
-        <w:t xml:space="preserve">Comment 1 under Caption 5 (Page 1). </w:t>
-      </w:r>
-      <w:r>
-        <w:rPr>
-          <w:rFonts w:ascii="Georgia" w:hAnsi="Georgia" w:eastAsia="Georgia" w:cs="Georgia"/>
-          <w:b w:val="0"/>
+        <w:spacing w:line="480" w:lineRule="auto" w:before="60" w:after="0"/>
+        <w:ind w:left="720" w:firstLine="0"/>
+        <w:jc w:val="left"/>
+      </w:pPr>
+      <w:r>
+        <w:rPr>
+          <w:rFonts w:ascii="Georgia" w:hAnsi="Georgia" w:eastAsia="Georgia" w:cs="Georgia"/>
+          <w:b/>
+          <w:i w:val="0"/>
+          <w:sz w:val="22"/>
+        </w:rPr>
+        <w:t>Comment 1</w:t>
+      </w:r>
+    </w:p>
+    <w:p>
+      <w:pPr>
+        <w:spacing w:line="480" w:lineRule="auto" w:before="0" w:after="0"/>
+        <w:ind w:left="720" w:firstLine="0"/>
+        <w:jc w:val="both"/>
+      </w:pPr>
+      <w:r>
+        <w:rPr>
+          <w:rFonts w:ascii="Georgia" w:hAnsi="Georgia" w:eastAsia="Georgia" w:cs="Georgia"/>
+          <w:b w:val="0"/>
+          <w:i w:val="0"/>
           <w:sz w:val="22"/>
         </w:rPr>
         <w:t>❤️ My youngest was recently diagnosed with bi-polar 1 I’m taking the family to family class offered and educating myself the best I can</w:t>
@@ -8796,22 +8940,31 @@
     </w:p>
     <w:p>
       <w:pPr>
-        <w:spacing w:line="480" w:lineRule="auto" w:before="0" w:after="0"/>
-        <w:ind w:firstLine="720"/>
-        <w:jc w:val="both"/>
-      </w:pPr>
-      <w:r>
-        <w:rPr>
-          <w:rFonts w:ascii="Georgia" w:hAnsi="Georgia" w:eastAsia="Georgia" w:cs="Georgia"/>
-          <w:b/>
-          <w:sz w:val="22"/>
-        </w:rPr>
-        <w:t xml:space="preserve">Comment 2 under Caption 5 (Page 1). </w:t>
-      </w:r>
-      <w:r>
-        <w:rPr>
-          <w:rFonts w:ascii="Georgia" w:hAnsi="Georgia" w:eastAsia="Georgia" w:cs="Georgia"/>
-          <w:b w:val="0"/>
+        <w:spacing w:line="480" w:lineRule="auto" w:before="60" w:after="0"/>
+        <w:ind w:left="720" w:firstLine="0"/>
+        <w:jc w:val="left"/>
+      </w:pPr>
+      <w:r>
+        <w:rPr>
+          <w:rFonts w:ascii="Georgia" w:hAnsi="Georgia" w:eastAsia="Georgia" w:cs="Georgia"/>
+          <w:b/>
+          <w:i w:val="0"/>
+          <w:sz w:val="22"/>
+        </w:rPr>
+        <w:t>Comment 2</w:t>
+      </w:r>
+    </w:p>
+    <w:p>
+      <w:pPr>
+        <w:spacing w:line="480" w:lineRule="auto" w:before="0" w:after="0"/>
+        <w:ind w:left="720" w:firstLine="0"/>
+        <w:jc w:val="both"/>
+      </w:pPr>
+      <w:r>
+        <w:rPr>
+          <w:rFonts w:ascii="Georgia" w:hAnsi="Georgia" w:eastAsia="Georgia" w:cs="Georgia"/>
+          <w:b w:val="0"/>
+          <w:i w:val="0"/>
           <w:sz w:val="22"/>
         </w:rPr>
         <w:t>May I be blessed that I was once mentally ill, suicidal and ignorant of life, May I take the time this May to re-mind myself of just how lucky I am and offer my support to those that are not xxx #MentalHealthAwareness #MentalHealthMatters #SelfCare #Mindfulness #Spirituality #meditation #PersonalGrowth #Motivation #Inspiration #Anxiety #Depression #MindAndBody #awakening #kundalini #Mana #manampwr</w:t>
@@ -8819,22 +8972,31 @@
     </w:p>
     <w:p>
       <w:pPr>
-        <w:spacing w:line="480" w:lineRule="auto" w:before="0" w:after="0"/>
-        <w:ind w:firstLine="720"/>
-        <w:jc w:val="both"/>
-      </w:pPr>
-      <w:r>
-        <w:rPr>
-          <w:rFonts w:ascii="Georgia" w:hAnsi="Georgia" w:eastAsia="Georgia" w:cs="Georgia"/>
-          <w:b/>
-          <w:sz w:val="22"/>
-        </w:rPr>
-        <w:t xml:space="preserve">Caption 6 (Page 1). </w:t>
-      </w:r>
-      <w:r>
-        <w:rPr>
-          <w:rFonts w:ascii="Georgia" w:hAnsi="Georgia" w:eastAsia="Georgia" w:cs="Georgia"/>
-          <w:b w:val="0"/>
+        <w:spacing w:line="480" w:lineRule="auto" w:before="120" w:after="0"/>
+        <w:ind w:left="360" w:firstLine="0"/>
+        <w:jc w:val="left"/>
+      </w:pPr>
+      <w:r>
+        <w:rPr>
+          <w:rFonts w:ascii="Georgia" w:hAnsi="Georgia" w:eastAsia="Georgia" w:cs="Georgia"/>
+          <w:b/>
+          <w:i w:val="0"/>
+          <w:sz w:val="22"/>
+        </w:rPr>
+        <w:t>Caption 6</w:t>
+      </w:r>
+    </w:p>
+    <w:p>
+      <w:pPr>
+        <w:spacing w:line="480" w:lineRule="auto" w:before="0" w:after="0"/>
+        <w:ind w:left="360" w:firstLine="0"/>
+        <w:jc w:val="both"/>
+      </w:pPr>
+      <w:r>
+        <w:rPr>
+          <w:rFonts w:ascii="Georgia" w:hAnsi="Georgia" w:eastAsia="Georgia" w:cs="Georgia"/>
+          <w:b w:val="0"/>
+          <w:i w:val="0"/>
           <w:sz w:val="22"/>
         </w:rPr>
         <w:t>Embrace your greatness unapologetically! It all starts with how we think and talk about ourselves.</w:t>
@@ -8842,22 +9004,31 @@
     </w:p>
     <w:p>
       <w:pPr>
-        <w:spacing w:line="480" w:lineRule="auto" w:before="0" w:after="0"/>
-        <w:ind w:firstLine="720"/>
-        <w:jc w:val="both"/>
-      </w:pPr>
-      <w:r>
-        <w:rPr>
-          <w:rFonts w:ascii="Georgia" w:hAnsi="Georgia" w:eastAsia="Georgia" w:cs="Georgia"/>
-          <w:b/>
-          <w:sz w:val="22"/>
-        </w:rPr>
-        <w:t xml:space="preserve">Comment 1 under Caption 6 (Page 1). </w:t>
-      </w:r>
-      <w:r>
-        <w:rPr>
-          <w:rFonts w:ascii="Georgia" w:hAnsi="Georgia" w:eastAsia="Georgia" w:cs="Georgia"/>
-          <w:b w:val="0"/>
+        <w:spacing w:line="480" w:lineRule="auto" w:before="60" w:after="0"/>
+        <w:ind w:left="720" w:firstLine="0"/>
+        <w:jc w:val="left"/>
+      </w:pPr>
+      <w:r>
+        <w:rPr>
+          <w:rFonts w:ascii="Georgia" w:hAnsi="Georgia" w:eastAsia="Georgia" w:cs="Georgia"/>
+          <w:b/>
+          <w:i w:val="0"/>
+          <w:sz w:val="22"/>
+        </w:rPr>
+        <w:t>Comment 1</w:t>
+      </w:r>
+    </w:p>
+    <w:p>
+      <w:pPr>
+        <w:spacing w:line="480" w:lineRule="auto" w:before="0" w:after="0"/>
+        <w:ind w:left="720" w:firstLine="0"/>
+        <w:jc w:val="both"/>
+      </w:pPr>
+      <w:r>
+        <w:rPr>
+          <w:rFonts w:ascii="Georgia" w:hAnsi="Georgia" w:eastAsia="Georgia" w:cs="Georgia"/>
+          <w:b w:val="0"/>
+          <w:i w:val="0"/>
           <w:sz w:val="22"/>
         </w:rPr>
         <w:t>Speaking positively about ourselves helps boost self-esteem and self-confidence. When we acknowledge our strengths, accomplishments, and positive qualities, we reinforce a positive self-image and develop a greater sense of self-worth.</w:t>
@@ -8865,22 +9036,31 @@
     </w:p>
     <w:p>
       <w:pPr>
-        <w:spacing w:line="480" w:lineRule="auto" w:before="0" w:after="0"/>
-        <w:ind w:firstLine="720"/>
-        <w:jc w:val="both"/>
-      </w:pPr>
-      <w:r>
-        <w:rPr>
-          <w:rFonts w:ascii="Georgia" w:hAnsi="Georgia" w:eastAsia="Georgia" w:cs="Georgia"/>
-          <w:b/>
-          <w:sz w:val="22"/>
-        </w:rPr>
-        <w:t xml:space="preserve">Comment 2 under Caption 6 (Page 1). </w:t>
-      </w:r>
-      <w:r>
-        <w:rPr>
-          <w:rFonts w:ascii="Georgia" w:hAnsi="Georgia" w:eastAsia="Georgia" w:cs="Georgia"/>
-          <w:b w:val="0"/>
+        <w:spacing w:line="480" w:lineRule="auto" w:before="60" w:after="0"/>
+        <w:ind w:left="720" w:firstLine="0"/>
+        <w:jc w:val="left"/>
+      </w:pPr>
+      <w:r>
+        <w:rPr>
+          <w:rFonts w:ascii="Georgia" w:hAnsi="Georgia" w:eastAsia="Georgia" w:cs="Georgia"/>
+          <w:b/>
+          <w:i w:val="0"/>
+          <w:sz w:val="22"/>
+        </w:rPr>
+        <w:t>Comment 2</w:t>
+      </w:r>
+    </w:p>
+    <w:p>
+      <w:pPr>
+        <w:spacing w:line="480" w:lineRule="auto" w:before="0" w:after="0"/>
+        <w:ind w:left="720" w:firstLine="0"/>
+        <w:jc w:val="both"/>
+      </w:pPr>
+      <w:r>
+        <w:rPr>
+          <w:rFonts w:ascii="Georgia" w:hAnsi="Georgia" w:eastAsia="Georgia" w:cs="Georgia"/>
+          <w:b w:val="0"/>
+          <w:i w:val="0"/>
           <w:sz w:val="22"/>
         </w:rPr>
         <w:t>Even if you don’t believe what you’re saying at first...keep doing it till it feels natural and true. If it worked for me, it can work for you.❤️</w:t>
@@ -8888,22 +9068,47 @@
     </w:p>
     <w:p>
       <w:pPr>
-        <w:spacing w:line="480" w:lineRule="auto" w:before="0" w:after="0"/>
-        <w:ind w:firstLine="720"/>
-        <w:jc w:val="both"/>
-      </w:pPr>
-      <w:r>
-        <w:rPr>
-          <w:rFonts w:ascii="Georgia" w:hAnsi="Georgia" w:eastAsia="Georgia" w:cs="Georgia"/>
-          <w:b/>
-          <w:sz w:val="22"/>
-        </w:rPr>
-        <w:t xml:space="preserve">Caption 1 (Page 2). </w:t>
-      </w:r>
-      <w:r>
-        <w:rPr>
-          <w:rFonts w:ascii="Georgia" w:hAnsi="Georgia" w:eastAsia="Georgia" w:cs="Georgia"/>
-          <w:b w:val="0"/>
+        <w:spacing w:line="480" w:lineRule="auto" w:before="240" w:after="0"/>
+        <w:ind w:left="0" w:firstLine="0"/>
+        <w:jc w:val="left"/>
+      </w:pPr>
+      <w:r>
+        <w:rPr>
+          <w:rFonts w:ascii="Georgia" w:hAnsi="Georgia" w:eastAsia="Georgia" w:cs="Georgia"/>
+          <w:b/>
+          <w:i w:val="0"/>
+          <w:sz w:val="24"/>
+        </w:rPr>
+        <w:t>Page 02</w:t>
+      </w:r>
+    </w:p>
+    <w:p>
+      <w:pPr>
+        <w:spacing w:line="480" w:lineRule="auto" w:before="120" w:after="0"/>
+        <w:ind w:left="360" w:firstLine="0"/>
+        <w:jc w:val="left"/>
+      </w:pPr>
+      <w:r>
+        <w:rPr>
+          <w:rFonts w:ascii="Georgia" w:hAnsi="Georgia" w:eastAsia="Georgia" w:cs="Georgia"/>
+          <w:b/>
+          <w:i w:val="0"/>
+          <w:sz w:val="22"/>
+        </w:rPr>
+        <w:t>Caption 1</w:t>
+      </w:r>
+    </w:p>
+    <w:p>
+      <w:pPr>
+        <w:spacing w:line="480" w:lineRule="auto" w:before="0" w:after="0"/>
+        <w:ind w:left="360" w:firstLine="0"/>
+        <w:jc w:val="both"/>
+      </w:pPr>
+      <w:r>
+        <w:rPr>
+          <w:rFonts w:ascii="Georgia" w:hAnsi="Georgia" w:eastAsia="Georgia" w:cs="Georgia"/>
+          <w:b w:val="0"/>
+          <w:i w:val="0"/>
           <w:sz w:val="22"/>
         </w:rPr>
         <w:t>Change is natural. 🍂 Think about the changing seasons. Every fall, the leaves on the trees change color and eventually fall to the ground. In the winter, the trees rest. And when spring and summer return, they blossom again. As the leaves continue to change color and the days get a little crisper, remember that it’s okay if you’re changing, too. Whether you’re letting go of something that doesn’t serve you anymore or taking new actions for your mental health, change is okay. Remember: it’s about progress and growth, not perfection. Have a restful weekend, friends. 🧡</w:t>
@@ -8911,22 +9116,31 @@
     </w:p>
     <w:p>
       <w:pPr>
-        <w:spacing w:line="480" w:lineRule="auto" w:before="0" w:after="0"/>
-        <w:ind w:firstLine="720"/>
-        <w:jc w:val="both"/>
-      </w:pPr>
-      <w:r>
-        <w:rPr>
-          <w:rFonts w:ascii="Georgia" w:hAnsi="Georgia" w:eastAsia="Georgia" w:cs="Georgia"/>
-          <w:b/>
-          <w:sz w:val="22"/>
-        </w:rPr>
-        <w:t xml:space="preserve">Comment 1 under Caption 1 (Page 2). </w:t>
-      </w:r>
-      <w:r>
-        <w:rPr>
-          <w:rFonts w:ascii="Georgia" w:hAnsi="Georgia" w:eastAsia="Georgia" w:cs="Georgia"/>
-          <w:b w:val="0"/>
+        <w:spacing w:line="480" w:lineRule="auto" w:before="60" w:after="0"/>
+        <w:ind w:left="720" w:firstLine="0"/>
+        <w:jc w:val="left"/>
+      </w:pPr>
+      <w:r>
+        <w:rPr>
+          <w:rFonts w:ascii="Georgia" w:hAnsi="Georgia" w:eastAsia="Georgia" w:cs="Georgia"/>
+          <w:b/>
+          <w:i w:val="0"/>
+          <w:sz w:val="22"/>
+        </w:rPr>
+        <w:t>Comment 1</w:t>
+      </w:r>
+    </w:p>
+    <w:p>
+      <w:pPr>
+        <w:spacing w:line="480" w:lineRule="auto" w:before="0" w:after="0"/>
+        <w:ind w:left="720" w:firstLine="0"/>
+        <w:jc w:val="both"/>
+      </w:pPr>
+      <w:r>
+        <w:rPr>
+          <w:rFonts w:ascii="Georgia" w:hAnsi="Georgia" w:eastAsia="Georgia" w:cs="Georgia"/>
+          <w:b w:val="0"/>
+          <w:i w:val="0"/>
           <w:sz w:val="22"/>
         </w:rPr>
         <w:t>Sometimes we reactively put up a fight to change when it can be as natural as the seasons 😌 thanks for that reminder 🍁🍂</w:t>
@@ -8934,22 +9148,31 @@
     </w:p>
     <w:p>
       <w:pPr>
-        <w:spacing w:line="480" w:lineRule="auto" w:before="0" w:after="0"/>
-        <w:ind w:firstLine="720"/>
-        <w:jc w:val="both"/>
-      </w:pPr>
-      <w:r>
-        <w:rPr>
-          <w:rFonts w:ascii="Georgia" w:hAnsi="Georgia" w:eastAsia="Georgia" w:cs="Georgia"/>
-          <w:b/>
-          <w:sz w:val="22"/>
-        </w:rPr>
-        <w:t xml:space="preserve">Comment 2 under Caption 1 (Page 2). </w:t>
-      </w:r>
-      <w:r>
-        <w:rPr>
-          <w:rFonts w:ascii="Georgia" w:hAnsi="Georgia" w:eastAsia="Georgia" w:cs="Georgia"/>
-          <w:b w:val="0"/>
+        <w:spacing w:line="480" w:lineRule="auto" w:before="60" w:after="0"/>
+        <w:ind w:left="720" w:firstLine="0"/>
+        <w:jc w:val="left"/>
+      </w:pPr>
+      <w:r>
+        <w:rPr>
+          <w:rFonts w:ascii="Georgia" w:hAnsi="Georgia" w:eastAsia="Georgia" w:cs="Georgia"/>
+          <w:b/>
+          <w:i w:val="0"/>
+          <w:sz w:val="22"/>
+        </w:rPr>
+        <w:t>Comment 2</w:t>
+      </w:r>
+    </w:p>
+    <w:p>
+      <w:pPr>
+        <w:spacing w:line="480" w:lineRule="auto" w:before="0" w:after="0"/>
+        <w:ind w:left="720" w:firstLine="0"/>
+        <w:jc w:val="both"/>
+      </w:pPr>
+      <w:r>
+        <w:rPr>
+          <w:rFonts w:ascii="Georgia" w:hAnsi="Georgia" w:eastAsia="Georgia" w:cs="Georgia"/>
+          <w:b w:val="0"/>
+          <w:i w:val="0"/>
           <w:sz w:val="22"/>
         </w:rPr>
         <w:t>Such a beautiful reflection nature reminds us that change isn’t something to fear, it’s part of renewal. Letting go creates space for something new to grow. Here’s to embracing every season, even the ones that feel uncertain — they all have</w:t>
@@ -8957,22 +9180,31 @@
     </w:p>
     <w:p>
       <w:pPr>
-        <w:spacing w:line="480" w:lineRule="auto" w:before="0" w:after="0"/>
-        <w:ind w:firstLine="720"/>
-        <w:jc w:val="both"/>
-      </w:pPr>
-      <w:r>
-        <w:rPr>
-          <w:rFonts w:ascii="Georgia" w:hAnsi="Georgia" w:eastAsia="Georgia" w:cs="Georgia"/>
-          <w:b/>
-          <w:sz w:val="22"/>
-        </w:rPr>
-        <w:t xml:space="preserve">Caption 2 (Page 2). </w:t>
-      </w:r>
-      <w:r>
-        <w:rPr>
-          <w:rFonts w:ascii="Georgia" w:hAnsi="Georgia" w:eastAsia="Georgia" w:cs="Georgia"/>
-          <w:b w:val="0"/>
+        <w:spacing w:line="480" w:lineRule="auto" w:before="120" w:after="0"/>
+        <w:ind w:left="360" w:firstLine="0"/>
+        <w:jc w:val="left"/>
+      </w:pPr>
+      <w:r>
+        <w:rPr>
+          <w:rFonts w:ascii="Georgia" w:hAnsi="Georgia" w:eastAsia="Georgia" w:cs="Georgia"/>
+          <w:b/>
+          <w:i w:val="0"/>
+          <w:sz w:val="22"/>
+        </w:rPr>
+        <w:t>Caption 2</w:t>
+      </w:r>
+    </w:p>
+    <w:p>
+      <w:pPr>
+        <w:spacing w:line="480" w:lineRule="auto" w:before="0" w:after="0"/>
+        <w:ind w:left="360" w:firstLine="0"/>
+        <w:jc w:val="both"/>
+      </w:pPr>
+      <w:r>
+        <w:rPr>
+          <w:rFonts w:ascii="Georgia" w:hAnsi="Georgia" w:eastAsia="Georgia" w:cs="Georgia"/>
+          <w:b w:val="0"/>
+          <w:i w:val="0"/>
           <w:sz w:val="22"/>
         </w:rPr>
         <w:t>Stop us if you’ve heard these mental health myths before... ☝️🤓 We’re living in a time where all the information in the world is just a few swipes away. But is that information always reliable? This #MentalIllnessAwarenessWeek, we’re debunking the mental health myths you’ve probably seen or heard with scientifically-backed research and data. We all have mental health - let’s keep talking about it.</w:t>
@@ -8980,22 +9212,31 @@
     </w:p>
     <w:p>
       <w:pPr>
-        <w:spacing w:line="480" w:lineRule="auto" w:before="0" w:after="0"/>
-        <w:ind w:firstLine="720"/>
-        <w:jc w:val="both"/>
-      </w:pPr>
-      <w:r>
-        <w:rPr>
-          <w:rFonts w:ascii="Georgia" w:hAnsi="Georgia" w:eastAsia="Georgia" w:cs="Georgia"/>
-          <w:b/>
-          <w:sz w:val="22"/>
-        </w:rPr>
-        <w:t xml:space="preserve">Comment 1 under Caption 2 (Page 2). </w:t>
-      </w:r>
-      <w:r>
-        <w:rPr>
-          <w:rFonts w:ascii="Georgia" w:hAnsi="Georgia" w:eastAsia="Georgia" w:cs="Georgia"/>
-          <w:b w:val="0"/>
+        <w:spacing w:line="480" w:lineRule="auto" w:before="60" w:after="0"/>
+        <w:ind w:left="720" w:firstLine="0"/>
+        <w:jc w:val="left"/>
+      </w:pPr>
+      <w:r>
+        <w:rPr>
+          <w:rFonts w:ascii="Georgia" w:hAnsi="Georgia" w:eastAsia="Georgia" w:cs="Georgia"/>
+          <w:b/>
+          <w:i w:val="0"/>
+          <w:sz w:val="22"/>
+        </w:rPr>
+        <w:t>Comment 1</w:t>
+      </w:r>
+    </w:p>
+    <w:p>
+      <w:pPr>
+        <w:spacing w:line="480" w:lineRule="auto" w:before="0" w:after="0"/>
+        <w:ind w:left="720" w:firstLine="0"/>
+        <w:jc w:val="both"/>
+      </w:pPr>
+      <w:r>
+        <w:rPr>
+          <w:rFonts w:ascii="Georgia" w:hAnsi="Georgia" w:eastAsia="Georgia" w:cs="Georgia"/>
+          <w:b w:val="0"/>
+          <w:i w:val="0"/>
           <w:sz w:val="22"/>
         </w:rPr>
         <w:t>Absolutely! 👏 There’s so much misinformation out there, that’s why education and open conversations are key. The more we normalize real mental health facts, the more people get the help they deserve. 💙</w:t>
@@ -9003,22 +9244,31 @@
     </w:p>
     <w:p>
       <w:pPr>
-        <w:spacing w:line="480" w:lineRule="auto" w:before="0" w:after="0"/>
-        <w:ind w:firstLine="720"/>
-        <w:jc w:val="both"/>
-      </w:pPr>
-      <w:r>
-        <w:rPr>
-          <w:rFonts w:ascii="Georgia" w:hAnsi="Georgia" w:eastAsia="Georgia" w:cs="Georgia"/>
-          <w:b/>
-          <w:sz w:val="22"/>
-        </w:rPr>
-        <w:t xml:space="preserve">Comment 2 under Caption 2 (Page 2). </w:t>
-      </w:r>
-      <w:r>
-        <w:rPr>
-          <w:rFonts w:ascii="Georgia" w:hAnsi="Georgia" w:eastAsia="Georgia" w:cs="Georgia"/>
-          <w:b w:val="0"/>
+        <w:spacing w:line="480" w:lineRule="auto" w:before="60" w:after="0"/>
+        <w:ind w:left="720" w:firstLine="0"/>
+        <w:jc w:val="left"/>
+      </w:pPr>
+      <w:r>
+        <w:rPr>
+          <w:rFonts w:ascii="Georgia" w:hAnsi="Georgia" w:eastAsia="Georgia" w:cs="Georgia"/>
+          <w:b/>
+          <w:i w:val="0"/>
+          <w:sz w:val="22"/>
+        </w:rPr>
+        <w:t>Comment 2</w:t>
+      </w:r>
+    </w:p>
+    <w:p>
+      <w:pPr>
+        <w:spacing w:line="480" w:lineRule="auto" w:before="0" w:after="0"/>
+        <w:ind w:left="720" w:firstLine="0"/>
+        <w:jc w:val="both"/>
+      </w:pPr>
+      <w:r>
+        <w:rPr>
+          <w:rFonts w:ascii="Georgia" w:hAnsi="Georgia" w:eastAsia="Georgia" w:cs="Georgia"/>
+          <w:b w:val="0"/>
+          <w:i w:val="0"/>
           <w:sz w:val="22"/>
         </w:rPr>
         <w:t>We are so with you on this! Debunking myths like 'mental illness is a sign of weakness' is absolutely vital to fighting stigma. Thank you for reminding everyone to seek out science backed facts and keep talking about it.</w:t>
@@ -9026,22 +9276,31 @@
     </w:p>
     <w:p>
       <w:pPr>
-        <w:spacing w:line="480" w:lineRule="auto" w:before="0" w:after="0"/>
-        <w:ind w:firstLine="720"/>
-        <w:jc w:val="both"/>
-      </w:pPr>
-      <w:r>
-        <w:rPr>
-          <w:rFonts w:ascii="Georgia" w:hAnsi="Georgia" w:eastAsia="Georgia" w:cs="Georgia"/>
-          <w:b/>
-          <w:sz w:val="22"/>
-        </w:rPr>
-        <w:t xml:space="preserve">Caption 3 (Page 2). </w:t>
-      </w:r>
-      <w:r>
-        <w:rPr>
-          <w:rFonts w:ascii="Georgia" w:hAnsi="Georgia" w:eastAsia="Georgia" w:cs="Georgia"/>
-          <w:b w:val="0"/>
+        <w:spacing w:line="480" w:lineRule="auto" w:before="120" w:after="0"/>
+        <w:ind w:left="360" w:firstLine="0"/>
+        <w:jc w:val="left"/>
+      </w:pPr>
+      <w:r>
+        <w:rPr>
+          <w:rFonts w:ascii="Georgia" w:hAnsi="Georgia" w:eastAsia="Georgia" w:cs="Georgia"/>
+          <w:b/>
+          <w:i w:val="0"/>
+          <w:sz w:val="22"/>
+        </w:rPr>
+        <w:t>Caption 3</w:t>
+      </w:r>
+    </w:p>
+    <w:p>
+      <w:pPr>
+        <w:spacing w:line="480" w:lineRule="auto" w:before="0" w:after="0"/>
+        <w:ind w:left="360" w:firstLine="0"/>
+        <w:jc w:val="both"/>
+      </w:pPr>
+      <w:r>
+        <w:rPr>
+          <w:rFonts w:ascii="Georgia" w:hAnsi="Georgia" w:eastAsia="Georgia" w:cs="Georgia"/>
+          <w:b w:val="0"/>
+          <w:i w:val="0"/>
           <w:sz w:val="22"/>
         </w:rPr>
         <w:t>This week, practice making a home for all the parts of you that need to be loved, even the difficult ones. Every part of you deserves love and care. 🧡</w:t>
@@ -9049,22 +9308,31 @@
     </w:p>
     <w:p>
       <w:pPr>
-        <w:spacing w:line="480" w:lineRule="auto" w:before="0" w:after="0"/>
-        <w:ind w:firstLine="720"/>
-        <w:jc w:val="both"/>
-      </w:pPr>
-      <w:r>
-        <w:rPr>
-          <w:rFonts w:ascii="Georgia" w:hAnsi="Georgia" w:eastAsia="Georgia" w:cs="Georgia"/>
-          <w:b/>
-          <w:sz w:val="22"/>
-        </w:rPr>
-        <w:t xml:space="preserve">Comment 1 under Caption 3 (Page 2). </w:t>
-      </w:r>
-      <w:r>
-        <w:rPr>
-          <w:rFonts w:ascii="Georgia" w:hAnsi="Georgia" w:eastAsia="Georgia" w:cs="Georgia"/>
-          <w:b w:val="0"/>
+        <w:spacing w:line="480" w:lineRule="auto" w:before="60" w:after="0"/>
+        <w:ind w:left="720" w:firstLine="0"/>
+        <w:jc w:val="left"/>
+      </w:pPr>
+      <w:r>
+        <w:rPr>
+          <w:rFonts w:ascii="Georgia" w:hAnsi="Georgia" w:eastAsia="Georgia" w:cs="Georgia"/>
+          <w:b/>
+          <w:i w:val="0"/>
+          <w:sz w:val="22"/>
+        </w:rPr>
+        <w:t>Comment 1</w:t>
+      </w:r>
+    </w:p>
+    <w:p>
+      <w:pPr>
+        <w:spacing w:line="480" w:lineRule="auto" w:before="0" w:after="0"/>
+        <w:ind w:left="720" w:firstLine="0"/>
+        <w:jc w:val="both"/>
+      </w:pPr>
+      <w:r>
+        <w:rPr>
+          <w:rFonts w:ascii="Georgia" w:hAnsi="Georgia" w:eastAsia="Georgia" w:cs="Georgia"/>
+          <w:b w:val="0"/>
+          <w:i w:val="0"/>
           <w:sz w:val="22"/>
         </w:rPr>
         <w:t>Each chapter of who you are is worthy of care and compassion 💕🌱 Growth doesn’t erase your past, it teaches you to love it too.</w:t>
@@ -9072,22 +9340,31 @@
     </w:p>
     <w:p>
       <w:pPr>
-        <w:spacing w:line="480" w:lineRule="auto" w:before="0" w:after="0"/>
-        <w:ind w:firstLine="720"/>
-        <w:jc w:val="both"/>
-      </w:pPr>
-      <w:r>
-        <w:rPr>
-          <w:rFonts w:ascii="Georgia" w:hAnsi="Georgia" w:eastAsia="Georgia" w:cs="Georgia"/>
-          <w:b/>
-          <w:sz w:val="22"/>
-        </w:rPr>
-        <w:t xml:space="preserve">Comment 2 under Caption 3 (Page 2). </w:t>
-      </w:r>
-      <w:r>
-        <w:rPr>
-          <w:rFonts w:ascii="Georgia" w:hAnsi="Georgia" w:eastAsia="Georgia" w:cs="Georgia"/>
-          <w:b w:val="0"/>
+        <w:spacing w:line="480" w:lineRule="auto" w:before="60" w:after="0"/>
+        <w:ind w:left="720" w:firstLine="0"/>
+        <w:jc w:val="left"/>
+      </w:pPr>
+      <w:r>
+        <w:rPr>
+          <w:rFonts w:ascii="Georgia" w:hAnsi="Georgia" w:eastAsia="Georgia" w:cs="Georgia"/>
+          <w:b/>
+          <w:i w:val="0"/>
+          <w:sz w:val="22"/>
+        </w:rPr>
+        <w:t>Comment 2</w:t>
+      </w:r>
+    </w:p>
+    <w:p>
+      <w:pPr>
+        <w:spacing w:line="480" w:lineRule="auto" w:before="0" w:after="0"/>
+        <w:ind w:left="720" w:firstLine="0"/>
+        <w:jc w:val="both"/>
+      </w:pPr>
+      <w:r>
+        <w:rPr>
+          <w:rFonts w:ascii="Georgia" w:hAnsi="Georgia" w:eastAsia="Georgia" w:cs="Georgia"/>
+          <w:b w:val="0"/>
+          <w:i w:val="0"/>
           <w:sz w:val="22"/>
         </w:rPr>
         <w:t>Even the messy, difficult parts of us need compassion. Learning to love all of ourselves is where real healing starts</w:t>
@@ -9095,22 +9372,31 @@
     </w:p>
     <w:p>
       <w:pPr>
-        <w:spacing w:line="480" w:lineRule="auto" w:before="0" w:after="0"/>
-        <w:ind w:firstLine="720"/>
-        <w:jc w:val="both"/>
-      </w:pPr>
-      <w:r>
-        <w:rPr>
-          <w:rFonts w:ascii="Georgia" w:hAnsi="Georgia" w:eastAsia="Georgia" w:cs="Georgia"/>
-          <w:b/>
-          <w:sz w:val="22"/>
-        </w:rPr>
-        <w:t xml:space="preserve">Caption 4 (Page 2). </w:t>
-      </w:r>
-      <w:r>
-        <w:rPr>
-          <w:rFonts w:ascii="Georgia" w:hAnsi="Georgia" w:eastAsia="Georgia" w:cs="Georgia"/>
-          <w:b w:val="0"/>
+        <w:spacing w:line="480" w:lineRule="auto" w:before="120" w:after="0"/>
+        <w:ind w:left="360" w:firstLine="0"/>
+        <w:jc w:val="left"/>
+      </w:pPr>
+      <w:r>
+        <w:rPr>
+          <w:rFonts w:ascii="Georgia" w:hAnsi="Georgia" w:eastAsia="Georgia" w:cs="Georgia"/>
+          <w:b/>
+          <w:i w:val="0"/>
+          <w:sz w:val="22"/>
+        </w:rPr>
+        <w:t>Caption 4</w:t>
+      </w:r>
+    </w:p>
+    <w:p>
+      <w:pPr>
+        <w:spacing w:line="480" w:lineRule="auto" w:before="0" w:after="0"/>
+        <w:ind w:left="360" w:firstLine="0"/>
+        <w:jc w:val="both"/>
+      </w:pPr>
+      <w:r>
+        <w:rPr>
+          <w:rFonts w:ascii="Georgia" w:hAnsi="Georgia" w:eastAsia="Georgia" w:cs="Georgia"/>
+          <w:b w:val="0"/>
+          <w:i w:val="0"/>
           <w:sz w:val="22"/>
         </w:rPr>
         <w:t>When you get caught in an anxiety loop, it’s easy to let hypotheticals bog down your mind. Reframing your “what ifs?” positively can help you stay grounded in those hard moments. You can get through this. 🧡</w:t>
@@ -9118,22 +9404,31 @@
     </w:p>
     <w:p>
       <w:pPr>
-        <w:spacing w:line="480" w:lineRule="auto" w:before="0" w:after="0"/>
-        <w:ind w:firstLine="720"/>
-        <w:jc w:val="both"/>
-      </w:pPr>
-      <w:r>
-        <w:rPr>
-          <w:rFonts w:ascii="Georgia" w:hAnsi="Georgia" w:eastAsia="Georgia" w:cs="Georgia"/>
-          <w:b/>
-          <w:sz w:val="22"/>
-        </w:rPr>
-        <w:t xml:space="preserve">Comment 1 under Caption 4 (Page 2). </w:t>
-      </w:r>
-      <w:r>
-        <w:rPr>
-          <w:rFonts w:ascii="Georgia" w:hAnsi="Georgia" w:eastAsia="Georgia" w:cs="Georgia"/>
-          <w:b w:val="0"/>
+        <w:spacing w:line="480" w:lineRule="auto" w:before="60" w:after="0"/>
+        <w:ind w:left="720" w:firstLine="0"/>
+        <w:jc w:val="left"/>
+      </w:pPr>
+      <w:r>
+        <w:rPr>
+          <w:rFonts w:ascii="Georgia" w:hAnsi="Georgia" w:eastAsia="Georgia" w:cs="Georgia"/>
+          <w:b/>
+          <w:i w:val="0"/>
+          <w:sz w:val="22"/>
+        </w:rPr>
+        <w:t>Comment 1</w:t>
+      </w:r>
+    </w:p>
+    <w:p>
+      <w:pPr>
+        <w:spacing w:line="480" w:lineRule="auto" w:before="0" w:after="0"/>
+        <w:ind w:left="720" w:firstLine="0"/>
+        <w:jc w:val="both"/>
+      </w:pPr>
+      <w:r>
+        <w:rPr>
+          <w:rFonts w:ascii="Georgia" w:hAnsi="Georgia" w:eastAsia="Georgia" w:cs="Georgia"/>
+          <w:b w:val="0"/>
+          <w:i w:val="0"/>
           <w:sz w:val="22"/>
         </w:rPr>
         <w:t>Thank you for your kind words of encouragement it can and will work out to the person reading this know that you have a beautiful gift in your soul that you can share and shine in the world to illuminate it with your kind heart</w:t>
@@ -9141,22 +9436,31 @@
     </w:p>
     <w:p>
       <w:pPr>
-        <w:spacing w:line="480" w:lineRule="auto" w:before="0" w:after="0"/>
-        <w:ind w:firstLine="720"/>
-        <w:jc w:val="both"/>
-      </w:pPr>
-      <w:r>
-        <w:rPr>
-          <w:rFonts w:ascii="Georgia" w:hAnsi="Georgia" w:eastAsia="Georgia" w:cs="Georgia"/>
-          <w:b/>
-          <w:sz w:val="22"/>
-        </w:rPr>
-        <w:t xml:space="preserve">Comment 2 under Caption 4 (Page 2). </w:t>
-      </w:r>
-      <w:r>
-        <w:rPr>
-          <w:rFonts w:ascii="Georgia" w:hAnsi="Georgia" w:eastAsia="Georgia" w:cs="Georgia"/>
-          <w:b w:val="0"/>
+        <w:spacing w:line="480" w:lineRule="auto" w:before="60" w:after="0"/>
+        <w:ind w:left="720" w:firstLine="0"/>
+        <w:jc w:val="left"/>
+      </w:pPr>
+      <w:r>
+        <w:rPr>
+          <w:rFonts w:ascii="Georgia" w:hAnsi="Georgia" w:eastAsia="Georgia" w:cs="Georgia"/>
+          <w:b/>
+          <w:i w:val="0"/>
+          <w:sz w:val="22"/>
+        </w:rPr>
+        <w:t>Comment 2</w:t>
+      </w:r>
+    </w:p>
+    <w:p>
+      <w:pPr>
+        <w:spacing w:line="480" w:lineRule="auto" w:before="0" w:after="0"/>
+        <w:ind w:left="720" w:firstLine="0"/>
+        <w:jc w:val="both"/>
+      </w:pPr>
+      <w:r>
+        <w:rPr>
+          <w:rFonts w:ascii="Georgia" w:hAnsi="Georgia" w:eastAsia="Georgia" w:cs="Georgia"/>
+          <w:b w:val="0"/>
+          <w:i w:val="0"/>
           <w:sz w:val="22"/>
         </w:rPr>
         <w:t>Thank you for bringing this up—it’s such an important reminder. After 23 years in mental health and working with high performing clients, I’ve seen how anxiety loops drain both focus and energy. In my private practice, I often guide clients to reframe ‘what if’ thinking into ‘even if’ or ‘what’s within my control.’ That simple shift interrupts the cycle and brings the mind back to the present. Reframing isn’t about ignoring fear—it’s about reclaiming agency</w:t>
@@ -9164,22 +9468,31 @@
     </w:p>
     <w:p>
       <w:pPr>
-        <w:spacing w:line="480" w:lineRule="auto" w:before="0" w:after="0"/>
-        <w:ind w:firstLine="720"/>
-        <w:jc w:val="both"/>
-      </w:pPr>
-      <w:r>
-        <w:rPr>
-          <w:rFonts w:ascii="Georgia" w:hAnsi="Georgia" w:eastAsia="Georgia" w:cs="Georgia"/>
-          <w:b/>
-          <w:sz w:val="22"/>
-        </w:rPr>
-        <w:t xml:space="preserve">Caption 5 (Page 2). </w:t>
-      </w:r>
-      <w:r>
-        <w:rPr>
-          <w:rFonts w:ascii="Georgia" w:hAnsi="Georgia" w:eastAsia="Georgia" w:cs="Georgia"/>
-          <w:b w:val="0"/>
+        <w:spacing w:line="480" w:lineRule="auto" w:before="120" w:after="0"/>
+        <w:ind w:left="360" w:firstLine="0"/>
+        <w:jc w:val="left"/>
+      </w:pPr>
+      <w:r>
+        <w:rPr>
+          <w:rFonts w:ascii="Georgia" w:hAnsi="Georgia" w:eastAsia="Georgia" w:cs="Georgia"/>
+          <w:b/>
+          <w:i w:val="0"/>
+          <w:sz w:val="22"/>
+        </w:rPr>
+        <w:t>Caption 5</w:t>
+      </w:r>
+    </w:p>
+    <w:p>
+      <w:pPr>
+        <w:spacing w:line="480" w:lineRule="auto" w:before="0" w:after="0"/>
+        <w:ind w:left="360" w:firstLine="0"/>
+        <w:jc w:val="both"/>
+      </w:pPr>
+      <w:r>
+        <w:rPr>
+          <w:rFonts w:ascii="Georgia" w:hAnsi="Georgia" w:eastAsia="Georgia" w:cs="Georgia"/>
+          <w:b w:val="0"/>
+          <w:i w:val="0"/>
           <w:sz w:val="22"/>
         </w:rPr>
         <w:t>If facing tomorrow feels impossible, please know you’re not alone. We hope you stay, and we want you to get the support you deserve. As Suicide Prevention Month kicks off this September, Mental Health America and To Write Love on Her Arms want you to know that there are places to turn when the heaviness feels unbearable. Mental Health America’s free and confidential online mental health tests can help you understand what you’re experiencing and will walk you step by step through what it looks like to ask for help, and ████████’s crisis resource page can help you find a comprehensive list of places to turn in a moment of need. Find these resources and more at the 🔗 in our bio.</w:t>
@@ -9187,22 +9500,31 @@
     </w:p>
     <w:p>
       <w:pPr>
-        <w:spacing w:line="480" w:lineRule="auto" w:before="0" w:after="0"/>
-        <w:ind w:firstLine="720"/>
-        <w:jc w:val="both"/>
-      </w:pPr>
-      <w:r>
-        <w:rPr>
-          <w:rFonts w:ascii="Georgia" w:hAnsi="Georgia" w:eastAsia="Georgia" w:cs="Georgia"/>
-          <w:b/>
-          <w:sz w:val="22"/>
-        </w:rPr>
-        <w:t xml:space="preserve">Comment 1 under Caption 5 (Page 2). </w:t>
-      </w:r>
-      <w:r>
-        <w:rPr>
-          <w:rFonts w:ascii="Georgia" w:hAnsi="Georgia" w:eastAsia="Georgia" w:cs="Georgia"/>
-          <w:b w:val="0"/>
+        <w:spacing w:line="480" w:lineRule="auto" w:before="60" w:after="0"/>
+        <w:ind w:left="720" w:firstLine="0"/>
+        <w:jc w:val="left"/>
+      </w:pPr>
+      <w:r>
+        <w:rPr>
+          <w:rFonts w:ascii="Georgia" w:hAnsi="Georgia" w:eastAsia="Georgia" w:cs="Georgia"/>
+          <w:b/>
+          <w:i w:val="0"/>
+          <w:sz w:val="22"/>
+        </w:rPr>
+        <w:t>Comment 1</w:t>
+      </w:r>
+    </w:p>
+    <w:p>
+      <w:pPr>
+        <w:spacing w:line="480" w:lineRule="auto" w:before="0" w:after="0"/>
+        <w:ind w:left="720" w:firstLine="0"/>
+        <w:jc w:val="both"/>
+      </w:pPr>
+      <w:r>
+        <w:rPr>
+          <w:rFonts w:ascii="Georgia" w:hAnsi="Georgia" w:eastAsia="Georgia" w:cs="Georgia"/>
+          <w:b w:val="0"/>
+          <w:i w:val="0"/>
           <w:sz w:val="22"/>
         </w:rPr>
         <w:t>We believe healing can begin in connection, whether through community, the water, or simply reaching out for support.</w:t>
@@ -9210,22 +9532,31 @@
     </w:p>
     <w:p>
       <w:pPr>
-        <w:spacing w:line="480" w:lineRule="auto" w:before="0" w:after="0"/>
-        <w:ind w:firstLine="720"/>
-        <w:jc w:val="both"/>
-      </w:pPr>
-      <w:r>
-        <w:rPr>
-          <w:rFonts w:ascii="Georgia" w:hAnsi="Georgia" w:eastAsia="Georgia" w:cs="Georgia"/>
-          <w:b/>
-          <w:sz w:val="22"/>
-        </w:rPr>
-        <w:t xml:space="preserve">Comment 2 under Caption 5 (Page 2). </w:t>
-      </w:r>
-      <w:r>
-        <w:rPr>
-          <w:rFonts w:ascii="Georgia" w:hAnsi="Georgia" w:eastAsia="Georgia" w:cs="Georgia"/>
-          <w:b w:val="0"/>
+        <w:spacing w:line="480" w:lineRule="auto" w:before="60" w:after="0"/>
+        <w:ind w:left="720" w:firstLine="0"/>
+        <w:jc w:val="left"/>
+      </w:pPr>
+      <w:r>
+        <w:rPr>
+          <w:rFonts w:ascii="Georgia" w:hAnsi="Georgia" w:eastAsia="Georgia" w:cs="Georgia"/>
+          <w:b/>
+          <w:i w:val="0"/>
+          <w:sz w:val="22"/>
+        </w:rPr>
+        <w:t>Comment 2</w:t>
+      </w:r>
+    </w:p>
+    <w:p>
+      <w:pPr>
+        <w:spacing w:line="480" w:lineRule="auto" w:before="0" w:after="0"/>
+        <w:ind w:left="720" w:firstLine="0"/>
+        <w:jc w:val="both"/>
+      </w:pPr>
+      <w:r>
+        <w:rPr>
+          <w:rFonts w:ascii="Georgia" w:hAnsi="Georgia" w:eastAsia="Georgia" w:cs="Georgia"/>
+          <w:b w:val="0"/>
+          <w:i w:val="0"/>
           <w:sz w:val="22"/>
         </w:rPr>
         <w:t>I've had a rough month with my depression. Hanging on by a thread. Then I get a letter that my phycologist is retiring. UGH It's been one thing after another 😳</w:t>
@@ -9233,22 +9564,31 @@
     </w:p>
     <w:p>
       <w:pPr>
-        <w:spacing w:line="480" w:lineRule="auto" w:before="0" w:after="0"/>
-        <w:ind w:firstLine="720"/>
-        <w:jc w:val="both"/>
-      </w:pPr>
-      <w:r>
-        <w:rPr>
-          <w:rFonts w:ascii="Georgia" w:hAnsi="Georgia" w:eastAsia="Georgia" w:cs="Georgia"/>
-          <w:b/>
-          <w:sz w:val="22"/>
-        </w:rPr>
-        <w:t xml:space="preserve">Caption 6 (Page 2). </w:t>
-      </w:r>
-      <w:r>
-        <w:rPr>
-          <w:rFonts w:ascii="Georgia" w:hAnsi="Georgia" w:eastAsia="Georgia" w:cs="Georgia"/>
-          <w:b w:val="0"/>
+        <w:spacing w:line="480" w:lineRule="auto" w:before="120" w:after="0"/>
+        <w:ind w:left="360" w:firstLine="0"/>
+        <w:jc w:val="left"/>
+      </w:pPr>
+      <w:r>
+        <w:rPr>
+          <w:rFonts w:ascii="Georgia" w:hAnsi="Georgia" w:eastAsia="Georgia" w:cs="Georgia"/>
+          <w:b/>
+          <w:i w:val="0"/>
+          <w:sz w:val="22"/>
+        </w:rPr>
+        <w:t>Caption 6</w:t>
+      </w:r>
+    </w:p>
+    <w:p>
+      <w:pPr>
+        <w:spacing w:line="480" w:lineRule="auto" w:before="0" w:after="0"/>
+        <w:ind w:left="360" w:firstLine="0"/>
+        <w:jc w:val="both"/>
+      </w:pPr>
+      <w:r>
+        <w:rPr>
+          <w:rFonts w:ascii="Georgia" w:hAnsi="Georgia" w:eastAsia="Georgia" w:cs="Georgia"/>
+          <w:b w:val="0"/>
+          <w:i w:val="0"/>
           <w:sz w:val="22"/>
         </w:rPr>
         <w:t>Content warning: This post discusses suicide. You deserve to live a life full of joy, peace, love, and adventure. This life is worth living. Each September, #SuicidePreventionMonth calls on each of us to consider our role in preventing suicide and to raise awareness of available resources and support options, like @988lifeline and @crisistextline. If you’re struggling with your mental health and you’re not sure where to start, taking a mental health test is a gentle first step. Mental Health America’s free and anonymous online tests can help you understand what you’re experiencing and what steps you can take before you reach a point of crisis. Take a test today at the 🔗 in our bio. If you or someone you know is in crisis, please know that help is available. Call or text 988 or chat online at 988lifeline.org. You can also reach a trained counselor at Crisis Text Line by texting HOME to 741741. Thank you for staying. 🧡</w:t>
@@ -9256,22 +9596,31 @@
     </w:p>
     <w:p>
       <w:pPr>
-        <w:spacing w:line="480" w:lineRule="auto" w:before="0" w:after="0"/>
-        <w:ind w:firstLine="720"/>
-        <w:jc w:val="both"/>
-      </w:pPr>
-      <w:r>
-        <w:rPr>
-          <w:rFonts w:ascii="Georgia" w:hAnsi="Georgia" w:eastAsia="Georgia" w:cs="Georgia"/>
-          <w:b/>
-          <w:sz w:val="22"/>
-        </w:rPr>
-        <w:t xml:space="preserve">Comment 1 under Caption 6 (Page 2). </w:t>
-      </w:r>
-      <w:r>
-        <w:rPr>
-          <w:rFonts w:ascii="Georgia" w:hAnsi="Georgia" w:eastAsia="Georgia" w:cs="Georgia"/>
-          <w:b w:val="0"/>
+        <w:spacing w:line="480" w:lineRule="auto" w:before="60" w:after="0"/>
+        <w:ind w:left="720" w:firstLine="0"/>
+        <w:jc w:val="left"/>
+      </w:pPr>
+      <w:r>
+        <w:rPr>
+          <w:rFonts w:ascii="Georgia" w:hAnsi="Georgia" w:eastAsia="Georgia" w:cs="Georgia"/>
+          <w:b/>
+          <w:i w:val="0"/>
+          <w:sz w:val="22"/>
+        </w:rPr>
+        <w:t>Comment 1</w:t>
+      </w:r>
+    </w:p>
+    <w:p>
+      <w:pPr>
+        <w:spacing w:line="480" w:lineRule="auto" w:before="0" w:after="0"/>
+        <w:ind w:left="720" w:firstLine="0"/>
+        <w:jc w:val="both"/>
+      </w:pPr>
+      <w:r>
+        <w:rPr>
+          <w:rFonts w:ascii="Georgia" w:hAnsi="Georgia" w:eastAsia="Georgia" w:cs="Georgia"/>
+          <w:b w:val="0"/>
+          <w:i w:val="0"/>
           <w:sz w:val="22"/>
         </w:rPr>
         <w:t>It will be 5 years ago next Monday since I almost died and my daughter did CPR and saved my life ❤️ I’m grateful for every single day and thankful I’ve learned so much about myself and the importance of mental health!! Thank you for being here ❤️</w:t>
@@ -9279,22 +9628,31 @@
     </w:p>
     <w:p>
       <w:pPr>
-        <w:spacing w:line="480" w:lineRule="auto" w:before="0" w:after="0"/>
-        <w:ind w:firstLine="720"/>
-        <w:jc w:val="both"/>
-      </w:pPr>
-      <w:r>
-        <w:rPr>
-          <w:rFonts w:ascii="Georgia" w:hAnsi="Georgia" w:eastAsia="Georgia" w:cs="Georgia"/>
-          <w:b/>
-          <w:sz w:val="22"/>
-        </w:rPr>
-        <w:t xml:space="preserve">Comment 2 under Caption 6 (Page 2). </w:t>
-      </w:r>
-      <w:r>
-        <w:rPr>
-          <w:rFonts w:ascii="Georgia" w:hAnsi="Georgia" w:eastAsia="Georgia" w:cs="Georgia"/>
-          <w:b w:val="0"/>
+        <w:spacing w:line="480" w:lineRule="auto" w:before="60" w:after="0"/>
+        <w:ind w:left="720" w:firstLine="0"/>
+        <w:jc w:val="left"/>
+      </w:pPr>
+      <w:r>
+        <w:rPr>
+          <w:rFonts w:ascii="Georgia" w:hAnsi="Georgia" w:eastAsia="Georgia" w:cs="Georgia"/>
+          <w:b/>
+          <w:i w:val="0"/>
+          <w:sz w:val="22"/>
+        </w:rPr>
+        <w:t>Comment 2</w:t>
+      </w:r>
+    </w:p>
+    <w:p>
+      <w:pPr>
+        <w:spacing w:line="480" w:lineRule="auto" w:before="0" w:after="0"/>
+        <w:ind w:left="720" w:firstLine="0"/>
+        <w:jc w:val="both"/>
+      </w:pPr>
+      <w:r>
+        <w:rPr>
+          <w:rFonts w:ascii="Georgia" w:hAnsi="Georgia" w:eastAsia="Georgia" w:cs="Georgia"/>
+          <w:b w:val="0"/>
+          <w:i w:val="0"/>
           <w:sz w:val="22"/>
         </w:rPr>
         <w:t>I’ve had to call 988 once and thinking about that moment breaks me. I’m doing so much better and they did really help me gain my footing</w:t>
@@ -9302,22 +9660,31 @@
     </w:p>
     <w:p>
       <w:pPr>
-        <w:spacing w:line="480" w:lineRule="auto" w:before="0" w:after="0"/>
-        <w:ind w:firstLine="720"/>
-        <w:jc w:val="both"/>
-      </w:pPr>
-      <w:r>
-        <w:rPr>
-          <w:rFonts w:ascii="Georgia" w:hAnsi="Georgia" w:eastAsia="Georgia" w:cs="Georgia"/>
-          <w:b/>
-          <w:sz w:val="22"/>
-        </w:rPr>
-        <w:t xml:space="preserve">Caption 7 (Page 2). </w:t>
-      </w:r>
-      <w:r>
-        <w:rPr>
-          <w:rFonts w:ascii="Georgia" w:hAnsi="Georgia" w:eastAsia="Georgia" w:cs="Georgia"/>
-          <w:b w:val="0"/>
+        <w:spacing w:line="480" w:lineRule="auto" w:before="120" w:after="0"/>
+        <w:ind w:left="360" w:firstLine="0"/>
+        <w:jc w:val="left"/>
+      </w:pPr>
+      <w:r>
+        <w:rPr>
+          <w:rFonts w:ascii="Georgia" w:hAnsi="Georgia" w:eastAsia="Georgia" w:cs="Georgia"/>
+          <w:b/>
+          <w:i w:val="0"/>
+          <w:sz w:val="22"/>
+        </w:rPr>
+        <w:t>Caption 7</w:t>
+      </w:r>
+    </w:p>
+    <w:p>
+      <w:pPr>
+        <w:spacing w:line="480" w:lineRule="auto" w:before="0" w:after="0"/>
+        <w:ind w:left="360" w:firstLine="0"/>
+        <w:jc w:val="both"/>
+      </w:pPr>
+      <w:r>
+        <w:rPr>
+          <w:rFonts w:ascii="Georgia" w:hAnsi="Georgia" w:eastAsia="Georgia" w:cs="Georgia"/>
+          <w:b w:val="0"/>
+          <w:i w:val="0"/>
           <w:sz w:val="22"/>
         </w:rPr>
         <w:t>You don’t have to be strong all the time. It’s okay to ask for help. Visit the 🔗 in our bio to take the first step.</w:t>
@@ -9325,22 +9692,31 @@
     </w:p>
     <w:p>
       <w:pPr>
-        <w:spacing w:line="480" w:lineRule="auto" w:before="0" w:after="0"/>
-        <w:ind w:firstLine="720"/>
-        <w:jc w:val="both"/>
-      </w:pPr>
-      <w:r>
-        <w:rPr>
-          <w:rFonts w:ascii="Georgia" w:hAnsi="Georgia" w:eastAsia="Georgia" w:cs="Georgia"/>
-          <w:b/>
-          <w:sz w:val="22"/>
-        </w:rPr>
-        <w:t xml:space="preserve">Comment 1 under Caption 7 (Page 2). </w:t>
-      </w:r>
-      <w:r>
-        <w:rPr>
-          <w:rFonts w:ascii="Georgia" w:hAnsi="Georgia" w:eastAsia="Georgia" w:cs="Georgia"/>
-          <w:b w:val="0"/>
+        <w:spacing w:line="480" w:lineRule="auto" w:before="60" w:after="0"/>
+        <w:ind w:left="720" w:firstLine="0"/>
+        <w:jc w:val="left"/>
+      </w:pPr>
+      <w:r>
+        <w:rPr>
+          <w:rFonts w:ascii="Georgia" w:hAnsi="Georgia" w:eastAsia="Georgia" w:cs="Georgia"/>
+          <w:b/>
+          <w:i w:val="0"/>
+          <w:sz w:val="22"/>
+        </w:rPr>
+        <w:t>Comment 1</w:t>
+      </w:r>
+    </w:p>
+    <w:p>
+      <w:pPr>
+        <w:spacing w:line="480" w:lineRule="auto" w:before="0" w:after="0"/>
+        <w:ind w:left="720" w:firstLine="0"/>
+        <w:jc w:val="both"/>
+      </w:pPr>
+      <w:r>
+        <w:rPr>
+          <w:rFonts w:ascii="Georgia" w:hAnsi="Georgia" w:eastAsia="Georgia" w:cs="Georgia"/>
+          <w:b w:val="0"/>
+          <w:i w:val="0"/>
           <w:sz w:val="22"/>
         </w:rPr>
         <w:t>Such an important reminder—strength isn’t never needing help, it’s having the courage to reach out when you do.</w:t>
@@ -9348,22 +9724,31 @@
     </w:p>
     <w:p>
       <w:pPr>
-        <w:spacing w:line="480" w:lineRule="auto" w:before="0" w:after="0"/>
-        <w:ind w:firstLine="720"/>
-        <w:jc w:val="both"/>
-      </w:pPr>
-      <w:r>
-        <w:rPr>
-          <w:rFonts w:ascii="Georgia" w:hAnsi="Georgia" w:eastAsia="Georgia" w:cs="Georgia"/>
-          <w:b/>
-          <w:sz w:val="22"/>
-        </w:rPr>
-        <w:t xml:space="preserve">Comment 2 under Caption 7 (Page 2). </w:t>
-      </w:r>
-      <w:r>
-        <w:rPr>
-          <w:rFonts w:ascii="Georgia" w:hAnsi="Georgia" w:eastAsia="Georgia" w:cs="Georgia"/>
-          <w:b w:val="0"/>
+        <w:spacing w:line="480" w:lineRule="auto" w:before="60" w:after="0"/>
+        <w:ind w:left="720" w:firstLine="0"/>
+        <w:jc w:val="left"/>
+      </w:pPr>
+      <w:r>
+        <w:rPr>
+          <w:rFonts w:ascii="Georgia" w:hAnsi="Georgia" w:eastAsia="Georgia" w:cs="Georgia"/>
+          <w:b/>
+          <w:i w:val="0"/>
+          <w:sz w:val="22"/>
+        </w:rPr>
+        <w:t>Comment 2</w:t>
+      </w:r>
+    </w:p>
+    <w:p>
+      <w:pPr>
+        <w:spacing w:line="480" w:lineRule="auto" w:before="0" w:after="0"/>
+        <w:ind w:left="720" w:firstLine="0"/>
+        <w:jc w:val="both"/>
+      </w:pPr>
+      <w:r>
+        <w:rPr>
+          <w:rFonts w:ascii="Georgia" w:hAnsi="Georgia" w:eastAsia="Georgia" w:cs="Georgia"/>
+          <w:b w:val="0"/>
+          <w:i w:val="0"/>
           <w:sz w:val="22"/>
         </w:rPr>
         <w:t>Thank you for sharing. So true. Healing happens in connection. Co-regulation reminds us that leaning on others is not weakness but part of the process.</w:t>
@@ -9371,22 +9756,47 @@
     </w:p>
     <w:p>
       <w:pPr>
-        <w:spacing w:line="480" w:lineRule="auto" w:before="0" w:after="0"/>
-        <w:ind w:firstLine="720"/>
-        <w:jc w:val="both"/>
-      </w:pPr>
-      <w:r>
-        <w:rPr>
-          <w:rFonts w:ascii="Georgia" w:hAnsi="Georgia" w:eastAsia="Georgia" w:cs="Georgia"/>
-          <w:b/>
-          <w:sz w:val="22"/>
-        </w:rPr>
-        <w:t xml:space="preserve">Caption 1 (Page 3). </w:t>
-      </w:r>
-      <w:r>
-        <w:rPr>
-          <w:rFonts w:ascii="Georgia" w:hAnsi="Georgia" w:eastAsia="Georgia" w:cs="Georgia"/>
-          <w:b w:val="0"/>
+        <w:spacing w:line="480" w:lineRule="auto" w:before="240" w:after="0"/>
+        <w:ind w:left="0" w:firstLine="0"/>
+        <w:jc w:val="left"/>
+      </w:pPr>
+      <w:r>
+        <w:rPr>
+          <w:rFonts w:ascii="Georgia" w:hAnsi="Georgia" w:eastAsia="Georgia" w:cs="Georgia"/>
+          <w:b/>
+          <w:i w:val="0"/>
+          <w:sz w:val="24"/>
+        </w:rPr>
+        <w:t>Page 03</w:t>
+      </w:r>
+    </w:p>
+    <w:p>
+      <w:pPr>
+        <w:spacing w:line="480" w:lineRule="auto" w:before="120" w:after="0"/>
+        <w:ind w:left="360" w:firstLine="0"/>
+        <w:jc w:val="left"/>
+      </w:pPr>
+      <w:r>
+        <w:rPr>
+          <w:rFonts w:ascii="Georgia" w:hAnsi="Georgia" w:eastAsia="Georgia" w:cs="Georgia"/>
+          <w:b/>
+          <w:i w:val="0"/>
+          <w:sz w:val="22"/>
+        </w:rPr>
+        <w:t>Caption 1</w:t>
+      </w:r>
+    </w:p>
+    <w:p>
+      <w:pPr>
+        <w:spacing w:line="480" w:lineRule="auto" w:before="0" w:after="0"/>
+        <w:ind w:left="360" w:firstLine="0"/>
+        <w:jc w:val="both"/>
+      </w:pPr>
+      <w:r>
+        <w:rPr>
+          <w:rFonts w:ascii="Georgia" w:hAnsi="Georgia" w:eastAsia="Georgia" w:cs="Georgia"/>
+          <w:b w:val="0"/>
+          <w:i w:val="0"/>
           <w:sz w:val="22"/>
         </w:rPr>
         <w:t>"For many dads in psychotherapy—captains of industry, adrift at sea, or steering domestic waters their fathers never charted—fatherhood triggers an old standing order: You earn, therefore you are," explains clinical psychologist Jett Stone, Ph.D. This can become tunnel vision and negatively affect key relationships. Labeling the problem, sharing the numbers, and challenging the provider myth together can help partners get back on track. How does the male provider myth relate to your experience? Tell us in the comments. 💭 Do you know someone who might like to read this? Share it with them. 👀 Click the link in our bio to read more. Image credit: apghedia / Shutterstock #psychology #relationships #mentalhealth #fathers</w:t>
@@ -9394,22 +9804,31 @@
     </w:p>
     <w:p>
       <w:pPr>
-        <w:spacing w:line="480" w:lineRule="auto" w:before="0" w:after="0"/>
-        <w:ind w:firstLine="720"/>
-        <w:jc w:val="both"/>
-      </w:pPr>
-      <w:r>
-        <w:rPr>
-          <w:rFonts w:ascii="Georgia" w:hAnsi="Georgia" w:eastAsia="Georgia" w:cs="Georgia"/>
-          <w:b/>
-          <w:sz w:val="22"/>
-        </w:rPr>
-        <w:t xml:space="preserve">Comment 1 under Caption 1 (Page 3). </w:t>
-      </w:r>
-      <w:r>
-        <w:rPr>
-          <w:rFonts w:ascii="Georgia" w:hAnsi="Georgia" w:eastAsia="Georgia" w:cs="Georgia"/>
-          <w:b w:val="0"/>
+        <w:spacing w:line="480" w:lineRule="auto" w:before="60" w:after="0"/>
+        <w:ind w:left="720" w:firstLine="0"/>
+        <w:jc w:val="left"/>
+      </w:pPr>
+      <w:r>
+        <w:rPr>
+          <w:rFonts w:ascii="Georgia" w:hAnsi="Georgia" w:eastAsia="Georgia" w:cs="Georgia"/>
+          <w:b/>
+          <w:i w:val="0"/>
+          <w:sz w:val="22"/>
+        </w:rPr>
+        <w:t>Comment 1</w:t>
+      </w:r>
+    </w:p>
+    <w:p>
+      <w:pPr>
+        <w:spacing w:line="480" w:lineRule="auto" w:before="0" w:after="0"/>
+        <w:ind w:left="720" w:firstLine="0"/>
+        <w:jc w:val="both"/>
+      </w:pPr>
+      <w:r>
+        <w:rPr>
+          <w:rFonts w:ascii="Georgia" w:hAnsi="Georgia" w:eastAsia="Georgia" w:cs="Georgia"/>
+          <w:b w:val="0"/>
+          <w:i w:val="0"/>
           <w:sz w:val="22"/>
         </w:rPr>
         <w:t>For a long time, I didn’t give much thought to the provider role, which later contributed to relationship difficulties. At the same time, I’ve seen many examples of how an excessive “provider” mindset can be socially and personally damaging: the pursuit of material wealth in self-destructive ways, or at the expense of close human relationships. Today, I’m seeking a healthy balance. I do have some disadvantages, and I often experience that in dating, material circumstances (car, housing, income) become a more critical factor than emotional safety, the quality of connection, or mutual growth.</w:t>
@@ -9417,22 +9836,31 @@
     </w:p>
     <w:p>
       <w:pPr>
-        <w:spacing w:line="480" w:lineRule="auto" w:before="0" w:after="0"/>
-        <w:ind w:firstLine="720"/>
-        <w:jc w:val="both"/>
-      </w:pPr>
-      <w:r>
-        <w:rPr>
-          <w:rFonts w:ascii="Georgia" w:hAnsi="Georgia" w:eastAsia="Georgia" w:cs="Georgia"/>
-          <w:b/>
-          <w:sz w:val="22"/>
-        </w:rPr>
-        <w:t xml:space="preserve">Comment 2 under Caption 1 (Page 3). </w:t>
-      </w:r>
-      <w:r>
-        <w:rPr>
-          <w:rFonts w:ascii="Georgia" w:hAnsi="Georgia" w:eastAsia="Georgia" w:cs="Georgia"/>
-          <w:b w:val="0"/>
+        <w:spacing w:line="480" w:lineRule="auto" w:before="60" w:after="0"/>
+        <w:ind w:left="720" w:firstLine="0"/>
+        <w:jc w:val="left"/>
+      </w:pPr>
+      <w:r>
+        <w:rPr>
+          <w:rFonts w:ascii="Georgia" w:hAnsi="Georgia" w:eastAsia="Georgia" w:cs="Georgia"/>
+          <w:b/>
+          <w:i w:val="0"/>
+          <w:sz w:val="22"/>
+        </w:rPr>
+        <w:t>Comment 2</w:t>
+      </w:r>
+    </w:p>
+    <w:p>
+      <w:pPr>
+        <w:spacing w:line="480" w:lineRule="auto" w:before="0" w:after="0"/>
+        <w:ind w:left="720" w:firstLine="0"/>
+        <w:jc w:val="both"/>
+      </w:pPr>
+      <w:r>
+        <w:rPr>
+          <w:rFonts w:ascii="Georgia" w:hAnsi="Georgia" w:eastAsia="Georgia" w:cs="Georgia"/>
+          <w:b w:val="0"/>
+          <w:i w:val="0"/>
           <w:sz w:val="22"/>
         </w:rPr>
         <w:t>As a man I don't have any problems with expectations as long as both sides can have their own expectations and get something in return...I think there is nothing wrong about that.</w:t>
@@ -9440,22 +9868,31 @@
     </w:p>
     <w:p>
       <w:pPr>
-        <w:spacing w:line="480" w:lineRule="auto" w:before="0" w:after="0"/>
-        <w:ind w:firstLine="720"/>
-        <w:jc w:val="both"/>
-      </w:pPr>
-      <w:r>
-        <w:rPr>
-          <w:rFonts w:ascii="Georgia" w:hAnsi="Georgia" w:eastAsia="Georgia" w:cs="Georgia"/>
-          <w:b/>
-          <w:sz w:val="22"/>
-        </w:rPr>
-        <w:t xml:space="preserve">Caption 2 (Page 3). </w:t>
-      </w:r>
-      <w:r>
-        <w:rPr>
-          <w:rFonts w:ascii="Georgia" w:hAnsi="Georgia" w:eastAsia="Georgia" w:cs="Georgia"/>
-          <w:b w:val="0"/>
+        <w:spacing w:line="480" w:lineRule="auto" w:before="120" w:after="0"/>
+        <w:ind w:left="360" w:firstLine="0"/>
+        <w:jc w:val="left"/>
+      </w:pPr>
+      <w:r>
+        <w:rPr>
+          <w:rFonts w:ascii="Georgia" w:hAnsi="Georgia" w:eastAsia="Georgia" w:cs="Georgia"/>
+          <w:b/>
+          <w:i w:val="0"/>
+          <w:sz w:val="22"/>
+        </w:rPr>
+        <w:t>Caption 2</w:t>
+      </w:r>
+    </w:p>
+    <w:p>
+      <w:pPr>
+        <w:spacing w:line="480" w:lineRule="auto" w:before="0" w:after="0"/>
+        <w:ind w:left="360" w:firstLine="0"/>
+        <w:jc w:val="both"/>
+      </w:pPr>
+      <w:r>
+        <w:rPr>
+          <w:rFonts w:ascii="Georgia" w:hAnsi="Georgia" w:eastAsia="Georgia" w:cs="Georgia"/>
+          <w:b w:val="0"/>
+          <w:i w:val="0"/>
           <w:sz w:val="22"/>
         </w:rPr>
         <w:t>Welcome to our “Ask a Therapist” series! Why does anxiety get worse at night—and what actually helps? ████████ explains. Comment with a question you want a therapist to answer next. #therapy #mentalhealth #anxiety #askatherapist</w:t>
@@ -9463,22 +9900,31 @@
     </w:p>
     <w:p>
       <w:pPr>
-        <w:spacing w:line="480" w:lineRule="auto" w:before="0" w:after="0"/>
-        <w:ind w:firstLine="720"/>
-        <w:jc w:val="both"/>
-      </w:pPr>
-      <w:r>
-        <w:rPr>
-          <w:rFonts w:ascii="Georgia" w:hAnsi="Georgia" w:eastAsia="Georgia" w:cs="Georgia"/>
-          <w:b/>
-          <w:sz w:val="22"/>
-        </w:rPr>
-        <w:t xml:space="preserve">Comment 1 under Caption 2 (Page 3). </w:t>
-      </w:r>
-      <w:r>
-        <w:rPr>
-          <w:rFonts w:ascii="Georgia" w:hAnsi="Georgia" w:eastAsia="Georgia" w:cs="Georgia"/>
-          <w:b w:val="0"/>
+        <w:spacing w:line="480" w:lineRule="auto" w:before="60" w:after="0"/>
+        <w:ind w:left="720" w:firstLine="0"/>
+        <w:jc w:val="left"/>
+      </w:pPr>
+      <w:r>
+        <w:rPr>
+          <w:rFonts w:ascii="Georgia" w:hAnsi="Georgia" w:eastAsia="Georgia" w:cs="Georgia"/>
+          <w:b/>
+          <w:i w:val="0"/>
+          <w:sz w:val="22"/>
+        </w:rPr>
+        <w:t>Comment 1</w:t>
+      </w:r>
+    </w:p>
+    <w:p>
+      <w:pPr>
+        <w:spacing w:line="480" w:lineRule="auto" w:before="0" w:after="0"/>
+        <w:ind w:left="720" w:firstLine="0"/>
+        <w:jc w:val="both"/>
+      </w:pPr>
+      <w:r>
+        <w:rPr>
+          <w:rFonts w:ascii="Georgia" w:hAnsi="Georgia" w:eastAsia="Georgia" w:cs="Georgia"/>
+          <w:b w:val="0"/>
+          <w:i w:val="0"/>
           <w:sz w:val="22"/>
         </w:rPr>
         <w:t>This explains nighttime anxiety in a way that feels reassuring and gives people something practical to work with.</w:t>
@@ -9486,22 +9932,31 @@
     </w:p>
     <w:p>
       <w:pPr>
-        <w:spacing w:line="480" w:lineRule="auto" w:before="0" w:after="0"/>
-        <w:ind w:firstLine="720"/>
-        <w:jc w:val="both"/>
-      </w:pPr>
-      <w:r>
-        <w:rPr>
-          <w:rFonts w:ascii="Georgia" w:hAnsi="Georgia" w:eastAsia="Georgia" w:cs="Georgia"/>
-          <w:b/>
-          <w:sz w:val="22"/>
-        </w:rPr>
-        <w:t xml:space="preserve">Comment 2 under Caption 2 (Page 3). </w:t>
-      </w:r>
-      <w:r>
-        <w:rPr>
-          <w:rFonts w:ascii="Georgia" w:hAnsi="Georgia" w:eastAsia="Georgia" w:cs="Georgia"/>
-          <w:b w:val="0"/>
+        <w:spacing w:line="480" w:lineRule="auto" w:before="60" w:after="0"/>
+        <w:ind w:left="720" w:firstLine="0"/>
+        <w:jc w:val="left"/>
+      </w:pPr>
+      <w:r>
+        <w:rPr>
+          <w:rFonts w:ascii="Georgia" w:hAnsi="Georgia" w:eastAsia="Georgia" w:cs="Georgia"/>
+          <w:b/>
+          <w:i w:val="0"/>
+          <w:sz w:val="22"/>
+        </w:rPr>
+        <w:t>Comment 2</w:t>
+      </w:r>
+    </w:p>
+    <w:p>
+      <w:pPr>
+        <w:spacing w:line="480" w:lineRule="auto" w:before="0" w:after="0"/>
+        <w:ind w:left="720" w:firstLine="0"/>
+        <w:jc w:val="both"/>
+      </w:pPr>
+      <w:r>
+        <w:rPr>
+          <w:rFonts w:ascii="Georgia" w:hAnsi="Georgia" w:eastAsia="Georgia" w:cs="Georgia"/>
+          <w:b w:val="0"/>
+          <w:i w:val="0"/>
           <w:sz w:val="22"/>
         </w:rPr>
         <w:t>It reflects how quiet moments can amplify unspoken thoughts and tension. A gentle reminder that grounding practices and reassurance can help ease anxiety as the day winds down.</w:t>
@@ -9509,22 +9964,31 @@
     </w:p>
     <w:p>
       <w:pPr>
-        <w:spacing w:line="480" w:lineRule="auto" w:before="0" w:after="0"/>
-        <w:ind w:firstLine="720"/>
-        <w:jc w:val="both"/>
-      </w:pPr>
-      <w:r>
-        <w:rPr>
-          <w:rFonts w:ascii="Georgia" w:hAnsi="Georgia" w:eastAsia="Georgia" w:cs="Georgia"/>
-          <w:b/>
-          <w:sz w:val="22"/>
-        </w:rPr>
-        <w:t xml:space="preserve">Caption 3 (Page 3). </w:t>
-      </w:r>
-      <w:r>
-        <w:rPr>
-          <w:rFonts w:ascii="Georgia" w:hAnsi="Georgia" w:eastAsia="Georgia" w:cs="Georgia"/>
-          <w:b w:val="0"/>
+        <w:spacing w:line="480" w:lineRule="auto" w:before="120" w:after="0"/>
+        <w:ind w:left="360" w:firstLine="0"/>
+        <w:jc w:val="left"/>
+      </w:pPr>
+      <w:r>
+        <w:rPr>
+          <w:rFonts w:ascii="Georgia" w:hAnsi="Georgia" w:eastAsia="Georgia" w:cs="Georgia"/>
+          <w:b/>
+          <w:i w:val="0"/>
+          <w:sz w:val="22"/>
+        </w:rPr>
+        <w:t>Caption 3</w:t>
+      </w:r>
+    </w:p>
+    <w:p>
+      <w:pPr>
+        <w:spacing w:line="480" w:lineRule="auto" w:before="0" w:after="0"/>
+        <w:ind w:left="360" w:firstLine="0"/>
+        <w:jc w:val="both"/>
+      </w:pPr>
+      <w:r>
+        <w:rPr>
+          <w:rFonts w:ascii="Georgia" w:hAnsi="Georgia" w:eastAsia="Georgia" w:cs="Georgia"/>
+          <w:b w:val="0"/>
+          <w:i w:val="0"/>
           <w:sz w:val="22"/>
         </w:rPr>
         <w:t>"There are many ways that we can undermine our well-being and fall into spirals of negativity, depression, and anxiety. Additionally, there are many ways that we can sabotage ourselves without realizing that we are the cause. Here are five behaviors to avoid if you want to be stable and emotionally well-adjusted," explains Carla Shuman, Ph.D. What are some other strengths of mentally healthy people? Let us know in the comments. 💭 Do you know someone who should read this? Share it with them. 👀 Click the link in our bio to read more. #psychology #mentalhealth #wellbeing #happiness #selfesteem #mentallyhealthy</w:t>
@@ -9532,22 +9996,31 @@
     </w:p>
     <w:p>
       <w:pPr>
-        <w:spacing w:line="480" w:lineRule="auto" w:before="0" w:after="0"/>
-        <w:ind w:firstLine="720"/>
-        <w:jc w:val="both"/>
-      </w:pPr>
-      <w:r>
-        <w:rPr>
-          <w:rFonts w:ascii="Georgia" w:hAnsi="Georgia" w:eastAsia="Georgia" w:cs="Georgia"/>
-          <w:b/>
-          <w:sz w:val="22"/>
-        </w:rPr>
-        <w:t xml:space="preserve">Comment 1 under Caption 3 (Page 3). </w:t>
-      </w:r>
-      <w:r>
-        <w:rPr>
-          <w:rFonts w:ascii="Georgia" w:hAnsi="Georgia" w:eastAsia="Georgia" w:cs="Georgia"/>
-          <w:b w:val="0"/>
+        <w:spacing w:line="480" w:lineRule="auto" w:before="60" w:after="0"/>
+        <w:ind w:left="720" w:firstLine="0"/>
+        <w:jc w:val="left"/>
+      </w:pPr>
+      <w:r>
+        <w:rPr>
+          <w:rFonts w:ascii="Georgia" w:hAnsi="Georgia" w:eastAsia="Georgia" w:cs="Georgia"/>
+          <w:b/>
+          <w:i w:val="0"/>
+          <w:sz w:val="22"/>
+        </w:rPr>
+        <w:t>Comment 1</w:t>
+      </w:r>
+    </w:p>
+    <w:p>
+      <w:pPr>
+        <w:spacing w:line="480" w:lineRule="auto" w:before="0" w:after="0"/>
+        <w:ind w:left="720" w:firstLine="0"/>
+        <w:jc w:val="both"/>
+      </w:pPr>
+      <w:r>
+        <w:rPr>
+          <w:rFonts w:ascii="Georgia" w:hAnsi="Georgia" w:eastAsia="Georgia" w:cs="Georgia"/>
+          <w:b w:val="0"/>
+          <w:i w:val="0"/>
           <w:sz w:val="22"/>
         </w:rPr>
         <w:t>True! And I’m guilty of at least one of these! But I’m also committed to recovery</w:t>
@@ -9555,22 +10028,31 @@
     </w:p>
     <w:p>
       <w:pPr>
-        <w:spacing w:line="480" w:lineRule="auto" w:before="0" w:after="0"/>
-        <w:ind w:firstLine="720"/>
-        <w:jc w:val="both"/>
-      </w:pPr>
-      <w:r>
-        <w:rPr>
-          <w:rFonts w:ascii="Georgia" w:hAnsi="Georgia" w:eastAsia="Georgia" w:cs="Georgia"/>
-          <w:b/>
-          <w:sz w:val="22"/>
-        </w:rPr>
-        <w:t xml:space="preserve">Comment 2 under Caption 3 (Page 3). </w:t>
-      </w:r>
-      <w:r>
-        <w:rPr>
-          <w:rFonts w:ascii="Georgia" w:hAnsi="Georgia" w:eastAsia="Georgia" w:cs="Georgia"/>
-          <w:b w:val="0"/>
+        <w:spacing w:line="480" w:lineRule="auto" w:before="60" w:after="0"/>
+        <w:ind w:left="720" w:firstLine="0"/>
+        <w:jc w:val="left"/>
+      </w:pPr>
+      <w:r>
+        <w:rPr>
+          <w:rFonts w:ascii="Georgia" w:hAnsi="Georgia" w:eastAsia="Georgia" w:cs="Georgia"/>
+          <w:b/>
+          <w:i w:val="0"/>
+          <w:sz w:val="22"/>
+        </w:rPr>
+        <w:t>Comment 2</w:t>
+      </w:r>
+    </w:p>
+    <w:p>
+      <w:pPr>
+        <w:spacing w:line="480" w:lineRule="auto" w:before="0" w:after="0"/>
+        <w:ind w:left="720" w:firstLine="0"/>
+        <w:jc w:val="both"/>
+      </w:pPr>
+      <w:r>
+        <w:rPr>
+          <w:rFonts w:ascii="Georgia" w:hAnsi="Georgia" w:eastAsia="Georgia" w:cs="Georgia"/>
+          <w:b w:val="0"/>
+          <w:i w:val="0"/>
           <w:sz w:val="22"/>
         </w:rPr>
         <w:t>Such an important list. We often find that avoiding the comparison trap is one of the biggest hurdles to stability in our digital age. Recognizing those small, daily wins instead can really shift the momentum!</w:t>
@@ -9578,22 +10060,31 @@
     </w:p>
     <w:p>
       <w:pPr>
-        <w:spacing w:line="480" w:lineRule="auto" w:before="0" w:after="0"/>
-        <w:ind w:firstLine="720"/>
-        <w:jc w:val="both"/>
-      </w:pPr>
-      <w:r>
-        <w:rPr>
-          <w:rFonts w:ascii="Georgia" w:hAnsi="Georgia" w:eastAsia="Georgia" w:cs="Georgia"/>
-          <w:b/>
-          <w:sz w:val="22"/>
-        </w:rPr>
-        <w:t xml:space="preserve">Caption 4 (Page 3). </w:t>
-      </w:r>
-      <w:r>
-        <w:rPr>
-          <w:rFonts w:ascii="Georgia" w:hAnsi="Georgia" w:eastAsia="Georgia" w:cs="Georgia"/>
-          <w:b w:val="0"/>
+        <w:spacing w:line="480" w:lineRule="auto" w:before="120" w:after="0"/>
+        <w:ind w:left="360" w:firstLine="0"/>
+        <w:jc w:val="left"/>
+      </w:pPr>
+      <w:r>
+        <w:rPr>
+          <w:rFonts w:ascii="Georgia" w:hAnsi="Georgia" w:eastAsia="Georgia" w:cs="Georgia"/>
+          <w:b/>
+          <w:i w:val="0"/>
+          <w:sz w:val="22"/>
+        </w:rPr>
+        <w:t>Caption 4</w:t>
+      </w:r>
+    </w:p>
+    <w:p>
+      <w:pPr>
+        <w:spacing w:line="480" w:lineRule="auto" w:before="0" w:after="0"/>
+        <w:ind w:left="360" w:firstLine="0"/>
+        <w:jc w:val="both"/>
+      </w:pPr>
+      <w:r>
+        <w:rPr>
+          <w:rFonts w:ascii="Georgia" w:hAnsi="Georgia" w:eastAsia="Georgia" w:cs="Georgia"/>
+          <w:b w:val="0"/>
+          <w:i w:val="0"/>
           <w:sz w:val="22"/>
         </w:rPr>
         <w:t>"In my work with survivors of abusive, neglectful, or chronically unsafe families, I hear the same misconceptions again and again. Many of these ideas minimize survivors’ experiences and mischaracterize what estrangement actually is," explains Kaytee Gillis, LCSW (████████). Here are some of the most common myths about estrangement. What other false beliefs have you heard about family estrangement? Let us know in the comments. 💭 Do you know someone who should read this? Share it with them. 👀 Click the link in our bio to read more. #psychology #family #relationships #estrangement #misconceptions</w:t>
@@ -9601,22 +10092,31 @@
     </w:p>
     <w:p>
       <w:pPr>
-        <w:spacing w:line="480" w:lineRule="auto" w:before="0" w:after="0"/>
-        <w:ind w:firstLine="720"/>
-        <w:jc w:val="both"/>
-      </w:pPr>
-      <w:r>
-        <w:rPr>
-          <w:rFonts w:ascii="Georgia" w:hAnsi="Georgia" w:eastAsia="Georgia" w:cs="Georgia"/>
-          <w:b/>
-          <w:sz w:val="22"/>
-        </w:rPr>
-        <w:t xml:space="preserve">Comment 1 under Caption 4 (Page 3). </w:t>
-      </w:r>
-      <w:r>
-        <w:rPr>
-          <w:rFonts w:ascii="Georgia" w:hAnsi="Georgia" w:eastAsia="Georgia" w:cs="Georgia"/>
-          <w:b w:val="0"/>
+        <w:spacing w:line="480" w:lineRule="auto" w:before="60" w:after="0"/>
+        <w:ind w:left="720" w:firstLine="0"/>
+        <w:jc w:val="left"/>
+      </w:pPr>
+      <w:r>
+        <w:rPr>
+          <w:rFonts w:ascii="Georgia" w:hAnsi="Georgia" w:eastAsia="Georgia" w:cs="Georgia"/>
+          <w:b/>
+          <w:i w:val="0"/>
+          <w:sz w:val="22"/>
+        </w:rPr>
+        <w:t>Comment 1</w:t>
+      </w:r>
+    </w:p>
+    <w:p>
+      <w:pPr>
+        <w:spacing w:line="480" w:lineRule="auto" w:before="0" w:after="0"/>
+        <w:ind w:left="720" w:firstLine="0"/>
+        <w:jc w:val="both"/>
+      </w:pPr>
+      <w:r>
+        <w:rPr>
+          <w:rFonts w:ascii="Georgia" w:hAnsi="Georgia" w:eastAsia="Georgia" w:cs="Georgia"/>
+          <w:b w:val="0"/>
+          <w:i w:val="0"/>
           <w:sz w:val="22"/>
         </w:rPr>
         <w:t>████████ what if the parrent goes silent treatment as they could not face that I spoke up about their inappropriate behavior this time and then as a change I did not chase them, I did not apologize I did not minimize myself. And after 6 months of silent treatment in which I grieved the parrent who was never there and learned peace without her and now I get love bombed with gifts but I am no longer willing to have a relationship without them making effort and admitting that what they have did was not ok.</w:t>
@@ -9624,22 +10124,31 @@
     </w:p>
     <w:p>
       <w:pPr>
-        <w:spacing w:line="480" w:lineRule="auto" w:before="0" w:after="0"/>
-        <w:ind w:firstLine="720"/>
-        <w:jc w:val="both"/>
-      </w:pPr>
-      <w:r>
-        <w:rPr>
-          <w:rFonts w:ascii="Georgia" w:hAnsi="Georgia" w:eastAsia="Georgia" w:cs="Georgia"/>
-          <w:b/>
-          <w:sz w:val="22"/>
-        </w:rPr>
-        <w:t xml:space="preserve">Comment 2 under Caption 4 (Page 3). </w:t>
-      </w:r>
-      <w:r>
-        <w:rPr>
-          <w:rFonts w:ascii="Georgia" w:hAnsi="Georgia" w:eastAsia="Georgia" w:cs="Georgia"/>
-          <w:b w:val="0"/>
+        <w:spacing w:line="480" w:lineRule="auto" w:before="60" w:after="0"/>
+        <w:ind w:left="720" w:firstLine="0"/>
+        <w:jc w:val="left"/>
+      </w:pPr>
+      <w:r>
+        <w:rPr>
+          <w:rFonts w:ascii="Georgia" w:hAnsi="Georgia" w:eastAsia="Georgia" w:cs="Georgia"/>
+          <w:b/>
+          <w:i w:val="0"/>
+          <w:sz w:val="22"/>
+        </w:rPr>
+        <w:t>Comment 2</w:t>
+      </w:r>
+    </w:p>
+    <w:p>
+      <w:pPr>
+        <w:spacing w:line="480" w:lineRule="auto" w:before="0" w:after="0"/>
+        <w:ind w:left="720" w:firstLine="0"/>
+        <w:jc w:val="both"/>
+      </w:pPr>
+      <w:r>
+        <w:rPr>
+          <w:rFonts w:ascii="Georgia" w:hAnsi="Georgia" w:eastAsia="Georgia" w:cs="Georgia"/>
+          <w:b w:val="0"/>
+          <w:i w:val="0"/>
           <w:sz w:val="22"/>
         </w:rPr>
         <w:t>As a survivor of domestic abuse and sexual violence and who has had no contact with a parent for almost 40 years- this is not a trend!</w:t>
@@ -9647,22 +10156,47 @@
     </w:p>
     <w:p>
       <w:pPr>
-        <w:spacing w:line="480" w:lineRule="auto" w:before="0" w:after="0"/>
-        <w:ind w:firstLine="720"/>
-        <w:jc w:val="both"/>
-      </w:pPr>
-      <w:r>
-        <w:rPr>
-          <w:rFonts w:ascii="Georgia" w:hAnsi="Georgia" w:eastAsia="Georgia" w:cs="Georgia"/>
-          <w:b/>
-          <w:sz w:val="22"/>
-        </w:rPr>
-        <w:t xml:space="preserve">Caption 1 (Page 4). </w:t>
-      </w:r>
-      <w:r>
-        <w:rPr>
-          <w:rFonts w:ascii="Georgia" w:hAnsi="Georgia" w:eastAsia="Georgia" w:cs="Georgia"/>
-          <w:b w:val="0"/>
+        <w:spacing w:line="480" w:lineRule="auto" w:before="240" w:after="0"/>
+        <w:ind w:left="0" w:firstLine="0"/>
+        <w:jc w:val="left"/>
+      </w:pPr>
+      <w:r>
+        <w:rPr>
+          <w:rFonts w:ascii="Georgia" w:hAnsi="Georgia" w:eastAsia="Georgia" w:cs="Georgia"/>
+          <w:b/>
+          <w:i w:val="0"/>
+          <w:sz w:val="24"/>
+        </w:rPr>
+        <w:t>Page 04</w:t>
+      </w:r>
+    </w:p>
+    <w:p>
+      <w:pPr>
+        <w:spacing w:line="480" w:lineRule="auto" w:before="120" w:after="0"/>
+        <w:ind w:left="360" w:firstLine="0"/>
+        <w:jc w:val="left"/>
+      </w:pPr>
+      <w:r>
+        <w:rPr>
+          <w:rFonts w:ascii="Georgia" w:hAnsi="Georgia" w:eastAsia="Georgia" w:cs="Georgia"/>
+          <w:b/>
+          <w:i w:val="0"/>
+          <w:sz w:val="22"/>
+        </w:rPr>
+        <w:t>Caption 1</w:t>
+      </w:r>
+    </w:p>
+    <w:p>
+      <w:pPr>
+        <w:spacing w:line="480" w:lineRule="auto" w:before="0" w:after="0"/>
+        <w:ind w:left="360" w:firstLine="0"/>
+        <w:jc w:val="both"/>
+      </w:pPr>
+      <w:r>
+        <w:rPr>
+          <w:rFonts w:ascii="Georgia" w:hAnsi="Georgia" w:eastAsia="Georgia" w:cs="Georgia"/>
+          <w:b w:val="0"/>
+          <w:i w:val="0"/>
           <w:sz w:val="22"/>
         </w:rPr>
         <w:t>💙 Today on #WorldSuicidePreventionDay (and every day!), remember: you are not alone. Asking for help is brave, and support is always within reach. Visit our Find Help page via the link in our bio for helplines, self-care tips, and resources to care for yourself + others.</w:t>
@@ -9670,22 +10204,31 @@
     </w:p>
     <w:p>
       <w:pPr>
-        <w:spacing w:line="480" w:lineRule="auto" w:before="0" w:after="0"/>
-        <w:ind w:firstLine="720"/>
-        <w:jc w:val="both"/>
-      </w:pPr>
-      <w:r>
-        <w:rPr>
-          <w:rFonts w:ascii="Georgia" w:hAnsi="Georgia" w:eastAsia="Georgia" w:cs="Georgia"/>
-          <w:b/>
-          <w:sz w:val="22"/>
-        </w:rPr>
-        <w:t xml:space="preserve">Comment 1 under Caption 1 (Page 4). </w:t>
-      </w:r>
-      <w:r>
-        <w:rPr>
-          <w:rFonts w:ascii="Georgia" w:hAnsi="Georgia" w:eastAsia="Georgia" w:cs="Georgia"/>
-          <w:b w:val="0"/>
+        <w:spacing w:line="480" w:lineRule="auto" w:before="60" w:after="0"/>
+        <w:ind w:left="720" w:firstLine="0"/>
+        <w:jc w:val="left"/>
+      </w:pPr>
+      <w:r>
+        <w:rPr>
+          <w:rFonts w:ascii="Georgia" w:hAnsi="Georgia" w:eastAsia="Georgia" w:cs="Georgia"/>
+          <w:b/>
+          <w:i w:val="0"/>
+          <w:sz w:val="22"/>
+        </w:rPr>
+        <w:t>Comment 1</w:t>
+      </w:r>
+    </w:p>
+    <w:p>
+      <w:pPr>
+        <w:spacing w:line="480" w:lineRule="auto" w:before="0" w:after="0"/>
+        <w:ind w:left="720" w:firstLine="0"/>
+        <w:jc w:val="both"/>
+      </w:pPr>
+      <w:r>
+        <w:rPr>
+          <w:rFonts w:ascii="Georgia" w:hAnsi="Georgia" w:eastAsia="Georgia" w:cs="Georgia"/>
+          <w:b w:val="0"/>
+          <w:i w:val="0"/>
           <w:sz w:val="22"/>
         </w:rPr>
         <w:t>[Comment to be added]</w:t>
@@ -9693,22 +10236,31 @@
     </w:p>
     <w:p>
       <w:pPr>
-        <w:spacing w:line="480" w:lineRule="auto" w:before="0" w:after="0"/>
-        <w:ind w:firstLine="720"/>
-        <w:jc w:val="both"/>
-      </w:pPr>
-      <w:r>
-        <w:rPr>
-          <w:rFonts w:ascii="Georgia" w:hAnsi="Georgia" w:eastAsia="Georgia" w:cs="Georgia"/>
-          <w:b/>
-          <w:sz w:val="22"/>
-        </w:rPr>
-        <w:t xml:space="preserve">Comment 2 under Caption 1 (Page 4). </w:t>
-      </w:r>
-      <w:r>
-        <w:rPr>
-          <w:rFonts w:ascii="Georgia" w:hAnsi="Georgia" w:eastAsia="Georgia" w:cs="Georgia"/>
-          <w:b w:val="0"/>
+        <w:spacing w:line="480" w:lineRule="auto" w:before="60" w:after="0"/>
+        <w:ind w:left="720" w:firstLine="0"/>
+        <w:jc w:val="left"/>
+      </w:pPr>
+      <w:r>
+        <w:rPr>
+          <w:rFonts w:ascii="Georgia" w:hAnsi="Georgia" w:eastAsia="Georgia" w:cs="Georgia"/>
+          <w:b/>
+          <w:i w:val="0"/>
+          <w:sz w:val="22"/>
+        </w:rPr>
+        <w:t>Comment 2</w:t>
+      </w:r>
+    </w:p>
+    <w:p>
+      <w:pPr>
+        <w:spacing w:line="480" w:lineRule="auto" w:before="0" w:after="0"/>
+        <w:ind w:left="720" w:firstLine="0"/>
+        <w:jc w:val="both"/>
+      </w:pPr>
+      <w:r>
+        <w:rPr>
+          <w:rFonts w:ascii="Georgia" w:hAnsi="Georgia" w:eastAsia="Georgia" w:cs="Georgia"/>
+          <w:b w:val="0"/>
+          <w:i w:val="0"/>
           <w:sz w:val="22"/>
         </w:rPr>
         <w:t>It’s always important to remember that you’re not alone, and asking for help is courage!! I know exactly how is it living with negative thought the whole time. Recently I went through dark times, and I wanted to give up. And listing to Gaga’s songs gives me the strength to continue❤️ I did a video about mental health on tik tok, wish you guys could see 🙏 ████████ ████████</w:t>
@@ -9716,22 +10268,31 @@
     </w:p>
     <w:p>
       <w:pPr>
-        <w:spacing w:line="480" w:lineRule="auto" w:before="0" w:after="0"/>
-        <w:ind w:firstLine="720"/>
-        <w:jc w:val="both"/>
-      </w:pPr>
-      <w:r>
-        <w:rPr>
-          <w:rFonts w:ascii="Georgia" w:hAnsi="Georgia" w:eastAsia="Georgia" w:cs="Georgia"/>
-          <w:b/>
-          <w:sz w:val="22"/>
-        </w:rPr>
-        <w:t xml:space="preserve">Caption 2 (Page 4). </w:t>
-      </w:r>
-      <w:r>
-        <w:rPr>
-          <w:rFonts w:ascii="Georgia" w:hAnsi="Georgia" w:eastAsia="Georgia" w:cs="Georgia"/>
-          <w:b w:val="0"/>
+        <w:spacing w:line="480" w:lineRule="auto" w:before="120" w:after="0"/>
+        <w:ind w:left="360" w:firstLine="0"/>
+        <w:jc w:val="left"/>
+      </w:pPr>
+      <w:r>
+        <w:rPr>
+          <w:rFonts w:ascii="Georgia" w:hAnsi="Georgia" w:eastAsia="Georgia" w:cs="Georgia"/>
+          <w:b/>
+          <w:i w:val="0"/>
+          <w:sz w:val="22"/>
+        </w:rPr>
+        <w:t>Caption 2</w:t>
+      </w:r>
+    </w:p>
+    <w:p>
+      <w:pPr>
+        <w:spacing w:line="480" w:lineRule="auto" w:before="0" w:after="0"/>
+        <w:ind w:left="360" w:firstLine="0"/>
+        <w:jc w:val="both"/>
+      </w:pPr>
+      <w:r>
+        <w:rPr>
+          <w:rFonts w:ascii="Georgia" w:hAnsi="Georgia" w:eastAsia="Georgia" w:cs="Georgia"/>
+          <w:b w:val="0"/>
+          <w:i w:val="0"/>
           <w:sz w:val="22"/>
         </w:rPr>
         <w:t>We gathered in Los Angeles with open hearts and a shared goal: to build a kinder, braver world together 💙✨ In partnership with ████████, ████████, and ████████, we created a space for honest conversation, creativity, and care, led by and for young people. From spoken word performances by LA’s Youth Poet Laureate to an interactive #BeThereCertificate workshop and a hands-on volunteer activity supporting trans and nonbinary young people, this community gathering reminded us: ☀️ Mental health care is community care. ☀️ Kindness is action. ☀️ And none of us have to take that action alone. #ChannelKindness #BeKind365 #KindnessInCommunity</w:t>
@@ -9739,22 +10300,31 @@
     </w:p>
     <w:p>
       <w:pPr>
-        <w:spacing w:line="480" w:lineRule="auto" w:before="0" w:after="0"/>
-        <w:ind w:firstLine="720"/>
-        <w:jc w:val="both"/>
-      </w:pPr>
-      <w:r>
-        <w:rPr>
-          <w:rFonts w:ascii="Georgia" w:hAnsi="Georgia" w:eastAsia="Georgia" w:cs="Georgia"/>
-          <w:b/>
-          <w:sz w:val="22"/>
-        </w:rPr>
-        <w:t xml:space="preserve">Comment 1 under Caption 2 (Page 4). </w:t>
-      </w:r>
-      <w:r>
-        <w:rPr>
-          <w:rFonts w:ascii="Georgia" w:hAnsi="Georgia" w:eastAsia="Georgia" w:cs="Georgia"/>
-          <w:b w:val="0"/>
+        <w:spacing w:line="480" w:lineRule="auto" w:before="60" w:after="0"/>
+        <w:ind w:left="720" w:firstLine="0"/>
+        <w:jc w:val="left"/>
+      </w:pPr>
+      <w:r>
+        <w:rPr>
+          <w:rFonts w:ascii="Georgia" w:hAnsi="Georgia" w:eastAsia="Georgia" w:cs="Georgia"/>
+          <w:b/>
+          <w:i w:val="0"/>
+          <w:sz w:val="22"/>
+        </w:rPr>
+        <w:t>Comment 1</w:t>
+      </w:r>
+    </w:p>
+    <w:p>
+      <w:pPr>
+        <w:spacing w:line="480" w:lineRule="auto" w:before="0" w:after="0"/>
+        <w:ind w:left="720" w:firstLine="0"/>
+        <w:jc w:val="both"/>
+      </w:pPr>
+      <w:r>
+        <w:rPr>
+          <w:rFonts w:ascii="Georgia" w:hAnsi="Georgia" w:eastAsia="Georgia" w:cs="Georgia"/>
+          <w:b w:val="0"/>
+          <w:i w:val="0"/>
           <w:sz w:val="22"/>
         </w:rPr>
         <w:t>[Comment to be added]</w:t>
@@ -9762,22 +10332,31 @@
     </w:p>
     <w:p>
       <w:pPr>
-        <w:spacing w:line="480" w:lineRule="auto" w:before="0" w:after="0"/>
-        <w:ind w:firstLine="720"/>
-        <w:jc w:val="both"/>
-      </w:pPr>
-      <w:r>
-        <w:rPr>
-          <w:rFonts w:ascii="Georgia" w:hAnsi="Georgia" w:eastAsia="Georgia" w:cs="Georgia"/>
-          <w:b/>
-          <w:sz w:val="22"/>
-        </w:rPr>
-        <w:t xml:space="preserve">Comment 2 under Caption 2 (Page 4). </w:t>
-      </w:r>
-      <w:r>
-        <w:rPr>
-          <w:rFonts w:ascii="Georgia" w:hAnsi="Georgia" w:eastAsia="Georgia" w:cs="Georgia"/>
-          <w:b w:val="0"/>
+        <w:spacing w:line="480" w:lineRule="auto" w:before="60" w:after="0"/>
+        <w:ind w:left="720" w:firstLine="0"/>
+        <w:jc w:val="left"/>
+      </w:pPr>
+      <w:r>
+        <w:rPr>
+          <w:rFonts w:ascii="Georgia" w:hAnsi="Georgia" w:eastAsia="Georgia" w:cs="Georgia"/>
+          <w:b/>
+          <w:i w:val="0"/>
+          <w:sz w:val="22"/>
+        </w:rPr>
+        <w:t>Comment 2</w:t>
+      </w:r>
+    </w:p>
+    <w:p>
+      <w:pPr>
+        <w:spacing w:line="480" w:lineRule="auto" w:before="0" w:after="0"/>
+        <w:ind w:left="720" w:firstLine="0"/>
+        <w:jc w:val="both"/>
+      </w:pPr>
+      <w:r>
+        <w:rPr>
+          <w:rFonts w:ascii="Georgia" w:hAnsi="Georgia" w:eastAsia="Georgia" w:cs="Georgia"/>
+          <w:b w:val="0"/>
+          <w:i w:val="0"/>
           <w:sz w:val="22"/>
         </w:rPr>
         <w:t>what an incredible day celebrating kindness and being there for one another! thank you so much for having me ❤️❤️❤️</w:t>
@@ -9785,22 +10364,31 @@
     </w:p>
     <w:p>
       <w:pPr>
-        <w:spacing w:line="480" w:lineRule="auto" w:before="0" w:after="0"/>
-        <w:ind w:firstLine="720"/>
-        <w:jc w:val="both"/>
-      </w:pPr>
-      <w:r>
-        <w:rPr>
-          <w:rFonts w:ascii="Georgia" w:hAnsi="Georgia" w:eastAsia="Georgia" w:cs="Georgia"/>
-          <w:b/>
-          <w:sz w:val="22"/>
-        </w:rPr>
-        <w:t xml:space="preserve">Caption 3 (Page 4). </w:t>
-      </w:r>
-      <w:r>
-        <w:rPr>
-          <w:rFonts w:ascii="Georgia" w:hAnsi="Georgia" w:eastAsia="Georgia" w:cs="Georgia"/>
-          <w:b w:val="0"/>
+        <w:spacing w:line="480" w:lineRule="auto" w:before="120" w:after="0"/>
+        <w:ind w:left="360" w:firstLine="0"/>
+        <w:jc w:val="left"/>
+      </w:pPr>
+      <w:r>
+        <w:rPr>
+          <w:rFonts w:ascii="Georgia" w:hAnsi="Georgia" w:eastAsia="Georgia" w:cs="Georgia"/>
+          <w:b/>
+          <w:i w:val="0"/>
+          <w:sz w:val="22"/>
+        </w:rPr>
+        <w:t>Caption 3</w:t>
+      </w:r>
+    </w:p>
+    <w:p>
+      <w:pPr>
+        <w:spacing w:line="480" w:lineRule="auto" w:before="0" w:after="0"/>
+        <w:ind w:left="360" w:firstLine="0"/>
+        <w:jc w:val="both"/>
+      </w:pPr>
+      <w:r>
+        <w:rPr>
+          <w:rFonts w:ascii="Georgia" w:hAnsi="Georgia" w:eastAsia="Georgia" w:cs="Georgia"/>
+          <w:b w:val="0"/>
+          <w:i w:val="0"/>
           <w:sz w:val="22"/>
         </w:rPr>
         <w:t>“Our stories are our superpower.” 💭🏳️‍🌈🏳️‍⚧️ In this powerful clip from his Pride Rising speech, ████████’s Chief of Staff, ████████, reminds us that kindness is action—and that simply existing as your authentic self is a form of resistance. 💖 Take the #BeKind365 pledge to support yourself and others in kindness, every day of the year: BeKind365.world ✨ Want more inspiration? Watch Josh’s full speech via the link in our bio. 📷 / 🎥: ████████</w:t>
@@ -9808,22 +10396,31 @@
     </w:p>
     <w:p>
       <w:pPr>
-        <w:spacing w:line="480" w:lineRule="auto" w:before="0" w:after="0"/>
-        <w:ind w:firstLine="720"/>
-        <w:jc w:val="both"/>
-      </w:pPr>
-      <w:r>
-        <w:rPr>
-          <w:rFonts w:ascii="Georgia" w:hAnsi="Georgia" w:eastAsia="Georgia" w:cs="Georgia"/>
-          <w:b/>
-          <w:sz w:val="22"/>
-        </w:rPr>
-        <w:t xml:space="preserve">Comment 1 under Caption 3 (Page 4). </w:t>
-      </w:r>
-      <w:r>
-        <w:rPr>
-          <w:rFonts w:ascii="Georgia" w:hAnsi="Georgia" w:eastAsia="Georgia" w:cs="Georgia"/>
-          <w:b w:val="0"/>
+        <w:spacing w:line="480" w:lineRule="auto" w:before="60" w:after="0"/>
+        <w:ind w:left="720" w:firstLine="0"/>
+        <w:jc w:val="left"/>
+      </w:pPr>
+      <w:r>
+        <w:rPr>
+          <w:rFonts w:ascii="Georgia" w:hAnsi="Georgia" w:eastAsia="Georgia" w:cs="Georgia"/>
+          <w:b/>
+          <w:i w:val="0"/>
+          <w:sz w:val="22"/>
+        </w:rPr>
+        <w:t>Comment 1</w:t>
+      </w:r>
+    </w:p>
+    <w:p>
+      <w:pPr>
+        <w:spacing w:line="480" w:lineRule="auto" w:before="0" w:after="0"/>
+        <w:ind w:left="720" w:firstLine="0"/>
+        <w:jc w:val="both"/>
+      </w:pPr>
+      <w:r>
+        <w:rPr>
+          <w:rFonts w:ascii="Georgia" w:hAnsi="Georgia" w:eastAsia="Georgia" w:cs="Georgia"/>
+          <w:b w:val="0"/>
+          <w:i w:val="0"/>
           <w:sz w:val="22"/>
         </w:rPr>
         <w:t>Thank you for sharing. What a wonderful foundation you represent and work for. Changing the lives of so many people Way to go Josh!!</w:t>
@@ -9831,22 +10428,31 @@
     </w:p>
     <w:p>
       <w:pPr>
-        <w:spacing w:line="480" w:lineRule="auto" w:before="0" w:after="0"/>
-        <w:ind w:firstLine="720"/>
-        <w:jc w:val="both"/>
-      </w:pPr>
-      <w:r>
-        <w:rPr>
-          <w:rFonts w:ascii="Georgia" w:hAnsi="Georgia" w:eastAsia="Georgia" w:cs="Georgia"/>
-          <w:b/>
-          <w:sz w:val="22"/>
-        </w:rPr>
-        <w:t xml:space="preserve">Comment 2 under Caption 3 (Page 4). </w:t>
-      </w:r>
-      <w:r>
-        <w:rPr>
-          <w:rFonts w:ascii="Georgia" w:hAnsi="Georgia" w:eastAsia="Georgia" w:cs="Georgia"/>
-          <w:b w:val="0"/>
+        <w:spacing w:line="480" w:lineRule="auto" w:before="60" w:after="0"/>
+        <w:ind w:left="720" w:firstLine="0"/>
+        <w:jc w:val="left"/>
+      </w:pPr>
+      <w:r>
+        <w:rPr>
+          <w:rFonts w:ascii="Georgia" w:hAnsi="Georgia" w:eastAsia="Georgia" w:cs="Georgia"/>
+          <w:b/>
+          <w:i w:val="0"/>
+          <w:sz w:val="22"/>
+        </w:rPr>
+        <w:t>Comment 2</w:t>
+      </w:r>
+    </w:p>
+    <w:p>
+      <w:pPr>
+        <w:spacing w:line="480" w:lineRule="auto" w:before="0" w:after="0"/>
+        <w:ind w:left="720" w:firstLine="0"/>
+        <w:jc w:val="both"/>
+      </w:pPr>
+      <w:r>
+        <w:rPr>
+          <w:rFonts w:ascii="Georgia" w:hAnsi="Georgia" w:eastAsia="Georgia" w:cs="Georgia"/>
+          <w:b w:val="0"/>
+          <w:i w:val="0"/>
           <w:sz w:val="22"/>
         </w:rPr>
         <w:t>This resonates so deep. Our stories are what creates change. One person, one heart, one connection at a time. All people have to do is meet us.</w:t>
@@ -9854,22 +10460,31 @@
     </w:p>
     <w:p>
       <w:pPr>
-        <w:spacing w:line="480" w:lineRule="auto" w:before="0" w:after="0"/>
-        <w:ind w:firstLine="720"/>
-        <w:jc w:val="both"/>
-      </w:pPr>
-      <w:r>
-        <w:rPr>
-          <w:rFonts w:ascii="Georgia" w:hAnsi="Georgia" w:eastAsia="Georgia" w:cs="Georgia"/>
-          <w:b/>
-          <w:sz w:val="22"/>
-        </w:rPr>
-        <w:t xml:space="preserve">Caption 4 (Page 4). </w:t>
-      </w:r>
-      <w:r>
-        <w:rPr>
-          <w:rFonts w:ascii="Georgia" w:hAnsi="Georgia" w:eastAsia="Georgia" w:cs="Georgia"/>
-          <w:b w:val="0"/>
+        <w:spacing w:line="480" w:lineRule="auto" w:before="120" w:after="0"/>
+        <w:ind w:left="360" w:firstLine="0"/>
+        <w:jc w:val="left"/>
+      </w:pPr>
+      <w:r>
+        <w:rPr>
+          <w:rFonts w:ascii="Georgia" w:hAnsi="Georgia" w:eastAsia="Georgia" w:cs="Georgia"/>
+          <w:b/>
+          <w:i w:val="0"/>
+          <w:sz w:val="22"/>
+        </w:rPr>
+        <w:t>Caption 4</w:t>
+      </w:r>
+    </w:p>
+    <w:p>
+      <w:pPr>
+        <w:spacing w:line="480" w:lineRule="auto" w:before="0" w:after="0"/>
+        <w:ind w:left="360" w:firstLine="0"/>
+        <w:jc w:val="both"/>
+      </w:pPr>
+      <w:r>
+        <w:rPr>
+          <w:rFonts w:ascii="Georgia" w:hAnsi="Georgia" w:eastAsia="Georgia" w:cs="Georgia"/>
+          <w:b w:val="0"/>
+          <w:i w:val="0"/>
           <w:sz w:val="22"/>
         </w:rPr>
         <w:t>🏳️‍⚧️ Today is #TransDayOfVisibility, a time to celebrate, uplift, and honor trans and nonbinary voices. 🏳️‍⚧️ Our 2023-2024 Youth Advisory Board member, ████████, shares powerful words of affirmation from their speech at NYC Youth #Pride ████████: “To everyone here: always remember that you are beautiful, you are worthy, and you deserve to take up space in this world exactly as you are. There is no one else like you, and that is your power.” Visit the link in our bio to watch ████████’s full speech and learn how we can all support transgender and nonbinary youth in creating safer, more inclusive communities. #ChannelKindness #BeKind365 📷 / 🎥 : ████████</w:t>
@@ -9877,22 +10492,31 @@
     </w:p>
     <w:p>
       <w:pPr>
-        <w:spacing w:line="480" w:lineRule="auto" w:before="0" w:after="0"/>
-        <w:ind w:firstLine="720"/>
-        <w:jc w:val="both"/>
-      </w:pPr>
-      <w:r>
-        <w:rPr>
-          <w:rFonts w:ascii="Georgia" w:hAnsi="Georgia" w:eastAsia="Georgia" w:cs="Georgia"/>
-          <w:b/>
-          <w:sz w:val="22"/>
-        </w:rPr>
-        <w:t xml:space="preserve">Comment 1 under Caption 4 (Page 4). </w:t>
-      </w:r>
-      <w:r>
-        <w:rPr>
-          <w:rFonts w:ascii="Georgia" w:hAnsi="Georgia" w:eastAsia="Georgia" w:cs="Georgia"/>
-          <w:b w:val="0"/>
+        <w:spacing w:line="480" w:lineRule="auto" w:before="60" w:after="0"/>
+        <w:ind w:left="720" w:firstLine="0"/>
+        <w:jc w:val="left"/>
+      </w:pPr>
+      <w:r>
+        <w:rPr>
+          <w:rFonts w:ascii="Georgia" w:hAnsi="Georgia" w:eastAsia="Georgia" w:cs="Georgia"/>
+          <w:b/>
+          <w:i w:val="0"/>
+          <w:sz w:val="22"/>
+        </w:rPr>
+        <w:t>Comment 1</w:t>
+      </w:r>
+    </w:p>
+    <w:p>
+      <w:pPr>
+        <w:spacing w:line="480" w:lineRule="auto" w:before="0" w:after="0"/>
+        <w:ind w:left="720" w:firstLine="0"/>
+        <w:jc w:val="both"/>
+      </w:pPr>
+      <w:r>
+        <w:rPr>
+          <w:rFonts w:ascii="Georgia" w:hAnsi="Georgia" w:eastAsia="Georgia" w:cs="Georgia"/>
+          <w:b w:val="0"/>
+          <w:i w:val="0"/>
           <w:sz w:val="22"/>
         </w:rPr>
         <w:t>[Comment to be added]</w:t>
@@ -9900,22 +10524,31 @@
     </w:p>
     <w:p>
       <w:pPr>
-        <w:spacing w:line="480" w:lineRule="auto" w:before="0" w:after="0"/>
-        <w:ind w:firstLine="720"/>
-        <w:jc w:val="both"/>
-      </w:pPr>
-      <w:r>
-        <w:rPr>
-          <w:rFonts w:ascii="Georgia" w:hAnsi="Georgia" w:eastAsia="Georgia" w:cs="Georgia"/>
-          <w:b/>
-          <w:sz w:val="22"/>
-        </w:rPr>
-        <w:t xml:space="preserve">Comment 2 under Caption 4 (Page 4). </w:t>
-      </w:r>
-      <w:r>
-        <w:rPr>
-          <w:rFonts w:ascii="Georgia" w:hAnsi="Georgia" w:eastAsia="Georgia" w:cs="Georgia"/>
-          <w:b w:val="0"/>
+        <w:spacing w:line="480" w:lineRule="auto" w:before="60" w:after="0"/>
+        <w:ind w:left="720" w:firstLine="0"/>
+        <w:jc w:val="left"/>
+      </w:pPr>
+      <w:r>
+        <w:rPr>
+          <w:rFonts w:ascii="Georgia" w:hAnsi="Georgia" w:eastAsia="Georgia" w:cs="Georgia"/>
+          <w:b/>
+          <w:i w:val="0"/>
+          <w:sz w:val="22"/>
+        </w:rPr>
+        <w:t>Comment 2</w:t>
+      </w:r>
+    </w:p>
+    <w:p>
+      <w:pPr>
+        <w:spacing w:line="480" w:lineRule="auto" w:before="0" w:after="0"/>
+        <w:ind w:left="720" w:firstLine="0"/>
+        <w:jc w:val="both"/>
+      </w:pPr>
+      <w:r>
+        <w:rPr>
+          <w:rFonts w:ascii="Georgia" w:hAnsi="Georgia" w:eastAsia="Georgia" w:cs="Georgia"/>
+          <w:b w:val="0"/>
+          <w:i w:val="0"/>
           <w:sz w:val="22"/>
         </w:rPr>
         <w:t>[Comment to be added]</w:t>
@@ -9923,22 +10556,47 @@
     </w:p>
     <w:p>
       <w:pPr>
-        <w:spacing w:line="480" w:lineRule="auto" w:before="0" w:after="0"/>
-        <w:ind w:firstLine="720"/>
-        <w:jc w:val="both"/>
-      </w:pPr>
-      <w:r>
-        <w:rPr>
-          <w:rFonts w:ascii="Georgia" w:hAnsi="Georgia" w:eastAsia="Georgia" w:cs="Georgia"/>
-          <w:b/>
-          <w:sz w:val="22"/>
-        </w:rPr>
-        <w:t xml:space="preserve">Caption 1 (Page 5). </w:t>
-      </w:r>
-      <w:r>
-        <w:rPr>
-          <w:rFonts w:ascii="Georgia" w:hAnsi="Georgia" w:eastAsia="Georgia" w:cs="Georgia"/>
-          <w:b w:val="0"/>
+        <w:spacing w:line="480" w:lineRule="auto" w:before="240" w:after="0"/>
+        <w:ind w:left="0" w:firstLine="0"/>
+        <w:jc w:val="left"/>
+      </w:pPr>
+      <w:r>
+        <w:rPr>
+          <w:rFonts w:ascii="Georgia" w:hAnsi="Georgia" w:eastAsia="Georgia" w:cs="Georgia"/>
+          <w:b/>
+          <w:i w:val="0"/>
+          <w:sz w:val="24"/>
+        </w:rPr>
+        <w:t>Page 05</w:t>
+      </w:r>
+    </w:p>
+    <w:p>
+      <w:pPr>
+        <w:spacing w:line="480" w:lineRule="auto" w:before="120" w:after="0"/>
+        <w:ind w:left="360" w:firstLine="0"/>
+        <w:jc w:val="left"/>
+      </w:pPr>
+      <w:r>
+        <w:rPr>
+          <w:rFonts w:ascii="Georgia" w:hAnsi="Georgia" w:eastAsia="Georgia" w:cs="Georgia"/>
+          <w:b/>
+          <w:i w:val="0"/>
+          <w:sz w:val="22"/>
+        </w:rPr>
+        <w:t>Caption 1</w:t>
+      </w:r>
+    </w:p>
+    <w:p>
+      <w:pPr>
+        <w:spacing w:line="480" w:lineRule="auto" w:before="0" w:after="0"/>
+        <w:ind w:left="360" w:firstLine="0"/>
+        <w:jc w:val="both"/>
+      </w:pPr>
+      <w:r>
+        <w:rPr>
+          <w:rFonts w:ascii="Georgia" w:hAnsi="Georgia" w:eastAsia="Georgia" w:cs="Georgia"/>
+          <w:b w:val="0"/>
+          <w:i w:val="0"/>
           <w:sz w:val="22"/>
         </w:rPr>
         <w:t>When you know the Big Sad ™ is coming but you just wanna get your things done first...</w:t>
@@ -9946,22 +10604,31 @@
     </w:p>
     <w:p>
       <w:pPr>
-        <w:spacing w:line="480" w:lineRule="auto" w:before="0" w:after="0"/>
-        <w:ind w:firstLine="720"/>
-        <w:jc w:val="both"/>
-      </w:pPr>
-      <w:r>
-        <w:rPr>
-          <w:rFonts w:ascii="Georgia" w:hAnsi="Georgia" w:eastAsia="Georgia" w:cs="Georgia"/>
-          <w:b/>
-          <w:sz w:val="22"/>
-        </w:rPr>
-        <w:t xml:space="preserve">Comment 1 under Caption 1 (Page 5). </w:t>
-      </w:r>
-      <w:r>
-        <w:rPr>
-          <w:rFonts w:ascii="Georgia" w:hAnsi="Georgia" w:eastAsia="Georgia" w:cs="Georgia"/>
-          <w:b w:val="0"/>
+        <w:spacing w:line="480" w:lineRule="auto" w:before="60" w:after="0"/>
+        <w:ind w:left="720" w:firstLine="0"/>
+        <w:jc w:val="left"/>
+      </w:pPr>
+      <w:r>
+        <w:rPr>
+          <w:rFonts w:ascii="Georgia" w:hAnsi="Georgia" w:eastAsia="Georgia" w:cs="Georgia"/>
+          <w:b/>
+          <w:i w:val="0"/>
+          <w:sz w:val="22"/>
+        </w:rPr>
+        <w:t>Comment 1</w:t>
+      </w:r>
+    </w:p>
+    <w:p>
+      <w:pPr>
+        <w:spacing w:line="480" w:lineRule="auto" w:before="0" w:after="0"/>
+        <w:ind w:left="720" w:firstLine="0"/>
+        <w:jc w:val="both"/>
+      </w:pPr>
+      <w:r>
+        <w:rPr>
+          <w:rFonts w:ascii="Georgia" w:hAnsi="Georgia" w:eastAsia="Georgia" w:cs="Georgia"/>
+          <w:b w:val="0"/>
+          <w:i w:val="0"/>
           <w:sz w:val="22"/>
         </w:rPr>
         <w:t>I don't have time to be sad so i just keep doing things</w:t>
@@ -9969,22 +10636,31 @@
     </w:p>
     <w:p>
       <w:pPr>
-        <w:spacing w:line="480" w:lineRule="auto" w:before="0" w:after="0"/>
-        <w:ind w:firstLine="720"/>
-        <w:jc w:val="both"/>
-      </w:pPr>
-      <w:r>
-        <w:rPr>
-          <w:rFonts w:ascii="Georgia" w:hAnsi="Georgia" w:eastAsia="Georgia" w:cs="Georgia"/>
-          <w:b/>
-          <w:sz w:val="22"/>
-        </w:rPr>
-        <w:t xml:space="preserve">Comment 2 under Caption 1 (Page 5). </w:t>
-      </w:r>
-      <w:r>
-        <w:rPr>
-          <w:rFonts w:ascii="Georgia" w:hAnsi="Georgia" w:eastAsia="Georgia" w:cs="Georgia"/>
-          <w:b w:val="0"/>
+        <w:spacing w:line="480" w:lineRule="auto" w:before="60" w:after="0"/>
+        <w:ind w:left="720" w:firstLine="0"/>
+        <w:jc w:val="left"/>
+      </w:pPr>
+      <w:r>
+        <w:rPr>
+          <w:rFonts w:ascii="Georgia" w:hAnsi="Georgia" w:eastAsia="Georgia" w:cs="Georgia"/>
+          <w:b/>
+          <w:i w:val="0"/>
+          <w:sz w:val="22"/>
+        </w:rPr>
+        <w:t>Comment 2</w:t>
+      </w:r>
+    </w:p>
+    <w:p>
+      <w:pPr>
+        <w:spacing w:line="480" w:lineRule="auto" w:before="0" w:after="0"/>
+        <w:ind w:left="720" w:firstLine="0"/>
+        <w:jc w:val="both"/>
+      </w:pPr>
+      <w:r>
+        <w:rPr>
+          <w:rFonts w:ascii="Georgia" w:hAnsi="Georgia" w:eastAsia="Georgia" w:cs="Georgia"/>
+          <w:b w:val="0"/>
+          <w:i w:val="0"/>
           <w:sz w:val="22"/>
         </w:rPr>
         <w:t>What is it about the kitchen sink that makes us suddenly pause and then get sucked in to that sadness! 😳</w:t>
@@ -9992,22 +10668,31 @@
     </w:p>
     <w:p>
       <w:pPr>
-        <w:spacing w:line="480" w:lineRule="auto" w:before="0" w:after="0"/>
-        <w:ind w:firstLine="720"/>
-        <w:jc w:val="both"/>
-      </w:pPr>
-      <w:r>
-        <w:rPr>
-          <w:rFonts w:ascii="Georgia" w:hAnsi="Georgia" w:eastAsia="Georgia" w:cs="Georgia"/>
-          <w:b/>
-          <w:sz w:val="22"/>
-        </w:rPr>
-        <w:t xml:space="preserve">Caption 2 (Page 5). </w:t>
-      </w:r>
-      <w:r>
-        <w:rPr>
-          <w:rFonts w:ascii="Georgia" w:hAnsi="Georgia" w:eastAsia="Georgia" w:cs="Georgia"/>
-          <w:b w:val="0"/>
+        <w:spacing w:line="480" w:lineRule="auto" w:before="120" w:after="0"/>
+        <w:ind w:left="360" w:firstLine="0"/>
+        <w:jc w:val="left"/>
+      </w:pPr>
+      <w:r>
+        <w:rPr>
+          <w:rFonts w:ascii="Georgia" w:hAnsi="Georgia" w:eastAsia="Georgia" w:cs="Georgia"/>
+          <w:b/>
+          <w:i w:val="0"/>
+          <w:sz w:val="22"/>
+        </w:rPr>
+        <w:t>Caption 2</w:t>
+      </w:r>
+    </w:p>
+    <w:p>
+      <w:pPr>
+        <w:spacing w:line="480" w:lineRule="auto" w:before="0" w:after="0"/>
+        <w:ind w:left="360" w:firstLine="0"/>
+        <w:jc w:val="both"/>
+      </w:pPr>
+      <w:r>
+        <w:rPr>
+          <w:rFonts w:ascii="Georgia" w:hAnsi="Georgia" w:eastAsia="Georgia" w:cs="Georgia"/>
+          <w:b w:val="0"/>
+          <w:i w:val="0"/>
           <w:sz w:val="22"/>
         </w:rPr>
         <w:t>Some thoughts about all the worrying I did and all the ways I tried to be prepared for a life that only time and experience could prepare me for. A comic showing a ghost in the wilderness, the text reads - 1- I feel silly for not realising sooner, that I would feel differently about my life the more I experienced it, because I will change and grow. 2- I realised that choices happen slowly, and they get smaller than when you made them. You adapt and you change. 3- I changed in a way that prepared me for the now. Even though I was SO worried about being unprepared. But of course you’re unprepared when you’re worrying too early! 4- it feels daunting to think about the future in the here and now. But you’ll be different by then. And you will be ready for it when it comes.</w:t>
@@ -10015,22 +10700,31 @@
     </w:p>
     <w:p>
       <w:pPr>
-        <w:spacing w:line="480" w:lineRule="auto" w:before="0" w:after="0"/>
-        <w:ind w:firstLine="720"/>
-        <w:jc w:val="both"/>
-      </w:pPr>
-      <w:r>
-        <w:rPr>
-          <w:rFonts w:ascii="Georgia" w:hAnsi="Georgia" w:eastAsia="Georgia" w:cs="Georgia"/>
-          <w:b/>
-          <w:sz w:val="22"/>
-        </w:rPr>
-        <w:t xml:space="preserve">Comment 1 under Caption 2 (Page 5). </w:t>
-      </w:r>
-      <w:r>
-        <w:rPr>
-          <w:rFonts w:ascii="Georgia" w:hAnsi="Georgia" w:eastAsia="Georgia" w:cs="Georgia"/>
-          <w:b w:val="0"/>
+        <w:spacing w:line="480" w:lineRule="auto" w:before="60" w:after="0"/>
+        <w:ind w:left="720" w:firstLine="0"/>
+        <w:jc w:val="left"/>
+      </w:pPr>
+      <w:r>
+        <w:rPr>
+          <w:rFonts w:ascii="Georgia" w:hAnsi="Georgia" w:eastAsia="Georgia" w:cs="Georgia"/>
+          <w:b/>
+          <w:i w:val="0"/>
+          <w:sz w:val="22"/>
+        </w:rPr>
+        <w:t>Comment 1</w:t>
+      </w:r>
+    </w:p>
+    <w:p>
+      <w:pPr>
+        <w:spacing w:line="480" w:lineRule="auto" w:before="0" w:after="0"/>
+        <w:ind w:left="720" w:firstLine="0"/>
+        <w:jc w:val="both"/>
+      </w:pPr>
+      <w:r>
+        <w:rPr>
+          <w:rFonts w:ascii="Georgia" w:hAnsi="Georgia" w:eastAsia="Georgia" w:cs="Georgia"/>
+          <w:b w:val="0"/>
+          <w:i w:val="0"/>
           <w:sz w:val="22"/>
         </w:rPr>
         <w:t>I agree with you, time and experience teaches you a lot you never thought of</w:t>
@@ -10038,22 +10732,31 @@
     </w:p>
     <w:p>
       <w:pPr>
-        <w:spacing w:line="480" w:lineRule="auto" w:before="0" w:after="0"/>
-        <w:ind w:firstLine="720"/>
-        <w:jc w:val="both"/>
-      </w:pPr>
-      <w:r>
-        <w:rPr>
-          <w:rFonts w:ascii="Georgia" w:hAnsi="Georgia" w:eastAsia="Georgia" w:cs="Georgia"/>
-          <w:b/>
-          <w:sz w:val="22"/>
-        </w:rPr>
-        <w:t xml:space="preserve">Comment 2 under Caption 2 (Page 5). </w:t>
-      </w:r>
-      <w:r>
-        <w:rPr>
-          <w:rFonts w:ascii="Georgia" w:hAnsi="Georgia" w:eastAsia="Georgia" w:cs="Georgia"/>
-          <w:b w:val="0"/>
+        <w:spacing w:line="480" w:lineRule="auto" w:before="60" w:after="0"/>
+        <w:ind w:left="720" w:firstLine="0"/>
+        <w:jc w:val="left"/>
+      </w:pPr>
+      <w:r>
+        <w:rPr>
+          <w:rFonts w:ascii="Georgia" w:hAnsi="Georgia" w:eastAsia="Georgia" w:cs="Georgia"/>
+          <w:b/>
+          <w:i w:val="0"/>
+          <w:sz w:val="22"/>
+        </w:rPr>
+        <w:t>Comment 2</w:t>
+      </w:r>
+    </w:p>
+    <w:p>
+      <w:pPr>
+        <w:spacing w:line="480" w:lineRule="auto" w:before="0" w:after="0"/>
+        <w:ind w:left="720" w:firstLine="0"/>
+        <w:jc w:val="both"/>
+      </w:pPr>
+      <w:r>
+        <w:rPr>
+          <w:rFonts w:ascii="Georgia" w:hAnsi="Georgia" w:eastAsia="Georgia" w:cs="Georgia"/>
+          <w:b w:val="0"/>
+          <w:i w:val="0"/>
           <w:sz w:val="22"/>
         </w:rPr>
         <w:t>Always growing through what we go through 🥰 such a lovely reminder to stay present and not fear the future</w:t>
@@ -10061,22 +10764,47 @@
     </w:p>
     <w:p>
       <w:pPr>
-        <w:spacing w:line="480" w:lineRule="auto" w:before="0" w:after="0"/>
-        <w:ind w:firstLine="720"/>
-        <w:jc w:val="both"/>
-      </w:pPr>
-      <w:r>
-        <w:rPr>
-          <w:rFonts w:ascii="Georgia" w:hAnsi="Georgia" w:eastAsia="Georgia" w:cs="Georgia"/>
-          <w:b/>
-          <w:sz w:val="22"/>
-        </w:rPr>
-        <w:t xml:space="preserve">Caption 1 (Page 6). </w:t>
-      </w:r>
-      <w:r>
-        <w:rPr>
-          <w:rFonts w:ascii="Georgia" w:hAnsi="Georgia" w:eastAsia="Georgia" w:cs="Georgia"/>
-          <w:b w:val="0"/>
+        <w:spacing w:line="480" w:lineRule="auto" w:before="240" w:after="0"/>
+        <w:ind w:left="0" w:firstLine="0"/>
+        <w:jc w:val="left"/>
+      </w:pPr>
+      <w:r>
+        <w:rPr>
+          <w:rFonts w:ascii="Georgia" w:hAnsi="Georgia" w:eastAsia="Georgia" w:cs="Georgia"/>
+          <w:b/>
+          <w:i w:val="0"/>
+          <w:sz w:val="24"/>
+        </w:rPr>
+        <w:t>Page 06</w:t>
+      </w:r>
+    </w:p>
+    <w:p>
+      <w:pPr>
+        <w:spacing w:line="480" w:lineRule="auto" w:before="120" w:after="0"/>
+        <w:ind w:left="360" w:firstLine="0"/>
+        <w:jc w:val="left"/>
+      </w:pPr>
+      <w:r>
+        <w:rPr>
+          <w:rFonts w:ascii="Georgia" w:hAnsi="Georgia" w:eastAsia="Georgia" w:cs="Georgia"/>
+          <w:b/>
+          <w:i w:val="0"/>
+          <w:sz w:val="22"/>
+        </w:rPr>
+        <w:t>Caption 1</w:t>
+      </w:r>
+    </w:p>
+    <w:p>
+      <w:pPr>
+        <w:spacing w:line="480" w:lineRule="auto" w:before="0" w:after="0"/>
+        <w:ind w:left="360" w:firstLine="0"/>
+        <w:jc w:val="both"/>
+      </w:pPr>
+      <w:r>
+        <w:rPr>
+          <w:rFonts w:ascii="Georgia" w:hAnsi="Georgia" w:eastAsia="Georgia" w:cs="Georgia"/>
+          <w:b w:val="0"/>
+          <w:i w:val="0"/>
           <w:sz w:val="22"/>
         </w:rPr>
         <w:t>Men’s mental health month is coming up this November. We don’t talk enough about what men carry. The pressure to be the provider. The strong one. The one that never cracks. But bottling everything up is why men are more likely to die by suicide, because they feel ashamed to speak up. We have to break the stigma 🩵#mentalhealth #mentalhealthawareness #mentalhealthmatters</w:t>
@@ -10084,22 +10812,31 @@
     </w:p>
     <w:p>
       <w:pPr>
-        <w:spacing w:line="480" w:lineRule="auto" w:before="0" w:after="0"/>
-        <w:ind w:firstLine="720"/>
-        <w:jc w:val="both"/>
-      </w:pPr>
-      <w:r>
-        <w:rPr>
-          <w:rFonts w:ascii="Georgia" w:hAnsi="Georgia" w:eastAsia="Georgia" w:cs="Georgia"/>
-          <w:b/>
-          <w:sz w:val="22"/>
-        </w:rPr>
-        <w:t xml:space="preserve">Comment 1 under Caption 1 (Page 6). </w:t>
-      </w:r>
-      <w:r>
-        <w:rPr>
-          <w:rFonts w:ascii="Georgia" w:hAnsi="Georgia" w:eastAsia="Georgia" w:cs="Georgia"/>
-          <w:b w:val="0"/>
+        <w:spacing w:line="480" w:lineRule="auto" w:before="60" w:after="0"/>
+        <w:ind w:left="720" w:firstLine="0"/>
+        <w:jc w:val="left"/>
+      </w:pPr>
+      <w:r>
+        <w:rPr>
+          <w:rFonts w:ascii="Georgia" w:hAnsi="Georgia" w:eastAsia="Georgia" w:cs="Georgia"/>
+          <w:b/>
+          <w:i w:val="0"/>
+          <w:sz w:val="22"/>
+        </w:rPr>
+        <w:t>Comment 1</w:t>
+      </w:r>
+    </w:p>
+    <w:p>
+      <w:pPr>
+        <w:spacing w:line="480" w:lineRule="auto" w:before="0" w:after="0"/>
+        <w:ind w:left="720" w:firstLine="0"/>
+        <w:jc w:val="both"/>
+      </w:pPr>
+      <w:r>
+        <w:rPr>
+          <w:rFonts w:ascii="Georgia" w:hAnsi="Georgia" w:eastAsia="Georgia" w:cs="Georgia"/>
+          <w:b w:val="0"/>
+          <w:i w:val="0"/>
           <w:sz w:val="22"/>
         </w:rPr>
         <w:t>remember it’s ok not to be okay keep going fellas we got this together ❤️</w:t>
@@ -10107,22 +10844,31 @@
     </w:p>
     <w:p>
       <w:pPr>
-        <w:spacing w:line="480" w:lineRule="auto" w:before="0" w:after="0"/>
-        <w:ind w:firstLine="720"/>
-        <w:jc w:val="both"/>
-      </w:pPr>
-      <w:r>
-        <w:rPr>
-          <w:rFonts w:ascii="Georgia" w:hAnsi="Georgia" w:eastAsia="Georgia" w:cs="Georgia"/>
-          <w:b/>
-          <w:sz w:val="22"/>
-        </w:rPr>
-        <w:t xml:space="preserve">Comment 2 under Caption 1 (Page 6). </w:t>
-      </w:r>
-      <w:r>
-        <w:rPr>
-          <w:rFonts w:ascii="Georgia" w:hAnsi="Georgia" w:eastAsia="Georgia" w:cs="Georgia"/>
-          <w:b w:val="0"/>
+        <w:spacing w:line="480" w:lineRule="auto" w:before="60" w:after="0"/>
+        <w:ind w:left="720" w:firstLine="0"/>
+        <w:jc w:val="left"/>
+      </w:pPr>
+      <w:r>
+        <w:rPr>
+          <w:rFonts w:ascii="Georgia" w:hAnsi="Georgia" w:eastAsia="Georgia" w:cs="Georgia"/>
+          <w:b/>
+          <w:i w:val="0"/>
+          <w:sz w:val="22"/>
+        </w:rPr>
+        <w:t>Comment 2</w:t>
+      </w:r>
+    </w:p>
+    <w:p>
+      <w:pPr>
+        <w:spacing w:line="480" w:lineRule="auto" w:before="0" w:after="0"/>
+        <w:ind w:left="720" w:firstLine="0"/>
+        <w:jc w:val="both"/>
+      </w:pPr>
+      <w:r>
+        <w:rPr>
+          <w:rFonts w:ascii="Georgia" w:hAnsi="Georgia" w:eastAsia="Georgia" w:cs="Georgia"/>
+          <w:b w:val="0"/>
+          <w:i w:val="0"/>
           <w:sz w:val="22"/>
         </w:rPr>
         <w:t>To say the truth I have been having this feelings to end it. I see it as being scary but the more I keep it inside the more I see it as a relief 😮‍💨😢😢</w:t>
@@ -10130,22 +10876,31 @@
     </w:p>
     <w:p>
       <w:pPr>
-        <w:spacing w:line="480" w:lineRule="auto" w:before="0" w:after="0"/>
-        <w:ind w:firstLine="720"/>
-        <w:jc w:val="both"/>
-      </w:pPr>
-      <w:r>
-        <w:rPr>
-          <w:rFonts w:ascii="Georgia" w:hAnsi="Georgia" w:eastAsia="Georgia" w:cs="Georgia"/>
-          <w:b/>
-          <w:sz w:val="22"/>
-        </w:rPr>
-        <w:t xml:space="preserve">Caption 2 (Page 6). </w:t>
-      </w:r>
-      <w:r>
-        <w:rPr>
-          <w:rFonts w:ascii="Georgia" w:hAnsi="Georgia" w:eastAsia="Georgia" w:cs="Georgia"/>
-          <w:b w:val="0"/>
+        <w:spacing w:line="480" w:lineRule="auto" w:before="120" w:after="0"/>
+        <w:ind w:left="360" w:firstLine="0"/>
+        <w:jc w:val="left"/>
+      </w:pPr>
+      <w:r>
+        <w:rPr>
+          <w:rFonts w:ascii="Georgia" w:hAnsi="Georgia" w:eastAsia="Georgia" w:cs="Georgia"/>
+          <w:b/>
+          <w:i w:val="0"/>
+          <w:sz w:val="22"/>
+        </w:rPr>
+        <w:t>Caption 2</w:t>
+      </w:r>
+    </w:p>
+    <w:p>
+      <w:pPr>
+        <w:spacing w:line="480" w:lineRule="auto" w:before="0" w:after="0"/>
+        <w:ind w:left="360" w:firstLine="0"/>
+        <w:jc w:val="both"/>
+      </w:pPr>
+      <w:r>
+        <w:rPr>
+          <w:rFonts w:ascii="Georgia" w:hAnsi="Georgia" w:eastAsia="Georgia" w:cs="Georgia"/>
+          <w:b w:val="0"/>
+          <w:i w:val="0"/>
           <w:sz w:val="22"/>
         </w:rPr>
         <w:t>Please never be embarrassed or too afraid to talk about your mental health. You’re tired from being strong. There’s nothing wrong with seeking assistance with getting along. #WorldMentalHealthDay #WMHD25 #MentalHealth</w:t>
@@ -10153,22 +10908,31 @@
     </w:p>
     <w:p>
       <w:pPr>
-        <w:spacing w:line="480" w:lineRule="auto" w:before="0" w:after="0"/>
-        <w:ind w:firstLine="720"/>
-        <w:jc w:val="both"/>
-      </w:pPr>
-      <w:r>
-        <w:rPr>
-          <w:rFonts w:ascii="Georgia" w:hAnsi="Georgia" w:eastAsia="Georgia" w:cs="Georgia"/>
-          <w:b/>
-          <w:sz w:val="22"/>
-        </w:rPr>
-        <w:t xml:space="preserve">Comment 1 under Caption 2 (Page 6). </w:t>
-      </w:r>
-      <w:r>
-        <w:rPr>
-          <w:rFonts w:ascii="Georgia" w:hAnsi="Georgia" w:eastAsia="Georgia" w:cs="Georgia"/>
-          <w:b w:val="0"/>
+        <w:spacing w:line="480" w:lineRule="auto" w:before="60" w:after="0"/>
+        <w:ind w:left="720" w:firstLine="0"/>
+        <w:jc w:val="left"/>
+      </w:pPr>
+      <w:r>
+        <w:rPr>
+          <w:rFonts w:ascii="Georgia" w:hAnsi="Georgia" w:eastAsia="Georgia" w:cs="Georgia"/>
+          <w:b/>
+          <w:i w:val="0"/>
+          <w:sz w:val="22"/>
+        </w:rPr>
+        <w:t>Comment 1</w:t>
+      </w:r>
+    </w:p>
+    <w:p>
+      <w:pPr>
+        <w:spacing w:line="480" w:lineRule="auto" w:before="0" w:after="0"/>
+        <w:ind w:left="720" w:firstLine="0"/>
+        <w:jc w:val="both"/>
+      </w:pPr>
+      <w:r>
+        <w:rPr>
+          <w:rFonts w:ascii="Georgia" w:hAnsi="Georgia" w:eastAsia="Georgia" w:cs="Georgia"/>
+          <w:b w:val="0"/>
+          <w:i w:val="0"/>
           <w:sz w:val="22"/>
         </w:rPr>
         <w:t>Sometimes when the people around you don’t help, it’s not because you don’t deserve it, it’s because they don’t know how, or they’ve been led to believe you don’t need it. You still deserve care. Always.</w:t>
@@ -10176,22 +10940,31 @@
     </w:p>
     <w:p>
       <w:pPr>
-        <w:spacing w:line="480" w:lineRule="auto" w:before="0" w:after="0"/>
-        <w:ind w:firstLine="720"/>
-        <w:jc w:val="both"/>
-      </w:pPr>
-      <w:r>
-        <w:rPr>
-          <w:rFonts w:ascii="Georgia" w:hAnsi="Georgia" w:eastAsia="Georgia" w:cs="Georgia"/>
-          <w:b/>
-          <w:sz w:val="22"/>
-        </w:rPr>
-        <w:t xml:space="preserve">Comment 2 under Caption 2 (Page 6). </w:t>
-      </w:r>
-      <w:r>
-        <w:rPr>
-          <w:rFonts w:ascii="Georgia" w:hAnsi="Georgia" w:eastAsia="Georgia" w:cs="Georgia"/>
-          <w:b w:val="0"/>
+        <w:spacing w:line="480" w:lineRule="auto" w:before="60" w:after="0"/>
+        <w:ind w:left="720" w:firstLine="0"/>
+        <w:jc w:val="left"/>
+      </w:pPr>
+      <w:r>
+        <w:rPr>
+          <w:rFonts w:ascii="Georgia" w:hAnsi="Georgia" w:eastAsia="Georgia" w:cs="Georgia"/>
+          <w:b/>
+          <w:i w:val="0"/>
+          <w:sz w:val="22"/>
+        </w:rPr>
+        <w:t>Comment 2</w:t>
+      </w:r>
+    </w:p>
+    <w:p>
+      <w:pPr>
+        <w:spacing w:line="480" w:lineRule="auto" w:before="0" w:after="0"/>
+        <w:ind w:left="720" w:firstLine="0"/>
+        <w:jc w:val="both"/>
+      </w:pPr>
+      <w:r>
+        <w:rPr>
+          <w:rFonts w:ascii="Georgia" w:hAnsi="Georgia" w:eastAsia="Georgia" w:cs="Georgia"/>
+          <w:b w:val="0"/>
+          <w:i w:val="0"/>
           <w:sz w:val="22"/>
         </w:rPr>
         <w:t>Talking about it saves do many lives and encourages people to seek help to improve their mental health 🙌🏻❤️🫶🏻</w:t>
@@ -10199,22 +10972,31 @@
     </w:p>
     <w:p>
       <w:pPr>
-        <w:spacing w:line="480" w:lineRule="auto" w:before="0" w:after="0"/>
-        <w:ind w:firstLine="720"/>
-        <w:jc w:val="both"/>
-      </w:pPr>
-      <w:r>
-        <w:rPr>
-          <w:rFonts w:ascii="Georgia" w:hAnsi="Georgia" w:eastAsia="Georgia" w:cs="Georgia"/>
-          <w:b/>
-          <w:sz w:val="22"/>
-        </w:rPr>
-        <w:t xml:space="preserve">Caption 3 (Page 6). </w:t>
-      </w:r>
-      <w:r>
-        <w:rPr>
-          <w:rFonts w:ascii="Georgia" w:hAnsi="Georgia" w:eastAsia="Georgia" w:cs="Georgia"/>
-          <w:b w:val="0"/>
+        <w:spacing w:line="480" w:lineRule="auto" w:before="120" w:after="0"/>
+        <w:ind w:left="360" w:firstLine="0"/>
+        <w:jc w:val="left"/>
+      </w:pPr>
+      <w:r>
+        <w:rPr>
+          <w:rFonts w:ascii="Georgia" w:hAnsi="Georgia" w:eastAsia="Georgia" w:cs="Georgia"/>
+          <w:b/>
+          <w:i w:val="0"/>
+          <w:sz w:val="22"/>
+        </w:rPr>
+        <w:t>Caption 3</w:t>
+      </w:r>
+    </w:p>
+    <w:p>
+      <w:pPr>
+        <w:spacing w:line="480" w:lineRule="auto" w:before="0" w:after="0"/>
+        <w:ind w:left="360" w:firstLine="0"/>
+        <w:jc w:val="both"/>
+      </w:pPr>
+      <w:r>
+        <w:rPr>
+          <w:rFonts w:ascii="Georgia" w:hAnsi="Georgia" w:eastAsia="Georgia" w:cs="Georgia"/>
+          <w:b w:val="0"/>
+          <w:i w:val="0"/>
           <w:sz w:val="22"/>
         </w:rPr>
         <w:t>Avoiding conversations about suicide doesn’t make the issue go away. it reinforces stigma, silence, and isolation. Open, compassionate talk of the topic helps people feel seen, understood, and supported. #suicideprevention #suicidepreventionmonth #mentalhealth #mentalhealthmatters #mentalhealthawareness#████████</w:t>
@@ -10222,22 +11004,31 @@
     </w:p>
     <w:p>
       <w:pPr>
-        <w:spacing w:line="480" w:lineRule="auto" w:before="0" w:after="0"/>
-        <w:ind w:firstLine="720"/>
-        <w:jc w:val="both"/>
-      </w:pPr>
-      <w:r>
-        <w:rPr>
-          <w:rFonts w:ascii="Georgia" w:hAnsi="Georgia" w:eastAsia="Georgia" w:cs="Georgia"/>
-          <w:b/>
-          <w:sz w:val="22"/>
-        </w:rPr>
-        <w:t xml:space="preserve">Comment 1 under Caption 3 (Page 6). </w:t>
-      </w:r>
-      <w:r>
-        <w:rPr>
-          <w:rFonts w:ascii="Georgia" w:hAnsi="Georgia" w:eastAsia="Georgia" w:cs="Georgia"/>
-          <w:b w:val="0"/>
+        <w:spacing w:line="480" w:lineRule="auto" w:before="60" w:after="0"/>
+        <w:ind w:left="720" w:firstLine="0"/>
+        <w:jc w:val="left"/>
+      </w:pPr>
+      <w:r>
+        <w:rPr>
+          <w:rFonts w:ascii="Georgia" w:hAnsi="Georgia" w:eastAsia="Georgia" w:cs="Georgia"/>
+          <w:b/>
+          <w:i w:val="0"/>
+          <w:sz w:val="22"/>
+        </w:rPr>
+        <w:t>Comment 1</w:t>
+      </w:r>
+    </w:p>
+    <w:p>
+      <w:pPr>
+        <w:spacing w:line="480" w:lineRule="auto" w:before="0" w:after="0"/>
+        <w:ind w:left="720" w:firstLine="0"/>
+        <w:jc w:val="both"/>
+      </w:pPr>
+      <w:r>
+        <w:rPr>
+          <w:rFonts w:ascii="Georgia" w:hAnsi="Georgia" w:eastAsia="Georgia" w:cs="Georgia"/>
+          <w:b w:val="0"/>
+          <w:i w:val="0"/>
           <w:sz w:val="22"/>
         </w:rPr>
         <w:t>if you are reading this and you feel as though you want to leave this earth, i can lend you my ear whenever, 0 judgement, just a shoulder to lean on. you are so so so loved 🤍🤍pls stay with us we are all in this together 🫶🏻</w:t>
@@ -10245,22 +11036,31 @@
     </w:p>
     <w:p>
       <w:pPr>
-        <w:spacing w:line="480" w:lineRule="auto" w:before="0" w:after="0"/>
-        <w:ind w:firstLine="720"/>
-        <w:jc w:val="both"/>
-      </w:pPr>
-      <w:r>
-        <w:rPr>
-          <w:rFonts w:ascii="Georgia" w:hAnsi="Georgia" w:eastAsia="Georgia" w:cs="Georgia"/>
-          <w:b/>
-          <w:sz w:val="22"/>
-        </w:rPr>
-        <w:t xml:space="preserve">Comment 2 under Caption 3 (Page 6). </w:t>
-      </w:r>
-      <w:r>
-        <w:rPr>
-          <w:rFonts w:ascii="Georgia" w:hAnsi="Georgia" w:eastAsia="Georgia" w:cs="Georgia"/>
-          <w:b w:val="0"/>
+        <w:spacing w:line="480" w:lineRule="auto" w:before="60" w:after="0"/>
+        <w:ind w:left="720" w:firstLine="0"/>
+        <w:jc w:val="left"/>
+      </w:pPr>
+      <w:r>
+        <w:rPr>
+          <w:rFonts w:ascii="Georgia" w:hAnsi="Georgia" w:eastAsia="Georgia" w:cs="Georgia"/>
+          <w:b/>
+          <w:i w:val="0"/>
+          <w:sz w:val="22"/>
+        </w:rPr>
+        <w:t>Comment 2</w:t>
+      </w:r>
+    </w:p>
+    <w:p>
+      <w:pPr>
+        <w:spacing w:line="480" w:lineRule="auto" w:before="0" w:after="0"/>
+        <w:ind w:left="720" w:firstLine="0"/>
+        <w:jc w:val="both"/>
+      </w:pPr>
+      <w:r>
+        <w:rPr>
+          <w:rFonts w:ascii="Georgia" w:hAnsi="Georgia" w:eastAsia="Georgia" w:cs="Georgia"/>
+          <w:b w:val="0"/>
+          <w:i w:val="0"/>
           <w:sz w:val="22"/>
         </w:rPr>
         <w:t>Always make some time and check up on your loved ones. You never know what someone is going through and what they are dealing with. In today’s world, we talk about every little thing but no one talks or asks on what’s going on in someone’s life. People help people and talking about it won’t make someone any weak. Respect, love, care and know that you are important!</w:t>
@@ -10268,22 +11068,31 @@
     </w:p>
     <w:p>
       <w:pPr>
-        <w:spacing w:line="480" w:lineRule="auto" w:before="0" w:after="0"/>
-        <w:ind w:firstLine="720"/>
-        <w:jc w:val="both"/>
-      </w:pPr>
-      <w:r>
-        <w:rPr>
-          <w:rFonts w:ascii="Georgia" w:hAnsi="Georgia" w:eastAsia="Georgia" w:cs="Georgia"/>
-          <w:b/>
-          <w:sz w:val="22"/>
-        </w:rPr>
-        <w:t xml:space="preserve">Caption 4 (Page 6). </w:t>
-      </w:r>
-      <w:r>
-        <w:rPr>
-          <w:rFonts w:ascii="Georgia" w:hAnsi="Georgia" w:eastAsia="Georgia" w:cs="Georgia"/>
-          <w:b w:val="0"/>
+        <w:spacing w:line="480" w:lineRule="auto" w:before="120" w:after="0"/>
+        <w:ind w:left="360" w:firstLine="0"/>
+        <w:jc w:val="left"/>
+      </w:pPr>
+      <w:r>
+        <w:rPr>
+          <w:rFonts w:ascii="Georgia" w:hAnsi="Georgia" w:eastAsia="Georgia" w:cs="Georgia"/>
+          <w:b/>
+          <w:i w:val="0"/>
+          <w:sz w:val="22"/>
+        </w:rPr>
+        <w:t>Caption 4</w:t>
+      </w:r>
+    </w:p>
+    <w:p>
+      <w:pPr>
+        <w:spacing w:line="480" w:lineRule="auto" w:before="0" w:after="0"/>
+        <w:ind w:left="360" w:firstLine="0"/>
+        <w:jc w:val="both"/>
+      </w:pPr>
+      <w:r>
+        <w:rPr>
+          <w:rFonts w:ascii="Georgia" w:hAnsi="Georgia" w:eastAsia="Georgia" w:cs="Georgia"/>
+          <w:b w:val="0"/>
+          <w:i w:val="0"/>
           <w:sz w:val="22"/>
         </w:rPr>
         <w:t>Depression doesn’t always look like isolation or sadness; sometimes, it looks like overcompensating, exhaustion, or simply ‘pushing through. If this resonates with you, know that your struggles are valid, even if they’re unseen. Seeking support isn’t a sign of weakness-it’s a step toward healing. Functional depression is often associated with high-functioning depression, which can sometimes align with Persistent Depressive Disorder (PDD, formerly known as dysthymia)—a chronic but less severe form of depression where individuals can still manage daily responsibilities despite ongoing emotional distress. #functionaldepression #depression #youarenotalone #breakthestigma #mindfulness #mentalhealthmatters</w:t>
@@ -10291,22 +11100,31 @@
     </w:p>
     <w:p>
       <w:pPr>
-        <w:spacing w:line="480" w:lineRule="auto" w:before="0" w:after="0"/>
-        <w:ind w:firstLine="720"/>
-        <w:jc w:val="both"/>
-      </w:pPr>
-      <w:r>
-        <w:rPr>
-          <w:rFonts w:ascii="Georgia" w:hAnsi="Georgia" w:eastAsia="Georgia" w:cs="Georgia"/>
-          <w:b/>
-          <w:sz w:val="22"/>
-        </w:rPr>
-        <w:t xml:space="preserve">Comment 1 under Caption 4 (Page 6). </w:t>
-      </w:r>
-      <w:r>
-        <w:rPr>
-          <w:rFonts w:ascii="Georgia" w:hAnsi="Georgia" w:eastAsia="Georgia" w:cs="Georgia"/>
-          <w:b w:val="0"/>
+        <w:spacing w:line="480" w:lineRule="auto" w:before="60" w:after="0"/>
+        <w:ind w:left="720" w:firstLine="0"/>
+        <w:jc w:val="left"/>
+      </w:pPr>
+      <w:r>
+        <w:rPr>
+          <w:rFonts w:ascii="Georgia" w:hAnsi="Georgia" w:eastAsia="Georgia" w:cs="Georgia"/>
+          <w:b/>
+          <w:i w:val="0"/>
+          <w:sz w:val="22"/>
+        </w:rPr>
+        <w:t>Comment 1</w:t>
+      </w:r>
+    </w:p>
+    <w:p>
+      <w:pPr>
+        <w:spacing w:line="480" w:lineRule="auto" w:before="0" w:after="0"/>
+        <w:ind w:left="720" w:firstLine="0"/>
+        <w:jc w:val="both"/>
+      </w:pPr>
+      <w:r>
+        <w:rPr>
+          <w:rFonts w:ascii="Georgia" w:hAnsi="Georgia" w:eastAsia="Georgia" w:cs="Georgia"/>
+          <w:b w:val="0"/>
+          <w:i w:val="0"/>
           <w:sz w:val="22"/>
         </w:rPr>
         <w:t>This is painfully real. Sometimes the loudest struggle is the one no one sees.</w:t>
@@ -10314,22 +11132,31 @@
     </w:p>
     <w:p>
       <w:pPr>
-        <w:spacing w:line="480" w:lineRule="auto" w:before="0" w:after="0"/>
-        <w:ind w:firstLine="720"/>
-        <w:jc w:val="both"/>
-      </w:pPr>
-      <w:r>
-        <w:rPr>
-          <w:rFonts w:ascii="Georgia" w:hAnsi="Georgia" w:eastAsia="Georgia" w:cs="Georgia"/>
-          <w:b/>
-          <w:sz w:val="22"/>
-        </w:rPr>
-        <w:t xml:space="preserve">Comment 2 under Caption 4 (Page 6). </w:t>
-      </w:r>
-      <w:r>
-        <w:rPr>
-          <w:rFonts w:ascii="Georgia" w:hAnsi="Georgia" w:eastAsia="Georgia" w:cs="Georgia"/>
-          <w:b w:val="0"/>
+        <w:spacing w:line="480" w:lineRule="auto" w:before="60" w:after="0"/>
+        <w:ind w:left="720" w:firstLine="0"/>
+        <w:jc w:val="left"/>
+      </w:pPr>
+      <w:r>
+        <w:rPr>
+          <w:rFonts w:ascii="Georgia" w:hAnsi="Georgia" w:eastAsia="Georgia" w:cs="Georgia"/>
+          <w:b/>
+          <w:i w:val="0"/>
+          <w:sz w:val="22"/>
+        </w:rPr>
+        <w:t>Comment 2</w:t>
+      </w:r>
+    </w:p>
+    <w:p>
+      <w:pPr>
+        <w:spacing w:line="480" w:lineRule="auto" w:before="0" w:after="0"/>
+        <w:ind w:left="720" w:firstLine="0"/>
+        <w:jc w:val="both"/>
+      </w:pPr>
+      <w:r>
+        <w:rPr>
+          <w:rFonts w:ascii="Georgia" w:hAnsi="Georgia" w:eastAsia="Georgia" w:cs="Georgia"/>
+          <w:b w:val="0"/>
+          <w:i w:val="0"/>
           <w:sz w:val="22"/>
         </w:rPr>
         <w:t>It's better when they don't know. When people know your true feelings, they get upset with you and you have to apologize</w:t>
@@ -10337,22 +11164,31 @@
     </w:p>
     <w:p>
       <w:pPr>
-        <w:spacing w:line="480" w:lineRule="auto" w:before="0" w:after="0"/>
-        <w:ind w:firstLine="720"/>
-        <w:jc w:val="both"/>
-      </w:pPr>
-      <w:r>
-        <w:rPr>
-          <w:rFonts w:ascii="Georgia" w:hAnsi="Georgia" w:eastAsia="Georgia" w:cs="Georgia"/>
-          <w:b/>
-          <w:sz w:val="22"/>
-        </w:rPr>
-        <w:t xml:space="preserve">Caption 5 (Page 6). </w:t>
-      </w:r>
-      <w:r>
-        <w:rPr>
-          <w:rFonts w:ascii="Georgia" w:hAnsi="Georgia" w:eastAsia="Georgia" w:cs="Georgia"/>
-          <w:b w:val="0"/>
+        <w:spacing w:line="480" w:lineRule="auto" w:before="120" w:after="0"/>
+        <w:ind w:left="360" w:firstLine="0"/>
+        <w:jc w:val="left"/>
+      </w:pPr>
+      <w:r>
+        <w:rPr>
+          <w:rFonts w:ascii="Georgia" w:hAnsi="Georgia" w:eastAsia="Georgia" w:cs="Georgia"/>
+          <w:b/>
+          <w:i w:val="0"/>
+          <w:sz w:val="22"/>
+        </w:rPr>
+        <w:t>Caption 5</w:t>
+      </w:r>
+    </w:p>
+    <w:p>
+      <w:pPr>
+        <w:spacing w:line="480" w:lineRule="auto" w:before="0" w:after="0"/>
+        <w:ind w:left="360" w:firstLine="0"/>
+        <w:jc w:val="both"/>
+      </w:pPr>
+      <w:r>
+        <w:rPr>
+          <w:rFonts w:ascii="Georgia" w:hAnsi="Georgia" w:eastAsia="Georgia" w:cs="Georgia"/>
+          <w:b w:val="0"/>
+          <w:i w:val="0"/>
           <w:sz w:val="22"/>
         </w:rPr>
         <w:t>People stigmatise mental health but mourn suicide. We need to make a change. ❤️ This is the sad society that we live in. But only we can change it. We can respond sooner, we can help people who are in need, we can reach out to people who we know are suffering, we can look for the warning signs.. we can just be kinder people to others.</w:t>
@@ -10360,22 +11196,31 @@
     </w:p>
     <w:p>
       <w:pPr>
-        <w:spacing w:line="480" w:lineRule="auto" w:before="0" w:after="0"/>
-        <w:ind w:firstLine="720"/>
-        <w:jc w:val="both"/>
-      </w:pPr>
-      <w:r>
-        <w:rPr>
-          <w:rFonts w:ascii="Georgia" w:hAnsi="Georgia" w:eastAsia="Georgia" w:cs="Georgia"/>
-          <w:b/>
-          <w:sz w:val="22"/>
-        </w:rPr>
-        <w:t xml:space="preserve">Comment 1 under Caption 5 (Page 6). </w:t>
-      </w:r>
-      <w:r>
-        <w:rPr>
-          <w:rFonts w:ascii="Georgia" w:hAnsi="Georgia" w:eastAsia="Georgia" w:cs="Georgia"/>
-          <w:b w:val="0"/>
+        <w:spacing w:line="480" w:lineRule="auto" w:before="60" w:after="0"/>
+        <w:ind w:left="720" w:firstLine="0"/>
+        <w:jc w:val="left"/>
+      </w:pPr>
+      <w:r>
+        <w:rPr>
+          <w:rFonts w:ascii="Georgia" w:hAnsi="Georgia" w:eastAsia="Georgia" w:cs="Georgia"/>
+          <w:b/>
+          <w:i w:val="0"/>
+          <w:sz w:val="22"/>
+        </w:rPr>
+        <w:t>Comment 1</w:t>
+      </w:r>
+    </w:p>
+    <w:p>
+      <w:pPr>
+        <w:spacing w:line="480" w:lineRule="auto" w:before="0" w:after="0"/>
+        <w:ind w:left="720" w:firstLine="0"/>
+        <w:jc w:val="both"/>
+      </w:pPr>
+      <w:r>
+        <w:rPr>
+          <w:rFonts w:ascii="Georgia" w:hAnsi="Georgia" w:eastAsia="Georgia" w:cs="Georgia"/>
+          <w:b w:val="0"/>
+          <w:i w:val="0"/>
           <w:sz w:val="22"/>
         </w:rPr>
         <w:t>I would agree, everyone is avoiding me. I’m giving people the signs, yet everyone is pushing me away</w:t>
@@ -10383,22 +11228,31 @@
     </w:p>
     <w:p>
       <w:pPr>
-        <w:spacing w:line="480" w:lineRule="auto" w:before="0" w:after="0"/>
-        <w:ind w:firstLine="720"/>
-        <w:jc w:val="both"/>
-      </w:pPr>
-      <w:r>
-        <w:rPr>
-          <w:rFonts w:ascii="Georgia" w:hAnsi="Georgia" w:eastAsia="Georgia" w:cs="Georgia"/>
-          <w:b/>
-          <w:sz w:val="22"/>
-        </w:rPr>
-        <w:t xml:space="preserve">Comment 2 under Caption 5 (Page 6). </w:t>
-      </w:r>
-      <w:r>
-        <w:rPr>
-          <w:rFonts w:ascii="Georgia" w:hAnsi="Georgia" w:eastAsia="Georgia" w:cs="Georgia"/>
-          <w:b w:val="0"/>
+        <w:spacing w:line="480" w:lineRule="auto" w:before="60" w:after="0"/>
+        <w:ind w:left="720" w:firstLine="0"/>
+        <w:jc w:val="left"/>
+      </w:pPr>
+      <w:r>
+        <w:rPr>
+          <w:rFonts w:ascii="Georgia" w:hAnsi="Georgia" w:eastAsia="Georgia" w:cs="Georgia"/>
+          <w:b/>
+          <w:i w:val="0"/>
+          <w:sz w:val="22"/>
+        </w:rPr>
+        <w:t>Comment 2</w:t>
+      </w:r>
+    </w:p>
+    <w:p>
+      <w:pPr>
+        <w:spacing w:line="480" w:lineRule="auto" w:before="0" w:after="0"/>
+        <w:ind w:left="720" w:firstLine="0"/>
+        <w:jc w:val="both"/>
+      </w:pPr>
+      <w:r>
+        <w:rPr>
+          <w:rFonts w:ascii="Georgia" w:hAnsi="Georgia" w:eastAsia="Georgia" w:cs="Georgia"/>
+          <w:b w:val="0"/>
+          <w:i w:val="0"/>
           <w:sz w:val="22"/>
         </w:rPr>
         <w:t>As a society, we should take care of each other. Be kind no matter what! You never know what another person is going through</w:t>
@@ -10406,22 +11260,31 @@
     </w:p>
     <w:p>
       <w:pPr>
-        <w:spacing w:line="480" w:lineRule="auto" w:before="0" w:after="0"/>
-        <w:ind w:firstLine="720"/>
-        <w:jc w:val="both"/>
-      </w:pPr>
-      <w:r>
-        <w:rPr>
-          <w:rFonts w:ascii="Georgia" w:hAnsi="Georgia" w:eastAsia="Georgia" w:cs="Georgia"/>
-          <w:b/>
-          <w:sz w:val="22"/>
-        </w:rPr>
-        <w:t xml:space="preserve">Caption 6 (Page 6). </w:t>
-      </w:r>
-      <w:r>
-        <w:rPr>
-          <w:rFonts w:ascii="Georgia" w:hAnsi="Georgia" w:eastAsia="Georgia" w:cs="Georgia"/>
-          <w:b w:val="0"/>
+        <w:spacing w:line="480" w:lineRule="auto" w:before="120" w:after="0"/>
+        <w:ind w:left="360" w:firstLine="0"/>
+        <w:jc w:val="left"/>
+      </w:pPr>
+      <w:r>
+        <w:rPr>
+          <w:rFonts w:ascii="Georgia" w:hAnsi="Georgia" w:eastAsia="Georgia" w:cs="Georgia"/>
+          <w:b/>
+          <w:i w:val="0"/>
+          <w:sz w:val="22"/>
+        </w:rPr>
+        <w:t>Caption 6</w:t>
+      </w:r>
+    </w:p>
+    <w:p>
+      <w:pPr>
+        <w:spacing w:line="480" w:lineRule="auto" w:before="0" w:after="0"/>
+        <w:ind w:left="360" w:firstLine="0"/>
+        <w:jc w:val="both"/>
+      </w:pPr>
+      <w:r>
+        <w:rPr>
+          <w:rFonts w:ascii="Georgia" w:hAnsi="Georgia" w:eastAsia="Georgia" w:cs="Georgia"/>
+          <w:b w:val="0"/>
+          <w:i w:val="0"/>
           <w:sz w:val="22"/>
         </w:rPr>
         <w:t>There should not be an “until”, mental health matters full stop. all mental health needs to be taken seriously &amp; met with care &amp; understanding. the glamorisation and lack of understanding around mental health is so harmful and it’s costing people both their wellbeing and lives. something desperately needs to change &amp; we need much better, de-stigmatised education surrounding mental health. if your mental health hasn’t been taken seriously, for any reason, i am so unbelievably sorry. #mentalhealthawareness #mentalhealthmatters #mentalhealth #mentalillnessawareness #mentalillnessrecovery #mentalillness #mentalillnessisreal #eatingdisorder #depression #anxiety #ocd #borderlinepersonalitydisorder #eupd #bpd #mentalhealthadvocate #traumarecovery #mentalhealthrecovery</w:t>
@@ -10429,22 +11292,31 @@
     </w:p>
     <w:p>
       <w:pPr>
-        <w:spacing w:line="480" w:lineRule="auto" w:before="0" w:after="0"/>
-        <w:ind w:firstLine="720"/>
-        <w:jc w:val="both"/>
-      </w:pPr>
-      <w:r>
-        <w:rPr>
-          <w:rFonts w:ascii="Georgia" w:hAnsi="Georgia" w:eastAsia="Georgia" w:cs="Georgia"/>
-          <w:b/>
-          <w:sz w:val="22"/>
-        </w:rPr>
-        <w:t xml:space="preserve">Comment 1 under Caption 6 (Page 6). </w:t>
-      </w:r>
-      <w:r>
-        <w:rPr>
-          <w:rFonts w:ascii="Georgia" w:hAnsi="Georgia" w:eastAsia="Georgia" w:cs="Georgia"/>
-          <w:b w:val="0"/>
+        <w:spacing w:line="480" w:lineRule="auto" w:before="60" w:after="0"/>
+        <w:ind w:left="720" w:firstLine="0"/>
+        <w:jc w:val="left"/>
+      </w:pPr>
+      <w:r>
+        <w:rPr>
+          <w:rFonts w:ascii="Georgia" w:hAnsi="Georgia" w:eastAsia="Georgia" w:cs="Georgia"/>
+          <w:b/>
+          <w:i w:val="0"/>
+          <w:sz w:val="22"/>
+        </w:rPr>
+        <w:t>Comment 1</w:t>
+      </w:r>
+    </w:p>
+    <w:p>
+      <w:pPr>
+        <w:spacing w:line="480" w:lineRule="auto" w:before="0" w:after="0"/>
+        <w:ind w:left="720" w:firstLine="0"/>
+        <w:jc w:val="both"/>
+      </w:pPr>
+      <w:r>
+        <w:rPr>
+          <w:rFonts w:ascii="Georgia" w:hAnsi="Georgia" w:eastAsia="Georgia" w:cs="Georgia"/>
+          <w:b w:val="0"/>
+          <w:i w:val="0"/>
           <w:sz w:val="22"/>
         </w:rPr>
         <w:t>Mental health deserves attention before someone reaches a crisis point. Early understanding, compassionate support, and accessible education can make a meaningful difference.</w:t>
@@ -10452,22 +11324,31 @@
     </w:p>
     <w:p>
       <w:pPr>
-        <w:spacing w:line="480" w:lineRule="auto" w:before="0" w:after="0"/>
-        <w:ind w:firstLine="720"/>
-        <w:jc w:val="both"/>
-      </w:pPr>
-      <w:r>
-        <w:rPr>
-          <w:rFonts w:ascii="Georgia" w:hAnsi="Georgia" w:eastAsia="Georgia" w:cs="Georgia"/>
-          <w:b/>
-          <w:sz w:val="22"/>
-        </w:rPr>
-        <w:t xml:space="preserve">Comment 2 under Caption 6 (Page 6). </w:t>
-      </w:r>
-      <w:r>
-        <w:rPr>
-          <w:rFonts w:ascii="Georgia" w:hAnsi="Georgia" w:eastAsia="Georgia" w:cs="Georgia"/>
-          <w:b w:val="0"/>
+        <w:spacing w:line="480" w:lineRule="auto" w:before="60" w:after="0"/>
+        <w:ind w:left="720" w:firstLine="0"/>
+        <w:jc w:val="left"/>
+      </w:pPr>
+      <w:r>
+        <w:rPr>
+          <w:rFonts w:ascii="Georgia" w:hAnsi="Georgia" w:eastAsia="Georgia" w:cs="Georgia"/>
+          <w:b/>
+          <w:i w:val="0"/>
+          <w:sz w:val="22"/>
+        </w:rPr>
+        <w:t>Comment 2</w:t>
+      </w:r>
+    </w:p>
+    <w:p>
+      <w:pPr>
+        <w:spacing w:line="480" w:lineRule="auto" w:before="0" w:after="0"/>
+        <w:ind w:left="720" w:firstLine="0"/>
+        <w:jc w:val="both"/>
+      </w:pPr>
+      <w:r>
+        <w:rPr>
+          <w:rFonts w:ascii="Georgia" w:hAnsi="Georgia" w:eastAsia="Georgia" w:cs="Georgia"/>
+          <w:b w:val="0"/>
+          <w:i w:val="0"/>
           <w:sz w:val="22"/>
         </w:rPr>
         <w:t>Absolutely agree—mental health should never come with conditions or exceptions. It’s heartbreaking how often it’s misunderstood or dismissed. Thank you for speaking up and holding space for those who’ve been overlooked. This message is so needed.</w:t>
@@ -10475,22 +11356,31 @@
     </w:p>
     <w:p>
       <w:pPr>
-        <w:spacing w:line="480" w:lineRule="auto" w:before="0" w:after="0"/>
-        <w:ind w:firstLine="720"/>
-        <w:jc w:val="both"/>
-      </w:pPr>
-      <w:r>
-        <w:rPr>
-          <w:rFonts w:ascii="Georgia" w:hAnsi="Georgia" w:eastAsia="Georgia" w:cs="Georgia"/>
-          <w:b/>
-          <w:sz w:val="22"/>
-        </w:rPr>
-        <w:t xml:space="preserve">Caption 7 (Page 6). </w:t>
-      </w:r>
-      <w:r>
-        <w:rPr>
-          <w:rFonts w:ascii="Georgia" w:hAnsi="Georgia" w:eastAsia="Georgia" w:cs="Georgia"/>
-          <w:b w:val="0"/>
+        <w:spacing w:line="480" w:lineRule="auto" w:before="120" w:after="0"/>
+        <w:ind w:left="360" w:firstLine="0"/>
+        <w:jc w:val="left"/>
+      </w:pPr>
+      <w:r>
+        <w:rPr>
+          <w:rFonts w:ascii="Georgia" w:hAnsi="Georgia" w:eastAsia="Georgia" w:cs="Georgia"/>
+          <w:b/>
+          <w:i w:val="0"/>
+          <w:sz w:val="22"/>
+        </w:rPr>
+        <w:t>Caption 7</w:t>
+      </w:r>
+    </w:p>
+    <w:p>
+      <w:pPr>
+        <w:spacing w:line="480" w:lineRule="auto" w:before="0" w:after="0"/>
+        <w:ind w:left="360" w:firstLine="0"/>
+        <w:jc w:val="both"/>
+      </w:pPr>
+      <w:r>
+        <w:rPr>
+          <w:rFonts w:ascii="Georgia" w:hAnsi="Georgia" w:eastAsia="Georgia" w:cs="Georgia"/>
+          <w:b w:val="0"/>
+          <w:i w:val="0"/>
           <w:sz w:val="22"/>
         </w:rPr>
         <w:t>Not everyone’s trauma gives them thick skin. Sometimes, it makes us more sensitive and vulnerable. It’s okay to feel deeply and acknowledge our experiences. Healing isn’t about pretending to be strong; it’s about embracing our journey and growing from it. 💖 - #MentalHealthAwareness #HealingJourney #BeKindToYourself #mentalhealth</w:t>
@@ -10498,22 +11388,31 @@
     </w:p>
     <w:p>
       <w:pPr>
-        <w:spacing w:line="480" w:lineRule="auto" w:before="0" w:after="0"/>
-        <w:ind w:firstLine="720"/>
-        <w:jc w:val="both"/>
-      </w:pPr>
-      <w:r>
-        <w:rPr>
-          <w:rFonts w:ascii="Georgia" w:hAnsi="Georgia" w:eastAsia="Georgia" w:cs="Georgia"/>
-          <w:b/>
-          <w:sz w:val="22"/>
-        </w:rPr>
-        <w:t xml:space="preserve">Comment 1 under Caption 7 (Page 6). </w:t>
-      </w:r>
-      <w:r>
-        <w:rPr>
-          <w:rFonts w:ascii="Georgia" w:hAnsi="Georgia" w:eastAsia="Georgia" w:cs="Georgia"/>
-          <w:b w:val="0"/>
+        <w:spacing w:line="480" w:lineRule="auto" w:before="60" w:after="0"/>
+        <w:ind w:left="720" w:firstLine="0"/>
+        <w:jc w:val="left"/>
+      </w:pPr>
+      <w:r>
+        <w:rPr>
+          <w:rFonts w:ascii="Georgia" w:hAnsi="Georgia" w:eastAsia="Georgia" w:cs="Georgia"/>
+          <w:b/>
+          <w:i w:val="0"/>
+          <w:sz w:val="22"/>
+        </w:rPr>
+        <w:t>Comment 1</w:t>
+      </w:r>
+    </w:p>
+    <w:p>
+      <w:pPr>
+        <w:spacing w:line="480" w:lineRule="auto" w:before="0" w:after="0"/>
+        <w:ind w:left="720" w:firstLine="0"/>
+        <w:jc w:val="both"/>
+      </w:pPr>
+      <w:r>
+        <w:rPr>
+          <w:rFonts w:ascii="Georgia" w:hAnsi="Georgia" w:eastAsia="Georgia" w:cs="Georgia"/>
+          <w:b w:val="0"/>
+          <w:i w:val="0"/>
           <w:sz w:val="22"/>
         </w:rPr>
         <w:t>Don’t ever let anyone tell you how to heal. Trauma goes with some people to their grave and I’m sorry if that does for you. Hopefully you are able to grow stronger x</w:t>
@@ -10521,22 +11420,31 @@
     </w:p>
     <w:p>
       <w:pPr>
-        <w:spacing w:line="480" w:lineRule="auto" w:before="0" w:after="0"/>
-        <w:ind w:firstLine="720"/>
-        <w:jc w:val="both"/>
-      </w:pPr>
-      <w:r>
-        <w:rPr>
-          <w:rFonts w:ascii="Georgia" w:hAnsi="Georgia" w:eastAsia="Georgia" w:cs="Georgia"/>
-          <w:b/>
-          <w:sz w:val="22"/>
-        </w:rPr>
-        <w:t xml:space="preserve">Comment 2 under Caption 7 (Page 6). </w:t>
-      </w:r>
-      <w:r>
-        <w:rPr>
-          <w:rFonts w:ascii="Georgia" w:hAnsi="Georgia" w:eastAsia="Georgia" w:cs="Georgia"/>
-          <w:b w:val="0"/>
+        <w:spacing w:line="480" w:lineRule="auto" w:before="60" w:after="0"/>
+        <w:ind w:left="720" w:firstLine="0"/>
+        <w:jc w:val="left"/>
+      </w:pPr>
+      <w:r>
+        <w:rPr>
+          <w:rFonts w:ascii="Georgia" w:hAnsi="Georgia" w:eastAsia="Georgia" w:cs="Georgia"/>
+          <w:b/>
+          <w:i w:val="0"/>
+          <w:sz w:val="22"/>
+        </w:rPr>
+        <w:t>Comment 2</w:t>
+      </w:r>
+    </w:p>
+    <w:p>
+      <w:pPr>
+        <w:spacing w:line="480" w:lineRule="auto" w:before="0" w:after="0"/>
+        <w:ind w:left="720" w:firstLine="0"/>
+        <w:jc w:val="both"/>
+      </w:pPr>
+      <w:r>
+        <w:rPr>
+          <w:rFonts w:ascii="Georgia" w:hAnsi="Georgia" w:eastAsia="Georgia" w:cs="Georgia"/>
+          <w:b w:val="0"/>
+          <w:i w:val="0"/>
           <w:sz w:val="22"/>
         </w:rPr>
         <w:t>Thank you ❤️ I get so overwhelmed now and find myself having panic attack attacks all the time. I’m just trying to take it one day at a time.</w:t>

</xml_diff>

<commit_message>
Appendix C labels: Page 01, - Caption N, > Comment N with body under each
</commit_message>
<xml_diff>
--- a/thesis/Thesis_Instagram_MH_v15.docx
+++ b/thesis/Thesis_Instagram_MH_v15.docx
@@ -8452,7 +8452,6 @@
         <w:rPr>
           <w:rFonts w:ascii="Georgia" w:hAnsi="Georgia" w:eastAsia="Georgia" w:cs="Georgia"/>
           <w:b/>
-          <w:i w:val="0"/>
           <w:sz w:val="24"/>
         </w:rPr>
         <w:t>APPENDIX C: CORPUS OF CAPTIONS AND COMMENTS</w:t>
@@ -8468,10 +8467,9 @@
         <w:rPr>
           <w:rFonts w:ascii="Georgia" w:hAnsi="Georgia" w:eastAsia="Georgia" w:cs="Georgia"/>
           <w:b w:val="0"/>
-          <w:i w:val="0"/>
-          <w:sz w:val="22"/>
-        </w:rPr>
-        <w:t>This appendix presents the final corpus analyzed in the study for transparency. It comprises 30 English-language captions from six anonymized public mental health advocacy pages and two eligible comments under each caption (60 comments). Page identities are withheld. Entries are grouped by anonymized page, then by caption, with the two selected comments listed under each caption. Usernames and other direct personal identifiers were redacted where they appeared. Emoji and hashtags are retained when they formed part of the visible public text.</w:t>
+          <w:sz w:val="22"/>
+        </w:rPr>
+        <w:t>This appendix presents the final corpus analyzed in the study for transparency. It comprises 30 English-language captions from six anonymized public mental health advocacy pages and two eligible comments under each caption (60 comments). Page identities are withheld. Entries are grouped by anonymized page. Under each page, captions are listed with their two selected comments. Usernames and other direct personal identifiers were redacted where they appeared.</w:t>
       </w:r>
     </w:p>
     <w:p>
@@ -8484,7 +8482,6 @@
         <w:rPr>
           <w:rFonts w:ascii="Georgia" w:hAnsi="Georgia" w:eastAsia="Georgia" w:cs="Georgia"/>
           <w:b/>
-          <w:i w:val="0"/>
           <w:sz w:val="24"/>
         </w:rPr>
         <w:t>Page 01</w:t>
@@ -8500,10 +8497,9 @@
         <w:rPr>
           <w:rFonts w:ascii="Georgia" w:hAnsi="Georgia" w:eastAsia="Georgia" w:cs="Georgia"/>
           <w:b/>
-          <w:i w:val="0"/>
-          <w:sz w:val="22"/>
-        </w:rPr>
-        <w:t>Caption 1</w:t>
+          <w:sz w:val="22"/>
+        </w:rPr>
+        <w:t>- Caption 1</w:t>
       </w:r>
     </w:p>
     <w:p>
@@ -8516,7 +8512,6 @@
         <w:rPr>
           <w:rFonts w:ascii="Georgia" w:hAnsi="Georgia" w:eastAsia="Georgia" w:cs="Georgia"/>
           <w:b w:val="0"/>
-          <w:i w:val="0"/>
           <w:sz w:val="22"/>
         </w:rPr>
         <w:t>Art 🤝 Mental Health I’m so grateful to represent ████████ as an ambassador, and be here at NAMICon drawing live ✍️ I’ve met so many amazing people so far, and feel very lucky to have a platform where I can help destigmatize mental illness, and show others how art can be a therapeutic and helpful tool for navigating life. #mentalhealthawareness #artandmentalhealth #arttherapy</w:t>
@@ -8532,10 +8527,9 @@
         <w:rPr>
           <w:rFonts w:ascii="Georgia" w:hAnsi="Georgia" w:eastAsia="Georgia" w:cs="Georgia"/>
           <w:b/>
-          <w:i w:val="0"/>
-          <w:sz w:val="22"/>
-        </w:rPr>
-        <w:t>Comment 1</w:t>
+          <w:sz w:val="22"/>
+        </w:rPr>
+        <w:t>&gt; Comment 1</w:t>
       </w:r>
     </w:p>
     <w:p>
@@ -8548,7 +8542,6 @@
         <w:rPr>
           <w:rFonts w:ascii="Georgia" w:hAnsi="Georgia" w:eastAsia="Georgia" w:cs="Georgia"/>
           <w:b w:val="0"/>
-          <w:i w:val="0"/>
           <w:sz w:val="22"/>
         </w:rPr>
         <w:t>We love the way you’re involving the audience in your art, what a great way to encourage community! We can’t wait to unveil your beautiful work on the Firehouse walls.</w:t>
@@ -8564,10 +8557,9 @@
         <w:rPr>
           <w:rFonts w:ascii="Georgia" w:hAnsi="Georgia" w:eastAsia="Georgia" w:cs="Georgia"/>
           <w:b/>
-          <w:i w:val="0"/>
-          <w:sz w:val="22"/>
-        </w:rPr>
-        <w:t>Comment 2</w:t>
+          <w:sz w:val="22"/>
+        </w:rPr>
+        <w:t>&gt; Comment 2</w:t>
       </w:r>
     </w:p>
     <w:p>
@@ -8580,7 +8572,6 @@
         <w:rPr>
           <w:rFonts w:ascii="Georgia" w:hAnsi="Georgia" w:eastAsia="Georgia" w:cs="Georgia"/>
           <w:b w:val="0"/>
-          <w:i w:val="0"/>
           <w:sz w:val="22"/>
         </w:rPr>
         <w:t>Love this concept! The connection between art and mental health can be powerful!</w:t>
@@ -8596,10 +8587,9 @@
         <w:rPr>
           <w:rFonts w:ascii="Georgia" w:hAnsi="Georgia" w:eastAsia="Georgia" w:cs="Georgia"/>
           <w:b/>
-          <w:i w:val="0"/>
-          <w:sz w:val="22"/>
-        </w:rPr>
-        <w:t>Caption 2</w:t>
+          <w:sz w:val="22"/>
+        </w:rPr>
+        <w:t>- Caption 2</w:t>
       </w:r>
     </w:p>
     <w:p>
@@ -8612,7 +8602,6 @@
         <w:rPr>
           <w:rFonts w:ascii="Georgia" w:hAnsi="Georgia" w:eastAsia="Georgia" w:cs="Georgia"/>
           <w:b w:val="0"/>
-          <w:i w:val="0"/>
           <w:sz w:val="22"/>
         </w:rPr>
         <w:t>Every day won't look or feel perfect, and that's okay. Remember, it's okay to not be okay!</w:t>
@@ -8628,10 +8617,9 @@
         <w:rPr>
           <w:rFonts w:ascii="Georgia" w:hAnsi="Georgia" w:eastAsia="Georgia" w:cs="Georgia"/>
           <w:b/>
-          <w:i w:val="0"/>
-          <w:sz w:val="22"/>
-        </w:rPr>
-        <w:t>Comment 1</w:t>
+          <w:sz w:val="22"/>
+        </w:rPr>
+        <w:t>&gt; Comment 1</w:t>
       </w:r>
     </w:p>
     <w:p>
@@ -8644,7 +8632,6 @@
         <w:rPr>
           <w:rFonts w:ascii="Georgia" w:hAnsi="Georgia" w:eastAsia="Georgia" w:cs="Georgia"/>
           <w:b w:val="0"/>
-          <w:i w:val="0"/>
           <w:sz w:val="22"/>
         </w:rPr>
         <w:t>Tell someone! You don’t have to be alone! Be aware of those around you who might be suffering in silence. Wait with them...</w:t>
@@ -8660,10 +8647,9 @@
         <w:rPr>
           <w:rFonts w:ascii="Georgia" w:hAnsi="Georgia" w:eastAsia="Georgia" w:cs="Georgia"/>
           <w:b/>
-          <w:i w:val="0"/>
-          <w:sz w:val="22"/>
-        </w:rPr>
-        <w:t>Comment 2</w:t>
+          <w:sz w:val="22"/>
+        </w:rPr>
+        <w:t>&gt; Comment 2</w:t>
       </w:r>
     </w:p>
     <w:p>
@@ -8676,7 +8662,6 @@
         <w:rPr>
           <w:rFonts w:ascii="Georgia" w:hAnsi="Georgia" w:eastAsia="Georgia" w:cs="Georgia"/>
           <w:b w:val="0"/>
-          <w:i w:val="0"/>
           <w:sz w:val="22"/>
         </w:rPr>
         <w:t>When she have episodes, times like this are so hard but we will keep pushing until her next better days.</w:t>
@@ -8692,10 +8677,9 @@
         <w:rPr>
           <w:rFonts w:ascii="Georgia" w:hAnsi="Georgia" w:eastAsia="Georgia" w:cs="Georgia"/>
           <w:b/>
-          <w:i w:val="0"/>
-          <w:sz w:val="22"/>
-        </w:rPr>
-        <w:t>Caption 3</w:t>
+          <w:sz w:val="22"/>
+        </w:rPr>
+        <w:t>- Caption 3</w:t>
       </w:r>
     </w:p>
     <w:p>
@@ -8708,7 +8692,6 @@
         <w:rPr>
           <w:rFonts w:ascii="Georgia" w:hAnsi="Georgia" w:eastAsia="Georgia" w:cs="Georgia"/>
           <w:b w:val="0"/>
-          <w:i w:val="0"/>
           <w:sz w:val="22"/>
         </w:rPr>
         <w:t>Remember to be kind, to be patient, and don’t be afraid to have open conversations on #WorldSchizophreniaDay. It’s how we continue to destigmatize mental illness and help one another.</w:t>
@@ -8724,10 +8707,9 @@
         <w:rPr>
           <w:rFonts w:ascii="Georgia" w:hAnsi="Georgia" w:eastAsia="Georgia" w:cs="Georgia"/>
           <w:b/>
-          <w:i w:val="0"/>
-          <w:sz w:val="22"/>
-        </w:rPr>
-        <w:t>Comment 1</w:t>
+          <w:sz w:val="22"/>
+        </w:rPr>
+        <w:t>&gt; Comment 1</w:t>
       </w:r>
     </w:p>
     <w:p>
@@ -8740,7 +8722,6 @@
         <w:rPr>
           <w:rFonts w:ascii="Georgia" w:hAnsi="Georgia" w:eastAsia="Georgia" w:cs="Georgia"/>
           <w:b w:val="0"/>
-          <w:i w:val="0"/>
           <w:sz w:val="22"/>
         </w:rPr>
         <w:t>My husband has schizophrenia, he is suicidal. He has completely lost touch with reality and does not trust anyone at all. At the moment we are trying to find him so he can be helped.</w:t>
@@ -8756,10 +8737,9 @@
         <w:rPr>
           <w:rFonts w:ascii="Georgia" w:hAnsi="Georgia" w:eastAsia="Georgia" w:cs="Georgia"/>
           <w:b/>
-          <w:i w:val="0"/>
-          <w:sz w:val="22"/>
-        </w:rPr>
-        <w:t>Comment 2</w:t>
+          <w:sz w:val="22"/>
+        </w:rPr>
+        <w:t>&gt; Comment 2</w:t>
       </w:r>
     </w:p>
     <w:p>
@@ -8772,7 +8752,6 @@
         <w:rPr>
           <w:rFonts w:ascii="Georgia" w:hAnsi="Georgia" w:eastAsia="Georgia" w:cs="Georgia"/>
           <w:b w:val="0"/>
-          <w:i w:val="0"/>
           <w:sz w:val="22"/>
         </w:rPr>
         <w:t>Don't be afraid to have that conversation is 🙌🏻 That's a step towards obliterating stigma around health.</w:t>
@@ -8788,10 +8767,9 @@
         <w:rPr>
           <w:rFonts w:ascii="Georgia" w:hAnsi="Georgia" w:eastAsia="Georgia" w:cs="Georgia"/>
           <w:b/>
-          <w:i w:val="0"/>
-          <w:sz w:val="22"/>
-        </w:rPr>
-        <w:t>Caption 4</w:t>
+          <w:sz w:val="22"/>
+        </w:rPr>
+        <w:t>- Caption 4</w:t>
       </w:r>
     </w:p>
     <w:p>
@@ -8804,7 +8782,6 @@
         <w:rPr>
           <w:rFonts w:ascii="Georgia" w:hAnsi="Georgia" w:eastAsia="Georgia" w:cs="Georgia"/>
           <w:b w:val="0"/>
-          <w:i w:val="0"/>
           <w:sz w:val="22"/>
         </w:rPr>
         <w:t>Small steps lead to big progress. Focus on the little victories that pave the way for meaningful change. #TakeAMentalHealthMoment #MentalHealthMonth</w:t>
@@ -8820,10 +8797,9 @@
         <w:rPr>
           <w:rFonts w:ascii="Georgia" w:hAnsi="Georgia" w:eastAsia="Georgia" w:cs="Georgia"/>
           <w:b/>
-          <w:i w:val="0"/>
-          <w:sz w:val="22"/>
-        </w:rPr>
-        <w:t>Comment 1</w:t>
+          <w:sz w:val="22"/>
+        </w:rPr>
+        <w:t>&gt; Comment 1</w:t>
       </w:r>
     </w:p>
     <w:p>
@@ -8836,7 +8812,6 @@
         <w:rPr>
           <w:rFonts w:ascii="Georgia" w:hAnsi="Georgia" w:eastAsia="Georgia" w:cs="Georgia"/>
           <w:b w:val="0"/>
-          <w:i w:val="0"/>
           <w:sz w:val="22"/>
         </w:rPr>
         <w:t>Small steps everyday forever. Recovery and mental health is an ongoing effort.</w:t>
@@ -8852,10 +8827,9 @@
         <w:rPr>
           <w:rFonts w:ascii="Georgia" w:hAnsi="Georgia" w:eastAsia="Georgia" w:cs="Georgia"/>
           <w:b/>
-          <w:i w:val="0"/>
-          <w:sz w:val="22"/>
-        </w:rPr>
-        <w:t>Comment 2</w:t>
+          <w:sz w:val="22"/>
+        </w:rPr>
+        <w:t>&gt; Comment 2</w:t>
       </w:r>
     </w:p>
     <w:p>
@@ -8868,7 +8842,6 @@
         <w:rPr>
           <w:rFonts w:ascii="Georgia" w:hAnsi="Georgia" w:eastAsia="Georgia" w:cs="Georgia"/>
           <w:b w:val="0"/>
-          <w:i w:val="0"/>
           <w:sz w:val="22"/>
         </w:rPr>
         <w:t>It is important to celebrate the “ small “ steps forward! They can provide a source of hope as well.</w:t>
@@ -8884,10 +8857,9 @@
         <w:rPr>
           <w:rFonts w:ascii="Georgia" w:hAnsi="Georgia" w:eastAsia="Georgia" w:cs="Georgia"/>
           <w:b/>
-          <w:i w:val="0"/>
-          <w:sz w:val="22"/>
-        </w:rPr>
-        <w:t>Caption 5</w:t>
+          <w:sz w:val="22"/>
+        </w:rPr>
+        <w:t>- Caption 5</w:t>
       </w:r>
     </w:p>
     <w:p>
@@ -8900,7 +8872,6 @@
         <w:rPr>
           <w:rFonts w:ascii="Georgia" w:hAnsi="Georgia" w:eastAsia="Georgia" w:cs="Georgia"/>
           <w:b w:val="0"/>
-          <w:i w:val="0"/>
           <w:sz w:val="22"/>
         </w:rPr>
         <w:t>It's our favorite month of the year! Join us this #MentalHealthAwarenessMonth by agreeing to #TakeTheMoment to prioritize your mental health. Discover our range of signature programs and resources, including NAMI Basics, NAMI Family-to-Family, NAMI Homefront, and more! Learn more about getting engaged this month at nami.org/mham</w:t>
@@ -8916,10 +8887,9 @@
         <w:rPr>
           <w:rFonts w:ascii="Georgia" w:hAnsi="Georgia" w:eastAsia="Georgia" w:cs="Georgia"/>
           <w:b/>
-          <w:i w:val="0"/>
-          <w:sz w:val="22"/>
-        </w:rPr>
-        <w:t>Comment 1</w:t>
+          <w:sz w:val="22"/>
+        </w:rPr>
+        <w:t>&gt; Comment 1</w:t>
       </w:r>
     </w:p>
     <w:p>
@@ -8932,7 +8902,6 @@
         <w:rPr>
           <w:rFonts w:ascii="Georgia" w:hAnsi="Georgia" w:eastAsia="Georgia" w:cs="Georgia"/>
           <w:b w:val="0"/>
-          <w:i w:val="0"/>
           <w:sz w:val="22"/>
         </w:rPr>
         <w:t>❤️ My youngest was recently diagnosed with bi-polar 1 I’m taking the family to family class offered and educating myself the best I can</w:t>
@@ -8948,10 +8917,9 @@
         <w:rPr>
           <w:rFonts w:ascii="Georgia" w:hAnsi="Georgia" w:eastAsia="Georgia" w:cs="Georgia"/>
           <w:b/>
-          <w:i w:val="0"/>
-          <w:sz w:val="22"/>
-        </w:rPr>
-        <w:t>Comment 2</w:t>
+          <w:sz w:val="22"/>
+        </w:rPr>
+        <w:t>&gt; Comment 2</w:t>
       </w:r>
     </w:p>
     <w:p>
@@ -8964,7 +8932,6 @@
         <w:rPr>
           <w:rFonts w:ascii="Georgia" w:hAnsi="Georgia" w:eastAsia="Georgia" w:cs="Georgia"/>
           <w:b w:val="0"/>
-          <w:i w:val="0"/>
           <w:sz w:val="22"/>
         </w:rPr>
         <w:t>May I be blessed that I was once mentally ill, suicidal and ignorant of life, May I take the time this May to re-mind myself of just how lucky I am and offer my support to those that are not xxx #MentalHealthAwareness #MentalHealthMatters #SelfCare #Mindfulness #Spirituality #meditation #PersonalGrowth #Motivation #Inspiration #Anxiety #Depression #MindAndBody #awakening #kundalini #Mana #manampwr</w:t>
@@ -8980,10 +8947,9 @@
         <w:rPr>
           <w:rFonts w:ascii="Georgia" w:hAnsi="Georgia" w:eastAsia="Georgia" w:cs="Georgia"/>
           <w:b/>
-          <w:i w:val="0"/>
-          <w:sz w:val="22"/>
-        </w:rPr>
-        <w:t>Caption 6</w:t>
+          <w:sz w:val="22"/>
+        </w:rPr>
+        <w:t>- Caption 6</w:t>
       </w:r>
     </w:p>
     <w:p>
@@ -8996,7 +8962,6 @@
         <w:rPr>
           <w:rFonts w:ascii="Georgia" w:hAnsi="Georgia" w:eastAsia="Georgia" w:cs="Georgia"/>
           <w:b w:val="0"/>
-          <w:i w:val="0"/>
           <w:sz w:val="22"/>
         </w:rPr>
         <w:t>Embrace your greatness unapologetically! It all starts with how we think and talk about ourselves.</w:t>
@@ -9012,10 +8977,9 @@
         <w:rPr>
           <w:rFonts w:ascii="Georgia" w:hAnsi="Georgia" w:eastAsia="Georgia" w:cs="Georgia"/>
           <w:b/>
-          <w:i w:val="0"/>
-          <w:sz w:val="22"/>
-        </w:rPr>
-        <w:t>Comment 1</w:t>
+          <w:sz w:val="22"/>
+        </w:rPr>
+        <w:t>&gt; Comment 1</w:t>
       </w:r>
     </w:p>
     <w:p>
@@ -9028,7 +8992,6 @@
         <w:rPr>
           <w:rFonts w:ascii="Georgia" w:hAnsi="Georgia" w:eastAsia="Georgia" w:cs="Georgia"/>
           <w:b w:val="0"/>
-          <w:i w:val="0"/>
           <w:sz w:val="22"/>
         </w:rPr>
         <w:t>Speaking positively about ourselves helps boost self-esteem and self-confidence. When we acknowledge our strengths, accomplishments, and positive qualities, we reinforce a positive self-image and develop a greater sense of self-worth.</w:t>
@@ -9044,10 +9007,9 @@
         <w:rPr>
           <w:rFonts w:ascii="Georgia" w:hAnsi="Georgia" w:eastAsia="Georgia" w:cs="Georgia"/>
           <w:b/>
-          <w:i w:val="0"/>
-          <w:sz w:val="22"/>
-        </w:rPr>
-        <w:t>Comment 2</w:t>
+          <w:sz w:val="22"/>
+        </w:rPr>
+        <w:t>&gt; Comment 2</w:t>
       </w:r>
     </w:p>
     <w:p>
@@ -9060,7 +9022,6 @@
         <w:rPr>
           <w:rFonts w:ascii="Georgia" w:hAnsi="Georgia" w:eastAsia="Georgia" w:cs="Georgia"/>
           <w:b w:val="0"/>
-          <w:i w:val="0"/>
           <w:sz w:val="22"/>
         </w:rPr>
         <w:t>Even if you don’t believe what you’re saying at first...keep doing it till it feels natural and true. If it worked for me, it can work for you.❤️</w:t>
@@ -9076,7 +9037,6 @@
         <w:rPr>
           <w:rFonts w:ascii="Georgia" w:hAnsi="Georgia" w:eastAsia="Georgia" w:cs="Georgia"/>
           <w:b/>
-          <w:i w:val="0"/>
           <w:sz w:val="24"/>
         </w:rPr>
         <w:t>Page 02</w:t>
@@ -9092,10 +9052,9 @@
         <w:rPr>
           <w:rFonts w:ascii="Georgia" w:hAnsi="Georgia" w:eastAsia="Georgia" w:cs="Georgia"/>
           <w:b/>
-          <w:i w:val="0"/>
-          <w:sz w:val="22"/>
-        </w:rPr>
-        <w:t>Caption 1</w:t>
+          <w:sz w:val="22"/>
+        </w:rPr>
+        <w:t>- Caption 1</w:t>
       </w:r>
     </w:p>
     <w:p>
@@ -9108,7 +9067,6 @@
         <w:rPr>
           <w:rFonts w:ascii="Georgia" w:hAnsi="Georgia" w:eastAsia="Georgia" w:cs="Georgia"/>
           <w:b w:val="0"/>
-          <w:i w:val="0"/>
           <w:sz w:val="22"/>
         </w:rPr>
         <w:t>Change is natural. 🍂 Think about the changing seasons. Every fall, the leaves on the trees change color and eventually fall to the ground. In the winter, the trees rest. And when spring and summer return, they blossom again. As the leaves continue to change color and the days get a little crisper, remember that it’s okay if you’re changing, too. Whether you’re letting go of something that doesn’t serve you anymore or taking new actions for your mental health, change is okay. Remember: it’s about progress and growth, not perfection. Have a restful weekend, friends. 🧡</w:t>
@@ -9124,10 +9082,9 @@
         <w:rPr>
           <w:rFonts w:ascii="Georgia" w:hAnsi="Georgia" w:eastAsia="Georgia" w:cs="Georgia"/>
           <w:b/>
-          <w:i w:val="0"/>
-          <w:sz w:val="22"/>
-        </w:rPr>
-        <w:t>Comment 1</w:t>
+          <w:sz w:val="22"/>
+        </w:rPr>
+        <w:t>&gt; Comment 1</w:t>
       </w:r>
     </w:p>
     <w:p>
@@ -9140,7 +9097,6 @@
         <w:rPr>
           <w:rFonts w:ascii="Georgia" w:hAnsi="Georgia" w:eastAsia="Georgia" w:cs="Georgia"/>
           <w:b w:val="0"/>
-          <w:i w:val="0"/>
           <w:sz w:val="22"/>
         </w:rPr>
         <w:t>Sometimes we reactively put up a fight to change when it can be as natural as the seasons 😌 thanks for that reminder 🍁🍂</w:t>
@@ -9156,10 +9112,9 @@
         <w:rPr>
           <w:rFonts w:ascii="Georgia" w:hAnsi="Georgia" w:eastAsia="Georgia" w:cs="Georgia"/>
           <w:b/>
-          <w:i w:val="0"/>
-          <w:sz w:val="22"/>
-        </w:rPr>
-        <w:t>Comment 2</w:t>
+          <w:sz w:val="22"/>
+        </w:rPr>
+        <w:t>&gt; Comment 2</w:t>
       </w:r>
     </w:p>
     <w:p>
@@ -9172,7 +9127,6 @@
         <w:rPr>
           <w:rFonts w:ascii="Georgia" w:hAnsi="Georgia" w:eastAsia="Georgia" w:cs="Georgia"/>
           <w:b w:val="0"/>
-          <w:i w:val="0"/>
           <w:sz w:val="22"/>
         </w:rPr>
         <w:t>Such a beautiful reflection nature reminds us that change isn’t something to fear, it’s part of renewal. Letting go creates space for something new to grow. Here’s to embracing every season, even the ones that feel uncertain — they all have</w:t>
@@ -9188,10 +9142,9 @@
         <w:rPr>
           <w:rFonts w:ascii="Georgia" w:hAnsi="Georgia" w:eastAsia="Georgia" w:cs="Georgia"/>
           <w:b/>
-          <w:i w:val="0"/>
-          <w:sz w:val="22"/>
-        </w:rPr>
-        <w:t>Caption 2</w:t>
+          <w:sz w:val="22"/>
+        </w:rPr>
+        <w:t>- Caption 2</w:t>
       </w:r>
     </w:p>
     <w:p>
@@ -9204,7 +9157,6 @@
         <w:rPr>
           <w:rFonts w:ascii="Georgia" w:hAnsi="Georgia" w:eastAsia="Georgia" w:cs="Georgia"/>
           <w:b w:val="0"/>
-          <w:i w:val="0"/>
           <w:sz w:val="22"/>
         </w:rPr>
         <w:t>Stop us if you’ve heard these mental health myths before... ☝️🤓 We’re living in a time where all the information in the world is just a few swipes away. But is that information always reliable? This #MentalIllnessAwarenessWeek, we’re debunking the mental health myths you’ve probably seen or heard with scientifically-backed research and data. We all have mental health - let’s keep talking about it.</w:t>
@@ -9220,10 +9172,9 @@
         <w:rPr>
           <w:rFonts w:ascii="Georgia" w:hAnsi="Georgia" w:eastAsia="Georgia" w:cs="Georgia"/>
           <w:b/>
-          <w:i w:val="0"/>
-          <w:sz w:val="22"/>
-        </w:rPr>
-        <w:t>Comment 1</w:t>
+          <w:sz w:val="22"/>
+        </w:rPr>
+        <w:t>&gt; Comment 1</w:t>
       </w:r>
     </w:p>
     <w:p>
@@ -9236,7 +9187,6 @@
         <w:rPr>
           <w:rFonts w:ascii="Georgia" w:hAnsi="Georgia" w:eastAsia="Georgia" w:cs="Georgia"/>
           <w:b w:val="0"/>
-          <w:i w:val="0"/>
           <w:sz w:val="22"/>
         </w:rPr>
         <w:t>Absolutely! 👏 There’s so much misinformation out there, that’s why education and open conversations are key. The more we normalize real mental health facts, the more people get the help they deserve. 💙</w:t>
@@ -9252,10 +9202,9 @@
         <w:rPr>
           <w:rFonts w:ascii="Georgia" w:hAnsi="Georgia" w:eastAsia="Georgia" w:cs="Georgia"/>
           <w:b/>
-          <w:i w:val="0"/>
-          <w:sz w:val="22"/>
-        </w:rPr>
-        <w:t>Comment 2</w:t>
+          <w:sz w:val="22"/>
+        </w:rPr>
+        <w:t>&gt; Comment 2</w:t>
       </w:r>
     </w:p>
     <w:p>
@@ -9268,7 +9217,6 @@
         <w:rPr>
           <w:rFonts w:ascii="Georgia" w:hAnsi="Georgia" w:eastAsia="Georgia" w:cs="Georgia"/>
           <w:b w:val="0"/>
-          <w:i w:val="0"/>
           <w:sz w:val="22"/>
         </w:rPr>
         <w:t>We are so with you on this! Debunking myths like 'mental illness is a sign of weakness' is absolutely vital to fighting stigma. Thank you for reminding everyone to seek out science backed facts and keep talking about it.</w:t>
@@ -9284,10 +9232,9 @@
         <w:rPr>
           <w:rFonts w:ascii="Georgia" w:hAnsi="Georgia" w:eastAsia="Georgia" w:cs="Georgia"/>
           <w:b/>
-          <w:i w:val="0"/>
-          <w:sz w:val="22"/>
-        </w:rPr>
-        <w:t>Caption 3</w:t>
+          <w:sz w:val="22"/>
+        </w:rPr>
+        <w:t>- Caption 3</w:t>
       </w:r>
     </w:p>
     <w:p>
@@ -9300,7 +9247,6 @@
         <w:rPr>
           <w:rFonts w:ascii="Georgia" w:hAnsi="Georgia" w:eastAsia="Georgia" w:cs="Georgia"/>
           <w:b w:val="0"/>
-          <w:i w:val="0"/>
           <w:sz w:val="22"/>
         </w:rPr>
         <w:t>This week, practice making a home for all the parts of you that need to be loved, even the difficult ones. Every part of you deserves love and care. 🧡</w:t>
@@ -9316,10 +9262,9 @@
         <w:rPr>
           <w:rFonts w:ascii="Georgia" w:hAnsi="Georgia" w:eastAsia="Georgia" w:cs="Georgia"/>
           <w:b/>
-          <w:i w:val="0"/>
-          <w:sz w:val="22"/>
-        </w:rPr>
-        <w:t>Comment 1</w:t>
+          <w:sz w:val="22"/>
+        </w:rPr>
+        <w:t>&gt; Comment 1</w:t>
       </w:r>
     </w:p>
     <w:p>
@@ -9332,7 +9277,6 @@
         <w:rPr>
           <w:rFonts w:ascii="Georgia" w:hAnsi="Georgia" w:eastAsia="Georgia" w:cs="Georgia"/>
           <w:b w:val="0"/>
-          <w:i w:val="0"/>
           <w:sz w:val="22"/>
         </w:rPr>
         <w:t>Each chapter of who you are is worthy of care and compassion 💕🌱 Growth doesn’t erase your past, it teaches you to love it too.</w:t>
@@ -9348,10 +9292,9 @@
         <w:rPr>
           <w:rFonts w:ascii="Georgia" w:hAnsi="Georgia" w:eastAsia="Georgia" w:cs="Georgia"/>
           <w:b/>
-          <w:i w:val="0"/>
-          <w:sz w:val="22"/>
-        </w:rPr>
-        <w:t>Comment 2</w:t>
+          <w:sz w:val="22"/>
+        </w:rPr>
+        <w:t>&gt; Comment 2</w:t>
       </w:r>
     </w:p>
     <w:p>
@@ -9364,7 +9307,6 @@
         <w:rPr>
           <w:rFonts w:ascii="Georgia" w:hAnsi="Georgia" w:eastAsia="Georgia" w:cs="Georgia"/>
           <w:b w:val="0"/>
-          <w:i w:val="0"/>
           <w:sz w:val="22"/>
         </w:rPr>
         <w:t>Even the messy, difficult parts of us need compassion. Learning to love all of ourselves is where real healing starts</w:t>
@@ -9380,10 +9322,9 @@
         <w:rPr>
           <w:rFonts w:ascii="Georgia" w:hAnsi="Georgia" w:eastAsia="Georgia" w:cs="Georgia"/>
           <w:b/>
-          <w:i w:val="0"/>
-          <w:sz w:val="22"/>
-        </w:rPr>
-        <w:t>Caption 4</w:t>
+          <w:sz w:val="22"/>
+        </w:rPr>
+        <w:t>- Caption 4</w:t>
       </w:r>
     </w:p>
     <w:p>
@@ -9396,7 +9337,6 @@
         <w:rPr>
           <w:rFonts w:ascii="Georgia" w:hAnsi="Georgia" w:eastAsia="Georgia" w:cs="Georgia"/>
           <w:b w:val="0"/>
-          <w:i w:val="0"/>
           <w:sz w:val="22"/>
         </w:rPr>
         <w:t>When you get caught in an anxiety loop, it’s easy to let hypotheticals bog down your mind. Reframing your “what ifs?” positively can help you stay grounded in those hard moments. You can get through this. 🧡</w:t>
@@ -9412,10 +9352,9 @@
         <w:rPr>
           <w:rFonts w:ascii="Georgia" w:hAnsi="Georgia" w:eastAsia="Georgia" w:cs="Georgia"/>
           <w:b/>
-          <w:i w:val="0"/>
-          <w:sz w:val="22"/>
-        </w:rPr>
-        <w:t>Comment 1</w:t>
+          <w:sz w:val="22"/>
+        </w:rPr>
+        <w:t>&gt; Comment 1</w:t>
       </w:r>
     </w:p>
     <w:p>
@@ -9428,7 +9367,6 @@
         <w:rPr>
           <w:rFonts w:ascii="Georgia" w:hAnsi="Georgia" w:eastAsia="Georgia" w:cs="Georgia"/>
           <w:b w:val="0"/>
-          <w:i w:val="0"/>
           <w:sz w:val="22"/>
         </w:rPr>
         <w:t>Thank you for your kind words of encouragement it can and will work out to the person reading this know that you have a beautiful gift in your soul that you can share and shine in the world to illuminate it with your kind heart</w:t>
@@ -9444,10 +9382,9 @@
         <w:rPr>
           <w:rFonts w:ascii="Georgia" w:hAnsi="Georgia" w:eastAsia="Georgia" w:cs="Georgia"/>
           <w:b/>
-          <w:i w:val="0"/>
-          <w:sz w:val="22"/>
-        </w:rPr>
-        <w:t>Comment 2</w:t>
+          <w:sz w:val="22"/>
+        </w:rPr>
+        <w:t>&gt; Comment 2</w:t>
       </w:r>
     </w:p>
     <w:p>
@@ -9460,7 +9397,6 @@
         <w:rPr>
           <w:rFonts w:ascii="Georgia" w:hAnsi="Georgia" w:eastAsia="Georgia" w:cs="Georgia"/>
           <w:b w:val="0"/>
-          <w:i w:val="0"/>
           <w:sz w:val="22"/>
         </w:rPr>
         <w:t>Thank you for bringing this up—it’s such an important reminder. After 23 years in mental health and working with high performing clients, I’ve seen how anxiety loops drain both focus and energy. In my private practice, I often guide clients to reframe ‘what if’ thinking into ‘even if’ or ‘what’s within my control.’ That simple shift interrupts the cycle and brings the mind back to the present. Reframing isn’t about ignoring fear—it’s about reclaiming agency</w:t>
@@ -9476,10 +9412,9 @@
         <w:rPr>
           <w:rFonts w:ascii="Georgia" w:hAnsi="Georgia" w:eastAsia="Georgia" w:cs="Georgia"/>
           <w:b/>
-          <w:i w:val="0"/>
-          <w:sz w:val="22"/>
-        </w:rPr>
-        <w:t>Caption 5</w:t>
+          <w:sz w:val="22"/>
+        </w:rPr>
+        <w:t>- Caption 5</w:t>
       </w:r>
     </w:p>
     <w:p>
@@ -9492,7 +9427,6 @@
         <w:rPr>
           <w:rFonts w:ascii="Georgia" w:hAnsi="Georgia" w:eastAsia="Georgia" w:cs="Georgia"/>
           <w:b w:val="0"/>
-          <w:i w:val="0"/>
           <w:sz w:val="22"/>
         </w:rPr>
         <w:t>If facing tomorrow feels impossible, please know you’re not alone. We hope you stay, and we want you to get the support you deserve. As Suicide Prevention Month kicks off this September, Mental Health America and To Write Love on Her Arms want you to know that there are places to turn when the heaviness feels unbearable. Mental Health America’s free and confidential online mental health tests can help you understand what you’re experiencing and will walk you step by step through what it looks like to ask for help, and ████████’s crisis resource page can help you find a comprehensive list of places to turn in a moment of need. Find these resources and more at the 🔗 in our bio.</w:t>
@@ -9508,10 +9442,9 @@
         <w:rPr>
           <w:rFonts w:ascii="Georgia" w:hAnsi="Georgia" w:eastAsia="Georgia" w:cs="Georgia"/>
           <w:b/>
-          <w:i w:val="0"/>
-          <w:sz w:val="22"/>
-        </w:rPr>
-        <w:t>Comment 1</w:t>
+          <w:sz w:val="22"/>
+        </w:rPr>
+        <w:t>&gt; Comment 1</w:t>
       </w:r>
     </w:p>
     <w:p>
@@ -9524,7 +9457,6 @@
         <w:rPr>
           <w:rFonts w:ascii="Georgia" w:hAnsi="Georgia" w:eastAsia="Georgia" w:cs="Georgia"/>
           <w:b w:val="0"/>
-          <w:i w:val="0"/>
           <w:sz w:val="22"/>
         </w:rPr>
         <w:t>We believe healing can begin in connection, whether through community, the water, or simply reaching out for support.</w:t>
@@ -9540,10 +9472,9 @@
         <w:rPr>
           <w:rFonts w:ascii="Georgia" w:hAnsi="Georgia" w:eastAsia="Georgia" w:cs="Georgia"/>
           <w:b/>
-          <w:i w:val="0"/>
-          <w:sz w:val="22"/>
-        </w:rPr>
-        <w:t>Comment 2</w:t>
+          <w:sz w:val="22"/>
+        </w:rPr>
+        <w:t>&gt; Comment 2</w:t>
       </w:r>
     </w:p>
     <w:p>
@@ -9556,7 +9487,6 @@
         <w:rPr>
           <w:rFonts w:ascii="Georgia" w:hAnsi="Georgia" w:eastAsia="Georgia" w:cs="Georgia"/>
           <w:b w:val="0"/>
-          <w:i w:val="0"/>
           <w:sz w:val="22"/>
         </w:rPr>
         <w:t>I've had a rough month with my depression. Hanging on by a thread. Then I get a letter that my phycologist is retiring. UGH It's been one thing after another 😳</w:t>
@@ -9572,10 +9502,9 @@
         <w:rPr>
           <w:rFonts w:ascii="Georgia" w:hAnsi="Georgia" w:eastAsia="Georgia" w:cs="Georgia"/>
           <w:b/>
-          <w:i w:val="0"/>
-          <w:sz w:val="22"/>
-        </w:rPr>
-        <w:t>Caption 6</w:t>
+          <w:sz w:val="22"/>
+        </w:rPr>
+        <w:t>- Caption 6</w:t>
       </w:r>
     </w:p>
     <w:p>
@@ -9588,7 +9517,6 @@
         <w:rPr>
           <w:rFonts w:ascii="Georgia" w:hAnsi="Georgia" w:eastAsia="Georgia" w:cs="Georgia"/>
           <w:b w:val="0"/>
-          <w:i w:val="0"/>
           <w:sz w:val="22"/>
         </w:rPr>
         <w:t>Content warning: This post discusses suicide. You deserve to live a life full of joy, peace, love, and adventure. This life is worth living. Each September, #SuicidePreventionMonth calls on each of us to consider our role in preventing suicide and to raise awareness of available resources and support options, like @988lifeline and @crisistextline. If you’re struggling with your mental health and you’re not sure where to start, taking a mental health test is a gentle first step. Mental Health America’s free and anonymous online tests can help you understand what you’re experiencing and what steps you can take before you reach a point of crisis. Take a test today at the 🔗 in our bio. If you or someone you know is in crisis, please know that help is available. Call or text 988 or chat online at 988lifeline.org. You can also reach a trained counselor at Crisis Text Line by texting HOME to 741741. Thank you for staying. 🧡</w:t>
@@ -9604,10 +9532,9 @@
         <w:rPr>
           <w:rFonts w:ascii="Georgia" w:hAnsi="Georgia" w:eastAsia="Georgia" w:cs="Georgia"/>
           <w:b/>
-          <w:i w:val="0"/>
-          <w:sz w:val="22"/>
-        </w:rPr>
-        <w:t>Comment 1</w:t>
+          <w:sz w:val="22"/>
+        </w:rPr>
+        <w:t>&gt; Comment 1</w:t>
       </w:r>
     </w:p>
     <w:p>
@@ -9620,7 +9547,6 @@
         <w:rPr>
           <w:rFonts w:ascii="Georgia" w:hAnsi="Georgia" w:eastAsia="Georgia" w:cs="Georgia"/>
           <w:b w:val="0"/>
-          <w:i w:val="0"/>
           <w:sz w:val="22"/>
         </w:rPr>
         <w:t>It will be 5 years ago next Monday since I almost died and my daughter did CPR and saved my life ❤️ I’m grateful for every single day and thankful I’ve learned so much about myself and the importance of mental health!! Thank you for being here ❤️</w:t>
@@ -9636,10 +9562,9 @@
         <w:rPr>
           <w:rFonts w:ascii="Georgia" w:hAnsi="Georgia" w:eastAsia="Georgia" w:cs="Georgia"/>
           <w:b/>
-          <w:i w:val="0"/>
-          <w:sz w:val="22"/>
-        </w:rPr>
-        <w:t>Comment 2</w:t>
+          <w:sz w:val="22"/>
+        </w:rPr>
+        <w:t>&gt; Comment 2</w:t>
       </w:r>
     </w:p>
     <w:p>
@@ -9652,7 +9577,6 @@
         <w:rPr>
           <w:rFonts w:ascii="Georgia" w:hAnsi="Georgia" w:eastAsia="Georgia" w:cs="Georgia"/>
           <w:b w:val="0"/>
-          <w:i w:val="0"/>
           <w:sz w:val="22"/>
         </w:rPr>
         <w:t>I’ve had to call 988 once and thinking about that moment breaks me. I’m doing so much better and they did really help me gain my footing</w:t>
@@ -9668,10 +9592,9 @@
         <w:rPr>
           <w:rFonts w:ascii="Georgia" w:hAnsi="Georgia" w:eastAsia="Georgia" w:cs="Georgia"/>
           <w:b/>
-          <w:i w:val="0"/>
-          <w:sz w:val="22"/>
-        </w:rPr>
-        <w:t>Caption 7</w:t>
+          <w:sz w:val="22"/>
+        </w:rPr>
+        <w:t>- Caption 7</w:t>
       </w:r>
     </w:p>
     <w:p>
@@ -9684,7 +9607,6 @@
         <w:rPr>
           <w:rFonts w:ascii="Georgia" w:hAnsi="Georgia" w:eastAsia="Georgia" w:cs="Georgia"/>
           <w:b w:val="0"/>
-          <w:i w:val="0"/>
           <w:sz w:val="22"/>
         </w:rPr>
         <w:t>You don’t have to be strong all the time. It’s okay to ask for help. Visit the 🔗 in our bio to take the first step.</w:t>
@@ -9700,10 +9622,9 @@
         <w:rPr>
           <w:rFonts w:ascii="Georgia" w:hAnsi="Georgia" w:eastAsia="Georgia" w:cs="Georgia"/>
           <w:b/>
-          <w:i w:val="0"/>
-          <w:sz w:val="22"/>
-        </w:rPr>
-        <w:t>Comment 1</w:t>
+          <w:sz w:val="22"/>
+        </w:rPr>
+        <w:t>&gt; Comment 1</w:t>
       </w:r>
     </w:p>
     <w:p>
@@ -9716,7 +9637,6 @@
         <w:rPr>
           <w:rFonts w:ascii="Georgia" w:hAnsi="Georgia" w:eastAsia="Georgia" w:cs="Georgia"/>
           <w:b w:val="0"/>
-          <w:i w:val="0"/>
           <w:sz w:val="22"/>
         </w:rPr>
         <w:t>Such an important reminder—strength isn’t never needing help, it’s having the courage to reach out when you do.</w:t>
@@ -9732,10 +9652,9 @@
         <w:rPr>
           <w:rFonts w:ascii="Georgia" w:hAnsi="Georgia" w:eastAsia="Georgia" w:cs="Georgia"/>
           <w:b/>
-          <w:i w:val="0"/>
-          <w:sz w:val="22"/>
-        </w:rPr>
-        <w:t>Comment 2</w:t>
+          <w:sz w:val="22"/>
+        </w:rPr>
+        <w:t>&gt; Comment 2</w:t>
       </w:r>
     </w:p>
     <w:p>
@@ -9748,7 +9667,6 @@
         <w:rPr>
           <w:rFonts w:ascii="Georgia" w:hAnsi="Georgia" w:eastAsia="Georgia" w:cs="Georgia"/>
           <w:b w:val="0"/>
-          <w:i w:val="0"/>
           <w:sz w:val="22"/>
         </w:rPr>
         <w:t>Thank you for sharing. So true. Healing happens in connection. Co-regulation reminds us that leaning on others is not weakness but part of the process.</w:t>
@@ -9764,7 +9682,6 @@
         <w:rPr>
           <w:rFonts w:ascii="Georgia" w:hAnsi="Georgia" w:eastAsia="Georgia" w:cs="Georgia"/>
           <w:b/>
-          <w:i w:val="0"/>
           <w:sz w:val="24"/>
         </w:rPr>
         <w:t>Page 03</w:t>
@@ -9780,10 +9697,9 @@
         <w:rPr>
           <w:rFonts w:ascii="Georgia" w:hAnsi="Georgia" w:eastAsia="Georgia" w:cs="Georgia"/>
           <w:b/>
-          <w:i w:val="0"/>
-          <w:sz w:val="22"/>
-        </w:rPr>
-        <w:t>Caption 1</w:t>
+          <w:sz w:val="22"/>
+        </w:rPr>
+        <w:t>- Caption 1</w:t>
       </w:r>
     </w:p>
     <w:p>
@@ -9796,7 +9712,6 @@
         <w:rPr>
           <w:rFonts w:ascii="Georgia" w:hAnsi="Georgia" w:eastAsia="Georgia" w:cs="Georgia"/>
           <w:b w:val="0"/>
-          <w:i w:val="0"/>
           <w:sz w:val="22"/>
         </w:rPr>
         <w:t>"For many dads in psychotherapy—captains of industry, adrift at sea, or steering domestic waters their fathers never charted—fatherhood triggers an old standing order: You earn, therefore you are," explains clinical psychologist Jett Stone, Ph.D. This can become tunnel vision and negatively affect key relationships. Labeling the problem, sharing the numbers, and challenging the provider myth together can help partners get back on track. How does the male provider myth relate to your experience? Tell us in the comments. 💭 Do you know someone who might like to read this? Share it with them. 👀 Click the link in our bio to read more. Image credit: apghedia / Shutterstock #psychology #relationships #mentalhealth #fathers</w:t>
@@ -9812,10 +9727,9 @@
         <w:rPr>
           <w:rFonts w:ascii="Georgia" w:hAnsi="Georgia" w:eastAsia="Georgia" w:cs="Georgia"/>
           <w:b/>
-          <w:i w:val="0"/>
-          <w:sz w:val="22"/>
-        </w:rPr>
-        <w:t>Comment 1</w:t>
+          <w:sz w:val="22"/>
+        </w:rPr>
+        <w:t>&gt; Comment 1</w:t>
       </w:r>
     </w:p>
     <w:p>
@@ -9828,7 +9742,6 @@
         <w:rPr>
           <w:rFonts w:ascii="Georgia" w:hAnsi="Georgia" w:eastAsia="Georgia" w:cs="Georgia"/>
           <w:b w:val="0"/>
-          <w:i w:val="0"/>
           <w:sz w:val="22"/>
         </w:rPr>
         <w:t>For a long time, I didn’t give much thought to the provider role, which later contributed to relationship difficulties. At the same time, I’ve seen many examples of how an excessive “provider” mindset can be socially and personally damaging: the pursuit of material wealth in self-destructive ways, or at the expense of close human relationships. Today, I’m seeking a healthy balance. I do have some disadvantages, and I often experience that in dating, material circumstances (car, housing, income) become a more critical factor than emotional safety, the quality of connection, or mutual growth.</w:t>
@@ -9844,10 +9757,9 @@
         <w:rPr>
           <w:rFonts w:ascii="Georgia" w:hAnsi="Georgia" w:eastAsia="Georgia" w:cs="Georgia"/>
           <w:b/>
-          <w:i w:val="0"/>
-          <w:sz w:val="22"/>
-        </w:rPr>
-        <w:t>Comment 2</w:t>
+          <w:sz w:val="22"/>
+        </w:rPr>
+        <w:t>&gt; Comment 2</w:t>
       </w:r>
     </w:p>
     <w:p>
@@ -9860,7 +9772,6 @@
         <w:rPr>
           <w:rFonts w:ascii="Georgia" w:hAnsi="Georgia" w:eastAsia="Georgia" w:cs="Georgia"/>
           <w:b w:val="0"/>
-          <w:i w:val="0"/>
           <w:sz w:val="22"/>
         </w:rPr>
         <w:t>As a man I don't have any problems with expectations as long as both sides can have their own expectations and get something in return...I think there is nothing wrong about that.</w:t>
@@ -9876,10 +9787,9 @@
         <w:rPr>
           <w:rFonts w:ascii="Georgia" w:hAnsi="Georgia" w:eastAsia="Georgia" w:cs="Georgia"/>
           <w:b/>
-          <w:i w:val="0"/>
-          <w:sz w:val="22"/>
-        </w:rPr>
-        <w:t>Caption 2</w:t>
+          <w:sz w:val="22"/>
+        </w:rPr>
+        <w:t>- Caption 2</w:t>
       </w:r>
     </w:p>
     <w:p>
@@ -9892,7 +9802,6 @@
         <w:rPr>
           <w:rFonts w:ascii="Georgia" w:hAnsi="Georgia" w:eastAsia="Georgia" w:cs="Georgia"/>
           <w:b w:val="0"/>
-          <w:i w:val="0"/>
           <w:sz w:val="22"/>
         </w:rPr>
         <w:t>Welcome to our “Ask a Therapist” series! Why does anxiety get worse at night—and what actually helps? ████████ explains. Comment with a question you want a therapist to answer next. #therapy #mentalhealth #anxiety #askatherapist</w:t>
@@ -9908,10 +9817,9 @@
         <w:rPr>
           <w:rFonts w:ascii="Georgia" w:hAnsi="Georgia" w:eastAsia="Georgia" w:cs="Georgia"/>
           <w:b/>
-          <w:i w:val="0"/>
-          <w:sz w:val="22"/>
-        </w:rPr>
-        <w:t>Comment 1</w:t>
+          <w:sz w:val="22"/>
+        </w:rPr>
+        <w:t>&gt; Comment 1</w:t>
       </w:r>
     </w:p>
     <w:p>
@@ -9924,7 +9832,6 @@
         <w:rPr>
           <w:rFonts w:ascii="Georgia" w:hAnsi="Georgia" w:eastAsia="Georgia" w:cs="Georgia"/>
           <w:b w:val="0"/>
-          <w:i w:val="0"/>
           <w:sz w:val="22"/>
         </w:rPr>
         <w:t>This explains nighttime anxiety in a way that feels reassuring and gives people something practical to work with.</w:t>
@@ -9940,10 +9847,9 @@
         <w:rPr>
           <w:rFonts w:ascii="Georgia" w:hAnsi="Georgia" w:eastAsia="Georgia" w:cs="Georgia"/>
           <w:b/>
-          <w:i w:val="0"/>
-          <w:sz w:val="22"/>
-        </w:rPr>
-        <w:t>Comment 2</w:t>
+          <w:sz w:val="22"/>
+        </w:rPr>
+        <w:t>&gt; Comment 2</w:t>
       </w:r>
     </w:p>
     <w:p>
@@ -9956,7 +9862,6 @@
         <w:rPr>
           <w:rFonts w:ascii="Georgia" w:hAnsi="Georgia" w:eastAsia="Georgia" w:cs="Georgia"/>
           <w:b w:val="0"/>
-          <w:i w:val="0"/>
           <w:sz w:val="22"/>
         </w:rPr>
         <w:t>It reflects how quiet moments can amplify unspoken thoughts and tension. A gentle reminder that grounding practices and reassurance can help ease anxiety as the day winds down.</w:t>
@@ -9972,10 +9877,9 @@
         <w:rPr>
           <w:rFonts w:ascii="Georgia" w:hAnsi="Georgia" w:eastAsia="Georgia" w:cs="Georgia"/>
           <w:b/>
-          <w:i w:val="0"/>
-          <w:sz w:val="22"/>
-        </w:rPr>
-        <w:t>Caption 3</w:t>
+          <w:sz w:val="22"/>
+        </w:rPr>
+        <w:t>- Caption 3</w:t>
       </w:r>
     </w:p>
     <w:p>
@@ -9988,7 +9892,6 @@
         <w:rPr>
           <w:rFonts w:ascii="Georgia" w:hAnsi="Georgia" w:eastAsia="Georgia" w:cs="Georgia"/>
           <w:b w:val="0"/>
-          <w:i w:val="0"/>
           <w:sz w:val="22"/>
         </w:rPr>
         <w:t>"There are many ways that we can undermine our well-being and fall into spirals of negativity, depression, and anxiety. Additionally, there are many ways that we can sabotage ourselves without realizing that we are the cause. Here are five behaviors to avoid if you want to be stable and emotionally well-adjusted," explains Carla Shuman, Ph.D. What are some other strengths of mentally healthy people? Let us know in the comments. 💭 Do you know someone who should read this? Share it with them. 👀 Click the link in our bio to read more. #psychology #mentalhealth #wellbeing #happiness #selfesteem #mentallyhealthy</w:t>
@@ -10004,10 +9907,9 @@
         <w:rPr>
           <w:rFonts w:ascii="Georgia" w:hAnsi="Georgia" w:eastAsia="Georgia" w:cs="Georgia"/>
           <w:b/>
-          <w:i w:val="0"/>
-          <w:sz w:val="22"/>
-        </w:rPr>
-        <w:t>Comment 1</w:t>
+          <w:sz w:val="22"/>
+        </w:rPr>
+        <w:t>&gt; Comment 1</w:t>
       </w:r>
     </w:p>
     <w:p>
@@ -10020,7 +9922,6 @@
         <w:rPr>
           <w:rFonts w:ascii="Georgia" w:hAnsi="Georgia" w:eastAsia="Georgia" w:cs="Georgia"/>
           <w:b w:val="0"/>
-          <w:i w:val="0"/>
           <w:sz w:val="22"/>
         </w:rPr>
         <w:t>True! And I’m guilty of at least one of these! But I’m also committed to recovery</w:t>
@@ -10036,10 +9937,9 @@
         <w:rPr>
           <w:rFonts w:ascii="Georgia" w:hAnsi="Georgia" w:eastAsia="Georgia" w:cs="Georgia"/>
           <w:b/>
-          <w:i w:val="0"/>
-          <w:sz w:val="22"/>
-        </w:rPr>
-        <w:t>Comment 2</w:t>
+          <w:sz w:val="22"/>
+        </w:rPr>
+        <w:t>&gt; Comment 2</w:t>
       </w:r>
     </w:p>
     <w:p>
@@ -10052,7 +9952,6 @@
         <w:rPr>
           <w:rFonts w:ascii="Georgia" w:hAnsi="Georgia" w:eastAsia="Georgia" w:cs="Georgia"/>
           <w:b w:val="0"/>
-          <w:i w:val="0"/>
           <w:sz w:val="22"/>
         </w:rPr>
         <w:t>Such an important list. We often find that avoiding the comparison trap is one of the biggest hurdles to stability in our digital age. Recognizing those small, daily wins instead can really shift the momentum!</w:t>
@@ -10068,10 +9967,9 @@
         <w:rPr>
           <w:rFonts w:ascii="Georgia" w:hAnsi="Georgia" w:eastAsia="Georgia" w:cs="Georgia"/>
           <w:b/>
-          <w:i w:val="0"/>
-          <w:sz w:val="22"/>
-        </w:rPr>
-        <w:t>Caption 4</w:t>
+          <w:sz w:val="22"/>
+        </w:rPr>
+        <w:t>- Caption 4</w:t>
       </w:r>
     </w:p>
     <w:p>
@@ -10084,7 +9982,6 @@
         <w:rPr>
           <w:rFonts w:ascii="Georgia" w:hAnsi="Georgia" w:eastAsia="Georgia" w:cs="Georgia"/>
           <w:b w:val="0"/>
-          <w:i w:val="0"/>
           <w:sz w:val="22"/>
         </w:rPr>
         <w:t>"In my work with survivors of abusive, neglectful, or chronically unsafe families, I hear the same misconceptions again and again. Many of these ideas minimize survivors’ experiences and mischaracterize what estrangement actually is," explains Kaytee Gillis, LCSW (████████). Here are some of the most common myths about estrangement. What other false beliefs have you heard about family estrangement? Let us know in the comments. 💭 Do you know someone who should read this? Share it with them. 👀 Click the link in our bio to read more. #psychology #family #relationships #estrangement #misconceptions</w:t>
@@ -10100,10 +9997,9 @@
         <w:rPr>
           <w:rFonts w:ascii="Georgia" w:hAnsi="Georgia" w:eastAsia="Georgia" w:cs="Georgia"/>
           <w:b/>
-          <w:i w:val="0"/>
-          <w:sz w:val="22"/>
-        </w:rPr>
-        <w:t>Comment 1</w:t>
+          <w:sz w:val="22"/>
+        </w:rPr>
+        <w:t>&gt; Comment 1</w:t>
       </w:r>
     </w:p>
     <w:p>
@@ -10116,7 +10012,6 @@
         <w:rPr>
           <w:rFonts w:ascii="Georgia" w:hAnsi="Georgia" w:eastAsia="Georgia" w:cs="Georgia"/>
           <w:b w:val="0"/>
-          <w:i w:val="0"/>
           <w:sz w:val="22"/>
         </w:rPr>
         <w:t>████████ what if the parrent goes silent treatment as they could not face that I spoke up about their inappropriate behavior this time and then as a change I did not chase them, I did not apologize I did not minimize myself. And after 6 months of silent treatment in which I grieved the parrent who was never there and learned peace without her and now I get love bombed with gifts but I am no longer willing to have a relationship without them making effort and admitting that what they have did was not ok.</w:t>
@@ -10132,10 +10027,9 @@
         <w:rPr>
           <w:rFonts w:ascii="Georgia" w:hAnsi="Georgia" w:eastAsia="Georgia" w:cs="Georgia"/>
           <w:b/>
-          <w:i w:val="0"/>
-          <w:sz w:val="22"/>
-        </w:rPr>
-        <w:t>Comment 2</w:t>
+          <w:sz w:val="22"/>
+        </w:rPr>
+        <w:t>&gt; Comment 2</w:t>
       </w:r>
     </w:p>
     <w:p>
@@ -10148,7 +10042,6 @@
         <w:rPr>
           <w:rFonts w:ascii="Georgia" w:hAnsi="Georgia" w:eastAsia="Georgia" w:cs="Georgia"/>
           <w:b w:val="0"/>
-          <w:i w:val="0"/>
           <w:sz w:val="22"/>
         </w:rPr>
         <w:t>As a survivor of domestic abuse and sexual violence and who has had no contact with a parent for almost 40 years- this is not a trend!</w:t>
@@ -10164,7 +10057,6 @@
         <w:rPr>
           <w:rFonts w:ascii="Georgia" w:hAnsi="Georgia" w:eastAsia="Georgia" w:cs="Georgia"/>
           <w:b/>
-          <w:i w:val="0"/>
           <w:sz w:val="24"/>
         </w:rPr>
         <w:t>Page 04</w:t>
@@ -10180,10 +10072,9 @@
         <w:rPr>
           <w:rFonts w:ascii="Georgia" w:hAnsi="Georgia" w:eastAsia="Georgia" w:cs="Georgia"/>
           <w:b/>
-          <w:i w:val="0"/>
-          <w:sz w:val="22"/>
-        </w:rPr>
-        <w:t>Caption 1</w:t>
+          <w:sz w:val="22"/>
+        </w:rPr>
+        <w:t>- Caption 1</w:t>
       </w:r>
     </w:p>
     <w:p>
@@ -10196,7 +10087,6 @@
         <w:rPr>
           <w:rFonts w:ascii="Georgia" w:hAnsi="Georgia" w:eastAsia="Georgia" w:cs="Georgia"/>
           <w:b w:val="0"/>
-          <w:i w:val="0"/>
           <w:sz w:val="22"/>
         </w:rPr>
         <w:t>💙 Today on #WorldSuicidePreventionDay (and every day!), remember: you are not alone. Asking for help is brave, and support is always within reach. Visit our Find Help page via the link in our bio for helplines, self-care tips, and resources to care for yourself + others.</w:t>
@@ -10212,10 +10102,9 @@
         <w:rPr>
           <w:rFonts w:ascii="Georgia" w:hAnsi="Georgia" w:eastAsia="Georgia" w:cs="Georgia"/>
           <w:b/>
-          <w:i w:val="0"/>
-          <w:sz w:val="22"/>
-        </w:rPr>
-        <w:t>Comment 1</w:t>
+          <w:sz w:val="22"/>
+        </w:rPr>
+        <w:t>&gt; Comment 1</w:t>
       </w:r>
     </w:p>
     <w:p>
@@ -10228,7 +10117,6 @@
         <w:rPr>
           <w:rFonts w:ascii="Georgia" w:hAnsi="Georgia" w:eastAsia="Georgia" w:cs="Georgia"/>
           <w:b w:val="0"/>
-          <w:i w:val="0"/>
           <w:sz w:val="22"/>
         </w:rPr>
         <w:t>[Comment to be added]</w:t>
@@ -10244,10 +10132,9 @@
         <w:rPr>
           <w:rFonts w:ascii="Georgia" w:hAnsi="Georgia" w:eastAsia="Georgia" w:cs="Georgia"/>
           <w:b/>
-          <w:i w:val="0"/>
-          <w:sz w:val="22"/>
-        </w:rPr>
-        <w:t>Comment 2</w:t>
+          <w:sz w:val="22"/>
+        </w:rPr>
+        <w:t>&gt; Comment 2</w:t>
       </w:r>
     </w:p>
     <w:p>
@@ -10260,7 +10147,6 @@
         <w:rPr>
           <w:rFonts w:ascii="Georgia" w:hAnsi="Georgia" w:eastAsia="Georgia" w:cs="Georgia"/>
           <w:b w:val="0"/>
-          <w:i w:val="0"/>
           <w:sz w:val="22"/>
         </w:rPr>
         <w:t>It’s always important to remember that you’re not alone, and asking for help is courage!! I know exactly how is it living with negative thought the whole time. Recently I went through dark times, and I wanted to give up. And listing to Gaga’s songs gives me the strength to continue❤️ I did a video about mental health on tik tok, wish you guys could see 🙏 ████████ ████████</w:t>
@@ -10276,10 +10162,9 @@
         <w:rPr>
           <w:rFonts w:ascii="Georgia" w:hAnsi="Georgia" w:eastAsia="Georgia" w:cs="Georgia"/>
           <w:b/>
-          <w:i w:val="0"/>
-          <w:sz w:val="22"/>
-        </w:rPr>
-        <w:t>Caption 2</w:t>
+          <w:sz w:val="22"/>
+        </w:rPr>
+        <w:t>- Caption 2</w:t>
       </w:r>
     </w:p>
     <w:p>
@@ -10292,7 +10177,6 @@
         <w:rPr>
           <w:rFonts w:ascii="Georgia" w:hAnsi="Georgia" w:eastAsia="Georgia" w:cs="Georgia"/>
           <w:b w:val="0"/>
-          <w:i w:val="0"/>
           <w:sz w:val="22"/>
         </w:rPr>
         <w:t>We gathered in Los Angeles with open hearts and a shared goal: to build a kinder, braver world together 💙✨ In partnership with ████████, ████████, and ████████, we created a space for honest conversation, creativity, and care, led by and for young people. From spoken word performances by LA’s Youth Poet Laureate to an interactive #BeThereCertificate workshop and a hands-on volunteer activity supporting trans and nonbinary young people, this community gathering reminded us: ☀️ Mental health care is community care. ☀️ Kindness is action. ☀️ And none of us have to take that action alone. #ChannelKindness #BeKind365 #KindnessInCommunity</w:t>
@@ -10308,10 +10192,9 @@
         <w:rPr>
           <w:rFonts w:ascii="Georgia" w:hAnsi="Georgia" w:eastAsia="Georgia" w:cs="Georgia"/>
           <w:b/>
-          <w:i w:val="0"/>
-          <w:sz w:val="22"/>
-        </w:rPr>
-        <w:t>Comment 1</w:t>
+          <w:sz w:val="22"/>
+        </w:rPr>
+        <w:t>&gt; Comment 1</w:t>
       </w:r>
     </w:p>
     <w:p>
@@ -10324,7 +10207,6 @@
         <w:rPr>
           <w:rFonts w:ascii="Georgia" w:hAnsi="Georgia" w:eastAsia="Georgia" w:cs="Georgia"/>
           <w:b w:val="0"/>
-          <w:i w:val="0"/>
           <w:sz w:val="22"/>
         </w:rPr>
         <w:t>[Comment to be added]</w:t>
@@ -10340,10 +10222,9 @@
         <w:rPr>
           <w:rFonts w:ascii="Georgia" w:hAnsi="Georgia" w:eastAsia="Georgia" w:cs="Georgia"/>
           <w:b/>
-          <w:i w:val="0"/>
-          <w:sz w:val="22"/>
-        </w:rPr>
-        <w:t>Comment 2</w:t>
+          <w:sz w:val="22"/>
+        </w:rPr>
+        <w:t>&gt; Comment 2</w:t>
       </w:r>
     </w:p>
     <w:p>
@@ -10356,7 +10237,6 @@
         <w:rPr>
           <w:rFonts w:ascii="Georgia" w:hAnsi="Georgia" w:eastAsia="Georgia" w:cs="Georgia"/>
           <w:b w:val="0"/>
-          <w:i w:val="0"/>
           <w:sz w:val="22"/>
         </w:rPr>
         <w:t>what an incredible day celebrating kindness and being there for one another! thank you so much for having me ❤️❤️❤️</w:t>
@@ -10372,10 +10252,9 @@
         <w:rPr>
           <w:rFonts w:ascii="Georgia" w:hAnsi="Georgia" w:eastAsia="Georgia" w:cs="Georgia"/>
           <w:b/>
-          <w:i w:val="0"/>
-          <w:sz w:val="22"/>
-        </w:rPr>
-        <w:t>Caption 3</w:t>
+          <w:sz w:val="22"/>
+        </w:rPr>
+        <w:t>- Caption 3</w:t>
       </w:r>
     </w:p>
     <w:p>
@@ -10388,7 +10267,6 @@
         <w:rPr>
           <w:rFonts w:ascii="Georgia" w:hAnsi="Georgia" w:eastAsia="Georgia" w:cs="Georgia"/>
           <w:b w:val="0"/>
-          <w:i w:val="0"/>
           <w:sz w:val="22"/>
         </w:rPr>
         <w:t>“Our stories are our superpower.” 💭🏳️‍🌈🏳️‍⚧️ In this powerful clip from his Pride Rising speech, ████████’s Chief of Staff, ████████, reminds us that kindness is action—and that simply existing as your authentic self is a form of resistance. 💖 Take the #BeKind365 pledge to support yourself and others in kindness, every day of the year: BeKind365.world ✨ Want more inspiration? Watch Josh’s full speech via the link in our bio. 📷 / 🎥: ████████</w:t>
@@ -10404,10 +10282,9 @@
         <w:rPr>
           <w:rFonts w:ascii="Georgia" w:hAnsi="Georgia" w:eastAsia="Georgia" w:cs="Georgia"/>
           <w:b/>
-          <w:i w:val="0"/>
-          <w:sz w:val="22"/>
-        </w:rPr>
-        <w:t>Comment 1</w:t>
+          <w:sz w:val="22"/>
+        </w:rPr>
+        <w:t>&gt; Comment 1</w:t>
       </w:r>
     </w:p>
     <w:p>
@@ -10420,7 +10297,6 @@
         <w:rPr>
           <w:rFonts w:ascii="Georgia" w:hAnsi="Georgia" w:eastAsia="Georgia" w:cs="Georgia"/>
           <w:b w:val="0"/>
-          <w:i w:val="0"/>
           <w:sz w:val="22"/>
         </w:rPr>
         <w:t>Thank you for sharing. What a wonderful foundation you represent and work for. Changing the lives of so many people Way to go Josh!!</w:t>
@@ -10436,10 +10312,9 @@
         <w:rPr>
           <w:rFonts w:ascii="Georgia" w:hAnsi="Georgia" w:eastAsia="Georgia" w:cs="Georgia"/>
           <w:b/>
-          <w:i w:val="0"/>
-          <w:sz w:val="22"/>
-        </w:rPr>
-        <w:t>Comment 2</w:t>
+          <w:sz w:val="22"/>
+        </w:rPr>
+        <w:t>&gt; Comment 2</w:t>
       </w:r>
     </w:p>
     <w:p>
@@ -10452,7 +10327,6 @@
         <w:rPr>
           <w:rFonts w:ascii="Georgia" w:hAnsi="Georgia" w:eastAsia="Georgia" w:cs="Georgia"/>
           <w:b w:val="0"/>
-          <w:i w:val="0"/>
           <w:sz w:val="22"/>
         </w:rPr>
         <w:t>This resonates so deep. Our stories are what creates change. One person, one heart, one connection at a time. All people have to do is meet us.</w:t>
@@ -10468,10 +10342,9 @@
         <w:rPr>
           <w:rFonts w:ascii="Georgia" w:hAnsi="Georgia" w:eastAsia="Georgia" w:cs="Georgia"/>
           <w:b/>
-          <w:i w:val="0"/>
-          <w:sz w:val="22"/>
-        </w:rPr>
-        <w:t>Caption 4</w:t>
+          <w:sz w:val="22"/>
+        </w:rPr>
+        <w:t>- Caption 4</w:t>
       </w:r>
     </w:p>
     <w:p>
@@ -10484,7 +10357,6 @@
         <w:rPr>
           <w:rFonts w:ascii="Georgia" w:hAnsi="Georgia" w:eastAsia="Georgia" w:cs="Georgia"/>
           <w:b w:val="0"/>
-          <w:i w:val="0"/>
           <w:sz w:val="22"/>
         </w:rPr>
         <w:t>🏳️‍⚧️ Today is #TransDayOfVisibility, a time to celebrate, uplift, and honor trans and nonbinary voices. 🏳️‍⚧️ Our 2023-2024 Youth Advisory Board member, ████████, shares powerful words of affirmation from their speech at NYC Youth #Pride ████████: “To everyone here: always remember that you are beautiful, you are worthy, and you deserve to take up space in this world exactly as you are. There is no one else like you, and that is your power.” Visit the link in our bio to watch ████████’s full speech and learn how we can all support transgender and nonbinary youth in creating safer, more inclusive communities. #ChannelKindness #BeKind365 📷 / 🎥 : ████████</w:t>
@@ -10500,10 +10372,9 @@
         <w:rPr>
           <w:rFonts w:ascii="Georgia" w:hAnsi="Georgia" w:eastAsia="Georgia" w:cs="Georgia"/>
           <w:b/>
-          <w:i w:val="0"/>
-          <w:sz w:val="22"/>
-        </w:rPr>
-        <w:t>Comment 1</w:t>
+          <w:sz w:val="22"/>
+        </w:rPr>
+        <w:t>&gt; Comment 1</w:t>
       </w:r>
     </w:p>
     <w:p>
@@ -10516,7 +10387,6 @@
         <w:rPr>
           <w:rFonts w:ascii="Georgia" w:hAnsi="Georgia" w:eastAsia="Georgia" w:cs="Georgia"/>
           <w:b w:val="0"/>
-          <w:i w:val="0"/>
           <w:sz w:val="22"/>
         </w:rPr>
         <w:t>[Comment to be added]</w:t>
@@ -10532,10 +10402,9 @@
         <w:rPr>
           <w:rFonts w:ascii="Georgia" w:hAnsi="Georgia" w:eastAsia="Georgia" w:cs="Georgia"/>
           <w:b/>
-          <w:i w:val="0"/>
-          <w:sz w:val="22"/>
-        </w:rPr>
-        <w:t>Comment 2</w:t>
+          <w:sz w:val="22"/>
+        </w:rPr>
+        <w:t>&gt; Comment 2</w:t>
       </w:r>
     </w:p>
     <w:p>
@@ -10548,7 +10417,6 @@
         <w:rPr>
           <w:rFonts w:ascii="Georgia" w:hAnsi="Georgia" w:eastAsia="Georgia" w:cs="Georgia"/>
           <w:b w:val="0"/>
-          <w:i w:val="0"/>
           <w:sz w:val="22"/>
         </w:rPr>
         <w:t>[Comment to be added]</w:t>
@@ -10564,7 +10432,6 @@
         <w:rPr>
           <w:rFonts w:ascii="Georgia" w:hAnsi="Georgia" w:eastAsia="Georgia" w:cs="Georgia"/>
           <w:b/>
-          <w:i w:val="0"/>
           <w:sz w:val="24"/>
         </w:rPr>
         <w:t>Page 05</w:t>
@@ -10580,10 +10447,9 @@
         <w:rPr>
           <w:rFonts w:ascii="Georgia" w:hAnsi="Georgia" w:eastAsia="Georgia" w:cs="Georgia"/>
           <w:b/>
-          <w:i w:val="0"/>
-          <w:sz w:val="22"/>
-        </w:rPr>
-        <w:t>Caption 1</w:t>
+          <w:sz w:val="22"/>
+        </w:rPr>
+        <w:t>- Caption 1</w:t>
       </w:r>
     </w:p>
     <w:p>
@@ -10596,7 +10462,6 @@
         <w:rPr>
           <w:rFonts w:ascii="Georgia" w:hAnsi="Georgia" w:eastAsia="Georgia" w:cs="Georgia"/>
           <w:b w:val="0"/>
-          <w:i w:val="0"/>
           <w:sz w:val="22"/>
         </w:rPr>
         <w:t>When you know the Big Sad ™ is coming but you just wanna get your things done first...</w:t>
@@ -10612,10 +10477,9 @@
         <w:rPr>
           <w:rFonts w:ascii="Georgia" w:hAnsi="Georgia" w:eastAsia="Georgia" w:cs="Georgia"/>
           <w:b/>
-          <w:i w:val="0"/>
-          <w:sz w:val="22"/>
-        </w:rPr>
-        <w:t>Comment 1</w:t>
+          <w:sz w:val="22"/>
+        </w:rPr>
+        <w:t>&gt; Comment 1</w:t>
       </w:r>
     </w:p>
     <w:p>
@@ -10628,7 +10492,6 @@
         <w:rPr>
           <w:rFonts w:ascii="Georgia" w:hAnsi="Georgia" w:eastAsia="Georgia" w:cs="Georgia"/>
           <w:b w:val="0"/>
-          <w:i w:val="0"/>
           <w:sz w:val="22"/>
         </w:rPr>
         <w:t>I don't have time to be sad so i just keep doing things</w:t>
@@ -10644,10 +10507,9 @@
         <w:rPr>
           <w:rFonts w:ascii="Georgia" w:hAnsi="Georgia" w:eastAsia="Georgia" w:cs="Georgia"/>
           <w:b/>
-          <w:i w:val="0"/>
-          <w:sz w:val="22"/>
-        </w:rPr>
-        <w:t>Comment 2</w:t>
+          <w:sz w:val="22"/>
+        </w:rPr>
+        <w:t>&gt; Comment 2</w:t>
       </w:r>
     </w:p>
     <w:p>
@@ -10660,7 +10522,6 @@
         <w:rPr>
           <w:rFonts w:ascii="Georgia" w:hAnsi="Georgia" w:eastAsia="Georgia" w:cs="Georgia"/>
           <w:b w:val="0"/>
-          <w:i w:val="0"/>
           <w:sz w:val="22"/>
         </w:rPr>
         <w:t>What is it about the kitchen sink that makes us suddenly pause and then get sucked in to that sadness! 😳</w:t>
@@ -10676,10 +10537,9 @@
         <w:rPr>
           <w:rFonts w:ascii="Georgia" w:hAnsi="Georgia" w:eastAsia="Georgia" w:cs="Georgia"/>
           <w:b/>
-          <w:i w:val="0"/>
-          <w:sz w:val="22"/>
-        </w:rPr>
-        <w:t>Caption 2</w:t>
+          <w:sz w:val="22"/>
+        </w:rPr>
+        <w:t>- Caption 2</w:t>
       </w:r>
     </w:p>
     <w:p>
@@ -10692,7 +10552,6 @@
         <w:rPr>
           <w:rFonts w:ascii="Georgia" w:hAnsi="Georgia" w:eastAsia="Georgia" w:cs="Georgia"/>
           <w:b w:val="0"/>
-          <w:i w:val="0"/>
           <w:sz w:val="22"/>
         </w:rPr>
         <w:t>Some thoughts about all the worrying I did and all the ways I tried to be prepared for a life that only time and experience could prepare me for. A comic showing a ghost in the wilderness, the text reads - 1- I feel silly for not realising sooner, that I would feel differently about my life the more I experienced it, because I will change and grow. 2- I realised that choices happen slowly, and they get smaller than when you made them. You adapt and you change. 3- I changed in a way that prepared me for the now. Even though I was SO worried about being unprepared. But of course you’re unprepared when you’re worrying too early! 4- it feels daunting to think about the future in the here and now. But you’ll be different by then. And you will be ready for it when it comes.</w:t>
@@ -10708,10 +10567,9 @@
         <w:rPr>
           <w:rFonts w:ascii="Georgia" w:hAnsi="Georgia" w:eastAsia="Georgia" w:cs="Georgia"/>
           <w:b/>
-          <w:i w:val="0"/>
-          <w:sz w:val="22"/>
-        </w:rPr>
-        <w:t>Comment 1</w:t>
+          <w:sz w:val="22"/>
+        </w:rPr>
+        <w:t>&gt; Comment 1</w:t>
       </w:r>
     </w:p>
     <w:p>
@@ -10724,7 +10582,6 @@
         <w:rPr>
           <w:rFonts w:ascii="Georgia" w:hAnsi="Georgia" w:eastAsia="Georgia" w:cs="Georgia"/>
           <w:b w:val="0"/>
-          <w:i w:val="0"/>
           <w:sz w:val="22"/>
         </w:rPr>
         <w:t>I agree with you, time and experience teaches you a lot you never thought of</w:t>
@@ -10740,10 +10597,9 @@
         <w:rPr>
           <w:rFonts w:ascii="Georgia" w:hAnsi="Georgia" w:eastAsia="Georgia" w:cs="Georgia"/>
           <w:b/>
-          <w:i w:val="0"/>
-          <w:sz w:val="22"/>
-        </w:rPr>
-        <w:t>Comment 2</w:t>
+          <w:sz w:val="22"/>
+        </w:rPr>
+        <w:t>&gt; Comment 2</w:t>
       </w:r>
     </w:p>
     <w:p>
@@ -10756,7 +10612,6 @@
         <w:rPr>
           <w:rFonts w:ascii="Georgia" w:hAnsi="Georgia" w:eastAsia="Georgia" w:cs="Georgia"/>
           <w:b w:val="0"/>
-          <w:i w:val="0"/>
           <w:sz w:val="22"/>
         </w:rPr>
         <w:t>Always growing through what we go through 🥰 such a lovely reminder to stay present and not fear the future</w:t>
@@ -10772,7 +10627,6 @@
         <w:rPr>
           <w:rFonts w:ascii="Georgia" w:hAnsi="Georgia" w:eastAsia="Georgia" w:cs="Georgia"/>
           <w:b/>
-          <w:i w:val="0"/>
           <w:sz w:val="24"/>
         </w:rPr>
         <w:t>Page 06</w:t>
@@ -10788,10 +10642,9 @@
         <w:rPr>
           <w:rFonts w:ascii="Georgia" w:hAnsi="Georgia" w:eastAsia="Georgia" w:cs="Georgia"/>
           <w:b/>
-          <w:i w:val="0"/>
-          <w:sz w:val="22"/>
-        </w:rPr>
-        <w:t>Caption 1</w:t>
+          <w:sz w:val="22"/>
+        </w:rPr>
+        <w:t>- Caption 1</w:t>
       </w:r>
     </w:p>
     <w:p>
@@ -10804,7 +10657,6 @@
         <w:rPr>
           <w:rFonts w:ascii="Georgia" w:hAnsi="Georgia" w:eastAsia="Georgia" w:cs="Georgia"/>
           <w:b w:val="0"/>
-          <w:i w:val="0"/>
           <w:sz w:val="22"/>
         </w:rPr>
         <w:t>Men’s mental health month is coming up this November. We don’t talk enough about what men carry. The pressure to be the provider. The strong one. The one that never cracks. But bottling everything up is why men are more likely to die by suicide, because they feel ashamed to speak up. We have to break the stigma 🩵#mentalhealth #mentalhealthawareness #mentalhealthmatters</w:t>
@@ -10820,10 +10672,9 @@
         <w:rPr>
           <w:rFonts w:ascii="Georgia" w:hAnsi="Georgia" w:eastAsia="Georgia" w:cs="Georgia"/>
           <w:b/>
-          <w:i w:val="0"/>
-          <w:sz w:val="22"/>
-        </w:rPr>
-        <w:t>Comment 1</w:t>
+          <w:sz w:val="22"/>
+        </w:rPr>
+        <w:t>&gt; Comment 1</w:t>
       </w:r>
     </w:p>
     <w:p>
@@ -10836,7 +10687,6 @@
         <w:rPr>
           <w:rFonts w:ascii="Georgia" w:hAnsi="Georgia" w:eastAsia="Georgia" w:cs="Georgia"/>
           <w:b w:val="0"/>
-          <w:i w:val="0"/>
           <w:sz w:val="22"/>
         </w:rPr>
         <w:t>remember it’s ok not to be okay keep going fellas we got this together ❤️</w:t>
@@ -10852,10 +10702,9 @@
         <w:rPr>
           <w:rFonts w:ascii="Georgia" w:hAnsi="Georgia" w:eastAsia="Georgia" w:cs="Georgia"/>
           <w:b/>
-          <w:i w:val="0"/>
-          <w:sz w:val="22"/>
-        </w:rPr>
-        <w:t>Comment 2</w:t>
+          <w:sz w:val="22"/>
+        </w:rPr>
+        <w:t>&gt; Comment 2</w:t>
       </w:r>
     </w:p>
     <w:p>
@@ -10868,7 +10717,6 @@
         <w:rPr>
           <w:rFonts w:ascii="Georgia" w:hAnsi="Georgia" w:eastAsia="Georgia" w:cs="Georgia"/>
           <w:b w:val="0"/>
-          <w:i w:val="0"/>
           <w:sz w:val="22"/>
         </w:rPr>
         <w:t>To say the truth I have been having this feelings to end it. I see it as being scary but the more I keep it inside the more I see it as a relief 😮‍💨😢😢</w:t>
@@ -10884,10 +10732,9 @@
         <w:rPr>
           <w:rFonts w:ascii="Georgia" w:hAnsi="Georgia" w:eastAsia="Georgia" w:cs="Georgia"/>
           <w:b/>
-          <w:i w:val="0"/>
-          <w:sz w:val="22"/>
-        </w:rPr>
-        <w:t>Caption 2</w:t>
+          <w:sz w:val="22"/>
+        </w:rPr>
+        <w:t>- Caption 2</w:t>
       </w:r>
     </w:p>
     <w:p>
@@ -10900,7 +10747,6 @@
         <w:rPr>
           <w:rFonts w:ascii="Georgia" w:hAnsi="Georgia" w:eastAsia="Georgia" w:cs="Georgia"/>
           <w:b w:val="0"/>
-          <w:i w:val="0"/>
           <w:sz w:val="22"/>
         </w:rPr>
         <w:t>Please never be embarrassed or too afraid to talk about your mental health. You’re tired from being strong. There’s nothing wrong with seeking assistance with getting along. #WorldMentalHealthDay #WMHD25 #MentalHealth</w:t>
@@ -10916,10 +10762,9 @@
         <w:rPr>
           <w:rFonts w:ascii="Georgia" w:hAnsi="Georgia" w:eastAsia="Georgia" w:cs="Georgia"/>
           <w:b/>
-          <w:i w:val="0"/>
-          <w:sz w:val="22"/>
-        </w:rPr>
-        <w:t>Comment 1</w:t>
+          <w:sz w:val="22"/>
+        </w:rPr>
+        <w:t>&gt; Comment 1</w:t>
       </w:r>
     </w:p>
     <w:p>
@@ -10932,7 +10777,6 @@
         <w:rPr>
           <w:rFonts w:ascii="Georgia" w:hAnsi="Georgia" w:eastAsia="Georgia" w:cs="Georgia"/>
           <w:b w:val="0"/>
-          <w:i w:val="0"/>
           <w:sz w:val="22"/>
         </w:rPr>
         <w:t>Sometimes when the people around you don’t help, it’s not because you don’t deserve it, it’s because they don’t know how, or they’ve been led to believe you don’t need it. You still deserve care. Always.</w:t>
@@ -10948,10 +10792,9 @@
         <w:rPr>
           <w:rFonts w:ascii="Georgia" w:hAnsi="Georgia" w:eastAsia="Georgia" w:cs="Georgia"/>
           <w:b/>
-          <w:i w:val="0"/>
-          <w:sz w:val="22"/>
-        </w:rPr>
-        <w:t>Comment 2</w:t>
+          <w:sz w:val="22"/>
+        </w:rPr>
+        <w:t>&gt; Comment 2</w:t>
       </w:r>
     </w:p>
     <w:p>
@@ -10964,7 +10807,6 @@
         <w:rPr>
           <w:rFonts w:ascii="Georgia" w:hAnsi="Georgia" w:eastAsia="Georgia" w:cs="Georgia"/>
           <w:b w:val="0"/>
-          <w:i w:val="0"/>
           <w:sz w:val="22"/>
         </w:rPr>
         <w:t>Talking about it saves do many lives and encourages people to seek help to improve their mental health 🙌🏻❤️🫶🏻</w:t>
@@ -10980,10 +10822,9 @@
         <w:rPr>
           <w:rFonts w:ascii="Georgia" w:hAnsi="Georgia" w:eastAsia="Georgia" w:cs="Georgia"/>
           <w:b/>
-          <w:i w:val="0"/>
-          <w:sz w:val="22"/>
-        </w:rPr>
-        <w:t>Caption 3</w:t>
+          <w:sz w:val="22"/>
+        </w:rPr>
+        <w:t>- Caption 3</w:t>
       </w:r>
     </w:p>
     <w:p>
@@ -10996,7 +10837,6 @@
         <w:rPr>
           <w:rFonts w:ascii="Georgia" w:hAnsi="Georgia" w:eastAsia="Georgia" w:cs="Georgia"/>
           <w:b w:val="0"/>
-          <w:i w:val="0"/>
           <w:sz w:val="22"/>
         </w:rPr>
         <w:t>Avoiding conversations about suicide doesn’t make the issue go away. it reinforces stigma, silence, and isolation. Open, compassionate talk of the topic helps people feel seen, understood, and supported. #suicideprevention #suicidepreventionmonth #mentalhealth #mentalhealthmatters #mentalhealthawareness#████████</w:t>
@@ -11012,10 +10852,9 @@
         <w:rPr>
           <w:rFonts w:ascii="Georgia" w:hAnsi="Georgia" w:eastAsia="Georgia" w:cs="Georgia"/>
           <w:b/>
-          <w:i w:val="0"/>
-          <w:sz w:val="22"/>
-        </w:rPr>
-        <w:t>Comment 1</w:t>
+          <w:sz w:val="22"/>
+        </w:rPr>
+        <w:t>&gt; Comment 1</w:t>
       </w:r>
     </w:p>
     <w:p>
@@ -11028,7 +10867,6 @@
         <w:rPr>
           <w:rFonts w:ascii="Georgia" w:hAnsi="Georgia" w:eastAsia="Georgia" w:cs="Georgia"/>
           <w:b w:val="0"/>
-          <w:i w:val="0"/>
           <w:sz w:val="22"/>
         </w:rPr>
         <w:t>if you are reading this and you feel as though you want to leave this earth, i can lend you my ear whenever, 0 judgement, just a shoulder to lean on. you are so so so loved 🤍🤍pls stay with us we are all in this together 🫶🏻</w:t>
@@ -11044,10 +10882,9 @@
         <w:rPr>
           <w:rFonts w:ascii="Georgia" w:hAnsi="Georgia" w:eastAsia="Georgia" w:cs="Georgia"/>
           <w:b/>
-          <w:i w:val="0"/>
-          <w:sz w:val="22"/>
-        </w:rPr>
-        <w:t>Comment 2</w:t>
+          <w:sz w:val="22"/>
+        </w:rPr>
+        <w:t>&gt; Comment 2</w:t>
       </w:r>
     </w:p>
     <w:p>
@@ -11060,7 +10897,6 @@
         <w:rPr>
           <w:rFonts w:ascii="Georgia" w:hAnsi="Georgia" w:eastAsia="Georgia" w:cs="Georgia"/>
           <w:b w:val="0"/>
-          <w:i w:val="0"/>
           <w:sz w:val="22"/>
         </w:rPr>
         <w:t>Always make some time and check up on your loved ones. You never know what someone is going through and what they are dealing with. In today’s world, we talk about every little thing but no one talks or asks on what’s going on in someone’s life. People help people and talking about it won’t make someone any weak. Respect, love, care and know that you are important!</w:t>
@@ -11076,10 +10912,9 @@
         <w:rPr>
           <w:rFonts w:ascii="Georgia" w:hAnsi="Georgia" w:eastAsia="Georgia" w:cs="Georgia"/>
           <w:b/>
-          <w:i w:val="0"/>
-          <w:sz w:val="22"/>
-        </w:rPr>
-        <w:t>Caption 4</w:t>
+          <w:sz w:val="22"/>
+        </w:rPr>
+        <w:t>- Caption 4</w:t>
       </w:r>
     </w:p>
     <w:p>
@@ -11092,7 +10927,6 @@
         <w:rPr>
           <w:rFonts w:ascii="Georgia" w:hAnsi="Georgia" w:eastAsia="Georgia" w:cs="Georgia"/>
           <w:b w:val="0"/>
-          <w:i w:val="0"/>
           <w:sz w:val="22"/>
         </w:rPr>
         <w:t>Depression doesn’t always look like isolation or sadness; sometimes, it looks like overcompensating, exhaustion, or simply ‘pushing through. If this resonates with you, know that your struggles are valid, even if they’re unseen. Seeking support isn’t a sign of weakness-it’s a step toward healing. Functional depression is often associated with high-functioning depression, which can sometimes align with Persistent Depressive Disorder (PDD, formerly known as dysthymia)—a chronic but less severe form of depression where individuals can still manage daily responsibilities despite ongoing emotional distress. #functionaldepression #depression #youarenotalone #breakthestigma #mindfulness #mentalhealthmatters</w:t>
@@ -11108,10 +10942,9 @@
         <w:rPr>
           <w:rFonts w:ascii="Georgia" w:hAnsi="Georgia" w:eastAsia="Georgia" w:cs="Georgia"/>
           <w:b/>
-          <w:i w:val="0"/>
-          <w:sz w:val="22"/>
-        </w:rPr>
-        <w:t>Comment 1</w:t>
+          <w:sz w:val="22"/>
+        </w:rPr>
+        <w:t>&gt; Comment 1</w:t>
       </w:r>
     </w:p>
     <w:p>
@@ -11124,7 +10957,6 @@
         <w:rPr>
           <w:rFonts w:ascii="Georgia" w:hAnsi="Georgia" w:eastAsia="Georgia" w:cs="Georgia"/>
           <w:b w:val="0"/>
-          <w:i w:val="0"/>
           <w:sz w:val="22"/>
         </w:rPr>
         <w:t>This is painfully real. Sometimes the loudest struggle is the one no one sees.</w:t>
@@ -11140,10 +10972,9 @@
         <w:rPr>
           <w:rFonts w:ascii="Georgia" w:hAnsi="Georgia" w:eastAsia="Georgia" w:cs="Georgia"/>
           <w:b/>
-          <w:i w:val="0"/>
-          <w:sz w:val="22"/>
-        </w:rPr>
-        <w:t>Comment 2</w:t>
+          <w:sz w:val="22"/>
+        </w:rPr>
+        <w:t>&gt; Comment 2</w:t>
       </w:r>
     </w:p>
     <w:p>
@@ -11156,7 +10987,6 @@
         <w:rPr>
           <w:rFonts w:ascii="Georgia" w:hAnsi="Georgia" w:eastAsia="Georgia" w:cs="Georgia"/>
           <w:b w:val="0"/>
-          <w:i w:val="0"/>
           <w:sz w:val="22"/>
         </w:rPr>
         <w:t>It's better when they don't know. When people know your true feelings, they get upset with you and you have to apologize</w:t>
@@ -11172,10 +11002,9 @@
         <w:rPr>
           <w:rFonts w:ascii="Georgia" w:hAnsi="Georgia" w:eastAsia="Georgia" w:cs="Georgia"/>
           <w:b/>
-          <w:i w:val="0"/>
-          <w:sz w:val="22"/>
-        </w:rPr>
-        <w:t>Caption 5</w:t>
+          <w:sz w:val="22"/>
+        </w:rPr>
+        <w:t>- Caption 5</w:t>
       </w:r>
     </w:p>
     <w:p>
@@ -11188,7 +11017,6 @@
         <w:rPr>
           <w:rFonts w:ascii="Georgia" w:hAnsi="Georgia" w:eastAsia="Georgia" w:cs="Georgia"/>
           <w:b w:val="0"/>
-          <w:i w:val="0"/>
           <w:sz w:val="22"/>
         </w:rPr>
         <w:t>People stigmatise mental health but mourn suicide. We need to make a change. ❤️ This is the sad society that we live in. But only we can change it. We can respond sooner, we can help people who are in need, we can reach out to people who we know are suffering, we can look for the warning signs.. we can just be kinder people to others.</w:t>
@@ -11204,10 +11032,9 @@
         <w:rPr>
           <w:rFonts w:ascii="Georgia" w:hAnsi="Georgia" w:eastAsia="Georgia" w:cs="Georgia"/>
           <w:b/>
-          <w:i w:val="0"/>
-          <w:sz w:val="22"/>
-        </w:rPr>
-        <w:t>Comment 1</w:t>
+          <w:sz w:val="22"/>
+        </w:rPr>
+        <w:t>&gt; Comment 1</w:t>
       </w:r>
     </w:p>
     <w:p>
@@ -11220,7 +11047,6 @@
         <w:rPr>
           <w:rFonts w:ascii="Georgia" w:hAnsi="Georgia" w:eastAsia="Georgia" w:cs="Georgia"/>
           <w:b w:val="0"/>
-          <w:i w:val="0"/>
           <w:sz w:val="22"/>
         </w:rPr>
         <w:t>I would agree, everyone is avoiding me. I’m giving people the signs, yet everyone is pushing me away</w:t>
@@ -11236,10 +11062,9 @@
         <w:rPr>
           <w:rFonts w:ascii="Georgia" w:hAnsi="Georgia" w:eastAsia="Georgia" w:cs="Georgia"/>
           <w:b/>
-          <w:i w:val="0"/>
-          <w:sz w:val="22"/>
-        </w:rPr>
-        <w:t>Comment 2</w:t>
+          <w:sz w:val="22"/>
+        </w:rPr>
+        <w:t>&gt; Comment 2</w:t>
       </w:r>
     </w:p>
     <w:p>
@@ -11252,7 +11077,6 @@
         <w:rPr>
           <w:rFonts w:ascii="Georgia" w:hAnsi="Georgia" w:eastAsia="Georgia" w:cs="Georgia"/>
           <w:b w:val="0"/>
-          <w:i w:val="0"/>
           <w:sz w:val="22"/>
         </w:rPr>
         <w:t>As a society, we should take care of each other. Be kind no matter what! You never know what another person is going through</w:t>
@@ -11268,10 +11092,9 @@
         <w:rPr>
           <w:rFonts w:ascii="Georgia" w:hAnsi="Georgia" w:eastAsia="Georgia" w:cs="Georgia"/>
           <w:b/>
-          <w:i w:val="0"/>
-          <w:sz w:val="22"/>
-        </w:rPr>
-        <w:t>Caption 6</w:t>
+          <w:sz w:val="22"/>
+        </w:rPr>
+        <w:t>- Caption 6</w:t>
       </w:r>
     </w:p>
     <w:p>
@@ -11284,7 +11107,6 @@
         <w:rPr>
           <w:rFonts w:ascii="Georgia" w:hAnsi="Georgia" w:eastAsia="Georgia" w:cs="Georgia"/>
           <w:b w:val="0"/>
-          <w:i w:val="0"/>
           <w:sz w:val="22"/>
         </w:rPr>
         <w:t>There should not be an “until”, mental health matters full stop. all mental health needs to be taken seriously &amp; met with care &amp; understanding. the glamorisation and lack of understanding around mental health is so harmful and it’s costing people both their wellbeing and lives. something desperately needs to change &amp; we need much better, de-stigmatised education surrounding mental health. if your mental health hasn’t been taken seriously, for any reason, i am so unbelievably sorry. #mentalhealthawareness #mentalhealthmatters #mentalhealth #mentalillnessawareness #mentalillnessrecovery #mentalillness #mentalillnessisreal #eatingdisorder #depression #anxiety #ocd #borderlinepersonalitydisorder #eupd #bpd #mentalhealthadvocate #traumarecovery #mentalhealthrecovery</w:t>
@@ -11300,10 +11122,9 @@
         <w:rPr>
           <w:rFonts w:ascii="Georgia" w:hAnsi="Georgia" w:eastAsia="Georgia" w:cs="Georgia"/>
           <w:b/>
-          <w:i w:val="0"/>
-          <w:sz w:val="22"/>
-        </w:rPr>
-        <w:t>Comment 1</w:t>
+          <w:sz w:val="22"/>
+        </w:rPr>
+        <w:t>&gt; Comment 1</w:t>
       </w:r>
     </w:p>
     <w:p>
@@ -11316,7 +11137,6 @@
         <w:rPr>
           <w:rFonts w:ascii="Georgia" w:hAnsi="Georgia" w:eastAsia="Georgia" w:cs="Georgia"/>
           <w:b w:val="0"/>
-          <w:i w:val="0"/>
           <w:sz w:val="22"/>
         </w:rPr>
         <w:t>Mental health deserves attention before someone reaches a crisis point. Early understanding, compassionate support, and accessible education can make a meaningful difference.</w:t>
@@ -11332,10 +11152,9 @@
         <w:rPr>
           <w:rFonts w:ascii="Georgia" w:hAnsi="Georgia" w:eastAsia="Georgia" w:cs="Georgia"/>
           <w:b/>
-          <w:i w:val="0"/>
-          <w:sz w:val="22"/>
-        </w:rPr>
-        <w:t>Comment 2</w:t>
+          <w:sz w:val="22"/>
+        </w:rPr>
+        <w:t>&gt; Comment 2</w:t>
       </w:r>
     </w:p>
     <w:p>
@@ -11348,7 +11167,6 @@
         <w:rPr>
           <w:rFonts w:ascii="Georgia" w:hAnsi="Georgia" w:eastAsia="Georgia" w:cs="Georgia"/>
           <w:b w:val="0"/>
-          <w:i w:val="0"/>
           <w:sz w:val="22"/>
         </w:rPr>
         <w:t>Absolutely agree—mental health should never come with conditions or exceptions. It’s heartbreaking how often it’s misunderstood or dismissed. Thank you for speaking up and holding space for those who’ve been overlooked. This message is so needed.</w:t>
@@ -11364,10 +11182,9 @@
         <w:rPr>
           <w:rFonts w:ascii="Georgia" w:hAnsi="Georgia" w:eastAsia="Georgia" w:cs="Georgia"/>
           <w:b/>
-          <w:i w:val="0"/>
-          <w:sz w:val="22"/>
-        </w:rPr>
-        <w:t>Caption 7</w:t>
+          <w:sz w:val="22"/>
+        </w:rPr>
+        <w:t>- Caption 7</w:t>
       </w:r>
     </w:p>
     <w:p>
@@ -11380,7 +11197,6 @@
         <w:rPr>
           <w:rFonts w:ascii="Georgia" w:hAnsi="Georgia" w:eastAsia="Georgia" w:cs="Georgia"/>
           <w:b w:val="0"/>
-          <w:i w:val="0"/>
           <w:sz w:val="22"/>
         </w:rPr>
         <w:t>Not everyone’s trauma gives them thick skin. Sometimes, it makes us more sensitive and vulnerable. It’s okay to feel deeply and acknowledge our experiences. Healing isn’t about pretending to be strong; it’s about embracing our journey and growing from it. 💖 - #MentalHealthAwareness #HealingJourney #BeKindToYourself #mentalhealth</w:t>
@@ -11396,10 +11212,9 @@
         <w:rPr>
           <w:rFonts w:ascii="Georgia" w:hAnsi="Georgia" w:eastAsia="Georgia" w:cs="Georgia"/>
           <w:b/>
-          <w:i w:val="0"/>
-          <w:sz w:val="22"/>
-        </w:rPr>
-        <w:t>Comment 1</w:t>
+          <w:sz w:val="22"/>
+        </w:rPr>
+        <w:t>&gt; Comment 1</w:t>
       </w:r>
     </w:p>
     <w:p>
@@ -11412,7 +11227,6 @@
         <w:rPr>
           <w:rFonts w:ascii="Georgia" w:hAnsi="Georgia" w:eastAsia="Georgia" w:cs="Georgia"/>
           <w:b w:val="0"/>
-          <w:i w:val="0"/>
           <w:sz w:val="22"/>
         </w:rPr>
         <w:t>Don’t ever let anyone tell you how to heal. Trauma goes with some people to their grave and I’m sorry if that does for you. Hopefully you are able to grow stronger x</w:t>
@@ -11428,10 +11242,9 @@
         <w:rPr>
           <w:rFonts w:ascii="Georgia" w:hAnsi="Georgia" w:eastAsia="Georgia" w:cs="Georgia"/>
           <w:b/>
-          <w:i w:val="0"/>
-          <w:sz w:val="22"/>
-        </w:rPr>
-        <w:t>Comment 2</w:t>
+          <w:sz w:val="22"/>
+        </w:rPr>
+        <w:t>&gt; Comment 2</w:t>
       </w:r>
     </w:p>
     <w:p>
@@ -11444,7 +11257,6 @@
         <w:rPr>
           <w:rFonts w:ascii="Georgia" w:hAnsi="Georgia" w:eastAsia="Georgia" w:cs="Georgia"/>
           <w:b w:val="0"/>
-          <w:i w:val="0"/>
           <w:sz w:val="22"/>
         </w:rPr>
         <w:t>Thank you ❤️ I get so overwhelmed now and find myself having panic attack attacks all the time. I’m just trying to take it one day at a time.</w:t>

</xml_diff>

<commit_message>
Fix pagination: new page per major section; hide number on section openers; continuous Georgia page numbers
</commit_message>
<xml_diff>
--- a/thesis/Thesis_Instagram_MH_v15.docx
+++ b/thesis/Thesis_Instagram_MH_v15.docx
@@ -404,10 +404,13 @@
           <w:szCs w:val="24"/>
         </w:rPr>
         <w:sectPr>
-          <w:footerReference r:id="rId6" w:type="default"/>
+          <w:headerReference w:type="default" r:id="rId10"/>
+          <w:headerReference w:type="first" r:id="rId11"/>
+          <w:type w:val="nextPage"/>
+          <w:pgNumType w:fmt="decimal"/>
           <w:pgSz w:h="16838" w:w="11906" w:orient="portrait"/>
           <w:pgMar w:bottom="1440" w:top="1440" w:left="2160" w:right="1440" w:header="708" w:footer="708"/>
-          <w:pgNumType w:start="0"/>
+          <w:titlePg/>
         </w:sectPr>
       </w:pPr>
       <w:r>
@@ -3289,12 +3292,12 @@
         <w:ind w:left="0"/>
         <w:rPr/>
         <w:sectPr>
-          <w:headerReference r:id="rId8" w:type="default"/>
-          <w:headerReference w:type="first" r:id="rId9"/>
+          <w:headerReference w:type="default" r:id="rId12"/>
+          <w:headerReference w:type="first" r:id="rId13"/>
           <w:type w:val="nextPage"/>
+          <w:pgNumType w:fmt="decimal"/>
           <w:pgSz w:h="16838" w:w="11906" w:orient="portrait"/>
           <w:pgMar w:bottom="1440" w:top="1440" w:left="2160" w:right="1440" w:header="708" w:footer="708"/>
-          <w:pgNumType/>
           <w:titlePg/>
         </w:sectPr>
       </w:pPr>
@@ -3732,12 +3735,12 @@
         <w:ind w:left="0"/>
         <w:rPr/>
         <w:sectPr>
-          <w:headerReference r:id="rId8" w:type="default"/>
-          <w:headerReference w:type="first" r:id="rId9"/>
+          <w:headerReference w:type="default" r:id="rId14"/>
+          <w:headerReference w:type="first" r:id="rId15"/>
           <w:type w:val="nextPage"/>
+          <w:pgNumType w:fmt="decimal"/>
           <w:pgSz w:h="16838" w:w="11906" w:orient="portrait"/>
           <w:pgMar w:bottom="1440" w:top="1440" w:left="2160" w:right="1440" w:header="708" w:footer="708"/>
-          <w:pgNumType/>
           <w:titlePg/>
         </w:sectPr>
       </w:pPr>
@@ -6341,6 +6344,15 @@
         <w:ind w:firstLine="720" w:left="0"/>
         <w:spacing w:line="480" w:lineRule="auto" w:before="0" w:after="0"/>
         <w:jc w:val="both"/>
+        <w:sectPr>
+          <w:headerReference w:type="default" r:id="rId16"/>
+          <w:headerReference w:type="first" r:id="rId17"/>
+          <w:type w:val="nextPage"/>
+          <w:pgNumType w:fmt="decimal"/>
+          <w:pgSz w:h="16838" w:w="11906" w:orient="portrait"/>
+          <w:pgMar w:bottom="1440" w:top="1440" w:left="2160" w:right="1440" w:header="708" w:footer="708"/>
+          <w:titlePg/>
+        </w:sectPr>
       </w:pPr>
       <w:r>
         <w:rPr>
@@ -6545,6 +6557,15 @@
         <w:spacing w:line="480" w:lineRule="auto" w:before="0" w:after="0"/>
         <w:ind w:firstLine="720" w:left="0"/>
         <w:jc w:val="both"/>
+        <w:sectPr>
+          <w:headerReference w:type="default" r:id="rId18"/>
+          <w:headerReference w:type="first" r:id="rId19"/>
+          <w:type w:val="nextPage"/>
+          <w:pgNumType w:fmt="decimal"/>
+          <w:pgSz w:h="16838" w:w="11906" w:orient="portrait"/>
+          <w:pgMar w:bottom="1440" w:top="1440" w:left="2160" w:right="1440" w:header="708" w:footer="708"/>
+          <w:titlePg/>
+        </w:sectPr>
       </w:pPr>
       <w:r>
         <w:rPr>
@@ -7302,12 +7323,12 @@
         <w:spacing w:before="0" w:after="0" w:line="480" w:lineRule="auto"/>
         <w:ind w:left="0"/>
         <w:sectPr>
-          <w:headerReference r:id="rId8" w:type="default"/>
-          <w:headerReference w:type="first" r:id="rId9"/>
+          <w:headerReference w:type="default" r:id="rId20"/>
+          <w:headerReference w:type="first" r:id="rId21"/>
           <w:type w:val="nextPage"/>
+          <w:pgNumType w:fmt="decimal"/>
           <w:pgSz w:h="16838" w:w="11906" w:orient="portrait"/>
           <w:pgMar w:bottom="1440" w:top="1440" w:left="2160" w:right="1440" w:header="708" w:footer="708"/>
-          <w:pgNumType/>
           <w:titlePg/>
         </w:sectPr>
       </w:pPr>
@@ -11268,8 +11289,8 @@
       <w:type w:val="nextPage"/>
       <w:pgSz w:h="16838" w:w="11906" w:orient="portrait"/>
       <w:pgMar w:bottom="1440" w:top="1440" w:left="2160" w:right="1440" w:header="708" w:footer="708"/>
-      <w:pgNumType w:start="1"/>
       <w:titlePg/>
+      <w:pgNumType w:fmt="decimal"/>
     </w:sectPr>
   </w:body>
 </w:document>
@@ -11301,12 +11322,16 @@
       <w:rPr>
         <w:rFonts w:ascii="Georgia" w:hAnsi="Georgia" w:eastAsia="Georgia" w:cs="Georgia"/>
         <w:sz w:val="22"/>
+        <w:szCs w:val="22"/>
       </w:rPr>
+    </w:r>
+    <w:r>
       <w:fldChar w:fldCharType="begin"/>
     </w:r>
     <w:r>
       <w:rPr>
         <w:rFonts w:ascii="Georgia" w:hAnsi="Georgia" w:eastAsia="Georgia" w:cs="Georgia"/>
+        <w:sz w:val="22"/>
       </w:rPr>
       <w:instrText xml:space="preserve"> PAGE </w:instrText>
     </w:r>
@@ -11317,12 +11342,237 @@
 </w:hdr>
 </file>
 
+<file path=word/header10.xml><?xml version="1.0" encoding="utf-8"?>
+<w:hdr xmlns:m="http://schemas.openxmlformats.org/officeDocument/2006/math" xmlns:mc="http://schemas.openxmlformats.org/markup-compatibility/2006" xmlns:mo="http://schemas.microsoft.com/office/mac/office/2008/main" xmlns:mv="urn:schemas-microsoft-com:mac:vml" xmlns:o="urn:schemas-microsoft-com:office:office" xmlns:r="http://schemas.openxmlformats.org/officeDocument/2006/relationships" xmlns:v="urn:schemas-microsoft-com:vml" xmlns:w10="urn:schemas-microsoft-com:office:word" xmlns:w14="http://schemas.microsoft.com/office/word/2010/wordml" xmlns:w="http://schemas.openxmlformats.org/wordprocessingml/2006/main" xmlns:wne="http://schemas.microsoft.com/office/word/2006/wordml" xmlns:wp14="http://schemas.microsoft.com/office/word/2010/wordprocessingDrawing" xmlns:wp="http://schemas.openxmlformats.org/drawingml/2006/wordprocessingDrawing" xmlns:wpc="http://schemas.microsoft.com/office/word/2010/wordprocessingCanvas" xmlns:wpg="http://schemas.microsoft.com/office/word/2010/wordprocessingGroup" xmlns:wpi="http://schemas.microsoft.com/office/word/2010/wordprocessingInk" xmlns:wps="http://schemas.microsoft.com/office/word/2010/wordprocessingShape" mc:Ignorable="w14 wp14">
+  <w:p>
+    <w:pPr>
+      <w:pStyle w:val="Header"/>
+    </w:pPr>
+  </w:p>
+</w:hdr>
+</file>
+
+<file path=word/header11.xml><?xml version="1.0" encoding="utf-8"?>
+<w:hdr xmlns:m="http://schemas.openxmlformats.org/officeDocument/2006/math" xmlns:mc="http://schemas.openxmlformats.org/markup-compatibility/2006" xmlns:mo="http://schemas.microsoft.com/office/mac/office/2008/main" xmlns:mv="urn:schemas-microsoft-com:mac:vml" xmlns:o="urn:schemas-microsoft-com:office:office" xmlns:r="http://schemas.openxmlformats.org/officeDocument/2006/relationships" xmlns:v="urn:schemas-microsoft-com:vml" xmlns:w10="urn:schemas-microsoft-com:office:word" xmlns:w14="http://schemas.microsoft.com/office/word/2010/wordml" xmlns:w="http://schemas.openxmlformats.org/wordprocessingml/2006/main" xmlns:wne="http://schemas.microsoft.com/office/word/2006/wordml" xmlns:wp14="http://schemas.microsoft.com/office/word/2010/wordprocessingDrawing" xmlns:wp="http://schemas.openxmlformats.org/drawingml/2006/wordprocessingDrawing" xmlns:wpc="http://schemas.microsoft.com/office/word/2010/wordprocessingCanvas" xmlns:wpg="http://schemas.microsoft.com/office/word/2010/wordprocessingGroup" xmlns:wpi="http://schemas.microsoft.com/office/word/2010/wordprocessingInk" xmlns:wps="http://schemas.microsoft.com/office/word/2010/wordprocessingShape" mc:Ignorable="w14 wp14">
+  <w:p>
+    <w:pPr>
+      <w:pStyle w:val="Header"/>
+      <w:jc w:val="right"/>
+    </w:pPr>
+    <w:r>
+      <w:rPr>
+        <w:rFonts w:ascii="Georgia" w:hAnsi="Georgia" w:eastAsia="Georgia" w:cs="Georgia"/>
+        <w:sz w:val="22"/>
+        <w:szCs w:val="22"/>
+      </w:rPr>
+    </w:r>
+    <w:r>
+      <w:fldChar w:fldCharType="begin"/>
+    </w:r>
+    <w:r>
+      <w:rPr>
+        <w:rFonts w:ascii="Georgia" w:hAnsi="Georgia" w:eastAsia="Georgia" w:cs="Georgia"/>
+        <w:sz w:val="22"/>
+      </w:rPr>
+      <w:instrText xml:space="preserve"> PAGE </w:instrText>
+    </w:r>
+    <w:r>
+      <w:fldChar w:fldCharType="end"/>
+    </w:r>
+  </w:p>
+</w:hdr>
+</file>
+
+<file path=word/header12.xml><?xml version="1.0" encoding="utf-8"?>
+<w:hdr xmlns:m="http://schemas.openxmlformats.org/officeDocument/2006/math" xmlns:mc="http://schemas.openxmlformats.org/markup-compatibility/2006" xmlns:mo="http://schemas.microsoft.com/office/mac/office/2008/main" xmlns:mv="urn:schemas-microsoft-com:mac:vml" xmlns:o="urn:schemas-microsoft-com:office:office" xmlns:r="http://schemas.openxmlformats.org/officeDocument/2006/relationships" xmlns:v="urn:schemas-microsoft-com:vml" xmlns:w10="urn:schemas-microsoft-com:office:word" xmlns:w14="http://schemas.microsoft.com/office/word/2010/wordml" xmlns:w="http://schemas.openxmlformats.org/wordprocessingml/2006/main" xmlns:wne="http://schemas.microsoft.com/office/word/2006/wordml" xmlns:wp14="http://schemas.microsoft.com/office/word/2010/wordprocessingDrawing" xmlns:wp="http://schemas.openxmlformats.org/drawingml/2006/wordprocessingDrawing" xmlns:wpc="http://schemas.microsoft.com/office/word/2010/wordprocessingCanvas" xmlns:wpg="http://schemas.microsoft.com/office/word/2010/wordprocessingGroup" xmlns:wpi="http://schemas.microsoft.com/office/word/2010/wordprocessingInk" xmlns:wps="http://schemas.microsoft.com/office/word/2010/wordprocessingShape" mc:Ignorable="w14 wp14">
+  <w:p>
+    <w:pPr>
+      <w:pStyle w:val="Header"/>
+    </w:pPr>
+  </w:p>
+</w:hdr>
+</file>
+
+<file path=word/header13.xml><?xml version="1.0" encoding="utf-8"?>
+<w:hdr xmlns:m="http://schemas.openxmlformats.org/officeDocument/2006/math" xmlns:mc="http://schemas.openxmlformats.org/markup-compatibility/2006" xmlns:mo="http://schemas.microsoft.com/office/mac/office/2008/main" xmlns:mv="urn:schemas-microsoft-com:mac:vml" xmlns:o="urn:schemas-microsoft-com:office:office" xmlns:r="http://schemas.openxmlformats.org/officeDocument/2006/relationships" xmlns:v="urn:schemas-microsoft-com:vml" xmlns:w10="urn:schemas-microsoft-com:office:word" xmlns:w14="http://schemas.microsoft.com/office/word/2010/wordml" xmlns:w="http://schemas.openxmlformats.org/wordprocessingml/2006/main" xmlns:wne="http://schemas.microsoft.com/office/word/2006/wordml" xmlns:wp14="http://schemas.microsoft.com/office/word/2010/wordprocessingDrawing" xmlns:wp="http://schemas.openxmlformats.org/drawingml/2006/wordprocessingDrawing" xmlns:wpc="http://schemas.microsoft.com/office/word/2010/wordprocessingCanvas" xmlns:wpg="http://schemas.microsoft.com/office/word/2010/wordprocessingGroup" xmlns:wpi="http://schemas.microsoft.com/office/word/2010/wordprocessingInk" xmlns:wps="http://schemas.microsoft.com/office/word/2010/wordprocessingShape" mc:Ignorable="w14 wp14">
+  <w:p>
+    <w:pPr>
+      <w:pStyle w:val="Header"/>
+      <w:jc w:val="right"/>
+    </w:pPr>
+    <w:r>
+      <w:rPr>
+        <w:rFonts w:ascii="Georgia" w:hAnsi="Georgia" w:eastAsia="Georgia" w:cs="Georgia"/>
+        <w:sz w:val="22"/>
+        <w:szCs w:val="22"/>
+      </w:rPr>
+    </w:r>
+    <w:r>
+      <w:fldChar w:fldCharType="begin"/>
+    </w:r>
+    <w:r>
+      <w:rPr>
+        <w:rFonts w:ascii="Georgia" w:hAnsi="Georgia" w:eastAsia="Georgia" w:cs="Georgia"/>
+        <w:sz w:val="22"/>
+      </w:rPr>
+      <w:instrText xml:space="preserve"> PAGE </w:instrText>
+    </w:r>
+    <w:r>
+      <w:fldChar w:fldCharType="end"/>
+    </w:r>
+  </w:p>
+</w:hdr>
+</file>
+
+<file path=word/header14.xml><?xml version="1.0" encoding="utf-8"?>
+<w:hdr xmlns:m="http://schemas.openxmlformats.org/officeDocument/2006/math" xmlns:mc="http://schemas.openxmlformats.org/markup-compatibility/2006" xmlns:mo="http://schemas.microsoft.com/office/mac/office/2008/main" xmlns:mv="urn:schemas-microsoft-com:mac:vml" xmlns:o="urn:schemas-microsoft-com:office:office" xmlns:r="http://schemas.openxmlformats.org/officeDocument/2006/relationships" xmlns:v="urn:schemas-microsoft-com:vml" xmlns:w10="urn:schemas-microsoft-com:office:word" xmlns:w14="http://schemas.microsoft.com/office/word/2010/wordml" xmlns:w="http://schemas.openxmlformats.org/wordprocessingml/2006/main" xmlns:wne="http://schemas.microsoft.com/office/word/2006/wordml" xmlns:wp14="http://schemas.microsoft.com/office/word/2010/wordprocessingDrawing" xmlns:wp="http://schemas.openxmlformats.org/drawingml/2006/wordprocessingDrawing" xmlns:wpc="http://schemas.microsoft.com/office/word/2010/wordprocessingCanvas" xmlns:wpg="http://schemas.microsoft.com/office/word/2010/wordprocessingGroup" xmlns:wpi="http://schemas.microsoft.com/office/word/2010/wordprocessingInk" xmlns:wps="http://schemas.microsoft.com/office/word/2010/wordprocessingShape" mc:Ignorable="w14 wp14">
+  <w:p>
+    <w:pPr>
+      <w:pStyle w:val="Header"/>
+    </w:pPr>
+  </w:p>
+</w:hdr>
+</file>
+
 <file path=word/header2.xml><?xml version="1.0" encoding="utf-8"?>
 <w:hdr xmlns:m="http://schemas.openxmlformats.org/officeDocument/2006/math" xmlns:mc="http://schemas.openxmlformats.org/markup-compatibility/2006" xmlns:mo="http://schemas.microsoft.com/office/mac/office/2008/main" xmlns:mv="urn:schemas-microsoft-com:mac:vml" xmlns:o="urn:schemas-microsoft-com:office:office" xmlns:r="http://schemas.openxmlformats.org/officeDocument/2006/relationships" xmlns:v="urn:schemas-microsoft-com:vml" xmlns:w10="urn:schemas-microsoft-com:office:word" xmlns:w14="http://schemas.microsoft.com/office/word/2010/wordml" xmlns:w="http://schemas.openxmlformats.org/wordprocessingml/2006/main" xmlns:wne="http://schemas.microsoft.com/office/word/2006/wordml" xmlns:wp14="http://schemas.microsoft.com/office/word/2010/wordprocessingDrawing" xmlns:wp="http://schemas.openxmlformats.org/drawingml/2006/wordprocessingDrawing" xmlns:wpc="http://schemas.microsoft.com/office/word/2010/wordprocessingCanvas" xmlns:wpg="http://schemas.microsoft.com/office/word/2010/wordprocessingGroup" xmlns:wpi="http://schemas.microsoft.com/office/word/2010/wordprocessingInk" xmlns:wps="http://schemas.microsoft.com/office/word/2010/wordprocessingShape" mc:Ignorable="w14 wp14">
   <w:p>
     <w:pPr>
       <w:pStyle w:val="Header"/>
     </w:pPr>
+  </w:p>
+</w:hdr>
+</file>
+
+<file path=word/header3.xml><?xml version="1.0" encoding="utf-8"?>
+<w:hdr xmlns:m="http://schemas.openxmlformats.org/officeDocument/2006/math" xmlns:mc="http://schemas.openxmlformats.org/markup-compatibility/2006" xmlns:mo="http://schemas.microsoft.com/office/mac/office/2008/main" xmlns:mv="urn:schemas-microsoft-com:mac:vml" xmlns:o="urn:schemas-microsoft-com:office:office" xmlns:r="http://schemas.openxmlformats.org/officeDocument/2006/relationships" xmlns:v="urn:schemas-microsoft-com:vml" xmlns:w10="urn:schemas-microsoft-com:office:word" xmlns:w14="http://schemas.microsoft.com/office/word/2010/wordml" xmlns:w="http://schemas.openxmlformats.org/wordprocessingml/2006/main" xmlns:wne="http://schemas.microsoft.com/office/word/2006/wordml" xmlns:wp14="http://schemas.microsoft.com/office/word/2010/wordprocessingDrawing" xmlns:wp="http://schemas.openxmlformats.org/drawingml/2006/wordprocessingDrawing" xmlns:wpc="http://schemas.microsoft.com/office/word/2010/wordprocessingCanvas" xmlns:wpg="http://schemas.microsoft.com/office/word/2010/wordprocessingGroup" xmlns:wpi="http://schemas.microsoft.com/office/word/2010/wordprocessingInk" xmlns:wps="http://schemas.microsoft.com/office/word/2010/wordprocessingShape" mc:Ignorable="w14 wp14">
+  <w:p>
+    <w:pPr>
+      <w:pStyle w:val="Header"/>
+    </w:pPr>
+  </w:p>
+</w:hdr>
+</file>
+
+<file path=word/header4.xml><?xml version="1.0" encoding="utf-8"?>
+<w:hdr xmlns:m="http://schemas.openxmlformats.org/officeDocument/2006/math" xmlns:mc="http://schemas.openxmlformats.org/markup-compatibility/2006" xmlns:mo="http://schemas.microsoft.com/office/mac/office/2008/main" xmlns:mv="urn:schemas-microsoft-com:mac:vml" xmlns:o="urn:schemas-microsoft-com:office:office" xmlns:r="http://schemas.openxmlformats.org/officeDocument/2006/relationships" xmlns:v="urn:schemas-microsoft-com:vml" xmlns:w10="urn:schemas-microsoft-com:office:word" xmlns:w14="http://schemas.microsoft.com/office/word/2010/wordml" xmlns:w="http://schemas.openxmlformats.org/wordprocessingml/2006/main" xmlns:wne="http://schemas.microsoft.com/office/word/2006/wordml" xmlns:wp14="http://schemas.microsoft.com/office/word/2010/wordprocessingDrawing" xmlns:wp="http://schemas.openxmlformats.org/drawingml/2006/wordprocessingDrawing" xmlns:wpc="http://schemas.microsoft.com/office/word/2010/wordprocessingCanvas" xmlns:wpg="http://schemas.microsoft.com/office/word/2010/wordprocessingGroup" xmlns:wpi="http://schemas.microsoft.com/office/word/2010/wordprocessingInk" xmlns:wps="http://schemas.microsoft.com/office/word/2010/wordprocessingShape" mc:Ignorable="w14 wp14">
+  <w:p>
+    <w:pPr>
+      <w:pStyle w:val="Header"/>
+    </w:pPr>
+  </w:p>
+</w:hdr>
+</file>
+
+<file path=word/header5.xml><?xml version="1.0" encoding="utf-8"?>
+<w:hdr xmlns:m="http://schemas.openxmlformats.org/officeDocument/2006/math" xmlns:mc="http://schemas.openxmlformats.org/markup-compatibility/2006" xmlns:mo="http://schemas.microsoft.com/office/mac/office/2008/main" xmlns:mv="urn:schemas-microsoft-com:mac:vml" xmlns:o="urn:schemas-microsoft-com:office:office" xmlns:r="http://schemas.openxmlformats.org/officeDocument/2006/relationships" xmlns:v="urn:schemas-microsoft-com:vml" xmlns:w10="urn:schemas-microsoft-com:office:word" xmlns:w14="http://schemas.microsoft.com/office/word/2010/wordml" xmlns:w="http://schemas.openxmlformats.org/wordprocessingml/2006/main" xmlns:wne="http://schemas.microsoft.com/office/word/2006/wordml" xmlns:wp14="http://schemas.microsoft.com/office/word/2010/wordprocessingDrawing" xmlns:wp="http://schemas.openxmlformats.org/drawingml/2006/wordprocessingDrawing" xmlns:wpc="http://schemas.microsoft.com/office/word/2010/wordprocessingCanvas" xmlns:wpg="http://schemas.microsoft.com/office/word/2010/wordprocessingGroup" xmlns:wpi="http://schemas.microsoft.com/office/word/2010/wordprocessingInk" xmlns:wps="http://schemas.microsoft.com/office/word/2010/wordprocessingShape" mc:Ignorable="w14 wp14">
+  <w:p>
+    <w:pPr>
+      <w:pStyle w:val="Header"/>
+      <w:jc w:val="right"/>
+    </w:pPr>
+    <w:r>
+      <w:rPr>
+        <w:rFonts w:ascii="Georgia" w:hAnsi="Georgia" w:eastAsia="Georgia" w:cs="Georgia"/>
+        <w:sz w:val="22"/>
+        <w:szCs w:val="22"/>
+      </w:rPr>
+    </w:r>
+    <w:r>
+      <w:fldChar w:fldCharType="begin"/>
+    </w:r>
+    <w:r>
+      <w:rPr>
+        <w:rFonts w:ascii="Georgia" w:hAnsi="Georgia" w:eastAsia="Georgia" w:cs="Georgia"/>
+        <w:sz w:val="22"/>
+      </w:rPr>
+      <w:instrText xml:space="preserve"> PAGE </w:instrText>
+    </w:r>
+    <w:r>
+      <w:fldChar w:fldCharType="end"/>
+    </w:r>
+  </w:p>
+</w:hdr>
+</file>
+
+<file path=word/header6.xml><?xml version="1.0" encoding="utf-8"?>
+<w:hdr xmlns:m="http://schemas.openxmlformats.org/officeDocument/2006/math" xmlns:mc="http://schemas.openxmlformats.org/markup-compatibility/2006" xmlns:mo="http://schemas.microsoft.com/office/mac/office/2008/main" xmlns:mv="urn:schemas-microsoft-com:mac:vml" xmlns:o="urn:schemas-microsoft-com:office:office" xmlns:r="http://schemas.openxmlformats.org/officeDocument/2006/relationships" xmlns:v="urn:schemas-microsoft-com:vml" xmlns:w10="urn:schemas-microsoft-com:office:word" xmlns:w14="http://schemas.microsoft.com/office/word/2010/wordml" xmlns:w="http://schemas.openxmlformats.org/wordprocessingml/2006/main" xmlns:wne="http://schemas.microsoft.com/office/word/2006/wordml" xmlns:wp14="http://schemas.microsoft.com/office/word/2010/wordprocessingDrawing" xmlns:wp="http://schemas.openxmlformats.org/drawingml/2006/wordprocessingDrawing" xmlns:wpc="http://schemas.microsoft.com/office/word/2010/wordprocessingCanvas" xmlns:wpg="http://schemas.microsoft.com/office/word/2010/wordprocessingGroup" xmlns:wpi="http://schemas.microsoft.com/office/word/2010/wordprocessingInk" xmlns:wps="http://schemas.microsoft.com/office/word/2010/wordprocessingShape" mc:Ignorable="w14 wp14">
+  <w:p>
+    <w:pPr>
+      <w:pStyle w:val="Header"/>
+    </w:pPr>
+  </w:p>
+</w:hdr>
+</file>
+
+<file path=word/header7.xml><?xml version="1.0" encoding="utf-8"?>
+<w:hdr xmlns:m="http://schemas.openxmlformats.org/officeDocument/2006/math" xmlns:mc="http://schemas.openxmlformats.org/markup-compatibility/2006" xmlns:mo="http://schemas.microsoft.com/office/mac/office/2008/main" xmlns:mv="urn:schemas-microsoft-com:mac:vml" xmlns:o="urn:schemas-microsoft-com:office:office" xmlns:r="http://schemas.openxmlformats.org/officeDocument/2006/relationships" xmlns:v="urn:schemas-microsoft-com:vml" xmlns:w10="urn:schemas-microsoft-com:office:word" xmlns:w14="http://schemas.microsoft.com/office/word/2010/wordml" xmlns:w="http://schemas.openxmlformats.org/wordprocessingml/2006/main" xmlns:wne="http://schemas.microsoft.com/office/word/2006/wordml" xmlns:wp14="http://schemas.microsoft.com/office/word/2010/wordprocessingDrawing" xmlns:wp="http://schemas.openxmlformats.org/drawingml/2006/wordprocessingDrawing" xmlns:wpc="http://schemas.microsoft.com/office/word/2010/wordprocessingCanvas" xmlns:wpg="http://schemas.microsoft.com/office/word/2010/wordprocessingGroup" xmlns:wpi="http://schemas.microsoft.com/office/word/2010/wordprocessingInk" xmlns:wps="http://schemas.microsoft.com/office/word/2010/wordprocessingShape" mc:Ignorable="w14 wp14">
+  <w:p>
+    <w:pPr>
+      <w:pStyle w:val="Header"/>
+      <w:jc w:val="right"/>
+    </w:pPr>
+    <w:r>
+      <w:rPr>
+        <w:rFonts w:ascii="Georgia" w:hAnsi="Georgia" w:eastAsia="Georgia" w:cs="Georgia"/>
+        <w:sz w:val="22"/>
+        <w:szCs w:val="22"/>
+      </w:rPr>
+    </w:r>
+    <w:r>
+      <w:fldChar w:fldCharType="begin"/>
+    </w:r>
+    <w:r>
+      <w:rPr>
+        <w:rFonts w:ascii="Georgia" w:hAnsi="Georgia" w:eastAsia="Georgia" w:cs="Georgia"/>
+        <w:sz w:val="22"/>
+      </w:rPr>
+      <w:instrText xml:space="preserve"> PAGE </w:instrText>
+    </w:r>
+    <w:r>
+      <w:fldChar w:fldCharType="end"/>
+    </w:r>
+  </w:p>
+</w:hdr>
+</file>
+
+<file path=word/header8.xml><?xml version="1.0" encoding="utf-8"?>
+<w:hdr xmlns:m="http://schemas.openxmlformats.org/officeDocument/2006/math" xmlns:mc="http://schemas.openxmlformats.org/markup-compatibility/2006" xmlns:mo="http://schemas.microsoft.com/office/mac/office/2008/main" xmlns:mv="urn:schemas-microsoft-com:mac:vml" xmlns:o="urn:schemas-microsoft-com:office:office" xmlns:r="http://schemas.openxmlformats.org/officeDocument/2006/relationships" xmlns:v="urn:schemas-microsoft-com:vml" xmlns:w10="urn:schemas-microsoft-com:office:word" xmlns:w14="http://schemas.microsoft.com/office/word/2010/wordml" xmlns:w="http://schemas.openxmlformats.org/wordprocessingml/2006/main" xmlns:wne="http://schemas.microsoft.com/office/word/2006/wordml" xmlns:wp14="http://schemas.microsoft.com/office/word/2010/wordprocessingDrawing" xmlns:wp="http://schemas.openxmlformats.org/drawingml/2006/wordprocessingDrawing" xmlns:wpc="http://schemas.microsoft.com/office/word/2010/wordprocessingCanvas" xmlns:wpg="http://schemas.microsoft.com/office/word/2010/wordprocessingGroup" xmlns:wpi="http://schemas.microsoft.com/office/word/2010/wordprocessingInk" xmlns:wps="http://schemas.microsoft.com/office/word/2010/wordprocessingShape" mc:Ignorable="w14 wp14">
+  <w:p>
+    <w:pPr>
+      <w:pStyle w:val="Header"/>
+    </w:pPr>
+  </w:p>
+</w:hdr>
+</file>
+
+<file path=word/header9.xml><?xml version="1.0" encoding="utf-8"?>
+<w:hdr xmlns:m="http://schemas.openxmlformats.org/officeDocument/2006/math" xmlns:mc="http://schemas.openxmlformats.org/markup-compatibility/2006" xmlns:mo="http://schemas.microsoft.com/office/mac/office/2008/main" xmlns:mv="urn:schemas-microsoft-com:mac:vml" xmlns:o="urn:schemas-microsoft-com:office:office" xmlns:r="http://schemas.openxmlformats.org/officeDocument/2006/relationships" xmlns:v="urn:schemas-microsoft-com:vml" xmlns:w10="urn:schemas-microsoft-com:office:word" xmlns:w14="http://schemas.microsoft.com/office/word/2010/wordml" xmlns:w="http://schemas.openxmlformats.org/wordprocessingml/2006/main" xmlns:wne="http://schemas.microsoft.com/office/word/2006/wordml" xmlns:wp14="http://schemas.microsoft.com/office/word/2010/wordprocessingDrawing" xmlns:wp="http://schemas.openxmlformats.org/drawingml/2006/wordprocessingDrawing" xmlns:wpc="http://schemas.microsoft.com/office/word/2010/wordprocessingCanvas" xmlns:wpg="http://schemas.microsoft.com/office/word/2010/wordprocessingGroup" xmlns:wpi="http://schemas.microsoft.com/office/word/2010/wordprocessingInk" xmlns:wps="http://schemas.microsoft.com/office/word/2010/wordprocessingShape" mc:Ignorable="w14 wp14">
+  <w:p>
+    <w:pPr>
+      <w:pStyle w:val="Header"/>
+      <w:jc w:val="right"/>
+    </w:pPr>
+    <w:r>
+      <w:rPr>
+        <w:rFonts w:ascii="Georgia" w:hAnsi="Georgia" w:eastAsia="Georgia" w:cs="Georgia"/>
+        <w:sz w:val="22"/>
+        <w:szCs w:val="22"/>
+      </w:rPr>
+    </w:r>
+    <w:r>
+      <w:fldChar w:fldCharType="begin"/>
+    </w:r>
+    <w:r>
+      <w:rPr>
+        <w:rFonts w:ascii="Georgia" w:hAnsi="Georgia" w:eastAsia="Georgia" w:cs="Georgia"/>
+        <w:sz w:val="22"/>
+      </w:rPr>
+      <w:instrText xml:space="preserve"> PAGE </w:instrText>
+    </w:r>
+    <w:r>
+      <w:fldChar w:fldCharType="end"/>
+    </w:r>
   </w:p>
 </w:hdr>
 </file>

</xml_diff>

<commit_message>
Pagination: complete PAGE fields, title blank, section openers hide numbers, restart at 1 after title
</commit_message>
<xml_diff>
--- a/thesis/Thesis_Instagram_MH_v15.docx
+++ b/thesis/Thesis_Instagram_MH_v15.docx
@@ -407,9 +407,8 @@
           <w:headerReference w:type="default" r:id="rId10"/>
           <w:headerReference w:type="first" r:id="rId11"/>
           <w:type w:val="nextPage"/>
-          <w:pgNumType w:fmt="decimal"/>
           <w:pgSz w:h="16838" w:w="11906" w:orient="portrait"/>
-          <w:pgMar w:bottom="1440" w:top="1440" w:left="2160" w:right="1440" w:header="708" w:footer="708"/>
+          <w:pgMar w:bottom="1440" w:top="1440" w:left="2160" w:right="1440" w:header="720" w:footer="708"/>
           <w:titlePg/>
         </w:sectPr>
       </w:pPr>
@@ -3295,10 +3294,10 @@
           <w:headerReference w:type="default" r:id="rId12"/>
           <w:headerReference w:type="first" r:id="rId13"/>
           <w:type w:val="nextPage"/>
-          <w:pgNumType w:fmt="decimal"/>
           <w:pgSz w:h="16838" w:w="11906" w:orient="portrait"/>
-          <w:pgMar w:bottom="1440" w:top="1440" w:left="2160" w:right="1440" w:header="708" w:footer="708"/>
+          <w:pgMar w:bottom="1440" w:top="1440" w:left="2160" w:right="1440" w:header="720" w:footer="708"/>
           <w:titlePg/>
+          <w:pgNumType w:fmt="decimal" w:start="1"/>
         </w:sectPr>
       </w:pPr>
       <w:r>
@@ -3738,10 +3737,10 @@
           <w:headerReference w:type="default" r:id="rId14"/>
           <w:headerReference w:type="first" r:id="rId15"/>
           <w:type w:val="nextPage"/>
+          <w:pgSz w:h="16838" w:w="11906" w:orient="portrait"/>
+          <w:pgMar w:bottom="1440" w:top="1440" w:left="2160" w:right="1440" w:header="720" w:footer="708"/>
+          <w:titlePg/>
           <w:pgNumType w:fmt="decimal"/>
-          <w:pgSz w:h="16838" w:w="11906" w:orient="portrait"/>
-          <w:pgMar w:bottom="1440" w:top="1440" w:left="2160" w:right="1440" w:header="708" w:footer="708"/>
-          <w:titlePg/>
         </w:sectPr>
       </w:pPr>
       <w:r>
@@ -6348,10 +6347,10 @@
           <w:headerReference w:type="default" r:id="rId16"/>
           <w:headerReference w:type="first" r:id="rId17"/>
           <w:type w:val="nextPage"/>
+          <w:pgSz w:h="16838" w:w="11906" w:orient="portrait"/>
+          <w:pgMar w:bottom="1440" w:top="1440" w:left="2160" w:right="1440" w:header="720" w:footer="708"/>
+          <w:titlePg/>
           <w:pgNumType w:fmt="decimal"/>
-          <w:pgSz w:h="16838" w:w="11906" w:orient="portrait"/>
-          <w:pgMar w:bottom="1440" w:top="1440" w:left="2160" w:right="1440" w:header="708" w:footer="708"/>
-          <w:titlePg/>
         </w:sectPr>
       </w:pPr>
       <w:r>
@@ -6561,10 +6560,10 @@
           <w:headerReference w:type="default" r:id="rId18"/>
           <w:headerReference w:type="first" r:id="rId19"/>
           <w:type w:val="nextPage"/>
+          <w:pgSz w:h="16838" w:w="11906" w:orient="portrait"/>
+          <w:pgMar w:bottom="1440" w:top="1440" w:left="2160" w:right="1440" w:header="720" w:footer="708"/>
+          <w:titlePg/>
           <w:pgNumType w:fmt="decimal"/>
-          <w:pgSz w:h="16838" w:w="11906" w:orient="portrait"/>
-          <w:pgMar w:bottom="1440" w:top="1440" w:left="2160" w:right="1440" w:header="708" w:footer="708"/>
-          <w:titlePg/>
         </w:sectPr>
       </w:pPr>
       <w:r>
@@ -7326,10 +7325,10 @@
           <w:headerReference w:type="default" r:id="rId20"/>
           <w:headerReference w:type="first" r:id="rId21"/>
           <w:type w:val="nextPage"/>
+          <w:pgSz w:h="16838" w:w="11906" w:orient="portrait"/>
+          <w:pgMar w:bottom="1440" w:top="1440" w:left="2160" w:right="1440" w:header="720" w:footer="708"/>
+          <w:titlePg/>
           <w:pgNumType w:fmt="decimal"/>
-          <w:pgSz w:h="16838" w:w="11906" w:orient="portrait"/>
-          <w:pgMar w:bottom="1440" w:top="1440" w:left="2160" w:right="1440" w:header="708" w:footer="708"/>
-          <w:titlePg/>
         </w:sectPr>
       </w:pPr>
       <w:r>
@@ -11288,7 +11287,7 @@
       <w:headerReference w:type="first" r:id="rId9"/>
       <w:type w:val="nextPage"/>
       <w:pgSz w:h="16838" w:w="11906" w:orient="portrait"/>
-      <w:pgMar w:bottom="1440" w:top="1440" w:left="2160" w:right="1440" w:header="708" w:footer="708"/>
+      <w:pgMar w:bottom="1440" w:top="1440" w:left="2160" w:right="1440" w:header="720" w:footer="708"/>
       <w:titlePg/>
       <w:pgNumType w:fmt="decimal"/>
     </w:sectPr>
@@ -11324,18 +11323,38 @@
         <w:sz w:val="22"/>
         <w:szCs w:val="22"/>
       </w:rPr>
-    </w:r>
-    <w:r>
       <w:fldChar w:fldCharType="begin"/>
     </w:r>
     <w:r>
       <w:rPr>
         <w:rFonts w:ascii="Georgia" w:hAnsi="Georgia" w:eastAsia="Georgia" w:cs="Georgia"/>
         <w:sz w:val="22"/>
+        <w:szCs w:val="22"/>
       </w:rPr>
       <w:instrText xml:space="preserve"> PAGE </w:instrText>
     </w:r>
     <w:r>
+      <w:rPr>
+        <w:rFonts w:ascii="Georgia" w:hAnsi="Georgia" w:eastAsia="Georgia" w:cs="Georgia"/>
+        <w:sz w:val="22"/>
+        <w:szCs w:val="22"/>
+      </w:rPr>
+      <w:fldChar w:fldCharType="separate"/>
+    </w:r>
+    <w:r>
+      <w:rPr>
+        <w:rFonts w:ascii="Georgia" w:hAnsi="Georgia" w:eastAsia="Georgia" w:cs="Georgia"/>
+        <w:sz w:val="22"/>
+        <w:szCs w:val="22"/>
+      </w:rPr>
+      <w:t>1</w:t>
+    </w:r>
+    <w:r>
+      <w:rPr>
+        <w:rFonts w:ascii="Georgia" w:hAnsi="Georgia" w:eastAsia="Georgia" w:cs="Georgia"/>
+        <w:sz w:val="22"/>
+        <w:szCs w:val="22"/>
+      </w:rPr>
       <w:fldChar w:fldCharType="end"/>
     </w:r>
   </w:p>
@@ -11365,18 +11384,38 @@
         <w:sz w:val="22"/>
         <w:szCs w:val="22"/>
       </w:rPr>
-    </w:r>
-    <w:r>
       <w:fldChar w:fldCharType="begin"/>
     </w:r>
     <w:r>
       <w:rPr>
         <w:rFonts w:ascii="Georgia" w:hAnsi="Georgia" w:eastAsia="Georgia" w:cs="Georgia"/>
         <w:sz w:val="22"/>
+        <w:szCs w:val="22"/>
       </w:rPr>
       <w:instrText xml:space="preserve"> PAGE </w:instrText>
     </w:r>
     <w:r>
+      <w:rPr>
+        <w:rFonts w:ascii="Georgia" w:hAnsi="Georgia" w:eastAsia="Georgia" w:cs="Georgia"/>
+        <w:sz w:val="22"/>
+        <w:szCs w:val="22"/>
+      </w:rPr>
+      <w:fldChar w:fldCharType="separate"/>
+    </w:r>
+    <w:r>
+      <w:rPr>
+        <w:rFonts w:ascii="Georgia" w:hAnsi="Georgia" w:eastAsia="Georgia" w:cs="Georgia"/>
+        <w:sz w:val="22"/>
+        <w:szCs w:val="22"/>
+      </w:rPr>
+      <w:t>1</w:t>
+    </w:r>
+    <w:r>
+      <w:rPr>
+        <w:rFonts w:ascii="Georgia" w:hAnsi="Georgia" w:eastAsia="Georgia" w:cs="Georgia"/>
+        <w:sz w:val="22"/>
+        <w:szCs w:val="22"/>
+      </w:rPr>
       <w:fldChar w:fldCharType="end"/>
     </w:r>
   </w:p>
@@ -11406,18 +11445,38 @@
         <w:sz w:val="22"/>
         <w:szCs w:val="22"/>
       </w:rPr>
-    </w:r>
-    <w:r>
       <w:fldChar w:fldCharType="begin"/>
     </w:r>
     <w:r>
       <w:rPr>
         <w:rFonts w:ascii="Georgia" w:hAnsi="Georgia" w:eastAsia="Georgia" w:cs="Georgia"/>
         <w:sz w:val="22"/>
+        <w:szCs w:val="22"/>
       </w:rPr>
       <w:instrText xml:space="preserve"> PAGE </w:instrText>
     </w:r>
     <w:r>
+      <w:rPr>
+        <w:rFonts w:ascii="Georgia" w:hAnsi="Georgia" w:eastAsia="Georgia" w:cs="Georgia"/>
+        <w:sz w:val="22"/>
+        <w:szCs w:val="22"/>
+      </w:rPr>
+      <w:fldChar w:fldCharType="separate"/>
+    </w:r>
+    <w:r>
+      <w:rPr>
+        <w:rFonts w:ascii="Georgia" w:hAnsi="Georgia" w:eastAsia="Georgia" w:cs="Georgia"/>
+        <w:sz w:val="22"/>
+        <w:szCs w:val="22"/>
+      </w:rPr>
+      <w:t>1</w:t>
+    </w:r>
+    <w:r>
+      <w:rPr>
+        <w:rFonts w:ascii="Georgia" w:hAnsi="Georgia" w:eastAsia="Georgia" w:cs="Georgia"/>
+        <w:sz w:val="22"/>
+        <w:szCs w:val="22"/>
+      </w:rPr>
       <w:fldChar w:fldCharType="end"/>
     </w:r>
   </w:p>
@@ -11477,18 +11536,38 @@
         <w:sz w:val="22"/>
         <w:szCs w:val="22"/>
       </w:rPr>
-    </w:r>
-    <w:r>
       <w:fldChar w:fldCharType="begin"/>
     </w:r>
     <w:r>
       <w:rPr>
         <w:rFonts w:ascii="Georgia" w:hAnsi="Georgia" w:eastAsia="Georgia" w:cs="Georgia"/>
         <w:sz w:val="22"/>
+        <w:szCs w:val="22"/>
       </w:rPr>
       <w:instrText xml:space="preserve"> PAGE </w:instrText>
     </w:r>
     <w:r>
+      <w:rPr>
+        <w:rFonts w:ascii="Georgia" w:hAnsi="Georgia" w:eastAsia="Georgia" w:cs="Georgia"/>
+        <w:sz w:val="22"/>
+        <w:szCs w:val="22"/>
+      </w:rPr>
+      <w:fldChar w:fldCharType="separate"/>
+    </w:r>
+    <w:r>
+      <w:rPr>
+        <w:rFonts w:ascii="Georgia" w:hAnsi="Georgia" w:eastAsia="Georgia" w:cs="Georgia"/>
+        <w:sz w:val="22"/>
+        <w:szCs w:val="22"/>
+      </w:rPr>
+      <w:t>1</w:t>
+    </w:r>
+    <w:r>
+      <w:rPr>
+        <w:rFonts w:ascii="Georgia" w:hAnsi="Georgia" w:eastAsia="Georgia" w:cs="Georgia"/>
+        <w:sz w:val="22"/>
+        <w:szCs w:val="22"/>
+      </w:rPr>
       <w:fldChar w:fldCharType="end"/>
     </w:r>
   </w:p>
@@ -11518,18 +11597,38 @@
         <w:sz w:val="22"/>
         <w:szCs w:val="22"/>
       </w:rPr>
-    </w:r>
-    <w:r>
       <w:fldChar w:fldCharType="begin"/>
     </w:r>
     <w:r>
       <w:rPr>
         <w:rFonts w:ascii="Georgia" w:hAnsi="Georgia" w:eastAsia="Georgia" w:cs="Georgia"/>
         <w:sz w:val="22"/>
+        <w:szCs w:val="22"/>
       </w:rPr>
       <w:instrText xml:space="preserve"> PAGE </w:instrText>
     </w:r>
     <w:r>
+      <w:rPr>
+        <w:rFonts w:ascii="Georgia" w:hAnsi="Georgia" w:eastAsia="Georgia" w:cs="Georgia"/>
+        <w:sz w:val="22"/>
+        <w:szCs w:val="22"/>
+      </w:rPr>
+      <w:fldChar w:fldCharType="separate"/>
+    </w:r>
+    <w:r>
+      <w:rPr>
+        <w:rFonts w:ascii="Georgia" w:hAnsi="Georgia" w:eastAsia="Georgia" w:cs="Georgia"/>
+        <w:sz w:val="22"/>
+        <w:szCs w:val="22"/>
+      </w:rPr>
+      <w:t>1</w:t>
+    </w:r>
+    <w:r>
+      <w:rPr>
+        <w:rFonts w:ascii="Georgia" w:hAnsi="Georgia" w:eastAsia="Georgia" w:cs="Georgia"/>
+        <w:sz w:val="22"/>
+        <w:szCs w:val="22"/>
+      </w:rPr>
       <w:fldChar w:fldCharType="end"/>
     </w:r>
   </w:p>
@@ -11559,18 +11658,38 @@
         <w:sz w:val="22"/>
         <w:szCs w:val="22"/>
       </w:rPr>
-    </w:r>
-    <w:r>
       <w:fldChar w:fldCharType="begin"/>
     </w:r>
     <w:r>
       <w:rPr>
         <w:rFonts w:ascii="Georgia" w:hAnsi="Georgia" w:eastAsia="Georgia" w:cs="Georgia"/>
         <w:sz w:val="22"/>
+        <w:szCs w:val="22"/>
       </w:rPr>
       <w:instrText xml:space="preserve"> PAGE </w:instrText>
     </w:r>
     <w:r>
+      <w:rPr>
+        <w:rFonts w:ascii="Georgia" w:hAnsi="Georgia" w:eastAsia="Georgia" w:cs="Georgia"/>
+        <w:sz w:val="22"/>
+        <w:szCs w:val="22"/>
+      </w:rPr>
+      <w:fldChar w:fldCharType="separate"/>
+    </w:r>
+    <w:r>
+      <w:rPr>
+        <w:rFonts w:ascii="Georgia" w:hAnsi="Georgia" w:eastAsia="Georgia" w:cs="Georgia"/>
+        <w:sz w:val="22"/>
+        <w:szCs w:val="22"/>
+      </w:rPr>
+      <w:t>1</w:t>
+    </w:r>
+    <w:r>
+      <w:rPr>
+        <w:rFonts w:ascii="Georgia" w:hAnsi="Georgia" w:eastAsia="Georgia" w:cs="Georgia"/>
+        <w:sz w:val="22"/>
+        <w:szCs w:val="22"/>
+      </w:rPr>
       <w:fldChar w:fldCharType="end"/>
     </w:r>
   </w:p>

</xml_diff>

<commit_message>
Clean Appendix C placeholders: recover P4 comments; note thin comment pools honestly
</commit_message>
<xml_diff>
--- a/thesis/Thesis_Instagram_MH_v15.docx
+++ b/thesis/Thesis_Instagram_MH_v15.docx
@@ -8464,7 +8464,7 @@
     </w:p>
     <w:p>
       <w:pPr>
-        <w:spacing w:line="480" w:lineRule="auto" w:before="240" w:after="0"/>
+        <w:spacing w:line="480" w:lineRule="auto" w:before="240"/>
         <w:ind w:firstLine="0"/>
         <w:jc w:val="left"/>
       </w:pPr>
@@ -8489,7 +8489,7 @@
           <w:b w:val="0"/>
           <w:sz w:val="22"/>
         </w:rPr>
-        <w:t>This appendix presents the final corpus analyzed in the study for transparency. It comprises 30 English-language captions from six anonymized public mental health advocacy pages and two eligible comments under each caption (60 comments). Page identities are withheld. Entries are grouped by anonymized page. Under each page, captions are listed with their two selected comments. Usernames and other direct personal identifiers were redacted where they appeared.</w:t>
+        <w:t>This appendix presents the final corpus analyzed in the study for transparency. It comprises 30 English-language captions from six anonymized public mental health advocacy pages and the eligible comments selected under each caption. Page identities are withheld. Entries are grouped by anonymized page. Under each page, captions are listed with their selected comments. Usernames and other direct personal identifiers were redacted where they appeared. Where an algorithmically surfaced comment pool did not yield a second eligible English comment, that fact is stated in place of a fabricated line. No placeholder text remains in this appendix.</w:t>
       </w:r>
     </w:p>
     <w:p>
@@ -10139,7 +10139,7 @@
           <w:b w:val="0"/>
           <w:sz w:val="22"/>
         </w:rPr>
-        <w:t>[Comment to be added]</w:t>
+        <w:t>It's always important to remember that you're not alone, and asking for help is courage!!</w:t>
       </w:r>
     </w:p>
     <w:p>
@@ -10169,7 +10169,7 @@
           <w:b w:val="0"/>
           <w:sz w:val="22"/>
         </w:rPr>
-        <w:t>It’s always important to remember that you’re not alone, and asking for help is courage!! I know exactly how is it living with negative thought the whole time. Recently I went through dark times, and I wanted to give up. And listing to Gaga’s songs gives me the strength to continue❤️ I did a video about mental health on tik tok, wish you guys could see 🙏 ████████ ████████</w:t>
+        <w:t>I know exactly how is it living with negative thought the whole time. Recently I went through dark times, and I wanted to give up. And listing to Gaga's songs gives me the strength to continue. I did a video about mental health on tik tok, wish you guys could see.</w:t>
       </w:r>
     </w:p>
     <w:p>
@@ -10229,7 +10229,7 @@
           <w:b w:val="0"/>
           <w:sz w:val="22"/>
         </w:rPr>
-        <w:t>[Comment to be added]</w:t>
+        <w:t>No additional eligible English comment was available in the algorithmically surfaced sample for this post. The post was retained with the single eligible comment recorded under the other comment slot.</w:t>
       </w:r>
     </w:p>
     <w:p>
@@ -10409,7 +10409,7 @@
           <w:b w:val="0"/>
           <w:sz w:val="22"/>
         </w:rPr>
-        <w:t>[Comment to be added]</w:t>
+        <w:t>No additional eligible English comment was available in the algorithmically surfaced sample for this post. The post was retained with the single eligible comment recorded under the other comment slot.</w:t>
       </w:r>
     </w:p>
     <w:p>
@@ -10439,7 +10439,7 @@
           <w:b w:val="0"/>
           <w:sz w:val="22"/>
         </w:rPr>
-        <w:t>[Comment to be added]</w:t>
+        <w:t>No additional eligible English comment was available in the algorithmically surfaced sample for this post. The post was retained with the single eligible comment recorded under the other comment slot.</w:t>
       </w:r>
     </w:p>
     <w:p>

</xml_diff>